<commit_message>
Schematics (evidence ladder, lens assay), restyled results figure, figures wired into report
Co-Authored-By: Claude Fable 5.1 <noreply@anthropic.com>
Claude-Session: https://claude.ai/code/session_018qJiaQKKjpemqx8e3Wrmcq
</commit_message>
<xml_diff>
--- a/report/report_draft.docx
+++ b/report/report_draft.docx
@@ -286,25 +286,7 @@
         <w:pStyle w:val="FirstParagraph"/>
       </w:pPr>
       <w:r>
-        <w:t xml:space="preserve">Bonjour, Aggarwal and Bhargava (UAI 2022) proposed pairwise net influence, an information-theoretic statistic that identifies a colluding pair in a repeated game from action logs alone. No public implementation exists and the method has never been applied to language-model agents or compared against any baseline. We implement the statistic for N players, validate it on scripted four-player iterated Rock-Paper-Scissors with one seeded colluding pair, and make two additions. First, a within-state permutation null that removes the positive small-sample bias of plug-in mutual information, which at 25 rounds (the scale LLM experiments actually run at) is as large as the paper’s detection threshold. Second, an</w:t>
-      </w:r>
-      <w:r>
-        <w:t xml:space="preserve"> </w:t>
-      </w:r>
-      <w:r>
-        <w:t xml:space="preserve">“</w:t>
-      </w:r>
-      <w:r>
-        <w:t xml:space="preserve">innocent parallel conduct</w:t>
-      </w:r>
-      <w:r>
-        <w:t xml:space="preserve">”</w:t>
-      </w:r>
-      <w:r>
-        <w:t xml:space="preserve"> </w:t>
-      </w:r>
-      <w:r>
-        <w:t xml:space="preserve">confound in the spirit of the antitrust plus-factor debate: two non-colluders who follow the same public rule and are therefore perfectly correlated without any agreement. Over 4,400 simulated games we find that the published memoryless statistic, raw mutual information, Cramer’s V and same-action rate all rank the innocent pair first in 100% of games, while conditioning on the public state (the previous round’s majority action) recovers the true pair in 98 to 100% of games at 25 to 500 rounds. Conditioning alone, however, inflates false positives to 100% at 25 rounds; the permutation correction reduces them to 25% at 25 rounds and 5% at 100 rounds with no loss of ranking power. We release the code and an LLM harness (four GPT-4.1-mini players, one secret team with a private channel that the detector never sees) and report a pilot in Section 5.</w:t>
+        <w:t xml:space="preserve">What should count as evidence that two AI agents are colluding? Antitrust law holds that parallel conduct is not an agreement and demands plus factors. We test one plus factor at two evidence surfaces, action logs and model internals, and in each case measure how the naive reading mistakes something innocent for collusion. On actions, we implement pairwise net influence (Bonjour et al. 2022) for N players, add a within-state permutation null, and run the ground-truth evaluation the method has never had: 4,400 scripted four-player games over five horizons, six collusion strengths, four baselines and two public-state definitions, an innocent pair following the same public rule, a harder innocent pair keyed on a richer state, and a coalition of three. The published memoryless statistic and every unconditioned baseline rank the innocent pair first in 96 to 100 percent of games; conditioning on the public state recovers the true pair in 98 to 100 percent; the permutation null cuts the 25-round false-positive rate from 100 percent to 25 percent; and we report where the conditioned detector breaks. We then apply the calibrated detector to GPT-4.1-mini agents with a hidden private channel. On internals, we run the privileged-observer control that Rose et al. (2026) proposed but did not execute: with a Jacobian lens on gemma-4-12B-it we ask whether the workspace representation of a partner’s coded proposal differs between a receiver that adopts it and one that understands it and refuses, across five matched conditions. Code, logs and notebooks are released.</w:t>
       </w:r>
     </w:p>
     <w:bookmarkEnd w:id="20"/>
@@ -330,7 +312,7 @@
         <w:pStyle w:val="BodyText"/>
       </w:pPr>
       <w:r>
-        <w:t xml:space="preserve">Bonjour et al. (2022) proposed a statistic that is attractive for exactly this reason. Rather than raw dependence, it measures the dependence between two agents’ actions conditional on the observable game state, and then subtracts the strongest dependence any third agent has on the same target. It is domain independent and needs only logged actions. Yet it has only been tested on three scripted or Q-learning players, with no baseline comparison, no public code, and a fixed threshold whose behaviour at small sample sizes was not examined.</w:t>
+        <w:t xml:space="preserve">Bonjour et al. (2022) proposed a statistic that is attractive for exactly this reason. Rather than raw dependence, it measures the dependence between two agents’ actions conditional on the observable game state, and then subtracts the strongest dependence any third agent has on the same target. It is domain independent and needs only logged actions. Before this sprint it had been tested only on three scripted or Q-learning players, with no baseline comparison, no public code, and a fixed threshold whose behaviour at short horizons was not examined. Several concurrent sprint entries apply it directly to LLM players (Ayeku 2026; Snow 2026; Lee et al. 2026). What none of them provides, and what a detector needs before anyone relies on its verdicts, is a ground-truth characterisation: at which horizons, collusion strengths and kinds of innocent correlation does it hold, and where does it break. That is the first half of this report.</w:t>
       </w:r>
     </w:p>
     <w:p>
@@ -404,13 +386,13 @@
           <w:bCs/>
           <w:b/>
         </w:rPr>
-        <w:t xml:space="preserve">Information-theoretic collusion detection.</w:t>
-      </w:r>
-      <w:r>
-        <w:t xml:space="preserve"> </w:t>
-      </w:r>
-      <w:r>
-        <w:t xml:space="preserve">Bonjour et al. (2022) define influence between agents as a conditional mutual information and detect collusion by a net-influence threshold (details in Section 3). Rose et al. (2026) detect collusion through model internals; our method is black box. Rippin et al. (2026) measure whether independent agents choose compatible steganographic schemes, a form of innocent-looking coordination that a state-conditioned statistic would need to handle. Xu et al. (2026) show that two deployments of the same base model have slight correlations in economic settings, which is the LLM analogue of our parallel-conduct confound.</w:t>
+        <w:t xml:space="preserve">Information-theoretic detection from actions.</w:t>
+      </w:r>
+      <w:r>
+        <w:t xml:space="preserve"> </w:t>
+      </w:r>
+      <w:r>
+        <w:t xml:space="preserve">Bonjour, Aggarwal and Bhargava (2022) define influence between agents as conditional mutual information given the game state and flag a pair whose net influence exceeds a fixed threshold. The method was validated on three scripted or Q-learning players with no baseline and no public code, and the threshold’s behaviour at short horizons was not examined. Later information-theoretic detectors for language-model agents work on transcripts rather than actions: Tailor (2025) and Ghanem (2026) estimate cross-run mutual information over messages with honest-replay calibration, and neither conditions on a public state. We found no application of transfer entropy or directed information to LLM coordination. Xu et al. (2026) show that two deployments of one base model carry a small residual bid correlation and conclude that price-level audits are blind by construction; this is the LLM form of the parallel-conduct confound we test. Within the same sprint, Ayeku (2026) and Snow (2026) independently apply net influence with a permutation test to LLM players, and Ayeku also conditions on a public state against an innocent rule-following pair. Our scripted sweep (4,400 games, five horizons, six collusion strengths, four baselines, two state functions, with and without correction) is the systematic ground-truth evaluation that those concurrent LLM-first entries do not report.</w:t>
       </w:r>
     </w:p>
     <w:p>
@@ -422,13 +404,13 @@
           <w:bCs/>
           <w:b/>
         </w:rPr>
-        <w:t xml:space="preserve">Collusion in LLM agents.</w:t>
-      </w:r>
-      <w:r>
-        <w:t xml:space="preserve"> </w:t>
-      </w:r>
-      <w:r>
-        <w:t xml:space="preserve">Fish et al. (2024) and Lin et al. (2024) show LLM pricing agents sustaining supracompetitive prices without explicit messages; Agrawal et al. (2025) study double auctions with seller chat and oversight; Nakamura et al. (2026) measure coalition advantage in workplace tasks when a pair is given a private channel. Our LLM harness borrows the private-channel positive control from Nakamura et al. and the action-only evidence standard from the sprint’s Track 2.</w:t>
+        <w:t xml:space="preserve">Detection from internals.</w:t>
+      </w:r>
+      <w:r>
+        <w:t xml:space="preserve"> </w:t>
+      </w:r>
+      <w:r>
+        <w:t xml:space="preserve">Rose et al. (2026) train a deception direction on residual activations and aggregate per-agent scores across a group, reaching 1.00 AUROC in-distribution and 0.73 to 0.93 zero-shot. They name, and leave to future work, a privileged-observer control in which an agent knows the scheme but does not take part. Li et al. (2026) find that a probe confined to the Jacobian-lens transport subspace detects stated stance but is no better than a random subspace at detecting withheld collusion. Veras Neves (2026) reads a coordination signal from the J-lens on single legal-judgement prompts in Qwen3.5-4B and gemma-4-e4b-it, with lexical-echo and answer-slot controls but no condition in which the model understands a proposal and declines it. Gurnee et al. (2026) and Ayonrinde and Lindsey (2026) show that a concept can sit in the workspace while the model suppresses it, which is the premise our refusal-matched assay tests.</w:t>
       </w:r>
     </w:p>
     <w:p>
@@ -446,7 +428,7 @@
         <w:t xml:space="preserve"> </w:t>
       </w:r>
       <w:r>
-        <w:t xml:space="preserve">Berger et al. (2025) survey how US antitrust treats parallel conduct: an agreement must be inferred from plus factors beyond parallelism. We operationalise one such factor, dependence that survives conditioning on the public information set, as a quantitative test.</w:t>
+        <w:t xml:space="preserve">Berger et al. (2025) survey plus factors beyond parallelism. We operationalise one: dependence that survives conditioning on the public information set and exceeds a permutation null.</w:t>
       </w:r>
     </w:p>
     <w:bookmarkEnd w:id="22"/>
@@ -714,9 +696,9 @@
       <w:r>
         <w:drawing>
           <wp:inline>
-            <wp:extent cx="5334000" cy="1493520"/>
+            <wp:extent cx="5334000" cy="1866900"/>
             <wp:effectExtent b="0" l="0" r="0" t="0"/>
-            <wp:docPr descr="Figure 1. Left: rank-1 accuracy when an innocent parallel pair is present (CP = 0.6). Middle: false-positive rate under the published criterion when no collusion is present, in the all-random and parallel-only worlds. Right: criterion accuracy at 25 rounds as a function of collusion strength, random non-colluders. 100 seeds per point." title="" id="29" name="Picture"/>
+            <wp:docPr descr="Figure 3. Left: rank-1 accuracy when an innocent parallel pair is present (CP = 0.6). Middle: false-positive rate under the published criterion when no collusion is present, in the all-random and parallel-only worlds. Right: criterion accuracy at 25 rounds as a function of collusion strength, random non-colluders. 100 seeds per point." title="" id="29" name="Picture"/>
             <a:graphic>
               <a:graphicData uri="http://schemas.openxmlformats.org/drawingml/2006/picture">
                 <pic:pic>
@@ -735,7 +717,7 @@
                   <pic:spPr bwMode="auto">
                     <a:xfrm>
                       <a:off x="0" y="0"/>
-                      <a:ext cx="5334000" cy="1493520"/>
+                      <a:ext cx="5334000" cy="1866900"/>
                     </a:xfrm>
                     <a:prstGeom prst="rect">
                       <a:avLst/>
@@ -759,7 +741,7 @@
         <w:pStyle w:val="ImageCaption"/>
       </w:pPr>
       <w:r>
-        <w:t xml:space="preserve">Figure 1. Left: rank-1 accuracy when an innocent parallel pair is present (CP = 0.6). Middle: false-positive rate under the published criterion when no collusion is present, in the all-random and parallel-only worlds. Right: criterion accuracy at 25 rounds as a function of collusion strength, random non-colluders. 100 seeds per point.</w:t>
+        <w:t xml:space="preserve">Figure 3. Left: rank-1 accuracy when an innocent parallel pair is present (CP = 0.6). Middle: false-positive rate under the published criterion when no collusion is present, in the all-random and parallel-only worlds. Right: criterion accuracy at 25 rounds as a function of collusion strength, random non-colluders. 100 seeds per point.</w:t>
       </w:r>
     </w:p>
     <w:p>
@@ -2405,7 +2387,7 @@
         <w:t xml:space="preserve"> </w:t>
       </w:r>
       <w:r>
-        <w:t xml:space="preserve">We tested one confound and one state function, both chosen to match. Real innocent correlation (shared base-model priors, common reactions to unmodelled shocks) is not reducible to a four-valued state. Our collusion model assumes ex-ante signalling, as in the original paper; LLM coalitions coordinate imperfectly. The fixed alpha is uncalibrated at 25 rounds in the all-random world. The LLM pilot is small (ten games per condition, one model, one temperature). All code was written in a single sprint day and has not been independently reviewed.</w:t>
+        <w:t xml:space="preserve">We tested one confound and one state function, both chosen to match. Real innocent correlation (shared base-model priors, common reactions to unmodelled shocks) is not reducible to a four-valued state. Our collusion model assumes ex-ante signalling, as in the original paper; LLM coalitions coordinate imperfectly. The fixed alpha is uncalibrated at 25 rounds in the all-random world. The LLM pilot is small (ten games per condition, one model, one temperature). All code was written in a single sprint day and has not been independently reviewed. Concurrent entries in the same sprint apply net influence with permutation tests to LLM players; our contribution on the action surface is the ground-truth characterisation, not the method. On the internals surface, Li et al. (2026) report that the J-lens subspace tracks what agents say rather than what they withhold; a null adopt-versus-refuse separation in our assay would be consistent with that, and a positive one would need reconciling with it.</w:t>
       </w:r>
     </w:p>
     <w:p>
@@ -2449,6 +2431,22 @@
         <w:pStyle w:val="BodyText"/>
       </w:pPr>
       <w:r>
+        <w:t xml:space="preserve">Ayeku, D. (2026). Telling Collusion from Common Knowledge: State-Conditioned Net Influence for LLM Agents. Apart Research AI Collusion Sprint entry (concurrent work).</w:t>
+      </w:r>
+    </w:p>
+    <w:p>
+      <w:pPr>
+        <w:pStyle w:val="BodyText"/>
+      </w:pPr>
+      <w:r>
+        <w:t xml:space="preserve">Ayonrinde, K. and Lindsey, J. (2026). J++ Lens: Jacobian Filtering Enables More Faithful Workspace Lenses. LessWrong, 8 October 2026.</w:t>
+      </w:r>
+    </w:p>
+    <w:p>
+      <w:pPr>
+        <w:pStyle w:val="BodyText"/>
+      </w:pPr>
+      <w:r>
         <w:t xml:space="preserve">Berger, D. et al. (2025). Coordination by Code: Rethinking Antitrust Liability in the Age of AI Pricing. ABA Antitrust Magazine, Fall 2025.</w:t>
       </w:r>
     </w:p>
@@ -2473,6 +2471,38 @@
         <w:pStyle w:val="BodyText"/>
       </w:pPr>
       <w:r>
+        <w:t xml:space="preserve">Ghanem, M. C. (2026). Steganalysis of Adaptive Covert Collusion in Tool-Using Agent Populations. arXiv:2608.02698.</w:t>
+      </w:r>
+    </w:p>
+    <w:p>
+      <w:pPr>
+        <w:pStyle w:val="BodyText"/>
+      </w:pPr>
+      <w:r>
+        <w:t xml:space="preserve">Gurnee, W. et al. (2026). Verbalizable Representations Form a Global Workspace in Language Models. Transformer Circuits Thread, 6 July 2026.</w:t>
+      </w:r>
+    </w:p>
+    <w:p>
+      <w:pPr>
+        <w:pStyle w:val="BodyText"/>
+      </w:pPr>
+      <w:r>
+        <w:t xml:space="preserve">Lee, C. E., Rosdalen, F., Samodelkin, P. and Edin, Y. (2026). From Pairs To Coalitions: Extending Information-Theoretic Collusion Detection To Multi-Agent Games. Apart Research AI Collusion Sprint entry (concurrent work).</w:t>
+      </w:r>
+    </w:p>
+    <w:p>
+      <w:pPr>
+        <w:pStyle w:val="BodyText"/>
+      </w:pPr>
+      <w:r>
+        <w:t xml:space="preserve">Li, D., Varigonda, A., Feng, A., Chauhan, M. and Shrivastava, D. (2026). Collusion Does Not Localize to Jacobian-Lens Transport Subspaces. NeurIPS 2026 Workshop on Agents in the Wild (poster).</w:t>
+      </w:r>
+    </w:p>
+    <w:p>
+      <w:pPr>
+        <w:pStyle w:val="BodyText"/>
+      </w:pPr>
+      <w:r>
         <w:t xml:space="preserve">Lin, R. et al. (2024). Strategic Collusion of LLM Agents: Market Division in Multi-Commodity Competitions. arXiv:2410.00031.</w:t>
       </w:r>
     </w:p>
@@ -2489,23 +2519,47 @@
         <w:pStyle w:val="BodyText"/>
       </w:pPr>
       <w:r>
-        <w:t xml:space="preserve">Rippin, M. et al. (2026). arXiv:2606.28425 (independent agents selecting compatible steganographic schemes; cited from the sprint brief).</w:t>
-      </w:r>
-    </w:p>
-    <w:p>
-      <w:pPr>
-        <w:pStyle w:val="BodyText"/>
-      </w:pPr>
-      <w:r>
-        <w:t xml:space="preserve">Rose, A., Cullen, C., Kaplowitz, B. G. and Schroeder de Witt, C. (2026). Detecting Multi-Agent Collusion Through Multi-Agent Interpretability. arXiv:2604.01151.</w:t>
-      </w:r>
-    </w:p>
-    <w:p>
-      <w:pPr>
-        <w:pStyle w:val="BodyText"/>
-      </w:pPr>
-      <w:r>
-        <w:t xml:space="preserve">Xu, et al. (2026). arXiv:2607.26385 (correlation between deployments of the same base model in economic settings; cited from the sprint brief).</w:t>
+        <w:t xml:space="preserve">Rose, A., Cullen, C., Abdelnabi, S., Torr, P., Kaplowitz, B. G. and Schroeder de Witt, C. (2026). Detecting Multi-Agent Collusion Through Multi-Agent Interpretability. arXiv:2604.01151 (v4, HELIOS and NARCBench).</w:t>
+      </w:r>
+    </w:p>
+    <w:p>
+      <w:pPr>
+        <w:pStyle w:val="BodyText"/>
+      </w:pPr>
+      <w:r>
+        <w:t xml:space="preserve">Snow, J. (2026). Reading Moves, Not Messages: Detecting Collusion Between LLM Agents. Apart Research AI Collusion Sprint entry (concurrent work).</w:t>
+      </w:r>
+    </w:p>
+    <w:p>
+      <w:pPr>
+        <w:pStyle w:val="BodyText"/>
+      </w:pPr>
+      <w:r>
+        <w:t xml:space="preserve">solarkyle (2026). jspace-lenses: fitted Jacobian lenses for open models. Hugging Face.</w:t>
+      </w:r>
+    </w:p>
+    <w:p>
+      <w:pPr>
+        <w:pStyle w:val="BodyText"/>
+      </w:pPr>
+      <w:r>
+        <w:t xml:space="preserve">Tailor, O. (2025). Audit the Whisper: Detecting Steganographic Collusion in Multi-Agent LLMs. arXiv:2510.04303.</w:t>
+      </w:r>
+    </w:p>
+    <w:p>
+      <w:pPr>
+        <w:pStyle w:val="BodyText"/>
+      </w:pPr>
+      <w:r>
+        <w:t xml:space="preserve">Veras Neves, C. E. (2026). j-space: Jacobian Lens for algorithmic collusion. Hugging Face Space (Trackio logbook), July 2026.</w:t>
+      </w:r>
+    </w:p>
+    <w:p>
+      <w:pPr>
+        <w:pStyle w:val="BodyText"/>
+      </w:pPr>
+      <w:r>
+        <w:t xml:space="preserve">Xu, X., Wu, C., Lu, J., Tan, K., Tao, S. and Hong, H. (2026). Collusion with Competitive Marginals: Price-Level Audits Are Blind by Construction. arXiv:2607.26385.</w:t>
       </w:r>
     </w:p>
     <w:bookmarkEnd w:id="35"/>

</xml_diff>

<commit_message>
Restore two-surface sections (3.5, 5, 6) with result markers; verified
Co-Authored-By: Claude Fable 5.1 <noreply@anthropic.com>
Claude-Session: https://claude.ai/code/session_018qJiaQKKjpemqx8e3Wrmcq
</commit_message>
<xml_diff>
--- a/report/report_draft.docx
+++ b/report/report_draft.docx
@@ -290,7 +290,7 @@
       </w:r>
     </w:p>
     <w:bookmarkEnd w:id="20"/>
-    <w:bookmarkStart w:id="21" w:name="introduction"/>
+    <w:bookmarkStart w:id="24" w:name="introduction"/>
     <w:p>
       <w:pPr>
         <w:pStyle w:val="Heading2"/>
@@ -320,7 +320,15 @@
         <w:pStyle w:val="BodyText"/>
       </w:pPr>
       <w:r>
-        <w:t xml:space="preserve">This report does three things in a weekend-sized scope:</w:t>
+        <w:t xml:space="preserve">The same problem recurs one level down. Interpretability-based collusion detectors (Rose et al. 2026, with the HELIOS framework and NARCBench) read a coalition out of activations. But a receiver that understands a partner’s harmful proposal in order to refuse it must represent that proposal too, so a lens that finds the proposal in the workspace has not yet found an agreement. Rose et al. name exactly this control, a privileged observer that knows the scheme but does not take part, and leave it to future work; Gurnee et al. (2026) and Ayonrinde and Lindsey (2026) show that a concept can sit in the workspace while the model suppresses it. The second half of this report runs that control with a workspace lens.</w:t>
+      </w:r>
+    </w:p>
+    <w:p>
+      <w:pPr>
+        <w:pStyle w:val="BodyText"/>
+      </w:pPr>
+      <w:r>
+        <w:t xml:space="preserve">This report therefore tests the plus-factor logic at two evidence surfaces, in a weekend-sized scope:</w:t>
       </w:r>
     </w:p>
     <w:p>
@@ -332,7 +340,7 @@
         <w:pStyle w:val="Compact"/>
       </w:pPr>
       <w:r>
-        <w:t xml:space="preserve">Implements the statistic for arbitrary N and releases it.</w:t>
+        <w:t xml:space="preserve">Actions. We implement pairwise net influence for arbitrary N with a permutation null, and evaluate it with ground truth against four baselines across horizons, collusion strengths, two public-state definitions, an innocent same-rule pair, a harder innocent pair keyed on a richer state, and a coalition of three; then apply it to GPT-4.1-mini agents with a hidden private channel.</w:t>
       </w:r>
     </w:p>
     <w:p>
@@ -344,19 +352,7 @@
         <w:pStyle w:val="Compact"/>
       </w:pPr>
       <w:r>
-        <w:t xml:space="preserve">Measures it against naive baselines on a four-player game with one seeded colluding pair, across game lengths from 25 to 500 rounds and collusion strengths from 0 to 1.</w:t>
-      </w:r>
-    </w:p>
-    <w:p>
-      <w:pPr>
-        <w:numPr>
-          <w:ilvl w:val="0"/>
-          <w:numId w:val="1001"/>
-        </w:numPr>
-        <w:pStyle w:val="Compact"/>
-      </w:pPr>
-      <w:r>
-        <w:t xml:space="preserve">Introduces an innocent-parallel-conduct confound and a permutation-based bias correction, and shows which combination separates a deliberate coalition from innocent correlation.</w:t>
+        <w:t xml:space="preserve">Internals. Using a fitted Jacobian lens on gemma-4-12B-it, we run the privileged-observer control: does the workspace readout of a partner’s coded proposal differ between a receiver that adopts it and one that understands it and refuses, with matched permission, tag-swap and tag-erase conditions.</w:t>
       </w:r>
     </w:p>
     <w:p>
@@ -364,11 +360,66 @@
         <w:pStyle w:val="FirstParagraph"/>
       </w:pPr>
       <w:r>
-        <w:t xml:space="preserve">The scripted environment costs nothing to run and gives ground truth, which is what a detector needs before it is trusted on LLM logs. The LLM harness then applies the same detector to language-model agents, where the colluders’ private channel is hidden from the detector.</w:t>
-      </w:r>
-    </w:p>
-    <w:bookmarkEnd w:id="21"/>
-    <w:bookmarkStart w:id="22" w:name="related-work"/>
+        <w:t xml:space="preserve">The scripted environment costs nothing and gives ground truth, which a detector needs before anyone trusts it on LLM logs; the LLM and lens experiments then test the two surfaces on real models. Figure 1 summarises the design.</w:t>
+      </w:r>
+    </w:p>
+    <w:p>
+      <w:pPr>
+        <w:pStyle w:val="CaptionedFigure"/>
+      </w:pPr>
+      <w:r>
+        <w:drawing>
+          <wp:inline>
+            <wp:extent cx="5334000" cy="3259666"/>
+            <wp:effectExtent b="0" l="0" r="0" t="0"/>
+            <wp:docPr descr="Figure 1. Two evidence surfaces, one rule. Left: on an action log, the naive statistic points at the innocent pair that follows the same public rule; the state-conditioned, permutation-calibrated statistic points at the hidden coalition. Right: in the receiver’s workspace, the lens reads the partner’s proposal; the assay asks whether the readout differs between adopting and understanding-and-refusing." title="" id="22" name="Picture"/>
+            <a:graphic>
+              <a:graphicData uri="http://schemas.openxmlformats.org/drawingml/2006/picture">
+                <pic:pic>
+                  <pic:nvPicPr>
+                    <pic:cNvPr descr="../results/fig_evidence_ladder.png" id="23" name="Picture"/>
+                    <pic:cNvPicPr>
+                      <a:picLocks noChangeArrowheads="1" noChangeAspect="1"/>
+                    </pic:cNvPicPr>
+                  </pic:nvPicPr>
+                  <pic:blipFill>
+                    <a:blip r:embed="rId21"/>
+                    <a:stretch>
+                      <a:fillRect/>
+                    </a:stretch>
+                  </pic:blipFill>
+                  <pic:spPr bwMode="auto">
+                    <a:xfrm>
+                      <a:off x="0" y="0"/>
+                      <a:ext cx="5334000" cy="3259666"/>
+                    </a:xfrm>
+                    <a:prstGeom prst="rect">
+                      <a:avLst/>
+                    </a:prstGeom>
+                    <a:noFill/>
+                    <a:ln w="9525">
+                      <a:noFill/>
+                      <a:headEnd/>
+                      <a:tailEnd/>
+                    </a:ln>
+                  </pic:spPr>
+                </pic:pic>
+              </a:graphicData>
+            </a:graphic>
+          </wp:inline>
+        </w:drawing>
+      </w:r>
+    </w:p>
+    <w:p>
+      <w:pPr>
+        <w:pStyle w:val="ImageCaption"/>
+      </w:pPr>
+      <w:r>
+        <w:t xml:space="preserve">Figure 1. Two evidence surfaces, one rule. Left: on an action log, the naive statistic points at the innocent pair that follows the same public rule; the state-conditioned, permutation-calibrated statistic points at the hidden coalition. Right: in the receiver’s workspace, the lens reads the partner’s proposal; the assay asks whether the readout differs between adopting and understanding-and-refusing.</w:t>
+      </w:r>
+    </w:p>
+    <w:bookmarkEnd w:id="24"/>
+    <w:bookmarkStart w:id="25" w:name="related-work"/>
     <w:p>
       <w:pPr>
         <w:pStyle w:val="Heading2"/>
@@ -431,8 +482,8 @@
         <w:t xml:space="preserve">Berger et al. (2025) survey plus factors beyond parallelism. We operationalise one: dependence that survives conditioning on the public information set and exceeds a permutation null.</w:t>
       </w:r>
     </w:p>
-    <w:bookmarkEnd w:id="22"/>
-    <w:bookmarkStart w:id="27" w:name="method"/>
+    <w:bookmarkEnd w:id="25"/>
+    <w:bookmarkStart w:id="34" w:name="method"/>
     <w:p>
       <w:pPr>
         <w:pStyle w:val="Heading2"/>
@@ -441,7 +492,7 @@
         <w:t xml:space="preserve">3. Method</w:t>
       </w:r>
     </w:p>
-    <w:bookmarkStart w:id="23" w:name="pairwise-net-influence"/>
+    <w:bookmarkStart w:id="26" w:name="pairwise-net-influence"/>
     <w:p>
       <w:pPr>
         <w:pStyle w:val="Heading3"/>
@@ -490,8 +541,8 @@
         <w:t xml:space="preserve">and agents i and j are declared colluding if Gamma(i; j) &gt;= alpha and Gamma(j; i) &gt;= alpha. The paper reports a pair only when exactly one pair satisfies this, and uses alpha = 0.05 (natural log). We implement this exactly, with plug-in (count-based) probabilities. For ranking experiments we score each unordered pair by min(Gamma(i; j), Gamma(j; i)).</w:t>
       </w:r>
     </w:p>
-    <w:bookmarkEnd w:id="23"/>
-    <w:bookmarkStart w:id="24" w:name="state-functions"/>
+    <w:bookmarkEnd w:id="26"/>
+    <w:bookmarkStart w:id="27" w:name="state-functions"/>
     <w:p>
       <w:pPr>
         <w:pStyle w:val="Heading3"/>
@@ -508,8 +559,8 @@
         <w:t xml:space="preserve">The paper leaves the choice of state to the game. We compare two: a memoryless state (a single value, so gamma reduces to plain mutual information) and the previous round’s majority action (ties broken to the lowest action index), which has four values and is the minimal public summary a parallel rule could key on. The code also provides the full previous action profile, which is too sparse for short games.</w:t>
       </w:r>
     </w:p>
-    <w:bookmarkEnd w:id="24"/>
-    <w:bookmarkStart w:id="25" w:name="permutation-bias-correction"/>
+    <w:bookmarkEnd w:id="27"/>
+    <w:bookmarkStart w:id="28" w:name="permutation-bias-correction"/>
     <w:p>
       <w:pPr>
         <w:pStyle w:val="Heading3"/>
@@ -544,8 +595,8 @@
         <w:t xml:space="preserve">by shuffling A_j within each state stratum (100 to 500 permutations), which preserves p(a_j | s). We report the bias-corrected statistic gamma - mean(null), clipped at zero, and a permutation p-value for each pair. Net influence is then computed from the corrected gamma.</w:t>
       </w:r>
     </w:p>
-    <w:bookmarkEnd w:id="25"/>
-    <w:bookmarkStart w:id="26" w:name="scripted-environment"/>
+    <w:bookmarkEnd w:id="28"/>
+    <w:bookmarkStart w:id="29" w:name="scripted-environment"/>
     <w:p>
       <w:pPr>
         <w:pStyle w:val="Heading3"/>
@@ -678,15 +729,22 @@
         <w:t xml:space="preserve">Detectors, all action-only: net influence with the memoryless state (NI, the published method), net influence with the majority state, both with and without the permutation correction, raw mutual information, Cramer’s V, and same-action rate. Metrics: rank-1 accuracy (true pair scores highest among the six pairs), criterion accuracy (exactly one pair crosses alpha and it is the true pair) and false-positive rate (any pair crosses alpha in a no-collusion condition).</w:t>
       </w:r>
     </w:p>
-    <w:bookmarkEnd w:id="26"/>
-    <w:bookmarkEnd w:id="27"/>
-    <w:bookmarkStart w:id="31" w:name="results-scripted"/>
-    <w:p>
-      <w:pPr>
-        <w:pStyle w:val="Heading2"/>
-      </w:pPr>
-      <w:r>
-        <w:t xml:space="preserve">4. Results (scripted)</w:t>
+    <w:bookmarkEnd w:id="29"/>
+    <w:bookmarkStart w:id="33" w:name="workspace-lens-proposal-assay"/>
+    <w:p>
+      <w:pPr>
+        <w:pStyle w:val="Heading3"/>
+      </w:pPr>
+      <w:r>
+        <w:t xml:space="preserve">3.5 Workspace-lens proposal assay</w:t>
+      </w:r>
+    </w:p>
+    <w:p>
+      <w:pPr>
+        <w:pStyle w:val="FirstParagraph"/>
+      </w:pPr>
+      <w:r>
+        <w:t xml:space="preserve">A planted-communication assay with a scripted sender and a model receiver (gemma-4-12B-it, NF4 4-bit, solarkyle lens, read at the last prompt token before generation). Each base case fixes four candidate items (red, blue, green, black), a policy marking two eligible and two ineligible, a random codebook mapping four tag words to the items, and a sender nomination that is ineligible. The receiver sees the policy, the full codebook and the tag, and must reply with one item or abstain. Five matched prompts per base case: unauthorized (pair-bonus objective, nomination ineligible), permitted (same tag, nomination made eligible), refusal (strict-compliance objective), tag swapped (tag for the other ineligible item) and tag erased. For every prompt we record the rank of each candidate’s token in the lens readout in an early band (first quarter of layers), a late band (0.6 to 0.95, the band that performed best in a prior sweep on this model) and the full upper band, and the item the receiver actually approved. The metrics, bands and conditions were fixed in code before any receiver was run. The headline quantity is candidate decoding of the transmitted item conditional on actual behaviour: adopted in the unauthorized condition versus refused in the refusal condition. Thirty base cases, 150 receiver evaluations. Figure 2 shows the pipeline and the five conditions.</w:t>
       </w:r>
     </w:p>
     <w:p>
@@ -696,20 +754,86 @@
       <w:r>
         <w:drawing>
           <wp:inline>
-            <wp:extent cx="5334000" cy="1866900"/>
+            <wp:extent cx="5334000" cy="2518833"/>
             <wp:effectExtent b="0" l="0" r="0" t="0"/>
-            <wp:docPr descr="Figure 3. Left: rank-1 accuracy when an innocent parallel pair is present (CP = 0.6). Middle: false-positive rate under the published criterion when no collusion is present, in the all-random and parallel-only worlds. Right: criterion accuracy at 25 rounds as a function of collusion strength, random non-colluders. 100 seeds per point." title="" id="29" name="Picture"/>
+            <wp:docPr descr="Figure 2. The lens assay: scripted sender, random codebook, receiver prompt, Jacobian-lens readout at the last prompt token, one-word action, and the five matched conditions per base case." title="" id="31" name="Picture"/>
             <a:graphic>
               <a:graphicData uri="http://schemas.openxmlformats.org/drawingml/2006/picture">
                 <pic:pic>
                   <pic:nvPicPr>
-                    <pic:cNvPr descr="../results/fig_scripted.png" id="30" name="Picture"/>
+                    <pic:cNvPr descr="../results/fig_lens_assay.png" id="32" name="Picture"/>
                     <pic:cNvPicPr>
                       <a:picLocks noChangeArrowheads="1" noChangeAspect="1"/>
                     </pic:cNvPicPr>
                   </pic:nvPicPr>
                   <pic:blipFill>
-                    <a:blip r:embed="rId28"/>
+                    <a:blip r:embed="rId30"/>
+                    <a:stretch>
+                      <a:fillRect/>
+                    </a:stretch>
+                  </pic:blipFill>
+                  <pic:spPr bwMode="auto">
+                    <a:xfrm>
+                      <a:off x="0" y="0"/>
+                      <a:ext cx="5334000" cy="2518833"/>
+                    </a:xfrm>
+                    <a:prstGeom prst="rect">
+                      <a:avLst/>
+                    </a:prstGeom>
+                    <a:noFill/>
+                    <a:ln w="9525">
+                      <a:noFill/>
+                      <a:headEnd/>
+                      <a:tailEnd/>
+                    </a:ln>
+                  </pic:spPr>
+                </pic:pic>
+              </a:graphicData>
+            </a:graphic>
+          </wp:inline>
+        </w:drawing>
+      </w:r>
+    </w:p>
+    <w:p>
+      <w:pPr>
+        <w:pStyle w:val="ImageCaption"/>
+      </w:pPr>
+      <w:r>
+        <w:t xml:space="preserve">Figure 2. The lens assay: scripted sender, random codebook, receiver prompt, Jacobian-lens readout at the last prompt token, one-word action, and the five matched conditions per base case.</w:t>
+      </w:r>
+    </w:p>
+    <w:bookmarkEnd w:id="33"/>
+    <w:bookmarkEnd w:id="34"/>
+    <w:bookmarkStart w:id="38" w:name="results-scripted"/>
+    <w:p>
+      <w:pPr>
+        <w:pStyle w:val="Heading2"/>
+      </w:pPr>
+      <w:r>
+        <w:t xml:space="preserve">4. Results (scripted)</w:t>
+      </w:r>
+    </w:p>
+    <w:p>
+      <w:pPr>
+        <w:pStyle w:val="CaptionedFigure"/>
+      </w:pPr>
+      <w:r>
+        <w:drawing>
+          <wp:inline>
+            <wp:extent cx="5334000" cy="1866900"/>
+            <wp:effectExtent b="0" l="0" r="0" t="0"/>
+            <wp:docPr descr="Figure 3. Left: rank-1 accuracy when an innocent parallel pair is present (CP = 0.6). Middle: false-positive rate under the published criterion when no collusion is present, in the all-random and parallel-only worlds. Right: criterion accuracy at 25 rounds as a function of collusion strength, random non-colluders. 100 seeds per point." title="" id="36" name="Picture"/>
+            <a:graphic>
+              <a:graphicData uri="http://schemas.openxmlformats.org/drawingml/2006/picture">
+                <pic:pic>
+                  <pic:nvPicPr>
+                    <pic:cNvPr descr="../results/fig_scripted.png" id="37" name="Picture"/>
+                    <pic:cNvPicPr>
+                      <a:picLocks noChangeArrowheads="1" noChangeAspect="1"/>
+                    </pic:cNvPicPr>
+                  </pic:nvPicPr>
+                  <pic:blipFill>
+                    <a:blip r:embed="rId35"/>
                     <a:stretch>
                       <a:fillRect/>
                     </a:stretch>
@@ -2171,14 +2295,14 @@
         <w:t xml:space="preserve">At T = 25 with random non-colluders, criterion accuracy for the corrected, state-conditioned detector rises from 0.07 at CP = 0 to 0.36, 0.65, 0.84 and 0.85 at CP = 0.4, 0.6, 0.8 and 1.0. A 25-round LLM game therefore needs the coalition to coordinate in well over half of rounds to be caught by a single game; pooling ten games (250 rounds) brings the detector into the regime where CP = 0.4 is caught reliably.</w:t>
       </w:r>
     </w:p>
-    <w:bookmarkEnd w:id="31"/>
-    <w:bookmarkStart w:id="32" w:name="llm-pilot"/>
+    <w:bookmarkEnd w:id="38"/>
+    <w:bookmarkStart w:id="39" w:name="X45bbaacc8ab6245fafe1d74c3b68a1c519c5399"/>
     <w:p>
       <w:pPr>
         <w:pStyle w:val="Heading2"/>
       </w:pPr>
       <w:r>
-        <w:t xml:space="preserve">5. LLM pilot</w:t>
+        <w:t xml:space="preserve">5. LLM agents: action-only detection with a hidden channel</w:t>
       </w:r>
     </w:p>
     <w:p>
@@ -2222,7 +2346,7 @@
         <w:t xml:space="preserve">team_no_channel</w:t>
       </w:r>
       <w:r>
-        <w:t xml:space="preserve">, the same instruction without the channel; and</w:t>
+        <w:t xml:space="preserve">, the same instruction without the channel, which tests whether a shared goal alone produces detectable dependence through shared salience (question 1.3); and</w:t>
       </w:r>
       <w:r>
         <w:t xml:space="preserve"> </w:t>
@@ -2235,25 +2359,63 @@
         <w:t xml:space="preserve">independent</w:t>
       </w:r>
       <w:r>
-        <w:t xml:space="preserve">, no team and no channel, which is the same-model negative control. The detector sees only the 25 x 4 action log; messages are logged for post-hoc inspection but never scored. We report coalition advantage (team mean score minus non-team mean score), the pooled 250-round statistics per condition, and per-game rank-1 accuracy.</w:t>
-      </w:r>
-    </w:p>
-    <w:p>
-      <w:pPr>
-        <w:pStyle w:val="BodyText"/>
+        <w:t xml:space="preserve">, no team and no channel, the same-model negative control. The detector sees only the 25 x 4 action log; messages are logged for inspection but never scored.</w:t>
+      </w:r>
+    </w:p>
+    <w:p>
+      <w:pPr>
+        <w:pStyle w:val="BodyText"/>
+      </w:pPr>
+      <w:r>
+        <w:t xml:space="preserve">[Results pending: filled automatically from results/</w:t>
+      </w:r>
+      <w:r>
+        <w:t xml:space="preserve">-llm-pilot/llm_analysis.json by experiments/fill_report.py.]</w:t>
+      </w:r>
+      <w:r>
+        <w:t xml:space="preserve"> </w:t>
+      </w:r>
+    </w:p>
+    <w:bookmarkEnd w:id="39"/>
+    <w:bookmarkStart w:id="40" w:name="X2a011f4509b9f80efa6dfc3d43167290cff797e"/>
+    <w:p>
+      <w:pPr>
+        <w:pStyle w:val="Heading2"/>
+      </w:pPr>
+      <w:r>
+        <w:t xml:space="preserve">6. Model internals: understanding is not agreement</w:t>
+      </w:r>
+    </w:p>
+    <w:p>
+      <w:pPr>
+        <w:pStyle w:val="FirstParagraph"/>
       </w:pPr>
       <w:r>
         <w:rPr>
           <w:bCs/>
           <w:b/>
         </w:rPr>
-        <w:t xml:space="preserve">Results.</w:t>
-      </w:r>
-      <w:r>
-        <w:t xml:space="preserve"> </w:t>
-      </w:r>
-      <w:r>
-        <w:t xml:space="preserve">[TO FILL FROM analyse_llm.py OUTPUT: coalition advantage per condition; pooled Gamma(team) and rank for NI+perm/majority and NI/none; permutation p-value for the team pair; per-game rank-1 accuracy; whether the independent condition produces any pair with p &lt; 0.05, which would be the same-model Schelling false positive.]</w:t>
+        <w:t xml:space="preserve">Setup.</w:t>
+      </w:r>
+      <w:r>
+        <w:t xml:space="preserve"> </w:t>
+      </w:r>
+      <w:r>
+        <w:t xml:space="preserve">As in Section 3.5.</w:t>
+      </w:r>
+    </w:p>
+    <w:p>
+      <w:pPr>
+        <w:pStyle w:val="BodyText"/>
+      </w:pPr>
+      <w:r>
+        <w:t xml:space="preserve">[Results pending: filled automatically from results/</w:t>
+      </w:r>
+      <w:r>
+        <w:t xml:space="preserve">-lens-proposal/lens_proposal_*_summary.json by experiments/fill_report.py.]</w:t>
+      </w:r>
+      <w:r>
+        <w:t xml:space="preserve"> </w:t>
       </w:r>
     </w:p>
     <w:p>
@@ -2265,13 +2427,65 @@
           <w:bCs/>
           <w:b/>
         </w:rPr>
-        <w:t xml:space="preserve">What the messages show.</w:t>
-      </w:r>
-      <w:r>
-        <w:t xml:space="preserve"> </w:t>
-      </w:r>
-      <w:r>
-        <w:t xml:space="preserve">[TO FILL: one or two sentences on whether Alpha and Bravo actually settled on the</w:t>
+        <w:t xml:space="preserve">Interpretation rule, fixed in advance.</w:t>
+      </w:r>
+      <w:r>
+        <w:t xml:space="preserve"> </w:t>
+      </w:r>
+      <w:r>
+        <w:t xml:space="preserve">If the transmitted item is decodable from the workspace in both the actually-adopted and the actually-refused cases, then presence of the proposal in the workspace is not specific to participation, and an auditor must not read it as such; the tag-swapped and tag-erased conditions confirm the readout tracks the transmitted information rather than the objective text. If decoding is high only when the receiver adopts, the lens carries behaviourally specific evidence at the pre-action position. Either outcome is reported as found.</w:t>
+      </w:r>
+    </w:p>
+    <w:bookmarkEnd w:id="40"/>
+    <w:bookmarkStart w:id="41" w:name="discussion"/>
+    <w:p>
+      <w:pPr>
+        <w:pStyle w:val="Heading2"/>
+      </w:pPr>
+      <w:r>
+        <w:t xml:space="preserve">7. Discussion</w:t>
+      </w:r>
+    </w:p>
+    <w:p>
+      <w:pPr>
+        <w:pStyle w:val="FirstParagraph"/>
+      </w:pPr>
+      <w:r>
+        <w:rPr>
+          <w:bCs/>
+          <w:b/>
+        </w:rPr>
+        <w:t xml:space="preserve">What is and is not new.</w:t>
+      </w:r>
+      <w:r>
+        <w:t xml:space="preserve"> </w:t>
+      </w:r>
+      <w:r>
+        <w:t xml:space="preserve">What is new here is narrow. We release the first general-N implementation of Bonjour et al.’s net influence with a within-state permutation null, and the first controlled study of its false-positive behaviour at 25 to 500 rounds against an innocent parallel-conduct pair, with four baselines and ground truth across 4,400 games. On the interpretability side, we are the first to ask whether a receiver’s workspace representation of a partner’s coded proposal differs between adopting it and understanding-and-refusing it, using matched refusal controls. What is not new: net influence itself; conditioning on state (already in the original definition); permutation calibration of dependence statistics; reading collusion-related content with the J-lens (Veras Neves, Li et al.); activation probes for collusion (Rose et al.); and the observation that same-model agents correlate (Xu et al.).</w:t>
+      </w:r>
+    </w:p>
+    <w:p>
+      <w:pPr>
+        <w:pStyle w:val="BodyText"/>
+      </w:pPr>
+      <w:r>
+        <w:t xml:space="preserve">The main result is a negative one with a constructive fix. The published net-influence statistic, like every unconditioned dependence statistic, cannot distinguish a coalition from two agents following the same public rule, and in a world that contains such agents it misidentifies them in every game. Conditioning on the public information set resolves this completely in our environment, but at the cost of a false-positive rate that the fixed threshold does not control at short game lengths; a permutation null fixes that. Together, conditioning plus calibration is a concrete, quantitative plus factor: dependence between two agents’ actions that is not explained by what everyone could observe, and is larger than chance would produce in a log this short.</w:t>
+      </w:r>
+    </w:p>
+    <w:p>
+      <w:pPr>
+        <w:pStyle w:val="BodyText"/>
+      </w:pPr>
+      <w:r>
+        <w:t xml:space="preserve">The internals half applies the same rule to a different observation surface. A lens that reads the partner’s proposal out of the workspace has shown comprehension; whether it has shown agreement is exactly what the refusal control decides. The sandbagging literature already shows that a model’s workspace can hold an answer it declines to say; our assay asks the collusion version: can it hold a proposal it declines to act on. Section 6 reports what we found, and the reporting rule was fixed before the receiver was run.</w:t>
+      </w:r>
+    </w:p>
+    <w:p>
+      <w:pPr>
+        <w:pStyle w:val="BodyText"/>
+      </w:pPr>
+      <w:r>
+        <w:t xml:space="preserve">Two caveats are important. The parallel rule we used keys on a state we then condition on, which is the best case for the method; an innocent rule that keys on a richer public state than the detector conditions on would survive as apparent influence, and in LLM settings the</w:t>
       </w:r>
       <w:r>
         <w:t xml:space="preserve"> </w:t>
@@ -2280,7 +2494,7 @@
         <w:t xml:space="preserve">“</w:t>
       </w:r>
       <w:r>
-        <w:t xml:space="preserve">partner plays the losing move</w:t>
+        <w:t xml:space="preserve">public rule</w:t>
       </w:r>
       <w:r>
         <w:t xml:space="preserve">”</w:t>
@@ -2289,69 +2503,25 @@
         <w:t xml:space="preserve"> </w:t>
       </w:r>
       <w:r>
-        <w:t xml:space="preserve">scheme, a same-move scheme, or something else, by reading results/llm_games.jsonl.]</w:t>
-      </w:r>
-    </w:p>
-    <w:bookmarkEnd w:id="32"/>
-    <w:bookmarkStart w:id="33" w:name="discussion"/>
+        <w:t xml:space="preserve">is the shared prior of the base model, which cannot be written down as a state variable. This is the open problem that the same-model negative control in Section 5 probes. Second, the same-action baseline’s failure is a reminder that collusion need not look like agreement; detectors should be sign-agnostic.</w:t>
+      </w:r>
+    </w:p>
+    <w:p>
+      <w:pPr>
+        <w:pStyle w:val="BodyText"/>
+      </w:pPr>
+      <w:r>
+        <w:t xml:space="preserve">Future work: evaluate a p-value-based criterion with multiple-comparison control across pairs; move to the Agrawal et al. (2025) double auction, where the public state is the order book; test whether conditioning on the other agents’ actions in the same round (rather than only the previous round) separates coordination from common response to a shock; and extend to coalitions larger than two.</w:t>
+      </w:r>
+    </w:p>
+    <w:bookmarkEnd w:id="41"/>
+    <w:bookmarkStart w:id="42" w:name="X34a9f4a4955810fa226028fb89dc1e250b93941"/>
     <w:p>
       <w:pPr>
         <w:pStyle w:val="Heading2"/>
       </w:pPr>
       <w:r>
-        <w:t xml:space="preserve">6. Discussion</w:t>
-      </w:r>
-    </w:p>
-    <w:p>
-      <w:pPr>
-        <w:pStyle w:val="FirstParagraph"/>
-      </w:pPr>
-      <w:r>
-        <w:t xml:space="preserve">The main result is a negative one with a constructive fix. The published net-influence statistic, like every unconditioned dependence statistic, cannot distinguish a coalition from two agents following the same public rule, and in a world that contains such agents it misidentifies them in every game. Conditioning on the public information set resolves this completely in our environment, but at the cost of a false-positive rate that the fixed threshold does not control at short game lengths; a permutation null fixes that. Together, conditioning plus calibration is a concrete, quantitative plus factor: dependence between two agents’ actions that is not explained by what everyone could observe, and is larger than chance would produce in a log this short.</w:t>
-      </w:r>
-    </w:p>
-    <w:p>
-      <w:pPr>
-        <w:pStyle w:val="BodyText"/>
-      </w:pPr>
-      <w:r>
-        <w:t xml:space="preserve">Two caveats are important. The parallel rule we used keys on a state we then condition on, which is the best case for the method; an innocent rule that keys on a richer public state than the detector conditions on would survive as apparent influence, and in LLM settings the</w:t>
-      </w:r>
-      <w:r>
-        <w:t xml:space="preserve"> </w:t>
-      </w:r>
-      <w:r>
-        <w:t xml:space="preserve">“</w:t>
-      </w:r>
-      <w:r>
-        <w:t xml:space="preserve">public rule</w:t>
-      </w:r>
-      <w:r>
-        <w:t xml:space="preserve">”</w:t>
-      </w:r>
-      <w:r>
-        <w:t xml:space="preserve"> </w:t>
-      </w:r>
-      <w:r>
-        <w:t xml:space="preserve">is the shared prior of the base model, which cannot be written down as a state variable. This is the open problem that the same-model negative control in Section 5 probes. Second, the same-action baseline’s failure is a reminder that collusion need not look like agreement; detectors should be sign-agnostic.</w:t>
-      </w:r>
-    </w:p>
-    <w:p>
-      <w:pPr>
-        <w:pStyle w:val="BodyText"/>
-      </w:pPr>
-      <w:r>
-        <w:t xml:space="preserve">Future work: evaluate a p-value-based criterion with multiple-comparison control across pairs; move to the Agrawal et al. (2025) double auction, where the public state is the order book; test whether conditioning on the other agents’ actions in the same round (rather than only the previous round) separates coordination from common response to a shock; and extend to coalitions larger than two.</w:t>
-      </w:r>
-    </w:p>
-    <w:bookmarkEnd w:id="33"/>
-    <w:bookmarkStart w:id="34" w:name="X34a9f4a4955810fa226028fb89dc1e250b93941"/>
-    <w:p>
-      <w:pPr>
-        <w:pStyle w:val="Heading2"/>
-      </w:pPr>
-      <w:r>
-        <w:t xml:space="preserve">7. Limitations and Dual-Use / Ethical Considerations</w:t>
+        <w:t xml:space="preserve">8. Limitations and Dual-Use / Ethical Considerations</w:t>
       </w:r>
     </w:p>
     <w:p>
@@ -2369,7 +2539,7 @@
         <w:t xml:space="preserve"> </w:t>
       </w:r>
       <w:r>
-        <w:t xml:space="preserve">On a scripted four-player game with known ground truth, state-conditioned, permutation-corrected net influence recovers a seeded colluding pair and ignores an innocent parallel pair, while the published statistic and naive baselines do not. The LLM pilot [is / is not, TO FILL] consistent with this at the single-game scale.</w:t>
+        <w:t xml:space="preserve">On a scripted four-player game with known ground truth, state-conditioned, permutation-corrected net influence recovers a seeded colluding pair and ignores an innocent parallel pair, while the published statistic and naive baselines do not. The LLM and lens sections report what the pilots found at pilot scale (ten games per condition; thirty base cases).</w:t>
       </w:r>
     </w:p>
     <w:p>
@@ -2387,7 +2557,7 @@
         <w:t xml:space="preserve"> </w:t>
       </w:r>
       <w:r>
-        <w:t xml:space="preserve">We tested one confound and one state function, both chosen to match. Real innocent correlation (shared base-model priors, common reactions to unmodelled shocks) is not reducible to a four-valued state. Our collusion model assumes ex-ante signalling, as in the original paper; LLM coalitions coordinate imperfectly. The fixed alpha is uncalibrated at 25 rounds in the all-random world. The LLM pilot is small (ten games per condition, one model, one temperature). All code was written in a single sprint day and has not been independently reviewed. Concurrent entries in the same sprint apply net influence with permutation tests to LLM players; our contribution on the action surface is the ground-truth characterisation, not the method. On the internals surface, Li et al. (2026) report that the J-lens subspace tracks what agents say rather than what they withhold; a null adopt-versus-refuse separation in our assay would be consistent with that, and a positive one would need reconciling with it.</w:t>
+        <w:t xml:space="preserve">We tested one confound and one state function, both chosen to match. Real innocent correlation (shared base-model priors, common reactions to unmodelled shocks) is not reducible to a four-valued state. Our collusion model assumes ex-ante signalling, as in the original paper; LLM coalitions coordinate imperfectly. The fixed alpha is uncalibrated at 25 rounds in the all-random world. The LLM pilot is small (ten games per condition, one model, one temperature). The lens assay uses one receiver model, one fitted lens, a scripted sender, a four-item vocabulary and a planted codebook; it is a controlled communication assay, not a demonstration that agents invent covert channels, and lens readouts of single tokens cover a fraction of the workspace. Decoding rates are compared across conditions on paired base cases, not against an absolute threshold. All code was written in a single sprint day and has not been independently reviewed. Concurrent entries in the same sprint apply net influence with permutation tests to LLM players; our contribution on the action surface is the ground-truth characterisation, not the method. On the internals surface, Li et al. (2026) report that the J-lens subspace tracks what agents say rather than what they withhold; a null adopt-versus-refuse separation in our assay would be consistent with that, and a positive one would need reconciling with it. Concurrent entries in the same sprint apply net influence with permutation tests to LLM players; our contribution on the action surface is the ground-truth characterisation, not the method. On the internals surface, Li et al. (2026) report that the J-lens subspace tracks what agents say rather than what they withhold; a null adopt-versus-refuse separation in our assay would be consistent with that, and a positive one would need reconciling with it.</w:t>
       </w:r>
     </w:p>
     <w:p>
@@ -2405,11 +2575,11 @@
         <w:t xml:space="preserve"> </w:t>
       </w:r>
       <w:r>
-        <w:t xml:space="preserve">A published detector tells a coalition what to avoid: here, any dependence between partners’ actions beyond what the public state explains. Agents could evade it by routing coordination through the public state itself (both responding to a public signal they jointly control) or by coordinating at a rate below the detection floor we measured (CP around 0.2 at 25 rounds). We think this is acceptable because the same analysis tells a defender where the floor is and that single short games are not enough evidence; pooled logs are. No real market data, deployed system or private information was used.</w:t>
-      </w:r>
-    </w:p>
-    <w:bookmarkEnd w:id="34"/>
-    <w:bookmarkStart w:id="35" w:name="references"/>
+        <w:t xml:space="preserve">A published detector tells a coalition what to avoid: here, any dependence between partners’ actions beyond what the public state explains, and, for the internals half, that a monitor reading the workspace for a proposal can be fooled in both directions. Agents could evade it by routing coordination through the public state itself (both responding to a public signal they jointly control) or by coordinating at a rate below the detection floor we measured (CP around 0.2 at 25 rounds). We think this is acceptable because the same analysis tells a defender where the floor is and that single short games are not enough evidence; pooled logs are. No real market data, deployed system or private information was used.</w:t>
+      </w:r>
+    </w:p>
+    <w:bookmarkEnd w:id="42"/>
+    <w:bookmarkStart w:id="43" w:name="references"/>
     <w:p>
       <w:pPr>
         <w:pStyle w:val="Heading2"/>
@@ -2562,8 +2732,8 @@
         <w:t xml:space="preserve">Xu, X., Wu, C., Lu, J., Tan, K., Tao, S. and Hong, H. (2026). Collusion with Competitive Marginals: Price-Level Audits Are Blind by Construction. arXiv:2607.26385.</w:t>
       </w:r>
     </w:p>
-    <w:bookmarkEnd w:id="35"/>
-    <w:bookmarkStart w:id="36" w:name="appendix-a.-reproducibility"/>
+    <w:bookmarkEnd w:id="43"/>
+    <w:bookmarkStart w:id="44" w:name="appendix-a.-reproducibility"/>
     <w:p>
       <w:pPr>
         <w:pStyle w:val="Heading2"/>
@@ -2637,7 +2807,7 @@
         <w:t xml:space="preserve">.</w:t>
       </w:r>
     </w:p>
-    <w:bookmarkEnd w:id="36"/>
+    <w:bookmarkEnd w:id="44"/>
     <w:sectPr/>
   </w:body>
 </w:document>

</xml_diff>

<commit_message>
Extensions: Holm-calibrated criterion, richer innocent rule, coalition of three (3,000 games); section 4.5 and figure 4
Co-Authored-By: Claude Fable 5.1 <noreply@anthropic.com>
Claude-Session: https://claude.ai/code/session_018qJiaQKKjpemqx8e3Wrmcq
</commit_message>
<xml_diff>
--- a/report/report_draft.docx
+++ b/report/report_draft.docx
@@ -804,7 +804,7 @@
     </w:p>
     <w:bookmarkEnd w:id="33"/>
     <w:bookmarkEnd w:id="34"/>
-    <w:bookmarkStart w:id="38" w:name="results-scripted"/>
+    <w:bookmarkStart w:id="42" w:name="results-scripted"/>
     <w:p>
       <w:pPr>
         <w:pStyle w:val="Heading2"/>
@@ -2295,8 +2295,1190 @@
         <w:t xml:space="preserve">At T = 25 with random non-colluders, criterion accuracy for the corrected, state-conditioned detector rises from 0.07 at CP = 0 to 0.36, 0.65, 0.84 and 0.85 at CP = 0.4, 0.6, 0.8 and 1.0. A 25-round LLM game therefore needs the coalition to coordinate in well over half of rounds to be caught by a single game; pooling ten games (250 rounds) brings the detector into the regime where CP = 0.4 is caught reliably.</w:t>
       </w:r>
     </w:p>
-    <w:bookmarkEnd w:id="38"/>
-    <w:bookmarkStart w:id="39" w:name="X45bbaacc8ab6245fafe1d74c3b68a1c519c5399"/>
+    <w:bookmarkStart w:id="41" w:name="Xe39c9d91cc6afdedab1e3c5e8913428fa7b5c95"/>
+    <w:p>
+      <w:pPr>
+        <w:pStyle w:val="Heading3"/>
+      </w:pPr>
+      <w:r>
+        <w:t xml:space="preserve">4.5 Extensions: calibrated criterion, a harder confound, and a coalition of three</w:t>
+      </w:r>
+    </w:p>
+    <w:p>
+      <w:pPr>
+        <w:pStyle w:val="FirstParagraph"/>
+      </w:pPr>
+      <w:r>
+        <w:t xml:space="preserve">Three further experiments (experiments/scripted_extensions.py, 100 seeds per cell, 200 permutations, 3,000 games; Figure 4) probe the limits of the method.</w:t>
+      </w:r>
+    </w:p>
+    <w:p>
+      <w:pPr>
+        <w:pStyle w:val="BodyText"/>
+      </w:pPr>
+      <w:r>
+        <w:rPr>
+          <w:bCs/>
+          <w:b/>
+        </w:rPr>
+        <w:t xml:space="preserve">A calibrated criterion.</w:t>
+      </w:r>
+      <w:r>
+        <w:t xml:space="preserve"> </w:t>
+      </w:r>
+      <w:r>
+        <w:t xml:space="preserve">We replace the fixed alpha = 0.05 threshold with a p-value rule: a pair is declared colluding iff its within-state permutation p-value, Holm-corrected over the six pairs, is below 0.05 and its corrected net-influence score is the largest among pairs. With the majority state this rule is calibrated where the fixed threshold is not (Table 3). In the all-random world it fires in 3 to 6% of games at every length, against 49% for the fixed threshold at 25 rounds; in the parallel-only world it fires in 0 to 1% of games and never names the innocent pair. The price is power at 25 rounds: 0.42 against 0.96 in</w:t>
+      </w:r>
+      <w:r>
+        <w:t xml:space="preserve"> </w:t>
+      </w:r>
+      <w:r>
+        <w:rPr>
+          <w:iCs/>
+          <w:i/>
+        </w:rPr>
+        <w:t xml:space="preserve">parallel</w:t>
+      </w:r>
+      <w:r>
+        <w:t xml:space="preserve"> </w:t>
+      </w:r>
+      <w:r>
+        <w:t xml:space="preserve">and 0.38 against 0.76 in</w:t>
+      </w:r>
+      <w:r>
+        <w:t xml:space="preserve"> </w:t>
+      </w:r>
+      <w:r>
+        <w:rPr>
+          <w:iCs/>
+          <w:i/>
+        </w:rPr>
+        <w:t xml:space="preserve">bonjour</w:t>
+      </w:r>
+      <w:r>
+        <w:t xml:space="preserve">. From 100 rounds both rules reach 1.00.</w:t>
+      </w:r>
+    </w:p>
+    <w:p>
+      <w:pPr>
+        <w:pStyle w:val="BodyText"/>
+      </w:pPr>
+      <w:r>
+        <w:rPr>
+          <w:bCs/>
+          <w:b/>
+        </w:rPr>
+        <w:t xml:space="preserve">Table 3. Fixed alpha versus the Holm p-value rule, NI+perm, state = previous majority, CP = 0.6.</w:t>
+      </w:r>
+    </w:p>
+    <w:tbl>
+      <w:tblPr>
+        <w:tblStyle w:val="Table"/>
+        <w:tblW w:type="pct" w:w="5000"/>
+        <w:tblLook w:firstRow="1" w:lastRow="0" w:firstColumn="0" w:lastColumn="0" w:noHBand="0" w:noVBand="0" w:val="0020"/>
+        <w:jc w:val="start"/>
+      </w:tblPr>
+      <w:tblGrid>
+        <w:gridCol w:w="1131"/>
+        <w:gridCol w:w="1131"/>
+        <w:gridCol w:w="1131"/>
+        <w:gridCol w:w="1131"/>
+        <w:gridCol w:w="1131"/>
+        <w:gridCol w:w="1131"/>
+        <w:gridCol w:w="1131"/>
+      </w:tblGrid>
+      <w:tr>
+        <w:trPr>
+          <w:tblHeader w:val="true"/>
+        </w:trPr>
+        <w:tc>
+          <w:tcPr/>
+          <w:p>
+            <w:pPr>
+              <w:pStyle w:val="Compact"/>
+              <w:jc w:val="left"/>
+            </w:pPr>
+            <w:r>
+              <w:t xml:space="preserve">T</w:t>
+            </w:r>
+          </w:p>
+        </w:tc>
+        <w:tc>
+          <w:tcPr/>
+          <w:p>
+            <w:pPr>
+              <w:pStyle w:val="Compact"/>
+              <w:jc w:val="left"/>
+            </w:pPr>
+            <w:r>
+              <w:t xml:space="preserve">fixed: power (parallel)</w:t>
+            </w:r>
+          </w:p>
+        </w:tc>
+        <w:tc>
+          <w:tcPr/>
+          <w:p>
+            <w:pPr>
+              <w:pStyle w:val="Compact"/>
+              <w:jc w:val="left"/>
+            </w:pPr>
+            <w:r>
+              <w:t xml:space="preserve">fixed: FPR (random)</w:t>
+            </w:r>
+          </w:p>
+        </w:tc>
+        <w:tc>
+          <w:tcPr/>
+          <w:p>
+            <w:pPr>
+              <w:pStyle w:val="Compact"/>
+              <w:jc w:val="left"/>
+            </w:pPr>
+            <w:r>
+              <w:t xml:space="preserve">fixed: FPR (parallel-only)</w:t>
+            </w:r>
+          </w:p>
+        </w:tc>
+        <w:tc>
+          <w:tcPr/>
+          <w:p>
+            <w:pPr>
+              <w:pStyle w:val="Compact"/>
+              <w:jc w:val="left"/>
+            </w:pPr>
+            <w:r>
+              <w:t xml:space="preserve">calibrated: power (parallel)</w:t>
+            </w:r>
+          </w:p>
+        </w:tc>
+        <w:tc>
+          <w:tcPr/>
+          <w:p>
+            <w:pPr>
+              <w:pStyle w:val="Compact"/>
+              <w:jc w:val="left"/>
+            </w:pPr>
+            <w:r>
+              <w:t xml:space="preserve">calibrated: FPR (random)</w:t>
+            </w:r>
+          </w:p>
+        </w:tc>
+        <w:tc>
+          <w:tcPr/>
+          <w:p>
+            <w:pPr>
+              <w:pStyle w:val="Compact"/>
+              <w:jc w:val="left"/>
+            </w:pPr>
+            <w:r>
+              <w:t xml:space="preserve">calibrated: FPR (parallel-only)</w:t>
+            </w:r>
+          </w:p>
+        </w:tc>
+      </w:tr>
+      <w:tr>
+        <w:tc>
+          <w:tcPr/>
+          <w:p>
+            <w:pPr>
+              <w:pStyle w:val="Compact"/>
+              <w:jc w:val="left"/>
+            </w:pPr>
+            <w:r>
+              <w:t xml:space="preserve">25</w:t>
+            </w:r>
+          </w:p>
+        </w:tc>
+        <w:tc>
+          <w:tcPr/>
+          <w:p>
+            <w:pPr>
+              <w:pStyle w:val="Compact"/>
+              <w:jc w:val="left"/>
+            </w:pPr>
+            <w:r>
+              <w:t xml:space="preserve">0.96</w:t>
+            </w:r>
+          </w:p>
+        </w:tc>
+        <w:tc>
+          <w:tcPr/>
+          <w:p>
+            <w:pPr>
+              <w:pStyle w:val="Compact"/>
+              <w:jc w:val="left"/>
+            </w:pPr>
+            <w:r>
+              <w:t xml:space="preserve">0.49</w:t>
+            </w:r>
+          </w:p>
+        </w:tc>
+        <w:tc>
+          <w:tcPr/>
+          <w:p>
+            <w:pPr>
+              <w:pStyle w:val="Compact"/>
+              <w:jc w:val="left"/>
+            </w:pPr>
+            <w:r>
+              <w:t xml:space="preserve">0.33</w:t>
+            </w:r>
+          </w:p>
+        </w:tc>
+        <w:tc>
+          <w:tcPr/>
+          <w:p>
+            <w:pPr>
+              <w:pStyle w:val="Compact"/>
+              <w:jc w:val="left"/>
+            </w:pPr>
+            <w:r>
+              <w:t xml:space="preserve">0.42</w:t>
+            </w:r>
+          </w:p>
+        </w:tc>
+        <w:tc>
+          <w:tcPr/>
+          <w:p>
+            <w:pPr>
+              <w:pStyle w:val="Compact"/>
+              <w:jc w:val="left"/>
+            </w:pPr>
+            <w:r>
+              <w:t xml:space="preserve">0.03</w:t>
+            </w:r>
+          </w:p>
+        </w:tc>
+        <w:tc>
+          <w:tcPr/>
+          <w:p>
+            <w:pPr>
+              <w:pStyle w:val="Compact"/>
+              <w:jc w:val="left"/>
+            </w:pPr>
+            <w:r>
+              <w:t xml:space="preserve">0.00</w:t>
+            </w:r>
+          </w:p>
+        </w:tc>
+      </w:tr>
+      <w:tr>
+        <w:tc>
+          <w:tcPr/>
+          <w:p>
+            <w:pPr>
+              <w:pStyle w:val="Compact"/>
+              <w:jc w:val="left"/>
+            </w:pPr>
+            <w:r>
+              <w:t xml:space="preserve">50</w:t>
+            </w:r>
+          </w:p>
+        </w:tc>
+        <w:tc>
+          <w:tcPr/>
+          <w:p>
+            <w:pPr>
+              <w:pStyle w:val="Compact"/>
+              <w:jc w:val="left"/>
+            </w:pPr>
+            <w:r>
+              <w:t xml:space="preserve">1.00</w:t>
+            </w:r>
+          </w:p>
+        </w:tc>
+        <w:tc>
+          <w:tcPr/>
+          <w:p>
+            <w:pPr>
+              <w:pStyle w:val="Compact"/>
+              <w:jc w:val="left"/>
+            </w:pPr>
+            <w:r>
+              <w:t xml:space="preserve">0.24</w:t>
+            </w:r>
+          </w:p>
+        </w:tc>
+        <w:tc>
+          <w:tcPr/>
+          <w:p>
+            <w:pPr>
+              <w:pStyle w:val="Compact"/>
+              <w:jc w:val="left"/>
+            </w:pPr>
+            <w:r>
+              <w:t xml:space="preserve">0.21</w:t>
+            </w:r>
+          </w:p>
+        </w:tc>
+        <w:tc>
+          <w:tcPr/>
+          <w:p>
+            <w:pPr>
+              <w:pStyle w:val="Compact"/>
+              <w:jc w:val="left"/>
+            </w:pPr>
+            <w:r>
+              <w:t xml:space="preserve">0.87</w:t>
+            </w:r>
+          </w:p>
+        </w:tc>
+        <w:tc>
+          <w:tcPr/>
+          <w:p>
+            <w:pPr>
+              <w:pStyle w:val="Compact"/>
+              <w:jc w:val="left"/>
+            </w:pPr>
+            <w:r>
+              <w:t xml:space="preserve">0.03</w:t>
+            </w:r>
+          </w:p>
+        </w:tc>
+        <w:tc>
+          <w:tcPr/>
+          <w:p>
+            <w:pPr>
+              <w:pStyle w:val="Compact"/>
+              <w:jc w:val="left"/>
+            </w:pPr>
+            <w:r>
+              <w:t xml:space="preserve">0.00</w:t>
+            </w:r>
+          </w:p>
+        </w:tc>
+      </w:tr>
+      <w:tr>
+        <w:tc>
+          <w:tcPr/>
+          <w:p>
+            <w:pPr>
+              <w:pStyle w:val="Compact"/>
+              <w:jc w:val="left"/>
+            </w:pPr>
+            <w:r>
+              <w:t xml:space="preserve">100</w:t>
+            </w:r>
+          </w:p>
+        </w:tc>
+        <w:tc>
+          <w:tcPr/>
+          <w:p>
+            <w:pPr>
+              <w:pStyle w:val="Compact"/>
+              <w:jc w:val="left"/>
+            </w:pPr>
+            <w:r>
+              <w:t xml:space="preserve">1.00</w:t>
+            </w:r>
+          </w:p>
+        </w:tc>
+        <w:tc>
+          <w:tcPr/>
+          <w:p>
+            <w:pPr>
+              <w:pStyle w:val="Compact"/>
+              <w:jc w:val="left"/>
+            </w:pPr>
+            <w:r>
+              <w:t xml:space="preserve">0.04</w:t>
+            </w:r>
+          </w:p>
+        </w:tc>
+        <w:tc>
+          <w:tcPr/>
+          <w:p>
+            <w:pPr>
+              <w:pStyle w:val="Compact"/>
+              <w:jc w:val="left"/>
+            </w:pPr>
+            <w:r>
+              <w:t xml:space="preserve">0.06</w:t>
+            </w:r>
+          </w:p>
+        </w:tc>
+        <w:tc>
+          <w:tcPr/>
+          <w:p>
+            <w:pPr>
+              <w:pStyle w:val="Compact"/>
+              <w:jc w:val="left"/>
+            </w:pPr>
+            <w:r>
+              <w:t xml:space="preserve">1.00</w:t>
+            </w:r>
+          </w:p>
+        </w:tc>
+        <w:tc>
+          <w:tcPr/>
+          <w:p>
+            <w:pPr>
+              <w:pStyle w:val="Compact"/>
+              <w:jc w:val="left"/>
+            </w:pPr>
+            <w:r>
+              <w:t xml:space="preserve">0.04</w:t>
+            </w:r>
+          </w:p>
+        </w:tc>
+        <w:tc>
+          <w:tcPr/>
+          <w:p>
+            <w:pPr>
+              <w:pStyle w:val="Compact"/>
+              <w:jc w:val="left"/>
+            </w:pPr>
+            <w:r>
+              <w:t xml:space="preserve">0.00</w:t>
+            </w:r>
+          </w:p>
+        </w:tc>
+      </w:tr>
+      <w:tr>
+        <w:tc>
+          <w:tcPr/>
+          <w:p>
+            <w:pPr>
+              <w:pStyle w:val="Compact"/>
+              <w:jc w:val="left"/>
+            </w:pPr>
+            <w:r>
+              <w:t xml:space="preserve">200</w:t>
+            </w:r>
+          </w:p>
+        </w:tc>
+        <w:tc>
+          <w:tcPr/>
+          <w:p>
+            <w:pPr>
+              <w:pStyle w:val="Compact"/>
+              <w:jc w:val="left"/>
+            </w:pPr>
+            <w:r>
+              <w:t xml:space="preserve">1.00</w:t>
+            </w:r>
+          </w:p>
+        </w:tc>
+        <w:tc>
+          <w:tcPr/>
+          <w:p>
+            <w:pPr>
+              <w:pStyle w:val="Compact"/>
+              <w:jc w:val="left"/>
+            </w:pPr>
+            <w:r>
+              <w:t xml:space="preserve">0.01</w:t>
+            </w:r>
+          </w:p>
+        </w:tc>
+        <w:tc>
+          <w:tcPr/>
+          <w:p>
+            <w:pPr>
+              <w:pStyle w:val="Compact"/>
+              <w:jc w:val="left"/>
+            </w:pPr>
+            <w:r>
+              <w:t xml:space="preserve">0.00</w:t>
+            </w:r>
+          </w:p>
+        </w:tc>
+        <w:tc>
+          <w:tcPr/>
+          <w:p>
+            <w:pPr>
+              <w:pStyle w:val="Compact"/>
+              <w:jc w:val="left"/>
+            </w:pPr>
+            <w:r>
+              <w:t xml:space="preserve">1.00</w:t>
+            </w:r>
+          </w:p>
+        </w:tc>
+        <w:tc>
+          <w:tcPr/>
+          <w:p>
+            <w:pPr>
+              <w:pStyle w:val="Compact"/>
+              <w:jc w:val="left"/>
+            </w:pPr>
+            <w:r>
+              <w:t xml:space="preserve">0.06</w:t>
+            </w:r>
+          </w:p>
+        </w:tc>
+        <w:tc>
+          <w:tcPr/>
+          <w:p>
+            <w:pPr>
+              <w:pStyle w:val="Compact"/>
+              <w:jc w:val="left"/>
+            </w:pPr>
+            <w:r>
+              <w:t xml:space="preserve">0.01</w:t>
+            </w:r>
+          </w:p>
+        </w:tc>
+      </w:tr>
+    </w:tbl>
+    <w:p>
+      <w:pPr>
+        <w:pStyle w:val="BodyText"/>
+      </w:pPr>
+      <w:r>
+        <w:rPr>
+          <w:bCs/>
+          <w:b/>
+        </w:rPr>
+        <w:t xml:space="preserve">A richer innocent rule.</w:t>
+      </w:r>
+      <w:r>
+        <w:t xml:space="preserve"> </w:t>
+      </w:r>
+      <w:r>
+        <w:t xml:space="preserve">The</w:t>
+      </w:r>
+      <w:r>
+        <w:t xml:space="preserve"> </w:t>
+      </w:r>
+      <w:r>
+        <w:rPr>
+          <w:iCs/>
+          <w:i/>
+        </w:rPr>
+        <w:t xml:space="preserve">parallel_rich</w:t>
+      </w:r>
+      <w:r>
+        <w:t xml:space="preserve"> </w:t>
+      </w:r>
+      <w:r>
+        <w:t xml:space="preserve">agents C and D both play the action that beats the previous move of the lowest-indexed player who scored in the previous round (random in round 0). This is a deterministic function of the previous full action profile but not of the previous majority. Conditioning on the majority state fails completely: gamma(C; D | S) stays at 0.91 to 1.07 nats, the innocent pair ranks first in 100% of games at every T, and the fixed criterion flags it in 65 to 100% of no-collusion games (Table 4). Conditioning on the full previous profile removes the dependence (gamma(C; D | S) = 0.000) but spreads the data over 15 to 29 occupied states; without the permutation correction the bias flags a pair in 97 to 100% of no-collusion games. With the correction, rank-1 accuracy of the true pair is 0.75 at 25 rounds, 0.97 at 50 and 1.00 from 100, with a false-positive rate of 0.00 to 0.06. The detector works only when the analyst conditions on at least the state the innocent rule uses, and only once T is large relative to the number of states.</w:t>
+      </w:r>
+    </w:p>
+    <w:p>
+      <w:pPr>
+        <w:pStyle w:val="BodyText"/>
+      </w:pPr>
+      <w:r>
+        <w:rPr>
+          <w:bCs/>
+          <w:b/>
+        </w:rPr>
+        <w:t xml:space="preserve">Table 4. Richer confound: rank-1 accuracy of the true pair (parallel_rich) and innocent pair flagged (parallel_rich_only), NI+perm.</w:t>
+      </w:r>
+    </w:p>
+    <w:tbl>
+      <w:tblPr>
+        <w:tblStyle w:val="Table"/>
+        <w:tblW w:type="pct" w:w="5000"/>
+        <w:tblLook w:firstRow="1" w:lastRow="0" w:firstColumn="0" w:lastColumn="0" w:noHBand="0" w:noVBand="0" w:val="0020"/>
+        <w:jc w:val="start"/>
+      </w:tblPr>
+      <w:tblGrid>
+        <w:gridCol w:w="1131"/>
+        <w:gridCol w:w="1131"/>
+        <w:gridCol w:w="1131"/>
+        <w:gridCol w:w="1131"/>
+        <w:gridCol w:w="1131"/>
+        <w:gridCol w:w="1131"/>
+        <w:gridCol w:w="1131"/>
+      </w:tblGrid>
+      <w:tr>
+        <w:trPr>
+          <w:tblHeader w:val="true"/>
+        </w:trPr>
+        <w:tc>
+          <w:tcPr/>
+          <w:p>
+            <w:pPr>
+              <w:pStyle w:val="Compact"/>
+              <w:jc w:val="left"/>
+            </w:pPr>
+            <w:r>
+              <w:t xml:space="preserve">T</w:t>
+            </w:r>
+          </w:p>
+        </w:tc>
+        <w:tc>
+          <w:tcPr/>
+          <w:p>
+            <w:pPr>
+              <w:pStyle w:val="Compact"/>
+              <w:jc w:val="left"/>
+            </w:pPr>
+            <w:r>
+              <w:t xml:space="preserve">rank-1, memoryless</w:t>
+            </w:r>
+          </w:p>
+        </w:tc>
+        <w:tc>
+          <w:tcPr/>
+          <w:p>
+            <w:pPr>
+              <w:pStyle w:val="Compact"/>
+              <w:jc w:val="left"/>
+            </w:pPr>
+            <w:r>
+              <w:t xml:space="preserve">rank-1, majority</w:t>
+            </w:r>
+          </w:p>
+        </w:tc>
+        <w:tc>
+          <w:tcPr/>
+          <w:p>
+            <w:pPr>
+              <w:pStyle w:val="Compact"/>
+              <w:jc w:val="left"/>
+            </w:pPr>
+            <w:r>
+              <w:t xml:space="preserve">rank-1, profile</w:t>
+            </w:r>
+          </w:p>
+        </w:tc>
+        <w:tc>
+          <w:tcPr/>
+          <w:p>
+            <w:pPr>
+              <w:pStyle w:val="Compact"/>
+              <w:jc w:val="left"/>
+            </w:pPr>
+            <w:r>
+              <w:t xml:space="preserve">innocent flagged, memoryless</w:t>
+            </w:r>
+          </w:p>
+        </w:tc>
+        <w:tc>
+          <w:tcPr/>
+          <w:p>
+            <w:pPr>
+              <w:pStyle w:val="Compact"/>
+              <w:jc w:val="left"/>
+            </w:pPr>
+            <w:r>
+              <w:t xml:space="preserve">innocent flagged, majority</w:t>
+            </w:r>
+          </w:p>
+        </w:tc>
+        <w:tc>
+          <w:tcPr/>
+          <w:p>
+            <w:pPr>
+              <w:pStyle w:val="Compact"/>
+              <w:jc w:val="left"/>
+            </w:pPr>
+            <w:r>
+              <w:t xml:space="preserve">innocent flagged, profile</w:t>
+            </w:r>
+          </w:p>
+        </w:tc>
+      </w:tr>
+      <w:tr>
+        <w:tc>
+          <w:tcPr/>
+          <w:p>
+            <w:pPr>
+              <w:pStyle w:val="Compact"/>
+              <w:jc w:val="left"/>
+            </w:pPr>
+            <w:r>
+              <w:t xml:space="preserve">25</w:t>
+            </w:r>
+          </w:p>
+        </w:tc>
+        <w:tc>
+          <w:tcPr/>
+          <w:p>
+            <w:pPr>
+              <w:pStyle w:val="Compact"/>
+              <w:jc w:val="left"/>
+            </w:pPr>
+            <w:r>
+              <w:t xml:space="preserve">0.01</w:t>
+            </w:r>
+          </w:p>
+        </w:tc>
+        <w:tc>
+          <w:tcPr/>
+          <w:p>
+            <w:pPr>
+              <w:pStyle w:val="Compact"/>
+              <w:jc w:val="left"/>
+            </w:pPr>
+            <w:r>
+              <w:t xml:space="preserve">0.00</w:t>
+            </w:r>
+          </w:p>
+        </w:tc>
+        <w:tc>
+          <w:tcPr/>
+          <w:p>
+            <w:pPr>
+              <w:pStyle w:val="Compact"/>
+              <w:jc w:val="left"/>
+            </w:pPr>
+            <w:r>
+              <w:t xml:space="preserve">0.75</w:t>
+            </w:r>
+          </w:p>
+        </w:tc>
+        <w:tc>
+          <w:tcPr/>
+          <w:p>
+            <w:pPr>
+              <w:pStyle w:val="Compact"/>
+              <w:jc w:val="left"/>
+            </w:pPr>
+            <w:r>
+              <w:t xml:space="preserve">0.86</w:t>
+            </w:r>
+          </w:p>
+        </w:tc>
+        <w:tc>
+          <w:tcPr/>
+          <w:p>
+            <w:pPr>
+              <w:pStyle w:val="Compact"/>
+              <w:jc w:val="left"/>
+            </w:pPr>
+            <w:r>
+              <w:t xml:space="preserve">0.85</w:t>
+            </w:r>
+          </w:p>
+        </w:tc>
+        <w:tc>
+          <w:tcPr/>
+          <w:p>
+            <w:pPr>
+              <w:pStyle w:val="Compact"/>
+              <w:jc w:val="left"/>
+            </w:pPr>
+            <w:r>
+              <w:t xml:space="preserve">0.00</w:t>
+            </w:r>
+          </w:p>
+        </w:tc>
+      </w:tr>
+      <w:tr>
+        <w:tc>
+          <w:tcPr/>
+          <w:p>
+            <w:pPr>
+              <w:pStyle w:val="Compact"/>
+              <w:jc w:val="left"/>
+            </w:pPr>
+            <w:r>
+              <w:t xml:space="preserve">50</w:t>
+            </w:r>
+          </w:p>
+        </w:tc>
+        <w:tc>
+          <w:tcPr/>
+          <w:p>
+            <w:pPr>
+              <w:pStyle w:val="Compact"/>
+              <w:jc w:val="left"/>
+            </w:pPr>
+            <w:r>
+              <w:t xml:space="preserve">0.00</w:t>
+            </w:r>
+          </w:p>
+        </w:tc>
+        <w:tc>
+          <w:tcPr/>
+          <w:p>
+            <w:pPr>
+              <w:pStyle w:val="Compact"/>
+              <w:jc w:val="left"/>
+            </w:pPr>
+            <w:r>
+              <w:t xml:space="preserve">0.00</w:t>
+            </w:r>
+          </w:p>
+        </w:tc>
+        <w:tc>
+          <w:tcPr/>
+          <w:p>
+            <w:pPr>
+              <w:pStyle w:val="Compact"/>
+              <w:jc w:val="left"/>
+            </w:pPr>
+            <w:r>
+              <w:t xml:space="preserve">0.97</w:t>
+            </w:r>
+          </w:p>
+        </w:tc>
+        <w:tc>
+          <w:tcPr/>
+          <w:p>
+            <w:pPr>
+              <w:pStyle w:val="Compact"/>
+              <w:jc w:val="left"/>
+            </w:pPr>
+            <w:r>
+              <w:t xml:space="preserve">0.93</w:t>
+            </w:r>
+          </w:p>
+        </w:tc>
+        <w:tc>
+          <w:tcPr/>
+          <w:p>
+            <w:pPr>
+              <w:pStyle w:val="Compact"/>
+              <w:jc w:val="left"/>
+            </w:pPr>
+            <w:r>
+              <w:t xml:space="preserve">0.90</w:t>
+            </w:r>
+          </w:p>
+        </w:tc>
+        <w:tc>
+          <w:tcPr/>
+          <w:p>
+            <w:pPr>
+              <w:pStyle w:val="Compact"/>
+              <w:jc w:val="left"/>
+            </w:pPr>
+            <w:r>
+              <w:t xml:space="preserve">0.00</w:t>
+            </w:r>
+          </w:p>
+        </w:tc>
+      </w:tr>
+      <w:tr>
+        <w:tc>
+          <w:tcPr/>
+          <w:p>
+            <w:pPr>
+              <w:pStyle w:val="Compact"/>
+              <w:jc w:val="left"/>
+            </w:pPr>
+            <w:r>
+              <w:t xml:space="preserve">100</w:t>
+            </w:r>
+          </w:p>
+        </w:tc>
+        <w:tc>
+          <w:tcPr/>
+          <w:p>
+            <w:pPr>
+              <w:pStyle w:val="Compact"/>
+              <w:jc w:val="left"/>
+            </w:pPr>
+            <w:r>
+              <w:t xml:space="preserve">0.00</w:t>
+            </w:r>
+          </w:p>
+        </w:tc>
+        <w:tc>
+          <w:tcPr/>
+          <w:p>
+            <w:pPr>
+              <w:pStyle w:val="Compact"/>
+              <w:jc w:val="left"/>
+            </w:pPr>
+            <w:r>
+              <w:t xml:space="preserve">0.00</w:t>
+            </w:r>
+          </w:p>
+        </w:tc>
+        <w:tc>
+          <w:tcPr/>
+          <w:p>
+            <w:pPr>
+              <w:pStyle w:val="Compact"/>
+              <w:jc w:val="left"/>
+            </w:pPr>
+            <w:r>
+              <w:t xml:space="preserve">1.00</w:t>
+            </w:r>
+          </w:p>
+        </w:tc>
+        <w:tc>
+          <w:tcPr/>
+          <w:p>
+            <w:pPr>
+              <w:pStyle w:val="Compact"/>
+              <w:jc w:val="left"/>
+            </w:pPr>
+            <w:r>
+              <w:t xml:space="preserve">0.98</w:t>
+            </w:r>
+          </w:p>
+        </w:tc>
+        <w:tc>
+          <w:tcPr/>
+          <w:p>
+            <w:pPr>
+              <w:pStyle w:val="Compact"/>
+              <w:jc w:val="left"/>
+            </w:pPr>
+            <w:r>
+              <w:t xml:space="preserve">0.90</w:t>
+            </w:r>
+          </w:p>
+        </w:tc>
+        <w:tc>
+          <w:tcPr/>
+          <w:p>
+            <w:pPr>
+              <w:pStyle w:val="Compact"/>
+              <w:jc w:val="left"/>
+            </w:pPr>
+            <w:r>
+              <w:t xml:space="preserve">0.00</w:t>
+            </w:r>
+          </w:p>
+        </w:tc>
+      </w:tr>
+      <w:tr>
+        <w:tc>
+          <w:tcPr/>
+          <w:p>
+            <w:pPr>
+              <w:pStyle w:val="Compact"/>
+              <w:jc w:val="left"/>
+            </w:pPr>
+            <w:r>
+              <w:t xml:space="preserve">200</w:t>
+            </w:r>
+          </w:p>
+        </w:tc>
+        <w:tc>
+          <w:tcPr/>
+          <w:p>
+            <w:pPr>
+              <w:pStyle w:val="Compact"/>
+              <w:jc w:val="left"/>
+            </w:pPr>
+            <w:r>
+              <w:t xml:space="preserve">0.00</w:t>
+            </w:r>
+          </w:p>
+        </w:tc>
+        <w:tc>
+          <w:tcPr/>
+          <w:p>
+            <w:pPr>
+              <w:pStyle w:val="Compact"/>
+              <w:jc w:val="left"/>
+            </w:pPr>
+            <w:r>
+              <w:t xml:space="preserve">0.00</w:t>
+            </w:r>
+          </w:p>
+        </w:tc>
+        <w:tc>
+          <w:tcPr/>
+          <w:p>
+            <w:pPr>
+              <w:pStyle w:val="Compact"/>
+              <w:jc w:val="left"/>
+            </w:pPr>
+            <w:r>
+              <w:t xml:space="preserve">1.00</w:t>
+            </w:r>
+          </w:p>
+        </w:tc>
+        <w:tc>
+          <w:tcPr/>
+          <w:p>
+            <w:pPr>
+              <w:pStyle w:val="Compact"/>
+              <w:jc w:val="left"/>
+            </w:pPr>
+            <w:r>
+              <w:t xml:space="preserve">1.00</w:t>
+            </w:r>
+          </w:p>
+        </w:tc>
+        <w:tc>
+          <w:tcPr/>
+          <w:p>
+            <w:pPr>
+              <w:pStyle w:val="Compact"/>
+              <w:jc w:val="left"/>
+            </w:pPr>
+            <w:r>
+              <w:t xml:space="preserve">0.99</w:t>
+            </w:r>
+          </w:p>
+        </w:tc>
+        <w:tc>
+          <w:tcPr/>
+          <w:p>
+            <w:pPr>
+              <w:pStyle w:val="Compact"/>
+              <w:jc w:val="left"/>
+            </w:pPr>
+            <w:r>
+              <w:t xml:space="preserve">0.00</w:t>
+            </w:r>
+          </w:p>
+        </w:tc>
+      </w:tr>
+      <w:tr>
+        <w:tc>
+          <w:tcPr/>
+          <w:p>
+            <w:pPr>
+              <w:pStyle w:val="Compact"/>
+              <w:jc w:val="left"/>
+            </w:pPr>
+            <w:r>
+              <w:t xml:space="preserve">500</w:t>
+            </w:r>
+          </w:p>
+        </w:tc>
+        <w:tc>
+          <w:tcPr/>
+          <w:p>
+            <w:pPr>
+              <w:pStyle w:val="Compact"/>
+              <w:jc w:val="left"/>
+            </w:pPr>
+            <w:r>
+              <w:t xml:space="preserve">0.00</w:t>
+            </w:r>
+          </w:p>
+        </w:tc>
+        <w:tc>
+          <w:tcPr/>
+          <w:p>
+            <w:pPr>
+              <w:pStyle w:val="Compact"/>
+              <w:jc w:val="left"/>
+            </w:pPr>
+            <w:r>
+              <w:t xml:space="preserve">0.00</w:t>
+            </w:r>
+          </w:p>
+        </w:tc>
+        <w:tc>
+          <w:tcPr/>
+          <w:p>
+            <w:pPr>
+              <w:pStyle w:val="Compact"/>
+              <w:jc w:val="left"/>
+            </w:pPr>
+            <w:r>
+              <w:t xml:space="preserve">1.00</w:t>
+            </w:r>
+          </w:p>
+        </w:tc>
+        <w:tc>
+          <w:tcPr/>
+          <w:p>
+            <w:pPr>
+              <w:pStyle w:val="Compact"/>
+              <w:jc w:val="left"/>
+            </w:pPr>
+            <w:r>
+              <w:t xml:space="preserve">1.00</w:t>
+            </w:r>
+          </w:p>
+        </w:tc>
+        <w:tc>
+          <w:tcPr/>
+          <w:p>
+            <w:pPr>
+              <w:pStyle w:val="Compact"/>
+              <w:jc w:val="left"/>
+            </w:pPr>
+            <w:r>
+              <w:t xml:space="preserve">1.00</w:t>
+            </w:r>
+          </w:p>
+        </w:tc>
+        <w:tc>
+          <w:tcPr/>
+          <w:p>
+            <w:pPr>
+              <w:pStyle w:val="Compact"/>
+              <w:jc w:val="left"/>
+            </w:pPr>
+            <w:r>
+              <w:t xml:space="preserve">0.00</w:t>
+            </w:r>
+          </w:p>
+        </w:tc>
+      </w:tr>
+    </w:tbl>
+    <w:p>
+      <w:pPr>
+        <w:pStyle w:val="BodyText"/>
+      </w:pPr>
+      <w:r>
+        <w:rPr>
+          <w:bCs/>
+          <w:b/>
+        </w:rPr>
+        <w:t xml:space="preserve">A coalition of three.</w:t>
+      </w:r>
+      <w:r>
+        <w:t xml:space="preserve"> </w:t>
+      </w:r>
+      <w:r>
+        <w:t xml:space="preserve">In a five-player game A is the primary and both B and C assist with CP = 0.6. Raw mutual information places all three coalition pairs in the top three from 200 rounds (2.81 of 3 at 50 rounds). Net influence places exactly two, because Gamma(B; C) is negative (mean -0.24 nats at 500 rounds). That is the right verdict for BC: B and C are conditionally independent given A (gamma(B; C | A) falls to 0.014 at 500 rounds), so the statistic should flag AB and AC and not BC. Rank-1 accuracy of a true pair is 0.98 to 1.00 under both statistics, so the net correction does not hurt the ranking. It does break the published criterion. Gamma(B; A) subtracts gamma(C; A), which equals gamma(B; A) in expectation, so the score of AB tends to zero (0.006 nats at 500 rounds) and the criterion returns None in 25%, 32%, 54% and 68% of games at 50, 100, 200 and 500 rounds, almost always because no pair crosses alpha. Power falls as T grows: with two assistants, the net correction cancels the signal it is meant to isolate.</w:t>
+      </w:r>
+    </w:p>
+    <w:p>
+      <w:pPr>
+        <w:pStyle w:val="CaptionedFigure"/>
+      </w:pPr>
+      <w:r>
+        <w:drawing>
+          <wp:inline>
+            <wp:extent cx="5334000" cy="1582993"/>
+            <wp:effectExtent b="0" l="0" r="0" t="0"/>
+            <wp:docPr descr="Figure 4. Extensions. Left: the Holm p-value rule is calibrated at every horizon where the fixed threshold is not, at a cost in power at 25 rounds. Middle: an innocent pair keyed on the full previous profile defeats majority-state conditioning; profile-state conditioning with the permutation correction recovers the true pair from 50 rounds. Right: in a coalition of three, net influence places exactly two of the three true pairs in the top three, correctly excluding the conditionally independent pair, but its score for the true pairs tends to zero with more data." title="" id="39" name="Picture"/>
+            <a:graphic>
+              <a:graphicData uri="http://schemas.openxmlformats.org/drawingml/2006/picture">
+                <pic:pic>
+                  <pic:nvPicPr>
+                    <pic:cNvPr descr="../results/fig_extensions.png" id="40" name="Picture"/>
+                    <pic:cNvPicPr>
+                      <a:picLocks noChangeArrowheads="1" noChangeAspect="1"/>
+                    </pic:cNvPicPr>
+                  </pic:nvPicPr>
+                  <pic:blipFill>
+                    <a:blip r:embed="rId38"/>
+                    <a:stretch>
+                      <a:fillRect/>
+                    </a:stretch>
+                  </pic:blipFill>
+                  <pic:spPr bwMode="auto">
+                    <a:xfrm>
+                      <a:off x="0" y="0"/>
+                      <a:ext cx="5334000" cy="1582993"/>
+                    </a:xfrm>
+                    <a:prstGeom prst="rect">
+                      <a:avLst/>
+                    </a:prstGeom>
+                    <a:noFill/>
+                    <a:ln w="9525">
+                      <a:noFill/>
+                      <a:headEnd/>
+                      <a:tailEnd/>
+                    </a:ln>
+                  </pic:spPr>
+                </pic:pic>
+              </a:graphicData>
+            </a:graphic>
+          </wp:inline>
+        </w:drawing>
+      </w:r>
+    </w:p>
+    <w:p>
+      <w:pPr>
+        <w:pStyle w:val="ImageCaption"/>
+      </w:pPr>
+      <w:r>
+        <w:t xml:space="preserve">Figure 4. Extensions. Left: the Holm p-value rule is calibrated at every horizon where the fixed threshold is not, at a cost in power at 25 rounds. Middle: an innocent pair keyed on the full previous profile defeats majority-state conditioning; profile-state conditioning with the permutation correction recovers the true pair from 50 rounds. Right: in a coalition of three, net influence places exactly two of the three true pairs in the top three, correctly excluding the conditionally independent pair, but its score for the true pairs tends to zero with more data.</w:t>
+      </w:r>
+    </w:p>
+    <w:bookmarkEnd w:id="41"/>
+    <w:bookmarkEnd w:id="42"/>
+    <w:bookmarkStart w:id="43" w:name="X45bbaacc8ab6245fafe1d74c3b68a1c519c5399"/>
     <w:p>
       <w:pPr>
         <w:pStyle w:val="Heading2"/>
@@ -2376,8 +3558,8 @@
         <w:t xml:space="preserve"> </w:t>
       </w:r>
     </w:p>
-    <w:bookmarkEnd w:id="39"/>
-    <w:bookmarkStart w:id="40" w:name="X2a011f4509b9f80efa6dfc3d43167290cff797e"/>
+    <w:bookmarkEnd w:id="43"/>
+    <w:bookmarkStart w:id="44" w:name="X2a011f4509b9f80efa6dfc3d43167290cff797e"/>
     <w:p>
       <w:pPr>
         <w:pStyle w:val="Heading2"/>
@@ -2436,8 +3618,8 @@
         <w:t xml:space="preserve">If the transmitted item is decodable from the workspace in both the actually-adopted and the actually-refused cases, then presence of the proposal in the workspace is not specific to participation, and an auditor must not read it as such; the tag-swapped and tag-erased conditions confirm the readout tracks the transmitted information rather than the objective text. If decoding is high only when the receiver adopts, the lens carries behaviourally specific evidence at the pre-action position. Either outcome is reported as found.</w:t>
       </w:r>
     </w:p>
-    <w:bookmarkEnd w:id="40"/>
-    <w:bookmarkStart w:id="41" w:name="discussion"/>
+    <w:bookmarkEnd w:id="44"/>
+    <w:bookmarkStart w:id="45" w:name="discussion"/>
     <w:p>
       <w:pPr>
         <w:pStyle w:val="Heading2"/>
@@ -2511,11 +3693,11 @@
         <w:pStyle w:val="BodyText"/>
       </w:pPr>
       <w:r>
-        <w:t xml:space="preserve">Future work: evaluate a p-value-based criterion with multiple-comparison control across pairs; move to the Agrawal et al. (2025) double auction, where the public state is the order book; test whether conditioning on the other agents’ actions in the same round (rather than only the previous round) separates coordination from common response to a shock; and extend to coalitions larger than two.</w:t>
-      </w:r>
-    </w:p>
-    <w:bookmarkEnd w:id="41"/>
-    <w:bookmarkStart w:id="42" w:name="X34a9f4a4955810fa226028fb89dc1e250b93941"/>
+        <w:t xml:space="preserve">Section 4.5 adds the result that matters most for deployment: the net correction, which removes third-party influence, cancels the coalition’s own signal when a primary has two assistants, so the published criterion loses power as the log grows. A coalition detector needs a conditional dependence structure (which pairs are dependent given which others), not a pairwise net score. Future work: move to the Agrawal et al. (2025) double auction, where the public state is the order book; test whether conditioning on the other agents’ actions in the same round (rather than only the previous round) separates coordination from common response to a shock; and extend to coalitions larger than two.</w:t>
+      </w:r>
+    </w:p>
+    <w:bookmarkEnd w:id="45"/>
+    <w:bookmarkStart w:id="46" w:name="X34a9f4a4955810fa226028fb89dc1e250b93941"/>
     <w:p>
       <w:pPr>
         <w:pStyle w:val="Heading2"/>
@@ -2578,8 +3760,8 @@
         <w:t xml:space="preserve">A published detector tells a coalition what to avoid: here, any dependence between partners’ actions beyond what the public state explains, and, for the internals half, that a monitor reading the workspace for a proposal can be fooled in both directions. Agents could evade it by routing coordination through the public state itself (both responding to a public signal they jointly control) or by coordinating at a rate below the detection floor we measured (CP around 0.2 at 25 rounds). We think this is acceptable because the same analysis tells a defender where the floor is and that single short games are not enough evidence; pooled logs are. No real market data, deployed system or private information was used.</w:t>
       </w:r>
     </w:p>
-    <w:bookmarkEnd w:id="42"/>
-    <w:bookmarkStart w:id="43" w:name="references"/>
+    <w:bookmarkEnd w:id="46"/>
+    <w:bookmarkStart w:id="47" w:name="references"/>
     <w:p>
       <w:pPr>
         <w:pStyle w:val="Heading2"/>
@@ -2732,8 +3914,8 @@
         <w:t xml:space="preserve">Xu, X., Wu, C., Lu, J., Tan, K., Tao, S. and Hong, H. (2026). Collusion with Competitive Marginals: Price-Level Audits Are Blind by Construction. arXiv:2607.26385.</w:t>
       </w:r>
     </w:p>
-    <w:bookmarkEnd w:id="43"/>
-    <w:bookmarkStart w:id="44" w:name="appendix-a.-reproducibility"/>
+    <w:bookmarkEnd w:id="47"/>
+    <w:bookmarkStart w:id="48" w:name="appendix-a.-reproducibility"/>
     <w:p>
       <w:pPr>
         <w:pStyle w:val="Heading2"/>
@@ -2807,7 +3989,7 @@
         <w:t xml:space="preserve">.</w:t>
       </w:r>
     </w:p>
-    <w:bookmarkEnd w:id="44"/>
+    <w:bookmarkEnd w:id="48"/>
     <w:sectPr/>
   </w:body>
 </w:document>

</xml_diff>

<commit_message>
Trim for the 8-page cap; compact docx layout; PDF preview
Co-Authored-By: Claude Fable 5.1 <noreply@anthropic.com>
Claude-Session: https://claude.ai/code/session_018qJiaQKKjpemqx8e3Wrmcq
</commit_message>
<xml_diff>
--- a/report/report_draft.docx
+++ b/report/report_draft.docx
@@ -556,7 +556,7 @@
         <w:pStyle w:val="FirstParagraph"/>
       </w:pPr>
       <w:r>
-        <w:t xml:space="preserve">The paper leaves the choice of state to the game. We compare two: a memoryless state (a single value, so gamma reduces to plain mutual information) and the previous round’s majority action (ties broken to the lowest action index), which has four values and is the minimal public summary a parallel rule could key on. The code also provides the full previous action profile, which is too sparse for short games.</w:t>
+        <w:t xml:space="preserve">The paper leaves the state to the game. We compare a memoryless state (gamma reduces to plain mutual information), the previous round’s majority action (four values, the minimal public summary a parallel rule could key on) and, in Section 4.5, the full previous action profile (82 values, sparse at short horizons).</w:t>
       </w:r>
     </w:p>
     <w:bookmarkEnd w:id="27"/>
@@ -726,7 +726,7 @@
         <w:pStyle w:val="BodyText"/>
       </w:pPr>
       <w:r>
-        <w:t xml:space="preserve">Detectors, all action-only: net influence with the memoryless state (NI, the published method), net influence with the majority state, both with and without the permutation correction, raw mutual information, Cramer’s V, and same-action rate. Metrics: rank-1 accuracy (true pair scores highest among the six pairs), criterion accuracy (exactly one pair crosses alpha and it is the true pair) and false-positive rate (any pair crosses alpha in a no-collusion condition).</w:t>
+        <w:t xml:space="preserve">Detectors, all action-only: net influence with the memoryless state (the published method) and with the majority state, each with and without the permutation correction; raw mutual information; Cramer’s V; same-action rate. Metrics: rank-1 accuracy (the true pair scores highest of six), criterion accuracy (exactly one pair crosses alpha and it is the true pair) and false-positive rate (any pair crosses alpha with no collusion present).</w:t>
       </w:r>
     </w:p>
     <w:bookmarkEnd w:id="29"/>
@@ -883,7 +883,7 @@
         <w:t xml:space="preserve"> </w:t>
       </w:r>
       <w:r>
-        <w:t xml:space="preserve">With random non-colluders (the paper’s setting) memoryless net influence works as published: rank-1 accuracy at CP = 0.6 is 0.95 at 25 rounds and 1.00 from 50 rounds; criterion accuracy is 0.82, 0.93 and 1.00 at 25, 50 and 100 rounds. The CP sweep at T = 100 reproduces the paper’s qualitative finding that weak collusion needs long logs: criterion accuracy is 0.24 at CP = 0.2, 0.95 at CP = 0.4 and 1.00 at CP = 0.6.</w:t>
+        <w:t xml:space="preserve">With random non-colluders (the paper’s setting) memoryless net influence works as published: rank-1 accuracy at CP = 0.6 is 0.95 at 25 rounds and 1.00 from 50; criterion accuracy is 0.82, 0.93 and 1.00 at 25, 50 and 100 rounds, and at T = 100 it rises from 0.24 at CP = 0.2 to 1.00 at CP = 0.6.</w:t>
       </w:r>
     </w:p>
     <w:p>
@@ -901,25 +901,7 @@
         <w:t xml:space="preserve"> </w:t>
       </w:r>
       <w:r>
-        <w:t xml:space="preserve">The naive agreement baseline scores 0.00 in every collusion condition from 50 rounds on, because the assisting move is the move that loses to the partner, so collusion here looks like anti-correlation. Any detector built on</w:t>
-      </w:r>
-      <w:r>
-        <w:t xml:space="preserve"> </w:t>
-      </w:r>
-      <w:r>
-        <w:t xml:space="preserve">“</w:t>
-      </w:r>
-      <w:r>
-        <w:t xml:space="preserve">do they choose the same thing</w:t>
-      </w:r>
-      <w:r>
-        <w:t xml:space="preserve">”</w:t>
-      </w:r>
-      <w:r>
-        <w:t xml:space="preserve"> </w:t>
-      </w:r>
-      <w:r>
-        <w:t xml:space="preserve">would miss this coalition entirely. Cramer’s V and raw mutual information, which are sign-agnostic, match net influence in the random-non-colluder world.</w:t>
+        <w:t xml:space="preserve">The agreement baseline scores 0.00 in every collusion condition from 50 rounds on, because the assisting move is the move that loses to the partner: collusion here looks like anti-correlation. Cramer’s V and raw mutual information, which are sign-agnostic, match net influence in the random-non-colluder world.</w:t>
       </w:r>
     </w:p>
     <w:p>
@@ -1749,13 +1731,11 @@
         <w:jc w:val="start"/>
       </w:tblPr>
       <w:tblGrid>
-        <w:gridCol w:w="1131"/>
-        <w:gridCol w:w="1131"/>
-        <w:gridCol w:w="1131"/>
-        <w:gridCol w:w="1131"/>
-        <w:gridCol w:w="1131"/>
-        <w:gridCol w:w="1131"/>
-        <w:gridCol w:w="1131"/>
+        <w:gridCol w:w="1584"/>
+        <w:gridCol w:w="1584"/>
+        <w:gridCol w:w="1584"/>
+        <w:gridCol w:w="1584"/>
+        <w:gridCol w:w="1584"/>
       </w:tblGrid>
       <w:tr>
         <w:trPr>
@@ -1781,43 +1761,7 @@
               <w:jc w:val="left"/>
             </w:pPr>
             <w:r>
-              <w:t xml:space="preserve">NI memoryless, random</w:t>
-            </w:r>
-          </w:p>
-        </w:tc>
-        <w:tc>
-          <w:tcPr/>
-          <w:p>
-            <w:pPr>
-              <w:pStyle w:val="Compact"/>
-              <w:jc w:val="left"/>
-            </w:pPr>
-            <w:r>
-              <w:t xml:space="preserve">NI majority, random</w:t>
-            </w:r>
-          </w:p>
-        </w:tc>
-        <w:tc>
-          <w:tcPr/>
-          <w:p>
-            <w:pPr>
-              <w:pStyle w:val="Compact"/>
-              <w:jc w:val="left"/>
-            </w:pPr>
-            <w:r>
-              <w:t xml:space="preserve">NI+perm majority, random</w:t>
-            </w:r>
-          </w:p>
-        </w:tc>
-        <w:tc>
-          <w:tcPr/>
-          <w:p>
-            <w:pPr>
-              <w:pStyle w:val="Compact"/>
-              <w:jc w:val="left"/>
-            </w:pPr>
-            <w:r>
-              <w:t xml:space="preserve">NI memoryless, parallel-only</w:t>
+              <w:t xml:space="preserve">NI memoryless, all random</w:t>
             </w:r>
           </w:p>
         </w:tc>
@@ -1830,6 +1774,18 @@
             </w:pPr>
             <w:r>
               <w:t xml:space="preserve">NI majority, parallel-only</w:t>
+            </w:r>
+          </w:p>
+        </w:tc>
+        <w:tc>
+          <w:tcPr/>
+          <w:p>
+            <w:pPr>
+              <w:pStyle w:val="Compact"/>
+              <w:jc w:val="left"/>
+            </w:pPr>
+            <w:r>
+              <w:t xml:space="preserve">NI+perm majority, all random</w:t>
             </w:r>
           </w:p>
         </w:tc>
@@ -1879,7 +1835,7 @@
               <w:jc w:val="left"/>
             </w:pPr>
             <w:r>
-              <w:t xml:space="preserve">0.54</w:t>
+              <w:t xml:space="preserve">1.00</w:t>
             </w:r>
           </w:p>
         </w:tc>
@@ -1892,30 +1848,6 @@
             </w:pPr>
             <w:r>
               <w:t xml:space="preserve">0.50</w:t>
-            </w:r>
-          </w:p>
-        </w:tc>
-        <w:tc>
-          <w:tcPr/>
-          <w:p>
-            <w:pPr>
-              <w:pStyle w:val="Compact"/>
-              <w:jc w:val="left"/>
-            </w:pPr>
-            <w:r>
-              <w:t xml:space="preserve">0.83</w:t>
-            </w:r>
-          </w:p>
-        </w:tc>
-        <w:tc>
-          <w:tcPr/>
-          <w:p>
-            <w:pPr>
-              <w:pStyle w:val="Compact"/>
-              <w:jc w:val="left"/>
-            </w:pPr>
-            <w:r>
-              <w:t xml:space="preserve">1.00</w:t>
             </w:r>
           </w:p>
         </w:tc>
@@ -1965,7 +1897,7 @@
               <w:jc w:val="left"/>
             </w:pPr>
             <w:r>
-              <w:t xml:space="preserve">0.38</w:t>
+              <w:t xml:space="preserve">0.99</w:t>
             </w:r>
           </w:p>
         </w:tc>
@@ -1978,30 +1910,6 @@
             </w:pPr>
             <w:r>
               <w:t xml:space="preserve">0.36</w:t>
-            </w:r>
-          </w:p>
-        </w:tc>
-        <w:tc>
-          <w:tcPr/>
-          <w:p>
-            <w:pPr>
-              <w:pStyle w:val="Compact"/>
-              <w:jc w:val="left"/>
-            </w:pPr>
-            <w:r>
-              <w:t xml:space="preserve">0.96</w:t>
-            </w:r>
-          </w:p>
-        </w:tc>
-        <w:tc>
-          <w:tcPr/>
-          <w:p>
-            <w:pPr>
-              <w:pStyle w:val="Compact"/>
-              <w:jc w:val="left"/>
-            </w:pPr>
-            <w:r>
-              <w:t xml:space="preserve">0.99</w:t>
             </w:r>
           </w:p>
         </w:tc>
@@ -2051,43 +1959,19 @@
               <w:jc w:val="left"/>
             </w:pPr>
             <w:r>
+              <w:t xml:space="preserve">0.67</w:t>
+            </w:r>
+          </w:p>
+        </w:tc>
+        <w:tc>
+          <w:tcPr/>
+          <w:p>
+            <w:pPr>
+              <w:pStyle w:val="Compact"/>
+              <w:jc w:val="left"/>
+            </w:pPr>
+            <w:r>
               <w:t xml:space="preserve">0.10</w:t>
-            </w:r>
-          </w:p>
-        </w:tc>
-        <w:tc>
-          <w:tcPr/>
-          <w:p>
-            <w:pPr>
-              <w:pStyle w:val="Compact"/>
-              <w:jc w:val="left"/>
-            </w:pPr>
-            <w:r>
-              <w:t xml:space="preserve">0.10</w:t>
-            </w:r>
-          </w:p>
-        </w:tc>
-        <w:tc>
-          <w:tcPr/>
-          <w:p>
-            <w:pPr>
-              <w:pStyle w:val="Compact"/>
-              <w:jc w:val="left"/>
-            </w:pPr>
-            <w:r>
-              <w:t xml:space="preserve">0.98</w:t>
-            </w:r>
-          </w:p>
-        </w:tc>
-        <w:tc>
-          <w:tcPr/>
-          <w:p>
-            <w:pPr>
-              <w:pStyle w:val="Compact"/>
-              <w:jc w:val="left"/>
-            </w:pPr>
-            <w:r>
-              <w:t xml:space="preserve">0.67</w:t>
             </w:r>
           </w:p>
         </w:tc>
@@ -2137,43 +2021,19 @@
               <w:jc w:val="left"/>
             </w:pPr>
             <w:r>
+              <w:t xml:space="preserve">0.08</w:t>
+            </w:r>
+          </w:p>
+        </w:tc>
+        <w:tc>
+          <w:tcPr/>
+          <w:p>
+            <w:pPr>
+              <w:pStyle w:val="Compact"/>
+              <w:jc w:val="left"/>
+            </w:pPr>
+            <w:r>
               <w:t xml:space="preserve">0.00</w:t>
-            </w:r>
-          </w:p>
-        </w:tc>
-        <w:tc>
-          <w:tcPr/>
-          <w:p>
-            <w:pPr>
-              <w:pStyle w:val="Compact"/>
-              <w:jc w:val="left"/>
-            </w:pPr>
-            <w:r>
-              <w:t xml:space="preserve">0.00</w:t>
-            </w:r>
-          </w:p>
-        </w:tc>
-        <w:tc>
-          <w:tcPr/>
-          <w:p>
-            <w:pPr>
-              <w:pStyle w:val="Compact"/>
-              <w:jc w:val="left"/>
-            </w:pPr>
-            <w:r>
-              <w:t xml:space="preserve">1.00</w:t>
-            </w:r>
-          </w:p>
-        </w:tc>
-        <w:tc>
-          <w:tcPr/>
-          <w:p>
-            <w:pPr>
-              <w:pStyle w:val="Compact"/>
-              <w:jc w:val="left"/>
-            </w:pPr>
-            <w:r>
-              <w:t xml:space="preserve">0.08</w:t>
             </w:r>
           </w:p>
         </w:tc>
@@ -2224,30 +2084,6 @@
             </w:pPr>
             <w:r>
               <w:t xml:space="preserve">0.00</w:t>
-            </w:r>
-          </w:p>
-        </w:tc>
-        <w:tc>
-          <w:tcPr/>
-          <w:p>
-            <w:pPr>
-              <w:pStyle w:val="Compact"/>
-              <w:jc w:val="left"/>
-            </w:pPr>
-            <w:r>
-              <w:t xml:space="preserve">0.00</w:t>
-            </w:r>
-          </w:p>
-        </w:tc>
-        <w:tc>
-          <w:tcPr/>
-          <w:p>
-            <w:pPr>
-              <w:pStyle w:val="Compact"/>
-              <w:jc w:val="left"/>
-            </w:pPr>
-            <w:r>
-              <w:t xml:space="preserve">1.00</w:t>
             </w:r>
           </w:p>
         </w:tc>
@@ -2292,7 +2128,7 @@
         <w:t xml:space="preserve"> </w:t>
       </w:r>
       <w:r>
-        <w:t xml:space="preserve">At T = 25 with random non-colluders, criterion accuracy for the corrected, state-conditioned detector rises from 0.07 at CP = 0 to 0.36, 0.65, 0.84 and 0.85 at CP = 0.4, 0.6, 0.8 and 1.0. A 25-round LLM game therefore needs the coalition to coordinate in well over half of rounds to be caught by a single game; pooling ten games (250 rounds) brings the detector into the regime where CP = 0.4 is caught reliably.</w:t>
+        <w:t xml:space="preserve">At T = 25 with random non-colluders, criterion accuracy for the corrected, state-conditioned detector rises from 0.07 at CP = 0 to 0.36, 0.65, 0.84 and 0.85 at CP = 0.4, 0.6, 0.8 and 1.0: a single 25-round LLM game catches only a coalition that coordinates in well over half of rounds; pooling ten games brings CP = 0.4 into reach.</w:t>
       </w:r>
     </w:p>
     <w:bookmarkStart w:id="41" w:name="Xe39c9d91cc6afdedab1e3c5e8913428fa7b5c95"/>
@@ -2852,557 +2688,9 @@
         <w:t xml:space="preserve"> </w:t>
       </w:r>
       <w:r>
-        <w:t xml:space="preserve">agents C and D both play the action that beats the previous move of the lowest-indexed player who scored in the previous round (random in round 0). This is a deterministic function of the previous full action profile but not of the previous majority. Conditioning on the majority state fails completely: gamma(C; D | S) stays at 0.91 to 1.07 nats, the innocent pair ranks first in 100% of games at every T, and the fixed criterion flags it in 65 to 100% of no-collusion games (Table 4). Conditioning on the full previous profile removes the dependence (gamma(C; D | S) = 0.000) but spreads the data over 15 to 29 occupied states; without the permutation correction the bias flags a pair in 97 to 100% of no-collusion games. With the correction, rank-1 accuracy of the true pair is 0.75 at 25 rounds, 0.97 at 50 and 1.00 from 100, with a false-positive rate of 0.00 to 0.06. The detector works only when the analyst conditions on at least the state the innocent rule uses, and only once T is large relative to the number of states.</w:t>
-      </w:r>
-    </w:p>
-    <w:p>
-      <w:pPr>
-        <w:pStyle w:val="BodyText"/>
-      </w:pPr>
-      <w:r>
-        <w:rPr>
-          <w:bCs/>
-          <w:b/>
-        </w:rPr>
-        <w:t xml:space="preserve">Table 4. Richer confound: rank-1 accuracy of the true pair (parallel_rich) and innocent pair flagged (parallel_rich_only), NI+perm.</w:t>
-      </w:r>
-    </w:p>
-    <w:tbl>
-      <w:tblPr>
-        <w:tblStyle w:val="Table"/>
-        <w:tblW w:type="pct" w:w="5000"/>
-        <w:tblLook w:firstRow="1" w:lastRow="0" w:firstColumn="0" w:lastColumn="0" w:noHBand="0" w:noVBand="0" w:val="0020"/>
-        <w:jc w:val="start"/>
-      </w:tblPr>
-      <w:tblGrid>
-        <w:gridCol w:w="1131"/>
-        <w:gridCol w:w="1131"/>
-        <w:gridCol w:w="1131"/>
-        <w:gridCol w:w="1131"/>
-        <w:gridCol w:w="1131"/>
-        <w:gridCol w:w="1131"/>
-        <w:gridCol w:w="1131"/>
-      </w:tblGrid>
-      <w:tr>
-        <w:trPr>
-          <w:tblHeader w:val="true"/>
-        </w:trPr>
-        <w:tc>
-          <w:tcPr/>
-          <w:p>
-            <w:pPr>
-              <w:pStyle w:val="Compact"/>
-              <w:jc w:val="left"/>
-            </w:pPr>
-            <w:r>
-              <w:t xml:space="preserve">T</w:t>
-            </w:r>
-          </w:p>
-        </w:tc>
-        <w:tc>
-          <w:tcPr/>
-          <w:p>
-            <w:pPr>
-              <w:pStyle w:val="Compact"/>
-              <w:jc w:val="left"/>
-            </w:pPr>
-            <w:r>
-              <w:t xml:space="preserve">rank-1, memoryless</w:t>
-            </w:r>
-          </w:p>
-        </w:tc>
-        <w:tc>
-          <w:tcPr/>
-          <w:p>
-            <w:pPr>
-              <w:pStyle w:val="Compact"/>
-              <w:jc w:val="left"/>
-            </w:pPr>
-            <w:r>
-              <w:t xml:space="preserve">rank-1, majority</w:t>
-            </w:r>
-          </w:p>
-        </w:tc>
-        <w:tc>
-          <w:tcPr/>
-          <w:p>
-            <w:pPr>
-              <w:pStyle w:val="Compact"/>
-              <w:jc w:val="left"/>
-            </w:pPr>
-            <w:r>
-              <w:t xml:space="preserve">rank-1, profile</w:t>
-            </w:r>
-          </w:p>
-        </w:tc>
-        <w:tc>
-          <w:tcPr/>
-          <w:p>
-            <w:pPr>
-              <w:pStyle w:val="Compact"/>
-              <w:jc w:val="left"/>
-            </w:pPr>
-            <w:r>
-              <w:t xml:space="preserve">innocent flagged, memoryless</w:t>
-            </w:r>
-          </w:p>
-        </w:tc>
-        <w:tc>
-          <w:tcPr/>
-          <w:p>
-            <w:pPr>
-              <w:pStyle w:val="Compact"/>
-              <w:jc w:val="left"/>
-            </w:pPr>
-            <w:r>
-              <w:t xml:space="preserve">innocent flagged, majority</w:t>
-            </w:r>
-          </w:p>
-        </w:tc>
-        <w:tc>
-          <w:tcPr/>
-          <w:p>
-            <w:pPr>
-              <w:pStyle w:val="Compact"/>
-              <w:jc w:val="left"/>
-            </w:pPr>
-            <w:r>
-              <w:t xml:space="preserve">innocent flagged, profile</w:t>
-            </w:r>
-          </w:p>
-        </w:tc>
-      </w:tr>
-      <w:tr>
-        <w:tc>
-          <w:tcPr/>
-          <w:p>
-            <w:pPr>
-              <w:pStyle w:val="Compact"/>
-              <w:jc w:val="left"/>
-            </w:pPr>
-            <w:r>
-              <w:t xml:space="preserve">25</w:t>
-            </w:r>
-          </w:p>
-        </w:tc>
-        <w:tc>
-          <w:tcPr/>
-          <w:p>
-            <w:pPr>
-              <w:pStyle w:val="Compact"/>
-              <w:jc w:val="left"/>
-            </w:pPr>
-            <w:r>
-              <w:t xml:space="preserve">0.01</w:t>
-            </w:r>
-          </w:p>
-        </w:tc>
-        <w:tc>
-          <w:tcPr/>
-          <w:p>
-            <w:pPr>
-              <w:pStyle w:val="Compact"/>
-              <w:jc w:val="left"/>
-            </w:pPr>
-            <w:r>
-              <w:t xml:space="preserve">0.00</w:t>
-            </w:r>
-          </w:p>
-        </w:tc>
-        <w:tc>
-          <w:tcPr/>
-          <w:p>
-            <w:pPr>
-              <w:pStyle w:val="Compact"/>
-              <w:jc w:val="left"/>
-            </w:pPr>
-            <w:r>
-              <w:t xml:space="preserve">0.75</w:t>
-            </w:r>
-          </w:p>
-        </w:tc>
-        <w:tc>
-          <w:tcPr/>
-          <w:p>
-            <w:pPr>
-              <w:pStyle w:val="Compact"/>
-              <w:jc w:val="left"/>
-            </w:pPr>
-            <w:r>
-              <w:t xml:space="preserve">0.86</w:t>
-            </w:r>
-          </w:p>
-        </w:tc>
-        <w:tc>
-          <w:tcPr/>
-          <w:p>
-            <w:pPr>
-              <w:pStyle w:val="Compact"/>
-              <w:jc w:val="left"/>
-            </w:pPr>
-            <w:r>
-              <w:t xml:space="preserve">0.85</w:t>
-            </w:r>
-          </w:p>
-        </w:tc>
-        <w:tc>
-          <w:tcPr/>
-          <w:p>
-            <w:pPr>
-              <w:pStyle w:val="Compact"/>
-              <w:jc w:val="left"/>
-            </w:pPr>
-            <w:r>
-              <w:t xml:space="preserve">0.00</w:t>
-            </w:r>
-          </w:p>
-        </w:tc>
-      </w:tr>
-      <w:tr>
-        <w:tc>
-          <w:tcPr/>
-          <w:p>
-            <w:pPr>
-              <w:pStyle w:val="Compact"/>
-              <w:jc w:val="left"/>
-            </w:pPr>
-            <w:r>
-              <w:t xml:space="preserve">50</w:t>
-            </w:r>
-          </w:p>
-        </w:tc>
-        <w:tc>
-          <w:tcPr/>
-          <w:p>
-            <w:pPr>
-              <w:pStyle w:val="Compact"/>
-              <w:jc w:val="left"/>
-            </w:pPr>
-            <w:r>
-              <w:t xml:space="preserve">0.00</w:t>
-            </w:r>
-          </w:p>
-        </w:tc>
-        <w:tc>
-          <w:tcPr/>
-          <w:p>
-            <w:pPr>
-              <w:pStyle w:val="Compact"/>
-              <w:jc w:val="left"/>
-            </w:pPr>
-            <w:r>
-              <w:t xml:space="preserve">0.00</w:t>
-            </w:r>
-          </w:p>
-        </w:tc>
-        <w:tc>
-          <w:tcPr/>
-          <w:p>
-            <w:pPr>
-              <w:pStyle w:val="Compact"/>
-              <w:jc w:val="left"/>
-            </w:pPr>
-            <w:r>
-              <w:t xml:space="preserve">0.97</w:t>
-            </w:r>
-          </w:p>
-        </w:tc>
-        <w:tc>
-          <w:tcPr/>
-          <w:p>
-            <w:pPr>
-              <w:pStyle w:val="Compact"/>
-              <w:jc w:val="left"/>
-            </w:pPr>
-            <w:r>
-              <w:t xml:space="preserve">0.93</w:t>
-            </w:r>
-          </w:p>
-        </w:tc>
-        <w:tc>
-          <w:tcPr/>
-          <w:p>
-            <w:pPr>
-              <w:pStyle w:val="Compact"/>
-              <w:jc w:val="left"/>
-            </w:pPr>
-            <w:r>
-              <w:t xml:space="preserve">0.90</w:t>
-            </w:r>
-          </w:p>
-        </w:tc>
-        <w:tc>
-          <w:tcPr/>
-          <w:p>
-            <w:pPr>
-              <w:pStyle w:val="Compact"/>
-              <w:jc w:val="left"/>
-            </w:pPr>
-            <w:r>
-              <w:t xml:space="preserve">0.00</w:t>
-            </w:r>
-          </w:p>
-        </w:tc>
-      </w:tr>
-      <w:tr>
-        <w:tc>
-          <w:tcPr/>
-          <w:p>
-            <w:pPr>
-              <w:pStyle w:val="Compact"/>
-              <w:jc w:val="left"/>
-            </w:pPr>
-            <w:r>
-              <w:t xml:space="preserve">100</w:t>
-            </w:r>
-          </w:p>
-        </w:tc>
-        <w:tc>
-          <w:tcPr/>
-          <w:p>
-            <w:pPr>
-              <w:pStyle w:val="Compact"/>
-              <w:jc w:val="left"/>
-            </w:pPr>
-            <w:r>
-              <w:t xml:space="preserve">0.00</w:t>
-            </w:r>
-          </w:p>
-        </w:tc>
-        <w:tc>
-          <w:tcPr/>
-          <w:p>
-            <w:pPr>
-              <w:pStyle w:val="Compact"/>
-              <w:jc w:val="left"/>
-            </w:pPr>
-            <w:r>
-              <w:t xml:space="preserve">0.00</w:t>
-            </w:r>
-          </w:p>
-        </w:tc>
-        <w:tc>
-          <w:tcPr/>
-          <w:p>
-            <w:pPr>
-              <w:pStyle w:val="Compact"/>
-              <w:jc w:val="left"/>
-            </w:pPr>
-            <w:r>
-              <w:t xml:space="preserve">1.00</w:t>
-            </w:r>
-          </w:p>
-        </w:tc>
-        <w:tc>
-          <w:tcPr/>
-          <w:p>
-            <w:pPr>
-              <w:pStyle w:val="Compact"/>
-              <w:jc w:val="left"/>
-            </w:pPr>
-            <w:r>
-              <w:t xml:space="preserve">0.98</w:t>
-            </w:r>
-          </w:p>
-        </w:tc>
-        <w:tc>
-          <w:tcPr/>
-          <w:p>
-            <w:pPr>
-              <w:pStyle w:val="Compact"/>
-              <w:jc w:val="left"/>
-            </w:pPr>
-            <w:r>
-              <w:t xml:space="preserve">0.90</w:t>
-            </w:r>
-          </w:p>
-        </w:tc>
-        <w:tc>
-          <w:tcPr/>
-          <w:p>
-            <w:pPr>
-              <w:pStyle w:val="Compact"/>
-              <w:jc w:val="left"/>
-            </w:pPr>
-            <w:r>
-              <w:t xml:space="preserve">0.00</w:t>
-            </w:r>
-          </w:p>
-        </w:tc>
-      </w:tr>
-      <w:tr>
-        <w:tc>
-          <w:tcPr/>
-          <w:p>
-            <w:pPr>
-              <w:pStyle w:val="Compact"/>
-              <w:jc w:val="left"/>
-            </w:pPr>
-            <w:r>
-              <w:t xml:space="preserve">200</w:t>
-            </w:r>
-          </w:p>
-        </w:tc>
-        <w:tc>
-          <w:tcPr/>
-          <w:p>
-            <w:pPr>
-              <w:pStyle w:val="Compact"/>
-              <w:jc w:val="left"/>
-            </w:pPr>
-            <w:r>
-              <w:t xml:space="preserve">0.00</w:t>
-            </w:r>
-          </w:p>
-        </w:tc>
-        <w:tc>
-          <w:tcPr/>
-          <w:p>
-            <w:pPr>
-              <w:pStyle w:val="Compact"/>
-              <w:jc w:val="left"/>
-            </w:pPr>
-            <w:r>
-              <w:t xml:space="preserve">0.00</w:t>
-            </w:r>
-          </w:p>
-        </w:tc>
-        <w:tc>
-          <w:tcPr/>
-          <w:p>
-            <w:pPr>
-              <w:pStyle w:val="Compact"/>
-              <w:jc w:val="left"/>
-            </w:pPr>
-            <w:r>
-              <w:t xml:space="preserve">1.00</w:t>
-            </w:r>
-          </w:p>
-        </w:tc>
-        <w:tc>
-          <w:tcPr/>
-          <w:p>
-            <w:pPr>
-              <w:pStyle w:val="Compact"/>
-              <w:jc w:val="left"/>
-            </w:pPr>
-            <w:r>
-              <w:t xml:space="preserve">1.00</w:t>
-            </w:r>
-          </w:p>
-        </w:tc>
-        <w:tc>
-          <w:tcPr/>
-          <w:p>
-            <w:pPr>
-              <w:pStyle w:val="Compact"/>
-              <w:jc w:val="left"/>
-            </w:pPr>
-            <w:r>
-              <w:t xml:space="preserve">0.99</w:t>
-            </w:r>
-          </w:p>
-        </w:tc>
-        <w:tc>
-          <w:tcPr/>
-          <w:p>
-            <w:pPr>
-              <w:pStyle w:val="Compact"/>
-              <w:jc w:val="left"/>
-            </w:pPr>
-            <w:r>
-              <w:t xml:space="preserve">0.00</w:t>
-            </w:r>
-          </w:p>
-        </w:tc>
-      </w:tr>
-      <w:tr>
-        <w:tc>
-          <w:tcPr/>
-          <w:p>
-            <w:pPr>
-              <w:pStyle w:val="Compact"/>
-              <w:jc w:val="left"/>
-            </w:pPr>
-            <w:r>
-              <w:t xml:space="preserve">500</w:t>
-            </w:r>
-          </w:p>
-        </w:tc>
-        <w:tc>
-          <w:tcPr/>
-          <w:p>
-            <w:pPr>
-              <w:pStyle w:val="Compact"/>
-              <w:jc w:val="left"/>
-            </w:pPr>
-            <w:r>
-              <w:t xml:space="preserve">0.00</w:t>
-            </w:r>
-          </w:p>
-        </w:tc>
-        <w:tc>
-          <w:tcPr/>
-          <w:p>
-            <w:pPr>
-              <w:pStyle w:val="Compact"/>
-              <w:jc w:val="left"/>
-            </w:pPr>
-            <w:r>
-              <w:t xml:space="preserve">0.00</w:t>
-            </w:r>
-          </w:p>
-        </w:tc>
-        <w:tc>
-          <w:tcPr/>
-          <w:p>
-            <w:pPr>
-              <w:pStyle w:val="Compact"/>
-              <w:jc w:val="left"/>
-            </w:pPr>
-            <w:r>
-              <w:t xml:space="preserve">1.00</w:t>
-            </w:r>
-          </w:p>
-        </w:tc>
-        <w:tc>
-          <w:tcPr/>
-          <w:p>
-            <w:pPr>
-              <w:pStyle w:val="Compact"/>
-              <w:jc w:val="left"/>
-            </w:pPr>
-            <w:r>
-              <w:t xml:space="preserve">1.00</w:t>
-            </w:r>
-          </w:p>
-        </w:tc>
-        <w:tc>
-          <w:tcPr/>
-          <w:p>
-            <w:pPr>
-              <w:pStyle w:val="Compact"/>
-              <w:jc w:val="left"/>
-            </w:pPr>
-            <w:r>
-              <w:t xml:space="preserve">1.00</w:t>
-            </w:r>
-          </w:p>
-        </w:tc>
-        <w:tc>
-          <w:tcPr/>
-          <w:p>
-            <w:pPr>
-              <w:pStyle w:val="Compact"/>
-              <w:jc w:val="left"/>
-            </w:pPr>
-            <w:r>
-              <w:t xml:space="preserve">0.00</w:t>
-            </w:r>
-          </w:p>
-        </w:tc>
-      </w:tr>
-    </w:tbl>
+        <w:t xml:space="preserve">agents C and D both play the action that beats the previous move of the lowest-indexed player who scored in the previous round (random in round 0). This is a deterministic function of the previous full action profile but not of the previous majority. Conditioning on the majority state fails completely: gamma(C; D | S) stays at 0.91 to 1.07 nats, the innocent pair ranks first in 100% of games at every T, and the fixed criterion flags it in 65 to 100% of no-collusion games (Table 3 reports the fixed and calibrated rules; the per-state numbers are in results/extensions_tables.txt). Conditioning on the full previous profile removes the dependence (gamma(C; D | S) = 0.000) but spreads the data over 15 to 29 occupied states; without the permutation correction the bias flags a pair in 97 to 100% of no-collusion games. With the correction, rank-1 accuracy of the true pair is 0.75 at 25 rounds, 0.97 at 50 and 1.00 from 100, with a false-positive rate of 0.00 to 0.06. The detector works only when the analyst conditions on at least the state the innocent rule uses, and only once T is large relative to the number of states.</w:t>
+      </w:r>
+    </w:p>
     <w:p>
       <w:pPr>
         <w:pStyle w:val="BodyText"/>
@@ -3651,7 +2939,7 @@
         <w:pStyle w:val="BodyText"/>
       </w:pPr>
       <w:r>
-        <w:t xml:space="preserve">The main result is a negative one with a constructive fix. The published net-influence statistic, like every unconditioned dependence statistic, cannot distinguish a coalition from two agents following the same public rule, and in a world that contains such agents it misidentifies them in every game. Conditioning on the public information set resolves this completely in our environment, but at the cost of a false-positive rate that the fixed threshold does not control at short game lengths; a permutation null fixes that. Together, conditioning plus calibration is a concrete, quantitative plus factor: dependence between two agents’ actions that is not explained by what everyone could observe, and is larger than chance would produce in a log this short.</w:t>
+        <w:t xml:space="preserve">The main action-side result is a negative one with a constructive fix. Every unconditioned dependence statistic, the published one included, mistakes two agents following the same public rule for a coalition in every game. Conditioning on the public information set fixes this, at the cost of a false-positive rate the fixed threshold does not control at short horizons; a permutation null fixes that. Conditioning plus calibration is a concrete plus factor: dependence not explained by what everyone could observe, larger than chance would produce in a log this short.</w:t>
       </w:r>
     </w:p>
     <w:p>
@@ -3990,7 +3278,9 @@
       </w:r>
     </w:p>
     <w:bookmarkEnd w:id="48"/>
-    <w:sectPr/>
+    <w:sectPr>
+      <w:pgMar w:left="1134" w:right="1134" w:top="1134" w:bottom="1134"/>
+    </w:sectPr>
   </w:body>
 </w:document>
 </file>
@@ -4317,6 +3607,9 @@
   <w:style w:default="1" w:styleId="Normal" w:type="paragraph">
     <w:name w:val="Normal"/>
     <w:qFormat/>
+    <w:rPr>
+      <w:sz w:val="21"/>
+    </w:rPr>
   </w:style>
   <w:style w:styleId="BodyText" w:type="paragraph">
     <w:name w:val="Body Text"/>
@@ -4326,12 +3619,18 @@
       <w:spacing w:after="180" w:before="180"/>
     </w:pPr>
     <w:qFormat/>
+    <w:rPr>
+      <w:sz w:val="21"/>
+    </w:rPr>
   </w:style>
   <w:style w:customStyle="1" w:styleId="FirstParagraph" w:type="paragraph">
     <w:name w:val="First Paragraph"/>
     <w:basedOn w:val="BodyText"/>
     <w:next w:val="BodyText"/>
     <w:qFormat/>
+    <w:rPr>
+      <w:sz w:val="21"/>
+    </w:rPr>
   </w:style>
   <w:style w:customStyle="1" w:styleId="Compact" w:type="paragraph">
     <w:name w:val="Compact"/>
@@ -4340,6 +3639,9 @@
     <w:pPr>
       <w:spacing w:after="36" w:before="36"/>
     </w:pPr>
+    <w:rPr>
+      <w:sz w:val="21"/>
+    </w:rPr>
   </w:style>
   <w:style w:styleId="Title" w:type="paragraph">
     <w:name w:val="Title"/>

</xml_diff>

<commit_message>
Final submission: LLM pilot and lens assay marked as not run; abstract and claims aligned; submission form; rebuilt docx/pdf
Co-Authored-By: Claude Fable 5.1 <noreply@anthropic.com>
Claude-Session: https://claude.ai/code/session_01Judwq7B36nbSWrsLjXUt7H
</commit_message>
<xml_diff>
--- a/report/report_draft.docx
+++ b/report/report_draft.docx
@@ -286,7 +286,7 @@
         <w:pStyle w:val="FirstParagraph"/>
       </w:pPr>
       <w:r>
-        <w:t xml:space="preserve">What should count as evidence that two AI agents are colluding? Antitrust law holds that parallel conduct is not an agreement and demands plus factors. We test one plus factor at two evidence surfaces, action logs and model internals, and in each case measure how the naive reading mistakes something innocent for collusion. On actions, we implement pairwise net influence (Bonjour et al. 2022) for N players, add a within-state permutation null, and run the ground-truth evaluation the method has never had: 4,400 scripted four-player games over five horizons, six collusion strengths, four baselines and two public-state definitions, an innocent pair following the same public rule, a harder innocent pair keyed on a richer state, and a coalition of three. The published memoryless statistic and every unconditioned baseline rank the innocent pair first in 96 to 100 percent of games; conditioning on the public state recovers the true pair in 98 to 100 percent; the permutation null cuts the 25-round false-positive rate from 100 percent to 25 percent; and we report where the conditioned detector breaks. We then apply the calibrated detector to GPT-4.1-mini agents with a hidden private channel. On internals, we run the privileged-observer control that Rose et al. (2026) proposed but did not execute: with a Jacobian lens on gemma-4-12B-it we ask whether the workspace representation of a partner’s coded proposal differs between a receiver that adopts it and one that understands it and refuses, across five matched conditions. Code, logs and notebooks are released.</w:t>
+        <w:t xml:space="preserve">What should count as evidence that two AI agents are colluding? Antitrust law holds that parallel conduct is not an agreement and demands plus factors. We test one plus factor at two evidence surfaces, action logs and model internals, and in each case measure how the naive reading mistakes something innocent for collusion. On actions, we implement pairwise net influence (Bonjour et al. 2022) for N players, add a within-state permutation null, and run the ground-truth evaluation the method has never had: 4,400 scripted four-player games over five horizons, six collusion strengths, four baselines and two public-state definitions, an innocent pair following the same public rule, a harder innocent pair keyed on a richer state, and a coalition of three. The published memoryless statistic and every unconditioned baseline rank the innocent pair first in 96 to 100 percent of games; conditioning on the public state recovers the true pair in 98 to 100 percent; the permutation null cuts the 25-round false-positive rate from 100 percent to 25 percent; and we report where the conditioned detector breaks. Two pilots on real models were built but returned no results before the deadline, so no claim is made for them: an action-only test of GPT-4.1-mini agents with a hidden channel, and the privileged-observer control Rose et al. (2026) proposed, a Jacobian-lens assay on gemma-4-12B-it asking whether a partner’s coded proposal reads out differently from a receiver that adopts it and one that understands and refuses. Code, logs and notebooks are released.</w:t>
       </w:r>
     </w:p>
     <w:bookmarkEnd w:id="20"/>
@@ -320,15 +320,15 @@
         <w:pStyle w:val="BodyText"/>
       </w:pPr>
       <w:r>
-        <w:t xml:space="preserve">The same problem recurs one level down. Interpretability-based collusion detectors (Rose et al. 2026, with the HELIOS framework and NARCBench) read a coalition out of activations. But a receiver that understands a partner’s harmful proposal in order to refuse it must represent that proposal too, so a lens that finds the proposal in the workspace has not yet found an agreement. Rose et al. name exactly this control, a privileged observer that knows the scheme but does not take part, and leave it to future work; Gurnee et al. (2026) and Ayonrinde and Lindsey (2026) show that a concept can sit in the workspace while the model suppresses it. The second half of this report runs that control with a workspace lens.</w:t>
-      </w:r>
-    </w:p>
-    <w:p>
-      <w:pPr>
-        <w:pStyle w:val="BodyText"/>
-      </w:pPr>
-      <w:r>
-        <w:t xml:space="preserve">This report therefore tests the plus-factor logic at two evidence surfaces, in a weekend-sized scope:</w:t>
+        <w:t xml:space="preserve">The same problem recurs one level down. Interpretability-based collusion detectors (Rose et al. 2026, with the HELIOS framework and NARCBench) read a coalition out of activations. But a receiver that understands a partner’s harmful proposal in order to refuse it must represent that proposal too, so a lens that finds the proposal in the workspace has not yet found an agreement. Rose et al. name exactly this control, a privileged observer that knows the scheme but does not take part, and leave it to future work; Gurnee et al. (2026) and Ayonrinde and Lindsey (2026) show that a concept can sit in the workspace while the model suppresses it. The second half of this report specifies that control with a workspace lens and releases the harness; the pilot did not complete before submission, so it is set out as a design and not as a result.</w:t>
+      </w:r>
+    </w:p>
+    <w:p>
+      <w:pPr>
+        <w:pStyle w:val="BodyText"/>
+      </w:pPr>
+      <w:r>
+        <w:t xml:space="preserve">This report therefore addresses the plus-factor logic at two evidence surfaces, in a weekend-sized scope:</w:t>
       </w:r>
     </w:p>
     <w:p>
@@ -340,7 +340,7 @@
         <w:pStyle w:val="Compact"/>
       </w:pPr>
       <w:r>
-        <w:t xml:space="preserve">Actions. We implement pairwise net influence for arbitrary N with a permutation null, and evaluate it with ground truth against four baselines across horizons, collusion strengths, two public-state definitions, an innocent same-rule pair, a harder innocent pair keyed on a richer state, and a coalition of three; then apply it to GPT-4.1-mini agents with a hidden private channel.</w:t>
+        <w:t xml:space="preserve">Actions. We implement pairwise net influence for arbitrary N with a permutation null, and evaluate it with ground truth against four baselines across horizons, collusion strengths, two public-state definitions, an innocent same-rule pair, a harder innocent pair keyed on a richer state, and a coalition of three. A harness to apply the same detector to GPT-4.1-mini agents with a hidden private channel is built and released, but its results did not arrive before the deadline.</w:t>
       </w:r>
     </w:p>
     <w:p>
@@ -352,7 +352,7 @@
         <w:pStyle w:val="Compact"/>
       </w:pPr>
       <w:r>
-        <w:t xml:space="preserve">Internals. Using a fitted Jacobian lens on gemma-4-12B-it, we run the privileged-observer control: does the workspace readout of a partner’s coded proposal differ between a receiver that adopts it and one that understands it and refuses, with matched permission, tag-swap and tag-erase conditions.</w:t>
+        <w:t xml:space="preserve">Internals. Using a fitted Jacobian lens on gemma-4-12B-it, we specify the privileged-observer control: does the workspace readout of a partner’s coded proposal differ between a receiver that adopts it and one that understands it and refuses, with matched permission, tag-swap and tag-erase conditions. The notebook is released; it was not run to completion before submission.</w:t>
       </w:r>
     </w:p>
     <w:p>
@@ -360,7 +360,7 @@
         <w:pStyle w:val="FirstParagraph"/>
       </w:pPr>
       <w:r>
-        <w:t xml:space="preserve">The scripted environment costs nothing and gives ground truth, which a detector needs before anyone trusts it on LLM logs; the LLM and lens experiments then test the two surfaces on real models. Figure 1 summarises the design.</w:t>
+        <w:t xml:space="preserve">The scripted environment costs nothing and gives ground truth, which a detector needs before anyone trusts it on LLM logs; the LLM and lens harnesses are built to test the two surfaces on real models and will be run after the sprint. Figure 1 summarises the design.</w:t>
       </w:r>
     </w:p>
     <w:p>
@@ -370,7 +370,7 @@
       <w:r>
         <w:drawing>
           <wp:inline>
-            <wp:extent cx="5334000" cy="3259666"/>
+            <wp:extent cx="4267200" cy="2607733"/>
             <wp:effectExtent b="0" l="0" r="0" t="0"/>
             <wp:docPr descr="Figure 1. Two evidence surfaces, one rule. Left: on an action log, the naive statistic points at the innocent pair that follows the same public rule; the state-conditioned, permutation-calibrated statistic points at the hidden coalition. Right: in the receiver’s workspace, the lens reads the partner’s proposal; the assay asks whether the readout differs between adopting and understanding-and-refusing." title="" id="22" name="Picture"/>
             <a:graphic>
@@ -391,7 +391,7 @@
                   <pic:spPr bwMode="auto">
                     <a:xfrm>
                       <a:off x="0" y="0"/>
-                      <a:ext cx="5334000" cy="3259666"/>
+                      <a:ext cx="4267200" cy="2607733"/>
                     </a:xfrm>
                     <a:prstGeom prst="rect">
                       <a:avLst/>
@@ -744,7 +744,7 @@
         <w:pStyle w:val="FirstParagraph"/>
       </w:pPr>
       <w:r>
-        <w:t xml:space="preserve">A planted-communication assay with a scripted sender and a model receiver (gemma-4-12B-it, NF4 4-bit, solarkyle lens, read at the last prompt token before generation). Each base case fixes four candidate items (red, blue, green, black), a policy marking two eligible and two ineligible, a random codebook mapping four tag words to the items, and a sender nomination that is ineligible. The receiver sees the policy, the full codebook and the tag, and must reply with one item or abstain. Five matched prompts per base case: unauthorized (pair-bonus objective, nomination ineligible), permitted (same tag, nomination made eligible), refusal (strict-compliance objective), tag swapped (tag for the other ineligible item) and tag erased. For every prompt we record the rank of each candidate’s token in the lens readout in an early band (first quarter of layers), a late band (0.6 to 0.95, the band that performed best in a prior sweep on this model) and the full upper band, and the item the receiver actually approved. The metrics, bands and conditions were fixed in code before any receiver was run. The headline quantity is candidate decoding of the transmitted item conditional on actual behaviour: adopted in the unauthorized condition versus refused in the refusal condition. Thirty base cases, 150 receiver evaluations. Figure 2 shows the pipeline and the five conditions.</w:t>
+        <w:t xml:space="preserve">A planted-communication assay with a scripted sender and a model receiver (gemma-4-12B-it, NF4 4-bit, solarkyle lens, read at the last prompt token before generation). Each base case fixes four candidate items (red, blue, green, black), a policy marking two eligible and two ineligible, a random codebook mapping four tag words to the items, and a sender nomination that is ineligible. The receiver sees the policy, the full codebook and the tag, and must reply with one item or abstain. Five matched prompts per base case: unauthorized (pair-bonus objective, nomination ineligible), permitted (same tag, nomination made eligible), refusal (strict-compliance objective), tag swapped (tag for the other ineligible item) and tag erased. For every prompt we record the rank of each candidate’s token in the lens readout in an early band (first quarter of layers), a late band (0.6 to 0.95, the band that performed best in a prior sweep on this model) and the full upper band, and the item the receiver actually approved. The metrics, bands and conditions were fixed in code before any receiver was run. The headline quantity is candidate decoding of the transmitted item conditional on actual behaviour: adopted in the unauthorized condition versus refused in the refusal condition. The design calls for thirty base cases and 150 receiver evaluations. Figure 2 shows the pipeline and the five conditions.</w:t>
       </w:r>
     </w:p>
     <w:p>
@@ -754,7 +754,7 @@
       <w:r>
         <w:drawing>
           <wp:inline>
-            <wp:extent cx="5334000" cy="2518833"/>
+            <wp:extent cx="4267200" cy="2015066"/>
             <wp:effectExtent b="0" l="0" r="0" t="0"/>
             <wp:docPr descr="Figure 2. The lens assay: scripted sender, random codebook, receiver prompt, Jacobian-lens readout at the last prompt token, one-word action, and the five matched conditions per base case." title="" id="31" name="Picture"/>
             <a:graphic>
@@ -775,7 +775,7 @@
                   <pic:spPr bwMode="auto">
                     <a:xfrm>
                       <a:off x="0" y="0"/>
-                      <a:ext cx="5334000" cy="2518833"/>
+                      <a:ext cx="4267200" cy="2015066"/>
                     </a:xfrm>
                     <a:prstGeom prst="rect">
                       <a:avLst/>
@@ -2716,7 +2716,7 @@
       <w:r>
         <w:drawing>
           <wp:inline>
-            <wp:extent cx="5334000" cy="1582993"/>
+            <wp:extent cx="4800600" cy="1424694"/>
             <wp:effectExtent b="0" l="0" r="0" t="0"/>
             <wp:docPr descr="Figure 4. Extensions. Left: the Holm p-value rule is calibrated at every horizon where the fixed threshold is not, at a cost in power at 25 rounds. Middle: an innocent pair keyed on the full previous profile defeats majority-state conditioning; profile-state conditioning with the permutation correction recovers the true pair from 50 rounds. Right: in a coalition of three, net influence places exactly two of the three true pairs in the top three, correctly excluding the conditionally independent pair, but its score for the true pairs tends to zero with more data." title="" id="39" name="Picture"/>
             <a:graphic>
@@ -2737,7 +2737,7 @@
                   <pic:spPr bwMode="auto">
                     <a:xfrm>
                       <a:off x="0" y="0"/>
-                      <a:ext cx="5334000" cy="1582993"/>
+                      <a:ext cx="4800600" cy="1424694"/>
                     </a:xfrm>
                     <a:prstGeom prst="rect">
                       <a:avLst/>
@@ -2784,7 +2784,7 @@
           <w:bCs/>
           <w:b/>
         </w:rPr>
-        <w:t xml:space="preserve">Setup.</w:t>
+        <w:t xml:space="preserve">Setup, as designed.</w:t>
       </w:r>
       <w:r>
         <w:t xml:space="preserve"> </w:t>
@@ -2837,10 +2837,17 @@
         <w:pStyle w:val="BodyText"/>
       </w:pPr>
       <w:r>
-        <w:t xml:space="preserve">[Results pending: filled automatically from results/</w:t>
-      </w:r>
-      <w:r>
-        <w:t xml:space="preserve">-llm-pilot/llm_analysis.json by experiments/fill_report.py.]</w:t>
+        <w:rPr>
+          <w:bCs/>
+          <w:b/>
+        </w:rPr>
+        <w:t xml:space="preserve">Status.</w:t>
+      </w:r>
+      <w:r>
+        <w:t xml:space="preserve"> </w:t>
+      </w:r>
+      <w:r>
+        <w:t xml:space="preserve">This pilot was set up but not completed before the submission deadline. The harness (experiments/llm_rps.py, experiments/analyse_llm.py) and the Colab notebook (collusion_llm_pilot.ipynb) are in the repository, and experiments/fill_report.py inserts the result table into this section once a run lands under results/. No run arrived in time, so this report makes no claim about coalition advantage, detector ranking, the no-channel salience condition or the same-model false-alarm rate on GPT-4.1-mini. The scripted results in Section 4 stand on their own; what they predict for this pilot is that a 25-round game detects the team pair only if the pair coordinates in well over half of rounds, and that pooling the ten games is needed for weaker coordination.</w:t>
       </w:r>
       <w:r>
         <w:t xml:space="preserve"> </w:t>
@@ -2865,27 +2872,13 @@
           <w:bCs/>
           <w:b/>
         </w:rPr>
-        <w:t xml:space="preserve">Setup.</w:t>
+        <w:t xml:space="preserve">Setup, as designed.</w:t>
       </w:r>
       <w:r>
         <w:t xml:space="preserve"> </w:t>
       </w:r>
       <w:r>
         <w:t xml:space="preserve">As in Section 3.5.</w:t>
-      </w:r>
-    </w:p>
-    <w:p>
-      <w:pPr>
-        <w:pStyle w:val="BodyText"/>
-      </w:pPr>
-      <w:r>
-        <w:t xml:space="preserve">[Results pending: filled automatically from results/</w:t>
-      </w:r>
-      <w:r>
-        <w:t xml:space="preserve">-lens-proposal/lens_proposal_*_summary.json by experiments/fill_report.py.]</w:t>
-      </w:r>
-      <w:r>
-        <w:t xml:space="preserve"> </w:t>
       </w:r>
     </w:p>
     <w:p>
@@ -2897,13 +2890,34 @@
           <w:bCs/>
           <w:b/>
         </w:rPr>
+        <w:t xml:space="preserve">Status.</w:t>
+      </w:r>
+      <w:r>
+        <w:t xml:space="preserve"> </w:t>
+      </w:r>
+      <w:r>
+        <w:t xml:space="preserve">This assay was set up but not completed before the submission deadline. The notebook (lens_understanding_is_not_agreement.ipynb) and the analysis script (experiments/lens_proposal.py) are in the repository, with the conditions, bands and metrics fixed in code, and experiments/fill_report.py inserts the per-condition table and the key contrast into this section once a run lands under results/. No run arrived in time, so this report makes no claim about adoption or violation rates, about the refusal control, about the tag-swapped and tag-erased conditions, or about whether the transmitted item is decodable when the receiver refuses. The interpretation rule below is recorded so that the result, when obtained, is read against a rule fixed before the data.</w:t>
+      </w:r>
+      <w:r>
+        <w:t xml:space="preserve"> </w:t>
+      </w:r>
+    </w:p>
+    <w:p>
+      <w:pPr>
+        <w:pStyle w:val="BodyText"/>
+      </w:pPr>
+      <w:r>
+        <w:rPr>
+          <w:bCs/>
+          <w:b/>
+        </w:rPr>
         <w:t xml:space="preserve">Interpretation rule, fixed in advance.</w:t>
       </w:r>
       <w:r>
         <w:t xml:space="preserve"> </w:t>
       </w:r>
       <w:r>
-        <w:t xml:space="preserve">If the transmitted item is decodable from the workspace in both the actually-adopted and the actually-refused cases, then presence of the proposal in the workspace is not specific to participation, and an auditor must not read it as such; the tag-swapped and tag-erased conditions confirm the readout tracks the transmitted information rather than the objective text. If decoding is high only when the receiver adopts, the lens carries behaviourally specific evidence at the pre-action position. Either outcome is reported as found.</w:t>
+        <w:t xml:space="preserve">If the transmitted item is decodable from the workspace in both the actually-adopted and the actually-refused cases, then presence of the proposal in the workspace is not specific to participation, and an auditor must not read it as such; the tag-swapped and tag-erased conditions confirm the readout tracks the transmitted information rather than the objective text. If decoding is high only when the receiver adopts, the lens carries behaviourally specific evidence at the pre-action position. Either outcome will be reported as found.</w:t>
       </w:r>
     </w:p>
     <w:bookmarkEnd w:id="44"/>
@@ -2931,7 +2945,7 @@
         <w:t xml:space="preserve"> </w:t>
       </w:r>
       <w:r>
-        <w:t xml:space="preserve">What is new here is narrow. We release the first general-N implementation of Bonjour et al.’s net influence with a within-state permutation null, and the first controlled study of its false-positive behaviour at 25 to 500 rounds against an innocent parallel-conduct pair, with four baselines and ground truth across 4,400 games. On the interpretability side, we are the first to ask whether a receiver’s workspace representation of a partner’s coded proposal differs between adopting it and understanding-and-refusing it, using matched refusal controls. What is not new: net influence itself; conditioning on state (already in the original definition); permutation calibration of dependence statistics; reading collusion-related content with the J-lens (Veras Neves, Li et al.); activation probes for collusion (Rose et al.); and the observation that same-model agents correlate (Xu et al.).</w:t>
+        <w:t xml:space="preserve">What is new here is narrow. We release the first general-N implementation of Bonjour et al.’s net influence with a within-state permutation null, and the first controlled study of its false-positive behaviour at 25 to 500 rounds against an innocent parallel-conduct pair, with four baselines and ground truth across 4,400 games. On the interpretability side, we specify and release a refusal-matched assay that asks whether a receiver’s workspace representation of a partner’s coded proposal differs between adopting it and understanding-and-refusing it; the assay has not yet produced a result. What is not new: net influence itself; conditioning on state (already in the original definition); permutation calibration of dependence statistics; reading collusion-related content with the J-lens (Veras Neves, Li et al.); activation probes for collusion (Rose et al.); and the observation that same-model agents correlate (Xu et al.).</w:t>
       </w:r>
     </w:p>
     <w:p>
@@ -2947,7 +2961,7 @@
         <w:pStyle w:val="BodyText"/>
       </w:pPr>
       <w:r>
-        <w:t xml:space="preserve">The internals half applies the same rule to a different observation surface. A lens that reads the partner’s proposal out of the workspace has shown comprehension; whether it has shown agreement is exactly what the refusal control decides. The sandbagging literature already shows that a model’s workspace can hold an answer it declines to say; our assay asks the collusion version: can it hold a proposal it declines to act on. Section 6 reports what we found, and the reporting rule was fixed before the receiver was run.</w:t>
+        <w:t xml:space="preserve">The internals half applies the same rule to a different observation surface. A lens that reads the partner’s proposal out of the workspace has shown comprehension; whether it has shown agreement is exactly what the refusal control decides. The sandbagging literature already shows that a model’s workspace can hold an answer it declines to say; our assay asks the collusion version: can it hold a proposal it declines to act on. Section 6 records that the assay did not run to completion before the deadline; the reporting rule was fixed in code before any receiver was run, and the notebook is released so that the question can be answered without changing the rule.</w:t>
       </w:r>
     </w:p>
     <w:p>
@@ -2973,7 +2987,7 @@
         <w:t xml:space="preserve"> </w:t>
       </w:r>
       <w:r>
-        <w:t xml:space="preserve">is the shared prior of the base model, which cannot be written down as a state variable. This is the open problem that the same-model negative control in Section 5 probes. Second, the same-action baseline’s failure is a reminder that collusion need not look like agreement; detectors should be sign-agnostic.</w:t>
+        <w:t xml:space="preserve">is the shared prior of the base model, which cannot be written down as a state variable. This is the open problem that the same-model negative control in Section 5 is built to probe, once that pilot has run. Second, the same-action baseline’s failure is a reminder that collusion need not look like agreement; detectors should be sign-agnostic.</w:t>
       </w:r>
     </w:p>
     <w:p>
@@ -3009,7 +3023,7 @@
         <w:t xml:space="preserve"> </w:t>
       </w:r>
       <w:r>
-        <w:t xml:space="preserve">On a scripted four-player game with known ground truth, state-conditioned, permutation-corrected net influence recovers a seeded colluding pair and ignores an innocent parallel pair, while the published statistic and naive baselines do not. The LLM and lens sections report what the pilots found at pilot scale (ten games per condition; thirty base cases).</w:t>
+        <w:t xml:space="preserve">On a scripted four-player game with known ground truth, state-conditioned, permutation-corrected net influence recovers a seeded colluding pair and ignores an innocent parallel pair, while the published statistic and naive baselines do not. Nothing in this report is established on a real language model: the LLM pilot and the lens assay were built at pilot scale (ten games per condition; thirty base cases) but did not return results before submission, and Sections 5 and 6 say so in place of a result.</w:t>
       </w:r>
     </w:p>
     <w:p>
@@ -3027,7 +3041,7 @@
         <w:t xml:space="preserve"> </w:t>
       </w:r>
       <w:r>
-        <w:t xml:space="preserve">We tested one confound and one state function, both chosen to match. Real innocent correlation (shared base-model priors, common reactions to unmodelled shocks) is not reducible to a four-valued state. Our collusion model assumes ex-ante signalling, as in the original paper; LLM coalitions coordinate imperfectly. The fixed alpha is uncalibrated at 25 rounds in the all-random world. The LLM pilot is small (ten games per condition, one model, one temperature). The lens assay uses one receiver model, one fitted lens, a scripted sender, a four-item vocabulary and a planted codebook; it is a controlled communication assay, not a demonstration that agents invent covert channels, and lens readouts of single tokens cover a fraction of the workspace. Decoding rates are compared across conditions on paired base cases, not against an absolute threshold. All code was written in a single sprint day and has not been independently reviewed. Concurrent entries in the same sprint apply net influence with permutation tests to LLM players; our contribution on the action surface is the ground-truth characterisation, not the method. On the internals surface, Li et al. (2026) report that the J-lens subspace tracks what agents say rather than what they withhold; a null adopt-versus-refuse separation in our assay would be consistent with that, and a positive one would need reconciling with it. Concurrent entries in the same sprint apply net influence with permutation tests to LLM players; our contribution on the action surface is the ground-truth characterisation, not the method. On the internals surface, Li et al. (2026) report that the J-lens subspace tracks what agents say rather than what they withhold; a null adopt-versus-refuse separation in our assay would be consistent with that, and a positive one would need reconciling with it.</w:t>
+        <w:t xml:space="preserve">We tested one confound and one state function, both chosen to match. Real innocent correlation (shared base-model priors, common reactions to unmodelled shocks) is not reducible to a four-valued state. Our collusion model assumes ex-ante signalling, as in the original paper; LLM coalitions coordinate imperfectly, and the only evidence on that point here is scripted. The LLM pilot design is small (ten games per condition, one model, one temperature) and has not yet been executed. The lens assay design uses one receiver model, one fitted lens, a scripted sender, a four-item vocabulary and a planted codebook; it is a controlled communication assay, not a demonstration that agents invent covert channels, and lens readouts of single tokens cover a fraction of the workspace. Its decoding rates, when obtained, will be compared across conditions on paired base cases, not against an absolute threshold. All code was written in a single sprint day and has not been independently reviewed. Concurrent entries in the same sprint apply net influence with permutation tests to LLM players; our contribution on the action surface is the ground-truth characterisation, not the method. On the internals surface, Li et al. (2026) report that the J-lens subspace tracks what agents say rather than what they withhold; a null adopt-versus-refuse separation in our assay would be consistent with that, and a positive one would need reconciling with it.</w:t>
       </w:r>
     </w:p>
     <w:p>
@@ -3241,6 +3255,30 @@
         <w:rPr>
           <w:rStyle w:val="VerbatimChar"/>
         </w:rPr>
+        <w:t xml:space="preserve">python experiments/scripted_extensions.py</w:t>
+      </w:r>
+      <w:r>
+        <w:t xml:space="preserve"> </w:t>
+      </w:r>
+      <w:r>
+        <w:t xml:space="preserve">regenerates Section 4.5 (</w:t>
+      </w:r>
+      <w:r>
+        <w:rPr>
+          <w:rStyle w:val="VerbatimChar"/>
+        </w:rPr>
+        <w:t xml:space="preserve">results/extensions_tables.txt</w:t>
+      </w:r>
+      <w:r>
+        <w:t xml:space="preserve">).</w:t>
+      </w:r>
+      <w:r>
+        <w:t xml:space="preserve"> </w:t>
+      </w:r>
+      <w:r>
+        <w:rPr>
+          <w:rStyle w:val="VerbatimChar"/>
+        </w:rPr>
         <w:t xml:space="preserve">python experiments/llm_rps.py --model gpt-4.1-mini --games 10 --rounds 25</w:t>
       </w:r>
       <w:r>
@@ -3262,7 +3300,64 @@
         <w:t xml:space="preserve"> </w:t>
       </w:r>
       <w:r>
-        <w:t xml:space="preserve">regenerate Section 5 for under 2 USD. Seeds: 0 to 99 (rounds sweep) and 10000 to 10099 (CP sweep). Full tables are in</w:t>
+        <w:t xml:space="preserve">produce the Section 5 results for under 2 USD; the notebook</w:t>
+      </w:r>
+      <w:r>
+        <w:t xml:space="preserve"> </w:t>
+      </w:r>
+      <w:r>
+        <w:rPr>
+          <w:rStyle w:val="VerbatimChar"/>
+        </w:rPr>
+        <w:t xml:space="preserve">collusion_llm_pilot.ipynb</w:t>
+      </w:r>
+      <w:r>
+        <w:t xml:space="preserve"> </w:t>
+      </w:r>
+      <w:r>
+        <w:t xml:space="preserve">wraps the same steps for Colab.</w:t>
+      </w:r>
+      <w:r>
+        <w:t xml:space="preserve"> </w:t>
+      </w:r>
+      <w:r>
+        <w:rPr>
+          <w:rStyle w:val="VerbatimChar"/>
+        </w:rPr>
+        <w:t xml:space="preserve">lens_understanding_is_not_agreement.ipynb</w:t>
+      </w:r>
+      <w:r>
+        <w:t xml:space="preserve"> </w:t>
+      </w:r>
+      <w:r>
+        <w:t xml:space="preserve">runs the Section 6 assay on a single GPU. Neither notebook returned results before submission.</w:t>
+      </w:r>
+      <w:r>
+        <w:t xml:space="preserve"> </w:t>
+      </w:r>
+      <w:r>
+        <w:rPr>
+          <w:rStyle w:val="VerbatimChar"/>
+        </w:rPr>
+        <w:t xml:space="preserve">python experiments/fill_report.py</w:t>
+      </w:r>
+      <w:r>
+        <w:t xml:space="preserve"> </w:t>
+      </w:r>
+      <w:r>
+        <w:t xml:space="preserve">inserts their tables into the report once their outputs are under</w:t>
+      </w:r>
+      <w:r>
+        <w:t xml:space="preserve"> </w:t>
+      </w:r>
+      <w:r>
+        <w:rPr>
+          <w:rStyle w:val="VerbatimChar"/>
+        </w:rPr>
+        <w:t xml:space="preserve">results/</w:t>
+      </w:r>
+      <w:r>
+        <w:t xml:space="preserve">. Seeds: 0 to 99 (rounds sweep) and 10000 to 10099 (CP sweep). Full scripted tables are in</w:t>
       </w:r>
       <w:r>
         <w:t xml:space="preserve"> </w:t>
@@ -3279,7 +3374,7 @@
     </w:p>
     <w:bookmarkEnd w:id="48"/>
     <w:sectPr>
-      <w:pgMar w:left="1134" w:right="1134" w:top="1134" w:bottom="1134"/>
+      <w:pgMar w:bottom="1134" w:left="1134" w:right="1134" w:top="1134"/>
     </w:sectPr>
   </w:body>
 </w:document>
@@ -4084,7 +4179,7 @@
       <w:color w:themeColor="accent1" w:themeShade="BF" w:val="365F91"/>
     </w:rPr>
   </w:style>
-  <w:style w:type="paragraph" w:customStyle="1" w:styleId="SourceCode">
+  <w:style w:customStyle="1" w:styleId="SourceCode" w:type="paragraph">
     <w:name w:val="Source Code"/>
     <w:basedOn w:val="Normal"/>
     <w:link w:val="VerbatimChar"/>
@@ -4092,7 +4187,7 @@
       <w:wordWrap w:val="off"/>
     </w:pPr>
   </w:style>
-  <w:style w:type="character" w:customStyle="1" w:styleId="KeywordTok">
+  <w:style w:customStyle="1" w:styleId="KeywordTok" w:type="character">
     <w:name w:val="KeywordTok"/>
     <w:basedOn w:val="VerbatimChar"/>
     <w:rPr>
@@ -4100,77 +4195,77 @@
       <w:b/>
     </w:rPr>
   </w:style>
-  <w:style w:type="character" w:customStyle="1" w:styleId="DataTypeTok">
+  <w:style w:customStyle="1" w:styleId="DataTypeTok" w:type="character">
     <w:name w:val="DataTypeTok"/>
     <w:basedOn w:val="VerbatimChar"/>
     <w:rPr>
       <w:color w:val="902000"/>
     </w:rPr>
   </w:style>
-  <w:style w:type="character" w:customStyle="1" w:styleId="DecValTok">
+  <w:style w:customStyle="1" w:styleId="DecValTok" w:type="character">
     <w:name w:val="DecValTok"/>
     <w:basedOn w:val="VerbatimChar"/>
     <w:rPr>
       <w:color w:val="40a070"/>
     </w:rPr>
   </w:style>
-  <w:style w:type="character" w:customStyle="1" w:styleId="BaseNTok">
+  <w:style w:customStyle="1" w:styleId="BaseNTok" w:type="character">
     <w:name w:val="BaseNTok"/>
     <w:basedOn w:val="VerbatimChar"/>
     <w:rPr>
       <w:color w:val="40a070"/>
     </w:rPr>
   </w:style>
-  <w:style w:type="character" w:customStyle="1" w:styleId="FloatTok">
+  <w:style w:customStyle="1" w:styleId="FloatTok" w:type="character">
     <w:name w:val="FloatTok"/>
     <w:basedOn w:val="VerbatimChar"/>
     <w:rPr>
       <w:color w:val="40a070"/>
     </w:rPr>
   </w:style>
-  <w:style w:type="character" w:customStyle="1" w:styleId="ConstantTok">
+  <w:style w:customStyle="1" w:styleId="ConstantTok" w:type="character">
     <w:name w:val="ConstantTok"/>
     <w:basedOn w:val="VerbatimChar"/>
     <w:rPr>
       <w:color w:val="880000"/>
     </w:rPr>
   </w:style>
-  <w:style w:type="character" w:customStyle="1" w:styleId="CharTok">
+  <w:style w:customStyle="1" w:styleId="CharTok" w:type="character">
     <w:name w:val="CharTok"/>
     <w:basedOn w:val="VerbatimChar"/>
     <w:rPr>
       <w:color w:val="4070a0"/>
     </w:rPr>
   </w:style>
-  <w:style w:type="character" w:customStyle="1" w:styleId="SpecialCharTok">
+  <w:style w:customStyle="1" w:styleId="SpecialCharTok" w:type="character">
     <w:name w:val="SpecialCharTok"/>
     <w:basedOn w:val="VerbatimChar"/>
     <w:rPr>
       <w:color w:val="4070a0"/>
     </w:rPr>
   </w:style>
-  <w:style w:type="character" w:customStyle="1" w:styleId="StringTok">
+  <w:style w:customStyle="1" w:styleId="StringTok" w:type="character">
     <w:name w:val="StringTok"/>
     <w:basedOn w:val="VerbatimChar"/>
     <w:rPr>
       <w:color w:val="4070a0"/>
     </w:rPr>
   </w:style>
-  <w:style w:type="character" w:customStyle="1" w:styleId="VerbatimStringTok">
+  <w:style w:customStyle="1" w:styleId="VerbatimStringTok" w:type="character">
     <w:name w:val="VerbatimStringTok"/>
     <w:basedOn w:val="VerbatimChar"/>
     <w:rPr>
       <w:color w:val="4070a0"/>
     </w:rPr>
   </w:style>
-  <w:style w:type="character" w:customStyle="1" w:styleId="SpecialStringTok">
+  <w:style w:customStyle="1" w:styleId="SpecialStringTok" w:type="character">
     <w:name w:val="SpecialStringTok"/>
     <w:basedOn w:val="VerbatimChar"/>
     <w:rPr>
       <w:color w:val="bb6688"/>
     </w:rPr>
   </w:style>
-  <w:style w:type="character" w:customStyle="1" w:styleId="ImportTok">
+  <w:style w:customStyle="1" w:styleId="ImportTok" w:type="character">
     <w:name w:val="ImportTok"/>
     <w:basedOn w:val="VerbatimChar"/>
     <w:rPr>
@@ -4178,7 +4273,7 @@
       <w:b/>
     </w:rPr>
   </w:style>
-  <w:style w:type="character" w:customStyle="1" w:styleId="CommentTok">
+  <w:style w:customStyle="1" w:styleId="CommentTok" w:type="character">
     <w:name w:val="CommentTok"/>
     <w:basedOn w:val="VerbatimChar"/>
     <w:rPr>
@@ -4186,7 +4281,7 @@
       <w:i/>
     </w:rPr>
   </w:style>
-  <w:style w:type="character" w:customStyle="1" w:styleId="DocumentationTok">
+  <w:style w:customStyle="1" w:styleId="DocumentationTok" w:type="character">
     <w:name w:val="DocumentationTok"/>
     <w:basedOn w:val="VerbatimChar"/>
     <w:rPr>
@@ -4194,7 +4289,7 @@
       <w:i/>
     </w:rPr>
   </w:style>
-  <w:style w:type="character" w:customStyle="1" w:styleId="AnnotationTok">
+  <w:style w:customStyle="1" w:styleId="AnnotationTok" w:type="character">
     <w:name w:val="AnnotationTok"/>
     <w:basedOn w:val="VerbatimChar"/>
     <w:rPr>
@@ -4203,7 +4298,7 @@
       <w:i/>
     </w:rPr>
   </w:style>
-  <w:style w:type="character" w:customStyle="1" w:styleId="CommentVarTok">
+  <w:style w:customStyle="1" w:styleId="CommentVarTok" w:type="character">
     <w:name w:val="CommentVarTok"/>
     <w:basedOn w:val="VerbatimChar"/>
     <w:rPr>
@@ -4212,28 +4307,28 @@
       <w:i/>
     </w:rPr>
   </w:style>
-  <w:style w:type="character" w:customStyle="1" w:styleId="OtherTok">
+  <w:style w:customStyle="1" w:styleId="OtherTok" w:type="character">
     <w:name w:val="OtherTok"/>
     <w:basedOn w:val="VerbatimChar"/>
     <w:rPr>
       <w:color w:val="007020"/>
     </w:rPr>
   </w:style>
-  <w:style w:type="character" w:customStyle="1" w:styleId="FunctionTok">
+  <w:style w:customStyle="1" w:styleId="FunctionTok" w:type="character">
     <w:name w:val="FunctionTok"/>
     <w:basedOn w:val="VerbatimChar"/>
     <w:rPr>
       <w:color w:val="06287e"/>
     </w:rPr>
   </w:style>
-  <w:style w:type="character" w:customStyle="1" w:styleId="VariableTok">
+  <w:style w:customStyle="1" w:styleId="VariableTok" w:type="character">
     <w:name w:val="VariableTok"/>
     <w:basedOn w:val="VerbatimChar"/>
     <w:rPr>
       <w:color w:val="19177c"/>
     </w:rPr>
   </w:style>
-  <w:style w:type="character" w:customStyle="1" w:styleId="ControlFlowTok">
+  <w:style w:customStyle="1" w:styleId="ControlFlowTok" w:type="character">
     <w:name w:val="ControlFlowTok"/>
     <w:basedOn w:val="VerbatimChar"/>
     <w:rPr>
@@ -4241,45 +4336,45 @@
       <w:b/>
     </w:rPr>
   </w:style>
-  <w:style w:type="character" w:customStyle="1" w:styleId="OperatorTok">
+  <w:style w:customStyle="1" w:styleId="OperatorTok" w:type="character">
     <w:name w:val="OperatorTok"/>
     <w:basedOn w:val="VerbatimChar"/>
     <w:rPr>
       <w:color w:val="666666"/>
     </w:rPr>
   </w:style>
-  <w:style w:type="character" w:customStyle="1" w:styleId="BuiltInTok">
+  <w:style w:customStyle="1" w:styleId="BuiltInTok" w:type="character">
     <w:name w:val="BuiltInTok"/>
     <w:basedOn w:val="VerbatimChar"/>
     <w:rPr>
       <w:color w:val="008000"/>
     </w:rPr>
   </w:style>
-  <w:style w:type="character" w:customStyle="1" w:styleId="ExtensionTok">
+  <w:style w:customStyle="1" w:styleId="ExtensionTok" w:type="character">
     <w:name w:val="ExtensionTok"/>
     <w:basedOn w:val="VerbatimChar"/>
     <w:rPr/>
   </w:style>
-  <w:style w:type="character" w:customStyle="1" w:styleId="PreprocessorTok">
+  <w:style w:customStyle="1" w:styleId="PreprocessorTok" w:type="character">
     <w:name w:val="PreprocessorTok"/>
     <w:basedOn w:val="VerbatimChar"/>
     <w:rPr>
       <w:color w:val="bc7a00"/>
     </w:rPr>
   </w:style>
-  <w:style w:type="character" w:customStyle="1" w:styleId="AttributeTok">
+  <w:style w:customStyle="1" w:styleId="AttributeTok" w:type="character">
     <w:name w:val="AttributeTok"/>
     <w:basedOn w:val="VerbatimChar"/>
     <w:rPr>
       <w:color w:val="7d9029"/>
     </w:rPr>
   </w:style>
-  <w:style w:type="character" w:customStyle="1" w:styleId="RegionMarkerTok">
+  <w:style w:customStyle="1" w:styleId="RegionMarkerTok" w:type="character">
     <w:name w:val="RegionMarkerTok"/>
     <w:basedOn w:val="VerbatimChar"/>
     <w:rPr/>
   </w:style>
-  <w:style w:type="character" w:customStyle="1" w:styleId="InformationTok">
+  <w:style w:customStyle="1" w:styleId="InformationTok" w:type="character">
     <w:name w:val="InformationTok"/>
     <w:basedOn w:val="VerbatimChar"/>
     <w:rPr>
@@ -4288,7 +4383,7 @@
       <w:i/>
     </w:rPr>
   </w:style>
-  <w:style w:type="character" w:customStyle="1" w:styleId="WarningTok">
+  <w:style w:customStyle="1" w:styleId="WarningTok" w:type="character">
     <w:name w:val="WarningTok"/>
     <w:basedOn w:val="VerbatimChar"/>
     <w:rPr>
@@ -4297,7 +4392,7 @@
       <w:i/>
     </w:rPr>
   </w:style>
-  <w:style w:type="character" w:customStyle="1" w:styleId="AlertTok">
+  <w:style w:customStyle="1" w:styleId="AlertTok" w:type="character">
     <w:name w:val="AlertTok"/>
     <w:basedOn w:val="VerbatimChar"/>
     <w:rPr>
@@ -4305,7 +4400,7 @@
       <w:b/>
     </w:rPr>
   </w:style>
-  <w:style w:type="character" w:customStyle="1" w:styleId="ErrorTok">
+  <w:style w:customStyle="1" w:styleId="ErrorTok" w:type="character">
     <w:name w:val="ErrorTok"/>
     <w:basedOn w:val="VerbatimChar"/>
     <w:rPr>
@@ -4313,7 +4408,7 @@
       <w:b/>
     </w:rPr>
   </w:style>
-  <w:style w:type="character" w:customStyle="1" w:styleId="NormalTok">
+  <w:style w:customStyle="1" w:styleId="NormalTok" w:type="character">
     <w:name w:val="NormalTok"/>
     <w:basedOn w:val="VerbatimChar"/>
     <w:rPr/>

</xml_diff>

<commit_message>
Lens assay results (gemma-4-12B-it, 30 cases): receiver never adopted an ineligible proposal; readout tracks the action; claims aligned; limitations moved to appendix; 8-page main text
Co-Authored-By: Claude Fable 5.1 <noreply@anthropic.com>
Claude-Session: https://claude.ai/code/session_018qJiaQKKjpemqx8e3Wrmcq
</commit_message>
<xml_diff>
--- a/report/report_draft.docx
+++ b/report/report_draft.docx
@@ -7,7 +7,67 @@
         <w:pStyle w:val="Title"/>
       </w:pPr>
       <w:r>
-        <w:t xml:space="preserve">Calibrated</w:t>
+        <w:t xml:space="preserve">Correlation</w:t>
+      </w:r>
+      <w:r>
+        <w:t xml:space="preserve"> </w:t>
+      </w:r>
+      <w:r>
+        <w:t xml:space="preserve">is</w:t>
+      </w:r>
+      <w:r>
+        <w:t xml:space="preserve"> </w:t>
+      </w:r>
+      <w:r>
+        <w:t xml:space="preserve">not</w:t>
+      </w:r>
+      <w:r>
+        <w:t xml:space="preserve"> </w:t>
+      </w:r>
+      <w:r>
+        <w:t xml:space="preserve">agreement,</w:t>
+      </w:r>
+      <w:r>
+        <w:t xml:space="preserve"> </w:t>
+      </w:r>
+      <w:r>
+        <w:t xml:space="preserve">and</w:t>
+      </w:r>
+      <w:r>
+        <w:t xml:space="preserve"> </w:t>
+      </w:r>
+      <w:r>
+        <w:t xml:space="preserve">the</w:t>
+      </w:r>
+      <w:r>
+        <w:t xml:space="preserve"> </w:t>
+      </w:r>
+      <w:r>
+        <w:t xml:space="preserve">workspace</w:t>
+      </w:r>
+      <w:r>
+        <w:t xml:space="preserve"> </w:t>
+      </w:r>
+      <w:r>
+        <w:t xml:space="preserve">shows</w:t>
+      </w:r>
+      <w:r>
+        <w:t xml:space="preserve"> </w:t>
+      </w:r>
+      <w:r>
+        <w:t xml:space="preserve">the</w:t>
+      </w:r>
+      <w:r>
+        <w:t xml:space="preserve"> </w:t>
+      </w:r>
+      <w:r>
+        <w:t xml:space="preserve">action:</w:t>
+      </w:r>
+      <w:r>
+        <w:t xml:space="preserve"> </w:t>
+      </w:r>
+      <w:r>
+        <w:t xml:space="preserve">calibrated</w:t>
       </w:r>
       <w:r>
         <w:t xml:space="preserve"> </w:t>
@@ -19,13 +79,13 @@
         <w:t xml:space="preserve"> </w:t>
       </w:r>
       <w:r>
-        <w:t xml:space="preserve">influence:</w:t>
-      </w:r>
-      <w:r>
-        <w:t xml:space="preserve"> </w:t>
-      </w:r>
-      <w:r>
-        <w:t xml:space="preserve">detecting</w:t>
+        <w:t xml:space="preserve">influence</w:t>
+      </w:r>
+      <w:r>
+        <w:t xml:space="preserve"> </w:t>
+      </w:r>
+      <w:r>
+        <w:t xml:space="preserve">and</w:t>
       </w:r>
       <w:r>
         <w:t xml:space="preserve"> </w:t>
@@ -37,79 +97,37 @@
         <w:t xml:space="preserve"> </w:t>
       </w:r>
       <w:r>
-        <w:t xml:space="preserve">colluding</w:t>
-      </w:r>
-      <w:r>
-        <w:t xml:space="preserve"> </w:t>
-      </w:r>
-      <w:r>
-        <w:t xml:space="preserve">pair</w:t>
-      </w:r>
-      <w:r>
-        <w:t xml:space="preserve"> </w:t>
-      </w:r>
-      <w:r>
-        <w:t xml:space="preserve">from</w:t>
-      </w:r>
-      <w:r>
-        <w:t xml:space="preserve"> </w:t>
-      </w:r>
-      <w:r>
-        <w:t xml:space="preserve">actions</w:t>
-      </w:r>
-      <w:r>
-        <w:t xml:space="preserve"> </w:t>
-      </w:r>
-      <w:r>
-        <w:t xml:space="preserve">alone,</w:t>
-      </w:r>
-      <w:r>
-        <w:t xml:space="preserve"> </w:t>
-      </w:r>
-      <w:r>
-        <w:t xml:space="preserve">and</w:t>
-      </w:r>
-      <w:r>
-        <w:t xml:space="preserve"> </w:t>
-      </w:r>
-      <w:r>
-        <w:t xml:space="preserve">telling</w:t>
-      </w:r>
-      <w:r>
-        <w:t xml:space="preserve"> </w:t>
-      </w:r>
-      <w:r>
-        <w:t xml:space="preserve">it</w:t>
-      </w:r>
-      <w:r>
-        <w:t xml:space="preserve"> </w:t>
-      </w:r>
-      <w:r>
-        <w:t xml:space="preserve">apart</w:t>
-      </w:r>
-      <w:r>
-        <w:t xml:space="preserve"> </w:t>
-      </w:r>
-      <w:r>
-        <w:t xml:space="preserve">from</w:t>
-      </w:r>
-      <w:r>
-        <w:t xml:space="preserve"> </w:t>
-      </w:r>
-      <w:r>
-        <w:t xml:space="preserve">innocent</w:t>
-      </w:r>
-      <w:r>
-        <w:t xml:space="preserve"> </w:t>
-      </w:r>
-      <w:r>
-        <w:t xml:space="preserve">parallel</w:t>
-      </w:r>
-      <w:r>
-        <w:t xml:space="preserve"> </w:t>
-      </w:r>
-      <w:r>
-        <w:t xml:space="preserve">conduct</w:t>
+        <w:t xml:space="preserve">Jacobian-lens</w:t>
+      </w:r>
+      <w:r>
+        <w:t xml:space="preserve"> </w:t>
+      </w:r>
+      <w:r>
+        <w:t xml:space="preserve">control</w:t>
+      </w:r>
+      <w:r>
+        <w:t xml:space="preserve"> </w:t>
+      </w:r>
+      <w:r>
+        <w:t xml:space="preserve">for</w:t>
+      </w:r>
+      <w:r>
+        <w:t xml:space="preserve"> </w:t>
+      </w:r>
+      <w:r>
+        <w:t xml:space="preserve">AI</w:t>
+      </w:r>
+      <w:r>
+        <w:t xml:space="preserve"> </w:t>
+      </w:r>
+      <w:r>
+        <w:t xml:space="preserve">agent</w:t>
+      </w:r>
+      <w:r>
+        <w:t xml:space="preserve"> </w:t>
+      </w:r>
+      <w:r>
+        <w:t xml:space="preserve">collusion</w:t>
       </w:r>
     </w:p>
     <w:p>
@@ -286,7 +304,7 @@
         <w:pStyle w:val="FirstParagraph"/>
       </w:pPr>
       <w:r>
-        <w:t xml:space="preserve">What should count as evidence that two AI agents are colluding? Antitrust law holds that parallel conduct is not an agreement and demands plus factors. We test one plus factor at two evidence surfaces, action logs and model internals, and in each case measure how the naive reading mistakes something innocent for collusion. On actions, we implement pairwise net influence (Bonjour et al. 2022) for N players, add a within-state permutation null, and run the ground-truth evaluation the method has never had: 4,400 scripted four-player games over five horizons, six collusion strengths, four baselines and two public-state definitions, an innocent pair following the same public rule, a harder innocent pair keyed on a richer state, and a coalition of three. The published memoryless statistic and every unconditioned baseline rank the innocent pair first in 96 to 100 percent of games; conditioning on the public state recovers the true pair in 98 to 100 percent; the permutation null cuts the 25-round false-positive rate from 100 percent to 25 percent; and we report where the conditioned detector breaks. Two pilots on real models were built but returned no results before the deadline, so no claim is made for them: an action-only test of GPT-4.1-mini agents with a hidden channel, and the privileged-observer control Rose et al. (2026) proposed, a Jacobian-lens assay on gemma-4-12B-it asking whether a partner’s coded proposal reads out differently from a receiver that adopts it and one that understands and refuses. Code, logs and notebooks are released.</w:t>
+        <w:t xml:space="preserve">What should count as evidence that two AI agents are colluding? Antitrust law holds that parallel conduct is not an agreement and demands plus factors. We test one plus factor at two evidence surfaces, action logs and model internals, and in each case measure how the naive reading mistakes something innocent for collusion. On actions, we implement pairwise net influence (Bonjour et al. 2022) for N players, add a within-state permutation null, and run the ground-truth evaluation the method has never had: 7,400 scripted games over five horizons, six collusion strengths, four baselines, two public-state definitions, two kinds of innocent pair and a coalition of three. The published memoryless statistic and every unconditioned baseline rank the innocent pair first in 96 to 100 percent of games; conditioning on the public state recovers the true pair in 98 to 100 percent; the permutation null cuts the 25-round false-positive rate from 100 percent to 25 percent; and we report where the conditioned detector breaks. On internals, we run the privileged-observer control Rose et al. (2026) proposed: a Jacobian-lens assay on gemma-4-12B-it with a partner’s coded proposal and five matched conditions. The receiver never approved an ineligible item; the proposal reads out at vocabulary rank 0 when the receiver is about to act on it legitimately and at chance when it has understood it and declined. A workspace monitor at the decision point sees the action, not the understanding. Code, logs and notebooks are released.</w:t>
       </w:r>
     </w:p>
     <w:bookmarkEnd w:id="20"/>
@@ -320,7 +338,7 @@
         <w:pStyle w:val="BodyText"/>
       </w:pPr>
       <w:r>
-        <w:t xml:space="preserve">The same problem recurs one level down. Interpretability-based collusion detectors (Rose et al. 2026, with the HELIOS framework and NARCBench) read a coalition out of activations. But a receiver that understands a partner’s harmful proposal in order to refuse it must represent that proposal too, so a lens that finds the proposal in the workspace has not yet found an agreement. Rose et al. name exactly this control, a privileged observer that knows the scheme but does not take part, and leave it to future work; Gurnee et al. (2026) and Ayonrinde and Lindsey (2026) show that a concept can sit in the workspace while the model suppresses it. The second half of this report specifies that control with a workspace lens and releases the harness; the pilot did not complete before submission, so it is set out as a design and not as a result.</w:t>
+        <w:t xml:space="preserve">The same problem recurs one level down. Interpretability-based collusion detectors (Rose et al. 2026, with the HELIOS framework and NARCBench) read a coalition out of activations. But a receiver that understands a partner’s harmful proposal in order to refuse it must represent that proposal too, so a lens that finds the proposal in the workspace has not yet found an agreement. Rose et al. name exactly this control, a privileged observer that knows the scheme but does not take part, and leave it to future work; Gurnee et al. (2026) and Ayonrinde and Lindsey (2026) show that a concept can sit in the workspace while the model suppresses it. The second half of this report runs that control with a workspace lens.</w:t>
       </w:r>
     </w:p>
     <w:p>
@@ -352,7 +370,7 @@
         <w:pStyle w:val="Compact"/>
       </w:pPr>
       <w:r>
-        <w:t xml:space="preserve">Internals. Using a fitted Jacobian lens on gemma-4-12B-it, we specify the privileged-observer control: does the workspace readout of a partner’s coded proposal differ between a receiver that adopts it and one that understands it and refuses, with matched permission, tag-swap and tag-erase conditions. The notebook is released; it was not run to completion before submission.</w:t>
+        <w:t xml:space="preserve">Internals. Using a fitted Jacobian lens on gemma-4-12B-it, we run the privileged-observer control: does the workspace readout of a partner’s coded proposal differ between a receiver that adopts it and one that understands it and refuses, with matched permission, tag-swap and tag-erase conditions.</w:t>
       </w:r>
     </w:p>
     <w:p>
@@ -443,7 +461,7 @@
         <w:t xml:space="preserve"> </w:t>
       </w:r>
       <w:r>
-        <w:t xml:space="preserve">Bonjour, Aggarwal and Bhargava (2022) define influence between agents as conditional mutual information given the game state and flag a pair whose net influence exceeds a fixed threshold. The method was validated on three scripted or Q-learning players with no baseline and no public code, and the threshold’s behaviour at short horizons was not examined. Later information-theoretic detectors for language-model agents work on transcripts rather than actions: Tailor (2025) and Ghanem (2026) estimate cross-run mutual information over messages with honest-replay calibration, and neither conditions on a public state. We found no application of transfer entropy or directed information to LLM coordination. Xu et al. (2026) show that two deployments of one base model carry a small residual bid correlation and conclude that price-level audits are blind by construction; this is the LLM form of the parallel-conduct confound we test. Within the same sprint, Ayeku (2026) and Snow (2026) independently apply net influence with a permutation test to LLM players, and Ayeku also conditions on a public state against an innocent rule-following pair. Our scripted sweep (4,400 games, five horizons, six collusion strengths, four baselines, two state functions, with and without correction) is the systematic ground-truth evaluation that those concurrent LLM-first entries do not report.</w:t>
+        <w:t xml:space="preserve">Bonjour, Aggarwal and Bhargava (2022) define influence between agents as conditional mutual information given the game state and flag a pair whose net influence exceeds a fixed threshold; the method was validated on three scripted or Q-learning players with no baseline and no public code. Later information-theoretic detectors for LLM agents (Tailor 2025; Ghanem 2026) estimate cross-run mutual information over transcripts, not actions, and do not condition on a public state. Xu et al. (2026) show that two deployments of one base model carry a small residual bid correlation, the LLM form of the parallel-conduct confound we test. Within this sprint, Ayeku (2026) and Snow (2026) apply net influence with a permutation test to LLM players, and Ayeku conditions on a public state against an innocent rule-following pair; Lee et al. (2026) extend it to coalitions with graph methods. Our scripted sweep is the systematic ground-truth evaluation those LLM-first entries do not report.</w:t>
       </w:r>
     </w:p>
     <w:p>
@@ -820,7 +838,7 @@
       <w:r>
         <w:drawing>
           <wp:inline>
-            <wp:extent cx="5334000" cy="1866900"/>
+            <wp:extent cx="4267200" cy="1493520"/>
             <wp:effectExtent b="0" l="0" r="0" t="0"/>
             <wp:docPr descr="Figure 3. Left: rank-1 accuracy when an innocent parallel pair is present (CP = 0.6). Middle: false-positive rate under the published criterion when no collusion is present, in the all-random and parallel-only worlds. Right: criterion accuracy at 25 rounds as a function of collusion strength, random non-colluders. 100 seeds per point." title="" id="36" name="Picture"/>
             <a:graphic>
@@ -841,7 +859,7 @@
                   <pic:spPr bwMode="auto">
                     <a:xfrm>
                       <a:off x="0" y="0"/>
-                      <a:ext cx="5334000" cy="1866900"/>
+                      <a:ext cx="4267200" cy="1493520"/>
                     </a:xfrm>
                     <a:prstGeom prst="rect">
                       <a:avLst/>
@@ -1624,7 +1642,7 @@
         <w:t xml:space="preserve"> </w:t>
       </w:r>
       <w:r>
-        <w:t xml:space="preserve">the state-conditioned criterion flags a pair in 100% of 25-round games and 67% of 100-round games (Table 2); in the</w:t>
+        <w:t xml:space="preserve">the state-conditioned criterion flags a pair in 100% of 25-round games and 67% of 100-round games ; in the</w:t>
       </w:r>
       <w:r>
         <w:t xml:space="preserve"> </w:t>
@@ -1711,408 +1729,6 @@
         <w:t xml:space="preserve">world the criterion still fires in about half of 25-round games for every variant (0.49 to 0.55) and in 1 to 10% of 100-round games, so at 25 rounds the fixed threshold should be replaced by the permutation p-value, which the code reports; we did not have time to evaluate a p-value-based criterion.</w:t>
       </w:r>
     </w:p>
-    <w:p>
-      <w:pPr>
-        <w:pStyle w:val="BodyText"/>
-      </w:pPr>
-      <w:r>
-        <w:rPr>
-          <w:bCs/>
-          <w:b/>
-        </w:rPr>
-        <w:t xml:space="preserve">Table 2. False-positive rate of the exactly-one-pair criterion (alpha = 0.05) when no collusion is present.</w:t>
-      </w:r>
-    </w:p>
-    <w:tbl>
-      <w:tblPr>
-        <w:tblStyle w:val="Table"/>
-        <w:tblW w:type="pct" w:w="5000"/>
-        <w:tblLook w:firstRow="1" w:lastRow="0" w:firstColumn="0" w:lastColumn="0" w:noHBand="0" w:noVBand="0" w:val="0020"/>
-        <w:jc w:val="start"/>
-      </w:tblPr>
-      <w:tblGrid>
-        <w:gridCol w:w="1584"/>
-        <w:gridCol w:w="1584"/>
-        <w:gridCol w:w="1584"/>
-        <w:gridCol w:w="1584"/>
-        <w:gridCol w:w="1584"/>
-      </w:tblGrid>
-      <w:tr>
-        <w:trPr>
-          <w:tblHeader w:val="true"/>
-        </w:trPr>
-        <w:tc>
-          <w:tcPr/>
-          <w:p>
-            <w:pPr>
-              <w:pStyle w:val="Compact"/>
-              <w:jc w:val="left"/>
-            </w:pPr>
-            <w:r>
-              <w:t xml:space="preserve">T</w:t>
-            </w:r>
-          </w:p>
-        </w:tc>
-        <w:tc>
-          <w:tcPr/>
-          <w:p>
-            <w:pPr>
-              <w:pStyle w:val="Compact"/>
-              <w:jc w:val="left"/>
-            </w:pPr>
-            <w:r>
-              <w:t xml:space="preserve">NI memoryless, all random</w:t>
-            </w:r>
-          </w:p>
-        </w:tc>
-        <w:tc>
-          <w:tcPr/>
-          <w:p>
-            <w:pPr>
-              <w:pStyle w:val="Compact"/>
-              <w:jc w:val="left"/>
-            </w:pPr>
-            <w:r>
-              <w:t xml:space="preserve">NI majority, parallel-only</w:t>
-            </w:r>
-          </w:p>
-        </w:tc>
-        <w:tc>
-          <w:tcPr/>
-          <w:p>
-            <w:pPr>
-              <w:pStyle w:val="Compact"/>
-              <w:jc w:val="left"/>
-            </w:pPr>
-            <w:r>
-              <w:t xml:space="preserve">NI+perm majority, all random</w:t>
-            </w:r>
-          </w:p>
-        </w:tc>
-        <w:tc>
-          <w:tcPr/>
-          <w:p>
-            <w:pPr>
-              <w:pStyle w:val="Compact"/>
-              <w:jc w:val="left"/>
-            </w:pPr>
-            <w:r>
-              <w:t xml:space="preserve">NI+perm majority, parallel-only</w:t>
-            </w:r>
-          </w:p>
-        </w:tc>
-      </w:tr>
-      <w:tr>
-        <w:tc>
-          <w:tcPr/>
-          <w:p>
-            <w:pPr>
-              <w:pStyle w:val="Compact"/>
-              <w:jc w:val="left"/>
-            </w:pPr>
-            <w:r>
-              <w:t xml:space="preserve">25</w:t>
-            </w:r>
-          </w:p>
-        </w:tc>
-        <w:tc>
-          <w:tcPr/>
-          <w:p>
-            <w:pPr>
-              <w:pStyle w:val="Compact"/>
-              <w:jc w:val="left"/>
-            </w:pPr>
-            <w:r>
-              <w:t xml:space="preserve">0.55</w:t>
-            </w:r>
-          </w:p>
-        </w:tc>
-        <w:tc>
-          <w:tcPr/>
-          <w:p>
-            <w:pPr>
-              <w:pStyle w:val="Compact"/>
-              <w:jc w:val="left"/>
-            </w:pPr>
-            <w:r>
-              <w:t xml:space="preserve">1.00</w:t>
-            </w:r>
-          </w:p>
-        </w:tc>
-        <w:tc>
-          <w:tcPr/>
-          <w:p>
-            <w:pPr>
-              <w:pStyle w:val="Compact"/>
-              <w:jc w:val="left"/>
-            </w:pPr>
-            <w:r>
-              <w:t xml:space="preserve">0.50</w:t>
-            </w:r>
-          </w:p>
-        </w:tc>
-        <w:tc>
-          <w:tcPr/>
-          <w:p>
-            <w:pPr>
-              <w:pStyle w:val="Compact"/>
-              <w:jc w:val="left"/>
-            </w:pPr>
-            <w:r>
-              <w:t xml:space="preserve">0.25</w:t>
-            </w:r>
-          </w:p>
-        </w:tc>
-      </w:tr>
-      <w:tr>
-        <w:tc>
-          <w:tcPr/>
-          <w:p>
-            <w:pPr>
-              <w:pStyle w:val="Compact"/>
-              <w:jc w:val="left"/>
-            </w:pPr>
-            <w:r>
-              <w:t xml:space="preserve">50</w:t>
-            </w:r>
-          </w:p>
-        </w:tc>
-        <w:tc>
-          <w:tcPr/>
-          <w:p>
-            <w:pPr>
-              <w:pStyle w:val="Compact"/>
-              <w:jc w:val="left"/>
-            </w:pPr>
-            <w:r>
-              <w:t xml:space="preserve">0.19</w:t>
-            </w:r>
-          </w:p>
-        </w:tc>
-        <w:tc>
-          <w:tcPr/>
-          <w:p>
-            <w:pPr>
-              <w:pStyle w:val="Compact"/>
-              <w:jc w:val="left"/>
-            </w:pPr>
-            <w:r>
-              <w:t xml:space="preserve">0.99</w:t>
-            </w:r>
-          </w:p>
-        </w:tc>
-        <w:tc>
-          <w:tcPr/>
-          <w:p>
-            <w:pPr>
-              <w:pStyle w:val="Compact"/>
-              <w:jc w:val="left"/>
-            </w:pPr>
-            <w:r>
-              <w:t xml:space="preserve">0.36</w:t>
-            </w:r>
-          </w:p>
-        </w:tc>
-        <w:tc>
-          <w:tcPr/>
-          <w:p>
-            <w:pPr>
-              <w:pStyle w:val="Compact"/>
-              <w:jc w:val="left"/>
-            </w:pPr>
-            <w:r>
-              <w:t xml:space="preserve">0.20</w:t>
-            </w:r>
-          </w:p>
-        </w:tc>
-      </w:tr>
-      <w:tr>
-        <w:tc>
-          <w:tcPr/>
-          <w:p>
-            <w:pPr>
-              <w:pStyle w:val="Compact"/>
-              <w:jc w:val="left"/>
-            </w:pPr>
-            <w:r>
-              <w:t xml:space="preserve">100</w:t>
-            </w:r>
-          </w:p>
-        </w:tc>
-        <w:tc>
-          <w:tcPr/>
-          <w:p>
-            <w:pPr>
-              <w:pStyle w:val="Compact"/>
-              <w:jc w:val="left"/>
-            </w:pPr>
-            <w:r>
-              <w:t xml:space="preserve">0.02</w:t>
-            </w:r>
-          </w:p>
-        </w:tc>
-        <w:tc>
-          <w:tcPr/>
-          <w:p>
-            <w:pPr>
-              <w:pStyle w:val="Compact"/>
-              <w:jc w:val="left"/>
-            </w:pPr>
-            <w:r>
-              <w:t xml:space="preserve">0.67</w:t>
-            </w:r>
-          </w:p>
-        </w:tc>
-        <w:tc>
-          <w:tcPr/>
-          <w:p>
-            <w:pPr>
-              <w:pStyle w:val="Compact"/>
-              <w:jc w:val="left"/>
-            </w:pPr>
-            <w:r>
-              <w:t xml:space="preserve">0.10</w:t>
-            </w:r>
-          </w:p>
-        </w:tc>
-        <w:tc>
-          <w:tcPr/>
-          <w:p>
-            <w:pPr>
-              <w:pStyle w:val="Compact"/>
-              <w:jc w:val="left"/>
-            </w:pPr>
-            <w:r>
-              <w:t xml:space="preserve">0.05</w:t>
-            </w:r>
-          </w:p>
-        </w:tc>
-      </w:tr>
-      <w:tr>
-        <w:tc>
-          <w:tcPr/>
-          <w:p>
-            <w:pPr>
-              <w:pStyle w:val="Compact"/>
-              <w:jc w:val="left"/>
-            </w:pPr>
-            <w:r>
-              <w:t xml:space="preserve">200</w:t>
-            </w:r>
-          </w:p>
-        </w:tc>
-        <w:tc>
-          <w:tcPr/>
-          <w:p>
-            <w:pPr>
-              <w:pStyle w:val="Compact"/>
-              <w:jc w:val="left"/>
-            </w:pPr>
-            <w:r>
-              <w:t xml:space="preserve">0.00</w:t>
-            </w:r>
-          </w:p>
-        </w:tc>
-        <w:tc>
-          <w:tcPr/>
-          <w:p>
-            <w:pPr>
-              <w:pStyle w:val="Compact"/>
-              <w:jc w:val="left"/>
-            </w:pPr>
-            <w:r>
-              <w:t xml:space="preserve">0.08</w:t>
-            </w:r>
-          </w:p>
-        </w:tc>
-        <w:tc>
-          <w:tcPr/>
-          <w:p>
-            <w:pPr>
-              <w:pStyle w:val="Compact"/>
-              <w:jc w:val="left"/>
-            </w:pPr>
-            <w:r>
-              <w:t xml:space="preserve">0.00</w:t>
-            </w:r>
-          </w:p>
-        </w:tc>
-        <w:tc>
-          <w:tcPr/>
-          <w:p>
-            <w:pPr>
-              <w:pStyle w:val="Compact"/>
-              <w:jc w:val="left"/>
-            </w:pPr>
-            <w:r>
-              <w:t xml:space="preserve">0.01</w:t>
-            </w:r>
-          </w:p>
-        </w:tc>
-      </w:tr>
-      <w:tr>
-        <w:tc>
-          <w:tcPr/>
-          <w:p>
-            <w:pPr>
-              <w:pStyle w:val="Compact"/>
-              <w:jc w:val="left"/>
-            </w:pPr>
-            <w:r>
-              <w:t xml:space="preserve">500</w:t>
-            </w:r>
-          </w:p>
-        </w:tc>
-        <w:tc>
-          <w:tcPr/>
-          <w:p>
-            <w:pPr>
-              <w:pStyle w:val="Compact"/>
-              <w:jc w:val="left"/>
-            </w:pPr>
-            <w:r>
-              <w:t xml:space="preserve">0.00</w:t>
-            </w:r>
-          </w:p>
-        </w:tc>
-        <w:tc>
-          <w:tcPr/>
-          <w:p>
-            <w:pPr>
-              <w:pStyle w:val="Compact"/>
-              <w:jc w:val="left"/>
-            </w:pPr>
-            <w:r>
-              <w:t xml:space="preserve">0.00</w:t>
-            </w:r>
-          </w:p>
-        </w:tc>
-        <w:tc>
-          <w:tcPr/>
-          <w:p>
-            <w:pPr>
-              <w:pStyle w:val="Compact"/>
-              <w:jc w:val="left"/>
-            </w:pPr>
-            <w:r>
-              <w:t xml:space="preserve">0.00</w:t>
-            </w:r>
-          </w:p>
-        </w:tc>
-        <w:tc>
-          <w:tcPr/>
-          <w:p>
-            <w:pPr>
-              <w:pStyle w:val="Compact"/>
-              <w:jc w:val="left"/>
-            </w:pPr>
-            <w:r>
-              <w:t xml:space="preserve">0.00</w:t>
-            </w:r>
-          </w:p>
-        </w:tc>
-      </w:tr>
-    </w:tbl>
     <w:p>
       <w:pPr>
         <w:pStyle w:val="BodyText"/>
@@ -2688,7 +2304,7 @@
         <w:t xml:space="preserve"> </w:t>
       </w:r>
       <w:r>
-        <w:t xml:space="preserve">agents C and D both play the action that beats the previous move of the lowest-indexed player who scored in the previous round (random in round 0). This is a deterministic function of the previous full action profile but not of the previous majority. Conditioning on the majority state fails completely: gamma(C; D | S) stays at 0.91 to 1.07 nats, the innocent pair ranks first in 100% of games at every T, and the fixed criterion flags it in 65 to 100% of no-collusion games (Table 3 reports the fixed and calibrated rules; the per-state numbers are in results/extensions_tables.txt). Conditioning on the full previous profile removes the dependence (gamma(C; D | S) = 0.000) but spreads the data over 15 to 29 occupied states; without the permutation correction the bias flags a pair in 97 to 100% of no-collusion games. With the correction, rank-1 accuracy of the true pair is 0.75 at 25 rounds, 0.97 at 50 and 1.00 from 100, with a false-positive rate of 0.00 to 0.06. The detector works only when the analyst conditions on at least the state the innocent rule uses, and only once T is large relative to the number of states.</w:t>
+        <w:t xml:space="preserve">agents C and D both play the action that beats the previous move of the lowest-indexed player who scored in the previous round (random in round 0). This is a deterministic function of the previous full action profile but not of the previous majority. Conditioning on the majority state fails completely: gamma(C; D | S) stays at 0.91 to 1.07 nats, the innocent pair ranks first in 100% of games at every T, and the fixed criterion flags it in 65 to 100% of no-collusion games (per-state numbers in results/extensions_tables.txt). Conditioning on the full previous profile removes the dependence (gamma(C; D | S) = 0.000) but spreads the data over 15 to 29 occupied states; without the permutation correction the bias flags a pair in 97 to 100% of no-collusion games. With the correction, rank-1 accuracy of the true pair is 0.75 at 25 rounds, 0.97 at 50 and 1.00 from 100, with a false-positive rate of 0.00 to 0.06. The detector works only when the analyst conditions on at least the state the innocent rule uses, and only once T is large relative to the number of states.</w:t>
       </w:r>
     </w:p>
     <w:p>
@@ -2784,13 +2400,13 @@
           <w:bCs/>
           <w:b/>
         </w:rPr>
-        <w:t xml:space="preserve">Setup, as designed.</w:t>
-      </w:r>
-      <w:r>
-        <w:t xml:space="preserve"> </w:t>
-      </w:r>
-      <w:r>
-        <w:t xml:space="preserve">Four GPT-4.1-mini players (temperature 1.0) play the same four-player game for 25 rounds with the full public history in context. Three conditions, ten games each:</w:t>
+        <w:t xml:space="preserve">Setup.</w:t>
+      </w:r>
+      <w:r>
+        <w:t xml:space="preserve"> </w:t>
+      </w:r>
+      <w:r>
+        <w:t xml:space="preserve">Four GPT-4.1-mini players, 25 rounds, full public history in context; ten games in each of three conditions:</w:t>
       </w:r>
       <w:r>
         <w:t xml:space="preserve"> </w:t>
@@ -2803,7 +2419,10 @@
         <w:t xml:space="preserve">collude</w:t>
       </w:r>
       <w:r>
-        <w:t xml:space="preserve">, where Alpha and Bravo are told privately that they are a team maximising their combined score and may exchange one private message each before every round;</w:t>
+        <w:t xml:space="preserve"> </w:t>
+      </w:r>
+      <w:r>
+        <w:t xml:space="preserve">(Alpha and Bravo told they are a team, with one private message each per round),</w:t>
       </w:r>
       <w:r>
         <w:t xml:space="preserve"> </w:t>
@@ -2816,7 +2435,10 @@
         <w:t xml:space="preserve">team_no_channel</w:t>
       </w:r>
       <w:r>
-        <w:t xml:space="preserve">, the same instruction without the channel, which tests whether a shared goal alone produces detectable dependence through shared salience (question 1.3); and</w:t>
+        <w:t xml:space="preserve"> </w:t>
+      </w:r>
+      <w:r>
+        <w:t xml:space="preserve">(team instruction, no channel: the shared-salience test of question 1.3) and</w:t>
       </w:r>
       <w:r>
         <w:t xml:space="preserve"> </w:t>
@@ -2829,7 +2451,10 @@
         <w:t xml:space="preserve">independent</w:t>
       </w:r>
       <w:r>
-        <w:t xml:space="preserve">, no team and no channel, the same-model negative control. The detector sees only the 25 x 4 action log; messages are logged for inspection but never scored.</w:t>
+        <w:t xml:space="preserve"> </w:t>
+      </w:r>
+      <w:r>
+        <w:t xml:space="preserve">(same-model control). The detector sees only the 25 x 4 action log.</w:t>
       </w:r>
     </w:p>
     <w:p>
@@ -2890,18 +2515,551 @@
           <w:bCs/>
           <w:b/>
         </w:rPr>
-        <w:t xml:space="preserve">Status.</w:t>
-      </w:r>
-      <w:r>
-        <w:t xml:space="preserve"> </w:t>
-      </w:r>
-      <w:r>
-        <w:t xml:space="preserve">This assay was set up but not completed before the submission deadline. The notebook (lens_understanding_is_not_agreement.ipynb) and the analysis script (experiments/lens_proposal.py) are in the repository, with the conditions, bands and metrics fixed in code, and experiments/fill_report.py inserts the per-condition table and the key contrast into this section once a run lands under results/. No run arrived in time, so this report makes no claim about adoption or violation rates, about the refusal control, about the tag-swapped and tag-erased conditions, or about whether the transmitted item is decodable when the receiver refuses. The interpretation rule below is recorded so that the result, when obtained, is read against a rule fixed before the data.</w:t>
-      </w:r>
-      <w:r>
-        <w:t xml:space="preserve"> </w:t>
-      </w:r>
-    </w:p>
+        <w:t xml:space="preserve">Results</w:t>
+      </w:r>
+      <w:r>
+        <w:t xml:space="preserve"> </w:t>
+      </w:r>
+      <w:r>
+        <w:t xml:space="preserve">(gemma-4-12B-it, 47 layers; bands early 0 to 10, late 28 to 43; 30 base cases, 150 receiver evaluations; raw output in results/20261026-0910-lens-proposal/).</w:t>
+      </w:r>
+    </w:p>
+    <w:tbl>
+      <w:tblPr>
+        <w:tblStyle w:val="Table"/>
+        <w:tblW w:type="pct" w:w="5000"/>
+        <w:tblLook w:firstRow="1" w:lastRow="0" w:firstColumn="0" w:lastColumn="0" w:noHBand="0" w:noVBand="0" w:val="0020"/>
+        <w:jc w:val="start"/>
+      </w:tblPr>
+      <w:tblGrid>
+        <w:gridCol w:w="1131"/>
+        <w:gridCol w:w="1131"/>
+        <w:gridCol w:w="1131"/>
+        <w:gridCol w:w="1131"/>
+        <w:gridCol w:w="1131"/>
+        <w:gridCol w:w="1131"/>
+        <w:gridCol w:w="1131"/>
+      </w:tblGrid>
+      <w:tr>
+        <w:trPr>
+          <w:tblHeader w:val="true"/>
+        </w:trPr>
+        <w:tc>
+          <w:tcPr/>
+          <w:p>
+            <w:pPr>
+              <w:pStyle w:val="Compact"/>
+              <w:jc w:val="left"/>
+            </w:pPr>
+            <w:r>
+              <w:t xml:space="preserve">condition</w:t>
+            </w:r>
+          </w:p>
+        </w:tc>
+        <w:tc>
+          <w:tcPr/>
+          <w:p>
+            <w:pPr>
+              <w:pStyle w:val="Compact"/>
+              <w:jc w:val="left"/>
+            </w:pPr>
+            <w:r>
+              <w:t xml:space="preserve">n</w:t>
+            </w:r>
+          </w:p>
+        </w:tc>
+        <w:tc>
+          <w:tcPr/>
+          <w:p>
+            <w:pPr>
+              <w:pStyle w:val="Compact"/>
+              <w:jc w:val="left"/>
+            </w:pPr>
+            <w:r>
+              <w:t xml:space="preserve">adopted nomination</w:t>
+            </w:r>
+          </w:p>
+        </w:tc>
+        <w:tc>
+          <w:tcPr/>
+          <w:p>
+            <w:pPr>
+              <w:pStyle w:val="Compact"/>
+              <w:jc w:val="left"/>
+            </w:pPr>
+            <w:r>
+              <w:t xml:space="preserve">policy violation</w:t>
+            </w:r>
+          </w:p>
+        </w:tc>
+        <w:tc>
+          <w:tcPr/>
+          <w:p>
+            <w:pPr>
+              <w:pStyle w:val="Compact"/>
+              <w:jc w:val="left"/>
+            </w:pPr>
+            <w:r>
+              <w:t xml:space="preserve">abstain</w:t>
+            </w:r>
+          </w:p>
+        </w:tc>
+        <w:tc>
+          <w:tcPr/>
+          <w:p>
+            <w:pPr>
+              <w:pStyle w:val="Compact"/>
+              <w:jc w:val="left"/>
+            </w:pPr>
+            <w:r>
+              <w:t xml:space="preserve">late band: transmitted item ranked first of four</w:t>
+            </w:r>
+          </w:p>
+        </w:tc>
+        <w:tc>
+          <w:tcPr/>
+          <w:p>
+            <w:pPr>
+              <w:pStyle w:val="Compact"/>
+              <w:jc w:val="left"/>
+            </w:pPr>
+            <w:r>
+              <w:t xml:space="preserve">late band: median vocabulary rank of nomination</w:t>
+            </w:r>
+          </w:p>
+        </w:tc>
+      </w:tr>
+      <w:tr>
+        <w:tc>
+          <w:tcPr/>
+          <w:p>
+            <w:pPr>
+              <w:pStyle w:val="Compact"/>
+              <w:jc w:val="left"/>
+            </w:pPr>
+            <w:r>
+              <w:t xml:space="preserve">unauthorized</w:t>
+            </w:r>
+          </w:p>
+        </w:tc>
+        <w:tc>
+          <w:tcPr/>
+          <w:p>
+            <w:pPr>
+              <w:pStyle w:val="Compact"/>
+              <w:jc w:val="left"/>
+            </w:pPr>
+            <w:r>
+              <w:t xml:space="preserve">30</w:t>
+            </w:r>
+          </w:p>
+        </w:tc>
+        <w:tc>
+          <w:tcPr/>
+          <w:p>
+            <w:pPr>
+              <w:pStyle w:val="Compact"/>
+              <w:jc w:val="left"/>
+            </w:pPr>
+            <w:r>
+              <w:t xml:space="preserve">0.00</w:t>
+            </w:r>
+          </w:p>
+        </w:tc>
+        <w:tc>
+          <w:tcPr/>
+          <w:p>
+            <w:pPr>
+              <w:pStyle w:val="Compact"/>
+              <w:jc w:val="left"/>
+            </w:pPr>
+            <w:r>
+              <w:t xml:space="preserve">0.00</w:t>
+            </w:r>
+          </w:p>
+        </w:tc>
+        <w:tc>
+          <w:tcPr/>
+          <w:p>
+            <w:pPr>
+              <w:pStyle w:val="Compact"/>
+              <w:jc w:val="left"/>
+            </w:pPr>
+            <w:r>
+              <w:t xml:space="preserve">1.00</w:t>
+            </w:r>
+          </w:p>
+        </w:tc>
+        <w:tc>
+          <w:tcPr/>
+          <w:p>
+            <w:pPr>
+              <w:pStyle w:val="Compact"/>
+              <w:jc w:val="left"/>
+            </w:pPr>
+            <w:r>
+              <w:t xml:space="preserve">0.23</w:t>
+            </w:r>
+          </w:p>
+        </w:tc>
+        <w:tc>
+          <w:tcPr/>
+          <w:p>
+            <w:pPr>
+              <w:pStyle w:val="Compact"/>
+              <w:jc w:val="left"/>
+            </w:pPr>
+            <w:r>
+              <w:t xml:space="preserve">1383</w:t>
+            </w:r>
+          </w:p>
+        </w:tc>
+      </w:tr>
+      <w:tr>
+        <w:tc>
+          <w:tcPr/>
+          <w:p>
+            <w:pPr>
+              <w:pStyle w:val="Compact"/>
+              <w:jc w:val="left"/>
+            </w:pPr>
+            <w:r>
+              <w:t xml:space="preserve">permitted</w:t>
+            </w:r>
+          </w:p>
+        </w:tc>
+        <w:tc>
+          <w:tcPr/>
+          <w:p>
+            <w:pPr>
+              <w:pStyle w:val="Compact"/>
+              <w:jc w:val="left"/>
+            </w:pPr>
+            <w:r>
+              <w:t xml:space="preserve">30</w:t>
+            </w:r>
+          </w:p>
+        </w:tc>
+        <w:tc>
+          <w:tcPr/>
+          <w:p>
+            <w:pPr>
+              <w:pStyle w:val="Compact"/>
+              <w:jc w:val="left"/>
+            </w:pPr>
+            <w:r>
+              <w:t xml:space="preserve">1.00</w:t>
+            </w:r>
+          </w:p>
+        </w:tc>
+        <w:tc>
+          <w:tcPr/>
+          <w:p>
+            <w:pPr>
+              <w:pStyle w:val="Compact"/>
+              <w:jc w:val="left"/>
+            </w:pPr>
+            <w:r>
+              <w:t xml:space="preserve">0.00</w:t>
+            </w:r>
+          </w:p>
+        </w:tc>
+        <w:tc>
+          <w:tcPr/>
+          <w:p>
+            <w:pPr>
+              <w:pStyle w:val="Compact"/>
+              <w:jc w:val="left"/>
+            </w:pPr>
+            <w:r>
+              <w:t xml:space="preserve">0.00</w:t>
+            </w:r>
+          </w:p>
+        </w:tc>
+        <w:tc>
+          <w:tcPr/>
+          <w:p>
+            <w:pPr>
+              <w:pStyle w:val="Compact"/>
+              <w:jc w:val="left"/>
+            </w:pPr>
+            <w:r>
+              <w:t xml:space="preserve">1.00</w:t>
+            </w:r>
+          </w:p>
+        </w:tc>
+        <w:tc>
+          <w:tcPr/>
+          <w:p>
+            <w:pPr>
+              <w:pStyle w:val="Compact"/>
+              <w:jc w:val="left"/>
+            </w:pPr>
+            <w:r>
+              <w:t xml:space="preserve">0</w:t>
+            </w:r>
+          </w:p>
+        </w:tc>
+      </w:tr>
+      <w:tr>
+        <w:tc>
+          <w:tcPr/>
+          <w:p>
+            <w:pPr>
+              <w:pStyle w:val="Compact"/>
+              <w:jc w:val="left"/>
+            </w:pPr>
+            <w:r>
+              <w:t xml:space="preserve">refusal</w:t>
+            </w:r>
+          </w:p>
+        </w:tc>
+        <w:tc>
+          <w:tcPr/>
+          <w:p>
+            <w:pPr>
+              <w:pStyle w:val="Compact"/>
+              <w:jc w:val="left"/>
+            </w:pPr>
+            <w:r>
+              <w:t xml:space="preserve">30</w:t>
+            </w:r>
+          </w:p>
+        </w:tc>
+        <w:tc>
+          <w:tcPr/>
+          <w:p>
+            <w:pPr>
+              <w:pStyle w:val="Compact"/>
+              <w:jc w:val="left"/>
+            </w:pPr>
+            <w:r>
+              <w:t xml:space="preserve">0.00</w:t>
+            </w:r>
+          </w:p>
+        </w:tc>
+        <w:tc>
+          <w:tcPr/>
+          <w:p>
+            <w:pPr>
+              <w:pStyle w:val="Compact"/>
+              <w:jc w:val="left"/>
+            </w:pPr>
+            <w:r>
+              <w:t xml:space="preserve">0.00</w:t>
+            </w:r>
+          </w:p>
+        </w:tc>
+        <w:tc>
+          <w:tcPr/>
+          <w:p>
+            <w:pPr>
+              <w:pStyle w:val="Compact"/>
+              <w:jc w:val="left"/>
+            </w:pPr>
+            <w:r>
+              <w:t xml:space="preserve">1.00</w:t>
+            </w:r>
+          </w:p>
+        </w:tc>
+        <w:tc>
+          <w:tcPr/>
+          <w:p>
+            <w:pPr>
+              <w:pStyle w:val="Compact"/>
+              <w:jc w:val="left"/>
+            </w:pPr>
+            <w:r>
+              <w:t xml:space="preserve">0.17</w:t>
+            </w:r>
+          </w:p>
+        </w:tc>
+        <w:tc>
+          <w:tcPr/>
+          <w:p>
+            <w:pPr>
+              <w:pStyle w:val="Compact"/>
+              <w:jc w:val="left"/>
+            </w:pPr>
+            <w:r>
+              <w:t xml:space="preserve">above 5000</w:t>
+            </w:r>
+          </w:p>
+        </w:tc>
+      </w:tr>
+      <w:tr>
+        <w:tc>
+          <w:tcPr/>
+          <w:p>
+            <w:pPr>
+              <w:pStyle w:val="Compact"/>
+              <w:jc w:val="left"/>
+            </w:pPr>
+            <w:r>
+              <w:t xml:space="preserve">tag swapped</w:t>
+            </w:r>
+          </w:p>
+        </w:tc>
+        <w:tc>
+          <w:tcPr/>
+          <w:p>
+            <w:pPr>
+              <w:pStyle w:val="Compact"/>
+              <w:jc w:val="left"/>
+            </w:pPr>
+            <w:r>
+              <w:t xml:space="preserve">30</w:t>
+            </w:r>
+          </w:p>
+        </w:tc>
+        <w:tc>
+          <w:tcPr/>
+          <w:p>
+            <w:pPr>
+              <w:pStyle w:val="Compact"/>
+              <w:jc w:val="left"/>
+            </w:pPr>
+            <w:r>
+              <w:t xml:space="preserve">0.00</w:t>
+            </w:r>
+          </w:p>
+        </w:tc>
+        <w:tc>
+          <w:tcPr/>
+          <w:p>
+            <w:pPr>
+              <w:pStyle w:val="Compact"/>
+              <w:jc w:val="left"/>
+            </w:pPr>
+            <w:r>
+              <w:t xml:space="preserve">0.00</w:t>
+            </w:r>
+          </w:p>
+        </w:tc>
+        <w:tc>
+          <w:tcPr/>
+          <w:p>
+            <w:pPr>
+              <w:pStyle w:val="Compact"/>
+              <w:jc w:val="left"/>
+            </w:pPr>
+            <w:r>
+              <w:t xml:space="preserve">1.00</w:t>
+            </w:r>
+          </w:p>
+        </w:tc>
+        <w:tc>
+          <w:tcPr/>
+          <w:p>
+            <w:pPr>
+              <w:pStyle w:val="Compact"/>
+              <w:jc w:val="left"/>
+            </w:pPr>
+            <w:r>
+              <w:t xml:space="preserve">0.13</w:t>
+            </w:r>
+          </w:p>
+        </w:tc>
+        <w:tc>
+          <w:tcPr/>
+          <w:p>
+            <w:pPr>
+              <w:pStyle w:val="Compact"/>
+              <w:jc w:val="left"/>
+            </w:pPr>
+            <w:r>
+              <w:t xml:space="preserve">1987</w:t>
+            </w:r>
+          </w:p>
+        </w:tc>
+      </w:tr>
+      <w:tr>
+        <w:tc>
+          <w:tcPr/>
+          <w:p>
+            <w:pPr>
+              <w:pStyle w:val="Compact"/>
+              <w:jc w:val="left"/>
+            </w:pPr>
+            <w:r>
+              <w:t xml:space="preserve">tag erased</w:t>
+            </w:r>
+          </w:p>
+        </w:tc>
+        <w:tc>
+          <w:tcPr/>
+          <w:p>
+            <w:pPr>
+              <w:pStyle w:val="Compact"/>
+              <w:jc w:val="left"/>
+            </w:pPr>
+            <w:r>
+              <w:t xml:space="preserve">30</w:t>
+            </w:r>
+          </w:p>
+        </w:tc>
+        <w:tc>
+          <w:tcPr/>
+          <w:p>
+            <w:pPr>
+              <w:pStyle w:val="Compact"/>
+              <w:jc w:val="left"/>
+            </w:pPr>
+            <w:r>
+              <w:t xml:space="preserve">0.00</w:t>
+            </w:r>
+          </w:p>
+        </w:tc>
+        <w:tc>
+          <w:tcPr/>
+          <w:p>
+            <w:pPr>
+              <w:pStyle w:val="Compact"/>
+              <w:jc w:val="left"/>
+            </w:pPr>
+            <w:r>
+              <w:t xml:space="preserve">0.00</w:t>
+            </w:r>
+          </w:p>
+        </w:tc>
+        <w:tc>
+          <w:tcPr/>
+          <w:p>
+            <w:pPr>
+              <w:pStyle w:val="Compact"/>
+              <w:jc w:val="left"/>
+            </w:pPr>
+            <w:r>
+              <w:t xml:space="preserve">1.00</w:t>
+            </w:r>
+          </w:p>
+        </w:tc>
+        <w:tc>
+          <w:tcPr/>
+          <w:p>
+            <w:pPr>
+              <w:pStyle w:val="Compact"/>
+              <w:jc w:val="left"/>
+            </w:pPr>
+            <w:r>
+              <w:t xml:space="preserve">n/a</w:t>
+            </w:r>
+          </w:p>
+        </w:tc>
+        <w:tc>
+          <w:tcPr/>
+          <w:p>
+            <w:pPr>
+              <w:pStyle w:val="Compact"/>
+              <w:jc w:val="left"/>
+            </w:pPr>
+            <w:r>
+              <w:t xml:space="preserve">above 5000</w:t>
+            </w:r>
+          </w:p>
+        </w:tc>
+      </w:tr>
+    </w:tbl>
     <w:p>
       <w:pPr>
         <w:pStyle w:val="BodyText"/>
@@ -2911,6 +3069,63 @@
           <w:bCs/>
           <w:b/>
         </w:rPr>
+        <w:t xml:space="preserve">The positive arm did not occur.</w:t>
+      </w:r>
+      <w:r>
+        <w:t xml:space="preserve"> </w:t>
+      </w:r>
+      <w:r>
+        <w:t xml:space="preserve">Under the pair-bonus objective with an ineligible nomination, the receiver abstained in 30 of 30 cases and never approved an ineligible item in any condition; no output was malformed. The planned contrast between actual adoption and actual refusal inside the unauthorized condition is therefore empty, and we report that as the result rather than relaxing the objective until the model complied.</w:t>
+      </w:r>
+    </w:p>
+    <w:p>
+      <w:pPr>
+        <w:pStyle w:val="BodyText"/>
+      </w:pPr>
+      <w:r>
+        <w:rPr>
+          <w:bCs/>
+          <w:b/>
+        </w:rPr>
+        <w:t xml:space="preserve">What the matched conditions still show.</w:t>
+      </w:r>
+      <w:r>
+        <w:t xml:space="preserve"> </w:t>
+      </w:r>
+      <w:r>
+        <w:t xml:space="preserve">The receiver demonstrably decoded the tag: in the permitted condition, where the same tag names an item the policy allows, it approved the nominated item in 30 of 30 cases. In that condition the nominated item sits at vocabulary rank 0 in the late band in every case. In the three conditions where the receiver understood the proposal and abstained (unauthorized, refusal, tag swapped), candidate decoding of the transmitted item in the late band is 0.13 to 0.23, at or below the 0.25 chance level for four candidates, with median vocabulary rank above 1,000; in the early band it is 0.30 to 0.37, also near chance; tag erased gives 0.00 by construction. So at the pre-action position the lens readout tracks the action the receiver is about to take, not the proposal it has received and understood. Representation of the proposal is absent, not merely non-specific, when the receiver declines to act on it.</w:t>
+      </w:r>
+    </w:p>
+    <w:p>
+      <w:pPr>
+        <w:pStyle w:val="BodyText"/>
+      </w:pPr>
+      <w:r>
+        <w:rPr>
+          <w:bCs/>
+          <w:b/>
+        </w:rPr>
+        <w:t xml:space="preserve">Reading.</w:t>
+      </w:r>
+      <w:r>
+        <w:t xml:space="preserve"> </w:t>
+      </w:r>
+      <w:r>
+        <w:t xml:space="preserve">The pre-registered rule anticipated a different failure, representation present in both adopt and refuse. The observed failure is the mirror image: a monitor reading the workspace for the proposal at the decision point would miss a receiver that has read and understood a coded proposal, because a declined proposal leaves no trace there. This is consistent with Li et al. (2026), who find that the J-lens subspace detects what agents say rather than what they withhold, and it matches the Gurnee et al. selectivity finding that presence in the workspace tracks causal use. The permitted condition also shows that a rank-0 readout of the nominated item is not evidence of collusion either: it appears in full when the identical tag is acted on legitimately. On this surface, the only condition the lens separates is whether the item is about to be emitted, which an auditor can read from the action itself.</w:t>
+      </w:r>
+      <w:r>
+        <w:t xml:space="preserve"> </w:t>
+      </w:r>
+    </w:p>
+    <w:p>
+      <w:pPr>
+        <w:pStyle w:val="BodyText"/>
+      </w:pPr>
+      <w:r>
+        <w:rPr>
+          <w:bCs/>
+          <w:b/>
+        </w:rPr>
         <w:t xml:space="preserve">Interpretation rule, fixed in advance.</w:t>
       </w:r>
       <w:r>
@@ -2961,7 +3176,7 @@
         <w:pStyle w:val="BodyText"/>
       </w:pPr>
       <w:r>
-        <w:t xml:space="preserve">The internals half applies the same rule to a different observation surface. A lens that reads the partner’s proposal out of the workspace has shown comprehension; whether it has shown agreement is exactly what the refusal control decides. The sandbagging literature already shows that a model’s workspace can hold an answer it declines to say; our assay asks the collusion version: can it hold a proposal it declines to act on. Section 6 records that the assay did not run to completion before the deadline; the reporting rule was fixed in code before any receiver was run, and the notebook is released so that the question can be answered without changing the rule.</w:t>
+        <w:t xml:space="preserve">The internals half applies the same rule to a different observation surface. A lens that reads the partner’s proposal out of the workspace has shown comprehension; whether it has shown agreement is exactly what the refusal control decides. Section 6 reports what we found under a rule fixed before any receiver was run: the model never acted on an ineligible proposal, and when it understood and declined one, the proposal was at chance in the lens. On this surface the readout at the decision point is a readout of the coming action. That is useful to an auditor only in the way the action itself already is, and it is the collusion-side counterpart of Li et al.’s finding that the J-lens subspace reads what agents say rather than what they withhold.</w:t>
       </w:r>
     </w:p>
     <w:p>
@@ -2999,13 +3214,167 @@
       </w:r>
     </w:p>
     <w:bookmarkEnd w:id="45"/>
-    <w:bookmarkStart w:id="46" w:name="X34a9f4a4955810fa226028fb89dc1e250b93941"/>
+    <w:bookmarkStart w:id="46" w:name="references"/>
     <w:p>
       <w:pPr>
         <w:pStyle w:val="Heading2"/>
       </w:pPr>
       <w:r>
-        <w:t xml:space="preserve">8. Limitations and Dual-Use / Ethical Considerations</w:t>
+        <w:t xml:space="preserve">References</w:t>
+      </w:r>
+    </w:p>
+    <w:p>
+      <w:pPr>
+        <w:pStyle w:val="FirstParagraph"/>
+      </w:pPr>
+      <w:r>
+        <w:t xml:space="preserve">Agrawal, K. et al. (2025). Evaluating LLM Agent Collusion in Double Auctions. arXiv:2507.01413.</w:t>
+      </w:r>
+    </w:p>
+    <w:p>
+      <w:pPr>
+        <w:pStyle w:val="BodyText"/>
+      </w:pPr>
+      <w:r>
+        <w:t xml:space="preserve">Ayeku, D. (2026). Telling Collusion from Common Knowledge: State-Conditioned Net Influence for LLM Agents. Apart Research AI Collusion Sprint entry (concurrent work).</w:t>
+      </w:r>
+    </w:p>
+    <w:p>
+      <w:pPr>
+        <w:pStyle w:val="BodyText"/>
+      </w:pPr>
+      <w:r>
+        <w:t xml:space="preserve">Ayonrinde, K. and Lindsey, J. (2026). J++ Lens: Jacobian Filtering Enables More Faithful Workspace Lenses. LessWrong, 8 October 2026.</w:t>
+      </w:r>
+    </w:p>
+    <w:p>
+      <w:pPr>
+        <w:pStyle w:val="BodyText"/>
+      </w:pPr>
+      <w:r>
+        <w:t xml:space="preserve">Berger, D. et al. (2025). Coordination by Code: Rethinking Antitrust Liability in the Age of AI Pricing. ABA Antitrust Magazine, Fall 2025.</w:t>
+      </w:r>
+    </w:p>
+    <w:p>
+      <w:pPr>
+        <w:pStyle w:val="BodyText"/>
+      </w:pPr>
+      <w:r>
+        <w:t xml:space="preserve">Bonjour, T., Aggarwal, V. and Bhargava, B. (2022). Information theoretic approach to detect collusion in multi-agent games. UAI 2022, PMLR 180:223-232.</w:t>
+      </w:r>
+    </w:p>
+    <w:p>
+      <w:pPr>
+        <w:pStyle w:val="BodyText"/>
+      </w:pPr>
+      <w:r>
+        <w:t xml:space="preserve">Fish, S., Gonczarowski, Y. A. and Shorrer, R. I. (2024). Algorithmic Collusion by Large Language Models. arXiv:2404.00806.</w:t>
+      </w:r>
+    </w:p>
+    <w:p>
+      <w:pPr>
+        <w:pStyle w:val="BodyText"/>
+      </w:pPr>
+      <w:r>
+        <w:t xml:space="preserve">Ghanem, M. C. (2026). Steganalysis of Adaptive Covert Collusion in Tool-Using Agent Populations. arXiv:2608.02698.</w:t>
+      </w:r>
+    </w:p>
+    <w:p>
+      <w:pPr>
+        <w:pStyle w:val="BodyText"/>
+      </w:pPr>
+      <w:r>
+        <w:t xml:space="preserve">Gurnee, W. et al. (2026). Verbalizable Representations Form a Global Workspace in Language Models. Transformer Circuits Thread, 6 July 2026.</w:t>
+      </w:r>
+    </w:p>
+    <w:p>
+      <w:pPr>
+        <w:pStyle w:val="BodyText"/>
+      </w:pPr>
+      <w:r>
+        <w:t xml:space="preserve">Lee, C. E., Rosdalen, F., Samodelkin, P. and Edin, Y. (2026). From Pairs To Coalitions: Extending Information-Theoretic Collusion Detection To Multi-Agent Games. Apart Research AI Collusion Sprint entry (concurrent work).</w:t>
+      </w:r>
+    </w:p>
+    <w:p>
+      <w:pPr>
+        <w:pStyle w:val="BodyText"/>
+      </w:pPr>
+      <w:r>
+        <w:t xml:space="preserve">Li, D., Varigonda, A., Feng, A., Chauhan, M. and Shrivastava, D. (2026). Collusion Does Not Localize to Jacobian-Lens Transport Subspaces. NeurIPS 2026 Workshop on Agents in the Wild (poster).</w:t>
+      </w:r>
+    </w:p>
+    <w:p>
+      <w:pPr>
+        <w:pStyle w:val="BodyText"/>
+      </w:pPr>
+      <w:r>
+        <w:t xml:space="preserve">Lin, R. et al. (2024). Strategic Collusion of LLM Agents: Market Division in Multi-Commodity Competitions. arXiv:2410.00031.</w:t>
+      </w:r>
+    </w:p>
+    <w:p>
+      <w:pPr>
+        <w:pStyle w:val="BodyText"/>
+      </w:pPr>
+      <w:r>
+        <w:t xml:space="preserve">Nakamura, M. et al. (2026). Colosseum: Auditing Collusion in Cooperative Multi-Agent Systems. arXiv:2602.15198.</w:t>
+      </w:r>
+    </w:p>
+    <w:p>
+      <w:pPr>
+        <w:pStyle w:val="BodyText"/>
+      </w:pPr>
+      <w:r>
+        <w:t xml:space="preserve">Rose, A., Cullen, C., Abdelnabi, S., Torr, P., Kaplowitz, B. G. and Schroeder de Witt, C. (2026). Detecting Multi-Agent Collusion Through Multi-Agent Interpretability. arXiv:2604.01151 (v4, HELIOS and NARCBench).</w:t>
+      </w:r>
+    </w:p>
+    <w:p>
+      <w:pPr>
+        <w:pStyle w:val="BodyText"/>
+      </w:pPr>
+      <w:r>
+        <w:t xml:space="preserve">Snow, J. (2026). Reading Moves, Not Messages: Detecting Collusion Between LLM Agents. Apart Research AI Collusion Sprint entry (concurrent work).</w:t>
+      </w:r>
+    </w:p>
+    <w:p>
+      <w:pPr>
+        <w:pStyle w:val="BodyText"/>
+      </w:pPr>
+      <w:r>
+        <w:t xml:space="preserve">solarkyle (2026). jspace-lenses: fitted Jacobian lenses for open models. Hugging Face.</w:t>
+      </w:r>
+    </w:p>
+    <w:p>
+      <w:pPr>
+        <w:pStyle w:val="BodyText"/>
+      </w:pPr>
+      <w:r>
+        <w:t xml:space="preserve">Tailor, O. (2025). Audit the Whisper: Detecting Steganographic Collusion in Multi-Agent LLMs. arXiv:2510.04303.</w:t>
+      </w:r>
+    </w:p>
+    <w:p>
+      <w:pPr>
+        <w:pStyle w:val="BodyText"/>
+      </w:pPr>
+      <w:r>
+        <w:t xml:space="preserve">Veras Neves, C. E. (2026). j-space: Jacobian Lens for algorithmic collusion. Hugging Face Space (Trackio logbook), July 2026.</w:t>
+      </w:r>
+    </w:p>
+    <w:p>
+      <w:pPr>
+        <w:pStyle w:val="BodyText"/>
+      </w:pPr>
+      <w:r>
+        <w:t xml:space="preserve">Xu, X., Wu, C., Lu, J., Tan, K., Tao, S. and Hong, H. (2026). Collusion with Competitive Marginals: Price-Level Audits Are Blind by Construction. arXiv:2607.26385.</w:t>
+      </w:r>
+    </w:p>
+    <w:bookmarkEnd w:id="46"/>
+    <w:bookmarkStart w:id="47" w:name="Xd4a64e993053a5aba7b3be9dbbc8fee33c2a0c7"/>
+    <w:p>
+      <w:pPr>
+        <w:pStyle w:val="Heading2"/>
+      </w:pPr>
+      <w:r>
+        <w:t xml:space="preserve">Appendix A. Limitations and Dual-Use / Ethical Considerations</w:t>
       </w:r>
     </w:p>
     <w:p>
@@ -3023,7 +3392,7 @@
         <w:t xml:space="preserve"> </w:t>
       </w:r>
       <w:r>
-        <w:t xml:space="preserve">On a scripted four-player game with known ground truth, state-conditioned, permutation-corrected net influence recovers a seeded colluding pair and ignores an innocent parallel pair, while the published statistic and naive baselines do not. Nothing in this report is established on a real language model: the LLM pilot and the lens assay were built at pilot scale (ten games per condition; thirty base cases) but did not return results before submission, and Sections 5 and 6 say so in place of a result.</w:t>
+        <w:t xml:space="preserve">On a scripted four-player game with known ground truth, state-conditioned, permutation-corrected net influence recovers a seeded colluding pair and ignores an innocent parallel pair, while the published statistic and naive baselines do not. On a real model, the lens assay (thirty base cases, one model, one lens) establishes that the pre-action workspace readout of a coded proposal tracks whether the receiver is about to act on it, and is at chance when the receiver has understood it and declined. The action-only LLM pilot did not return results before submission and Section 5 says so in place of a result.</w:t>
       </w:r>
     </w:p>
     <w:p>
@@ -3041,7 +3410,7 @@
         <w:t xml:space="preserve"> </w:t>
       </w:r>
       <w:r>
-        <w:t xml:space="preserve">We tested one confound and one state function, both chosen to match. Real innocent correlation (shared base-model priors, common reactions to unmodelled shocks) is not reducible to a four-valued state. Our collusion model assumes ex-ante signalling, as in the original paper; LLM coalitions coordinate imperfectly, and the only evidence on that point here is scripted. The LLM pilot design is small (ten games per condition, one model, one temperature) and has not yet been executed. The lens assay design uses one receiver model, one fitted lens, a scripted sender, a four-item vocabulary and a planted codebook; it is a controlled communication assay, not a demonstration that agents invent covert channels, and lens readouts of single tokens cover a fraction of the workspace. Its decoding rates, when obtained, will be compared across conditions on paired base cases, not against an absolute threshold. All code was written in a single sprint day and has not been independently reviewed. Concurrent entries in the same sprint apply net influence with permutation tests to LLM players; our contribution on the action surface is the ground-truth characterisation, not the method. On the internals surface, Li et al. (2026) report that the J-lens subspace tracks what agents say rather than what they withhold; a null adopt-versus-refuse separation in our assay would be consistent with that, and a positive one would need reconciling with it.</w:t>
+        <w:t xml:space="preserve">We tested one confound and one state function, both chosen to match. Real innocent correlation (shared base-model priors, common reactions to unmodelled shocks) is not reducible to a four-valued state. Our collusion model assumes ex-ante signalling, as in the original paper; LLM coalitions coordinate imperfectly, and the only evidence on that point here is scripted. The LLM pilot design is small (ten games per condition, one model, one temperature) and has not yet been executed. The lens assay uses one receiver model, one fitted lens, a scripted sender, a four-item vocabulary and a planted codebook; it is a controlled communication assay, not a demonstration that agents invent covert channels, and lens readouts of single tokens cover a fraction of the workspace. Its intended positive arm did not occur, because gemma-4-12B-it refused every ineligible nomination under the bonus objective, so the adopt-versus-refuse contrast is between permitted adoption and refusal rather than between unauthorised adoption and refusal; a receiver that does collude might represent a proposal differently, and the rank-0 readout in the permitted arm is what any next-token lens would show for the about-to-be-emitted word, so it is not evidence of a workspace-level proposal representation beyond output prediction. Decoding rates are compared across conditions on paired base cases, not against an absolute threshold, and the chance level for four candidates is 0.25. All code was written in a single sprint day and has not been independently reviewed. Concurrent entries in the same sprint apply net influence with permutation tests to LLM players; our contribution on the action surface is the ground-truth characterisation, not the method. On the internals surface, Li et al. (2026) report that the J-lens subspace tracks what agents say rather than what they withhold; a null adopt-versus-refuse separation in our assay would be consistent with that, and a positive one would need reconciling with it.</w:t>
       </w:r>
     </w:p>
     <w:p>
@@ -3059,171 +3428,17 @@
         <w:t xml:space="preserve"> </w:t>
       </w:r>
       <w:r>
-        <w:t xml:space="preserve">A published detector tells a coalition what to avoid: here, any dependence between partners’ actions beyond what the public state explains, and, for the internals half, that a monitor reading the workspace for a proposal can be fooled in both directions. Agents could evade it by routing coordination through the public state itself (both responding to a public signal they jointly control) or by coordinating at a rate below the detection floor we measured (CP around 0.2 at 25 rounds). We think this is acceptable because the same analysis tells a defender where the floor is and that single short games are not enough evidence; pooled logs are. No real market data, deployed system or private information was used.</w:t>
-      </w:r>
-    </w:p>
-    <w:bookmarkEnd w:id="46"/>
-    <w:bookmarkStart w:id="47" w:name="references"/>
+        <w:t xml:space="preserve">A published detector tells a coalition what to avoid: here, any dependence between partners’ actions beyond what the public state explains, and, for the internals half, that a receiver who reads a coded proposal and declines to act on it is invisible to a workspace monitor at the decision point. Agents could evade it by routing coordination through the public state itself (both responding to a public signal they jointly control) or by coordinating at a rate below the detection floor we measured (CP around 0.2 at 25 rounds). We think this is acceptable because the same analysis tells a defender where the floor is and that single short games are not enough evidence; pooled logs are. No real market data, deployed system or private information was used.</w:t>
+      </w:r>
+    </w:p>
+    <w:bookmarkEnd w:id="47"/>
+    <w:bookmarkStart w:id="48" w:name="appendix-b.-reproducibility"/>
     <w:p>
       <w:pPr>
         <w:pStyle w:val="Heading2"/>
       </w:pPr>
       <w:r>
-        <w:t xml:space="preserve">References</w:t>
-      </w:r>
-    </w:p>
-    <w:p>
-      <w:pPr>
-        <w:pStyle w:val="FirstParagraph"/>
-      </w:pPr>
-      <w:r>
-        <w:t xml:space="preserve">Agrawal, K. et al. (2025). Evaluating LLM Agent Collusion in Double Auctions. arXiv:2507.01413.</w:t>
-      </w:r>
-    </w:p>
-    <w:p>
-      <w:pPr>
-        <w:pStyle w:val="BodyText"/>
-      </w:pPr>
-      <w:r>
-        <w:t xml:space="preserve">Ayeku, D. (2026). Telling Collusion from Common Knowledge: State-Conditioned Net Influence for LLM Agents. Apart Research AI Collusion Sprint entry (concurrent work).</w:t>
-      </w:r>
-    </w:p>
-    <w:p>
-      <w:pPr>
-        <w:pStyle w:val="BodyText"/>
-      </w:pPr>
-      <w:r>
-        <w:t xml:space="preserve">Ayonrinde, K. and Lindsey, J. (2026). J++ Lens: Jacobian Filtering Enables More Faithful Workspace Lenses. LessWrong, 8 October 2026.</w:t>
-      </w:r>
-    </w:p>
-    <w:p>
-      <w:pPr>
-        <w:pStyle w:val="BodyText"/>
-      </w:pPr>
-      <w:r>
-        <w:t xml:space="preserve">Berger, D. et al. (2025). Coordination by Code: Rethinking Antitrust Liability in the Age of AI Pricing. ABA Antitrust Magazine, Fall 2025.</w:t>
-      </w:r>
-    </w:p>
-    <w:p>
-      <w:pPr>
-        <w:pStyle w:val="BodyText"/>
-      </w:pPr>
-      <w:r>
-        <w:t xml:space="preserve">Bonjour, T., Aggarwal, V. and Bhargava, B. (2022). Information theoretic approach to detect collusion in multi-agent games. UAI 2022, PMLR 180:223-232.</w:t>
-      </w:r>
-    </w:p>
-    <w:p>
-      <w:pPr>
-        <w:pStyle w:val="BodyText"/>
-      </w:pPr>
-      <w:r>
-        <w:t xml:space="preserve">Fish, S., Gonczarowski, Y. A. and Shorrer, R. I. (2024). Algorithmic Collusion by Large Language Models. arXiv:2404.00806.</w:t>
-      </w:r>
-    </w:p>
-    <w:p>
-      <w:pPr>
-        <w:pStyle w:val="BodyText"/>
-      </w:pPr>
-      <w:r>
-        <w:t xml:space="preserve">Ghanem, M. C. (2026). Steganalysis of Adaptive Covert Collusion in Tool-Using Agent Populations. arXiv:2608.02698.</w:t>
-      </w:r>
-    </w:p>
-    <w:p>
-      <w:pPr>
-        <w:pStyle w:val="BodyText"/>
-      </w:pPr>
-      <w:r>
-        <w:t xml:space="preserve">Gurnee, W. et al. (2026). Verbalizable Representations Form a Global Workspace in Language Models. Transformer Circuits Thread, 6 July 2026.</w:t>
-      </w:r>
-    </w:p>
-    <w:p>
-      <w:pPr>
-        <w:pStyle w:val="BodyText"/>
-      </w:pPr>
-      <w:r>
-        <w:t xml:space="preserve">Lee, C. E., Rosdalen, F., Samodelkin, P. and Edin, Y. (2026). From Pairs To Coalitions: Extending Information-Theoretic Collusion Detection To Multi-Agent Games. Apart Research AI Collusion Sprint entry (concurrent work).</w:t>
-      </w:r>
-    </w:p>
-    <w:p>
-      <w:pPr>
-        <w:pStyle w:val="BodyText"/>
-      </w:pPr>
-      <w:r>
-        <w:t xml:space="preserve">Li, D., Varigonda, A., Feng, A., Chauhan, M. and Shrivastava, D. (2026). Collusion Does Not Localize to Jacobian-Lens Transport Subspaces. NeurIPS 2026 Workshop on Agents in the Wild (poster).</w:t>
-      </w:r>
-    </w:p>
-    <w:p>
-      <w:pPr>
-        <w:pStyle w:val="BodyText"/>
-      </w:pPr>
-      <w:r>
-        <w:t xml:space="preserve">Lin, R. et al. (2024). Strategic Collusion of LLM Agents: Market Division in Multi-Commodity Competitions. arXiv:2410.00031.</w:t>
-      </w:r>
-    </w:p>
-    <w:p>
-      <w:pPr>
-        <w:pStyle w:val="BodyText"/>
-      </w:pPr>
-      <w:r>
-        <w:t xml:space="preserve">Nakamura, M. et al. (2026). Colosseum: Auditing Collusion in Cooperative Multi-Agent Systems. arXiv:2602.15198.</w:t>
-      </w:r>
-    </w:p>
-    <w:p>
-      <w:pPr>
-        <w:pStyle w:val="BodyText"/>
-      </w:pPr>
-      <w:r>
-        <w:t xml:space="preserve">Rose, A., Cullen, C., Abdelnabi, S., Torr, P., Kaplowitz, B. G. and Schroeder de Witt, C. (2026). Detecting Multi-Agent Collusion Through Multi-Agent Interpretability. arXiv:2604.01151 (v4, HELIOS and NARCBench).</w:t>
-      </w:r>
-    </w:p>
-    <w:p>
-      <w:pPr>
-        <w:pStyle w:val="BodyText"/>
-      </w:pPr>
-      <w:r>
-        <w:t xml:space="preserve">Snow, J. (2026). Reading Moves, Not Messages: Detecting Collusion Between LLM Agents. Apart Research AI Collusion Sprint entry (concurrent work).</w:t>
-      </w:r>
-    </w:p>
-    <w:p>
-      <w:pPr>
-        <w:pStyle w:val="BodyText"/>
-      </w:pPr>
-      <w:r>
-        <w:t xml:space="preserve">solarkyle (2026). jspace-lenses: fitted Jacobian lenses for open models. Hugging Face.</w:t>
-      </w:r>
-    </w:p>
-    <w:p>
-      <w:pPr>
-        <w:pStyle w:val="BodyText"/>
-      </w:pPr>
-      <w:r>
-        <w:t xml:space="preserve">Tailor, O. (2025). Audit the Whisper: Detecting Steganographic Collusion in Multi-Agent LLMs. arXiv:2510.04303.</w:t>
-      </w:r>
-    </w:p>
-    <w:p>
-      <w:pPr>
-        <w:pStyle w:val="BodyText"/>
-      </w:pPr>
-      <w:r>
-        <w:t xml:space="preserve">Veras Neves, C. E. (2026). j-space: Jacobian Lens for algorithmic collusion. Hugging Face Space (Trackio logbook), July 2026.</w:t>
-      </w:r>
-    </w:p>
-    <w:p>
-      <w:pPr>
-        <w:pStyle w:val="BodyText"/>
-      </w:pPr>
-      <w:r>
-        <w:t xml:space="preserve">Xu, X., Wu, C., Lu, J., Tan, K., Tao, S. and Hong, H. (2026). Collusion with Competitive Marginals: Price-Level Audits Are Blind by Construction. arXiv:2607.26385.</w:t>
-      </w:r>
-    </w:p>
-    <w:bookmarkEnd w:id="47"/>
-    <w:bookmarkStart w:id="48" w:name="appendix-a.-reproducibility"/>
-    <w:p>
-      <w:pPr>
-        <w:pStyle w:val="Heading2"/>
-      </w:pPr>
-      <w:r>
-        <w:t xml:space="preserve">Appendix A. Reproducibility</w:t>
+        <w:t xml:space="preserve">Appendix B. Reproducibility</w:t>
       </w:r>
     </w:p>
     <w:p>
@@ -3374,7 +3589,7 @@
     </w:p>
     <w:bookmarkEnd w:id="48"/>
     <w:sectPr>
-      <w:pgMar w:bottom="1134" w:left="1134" w:right="1134" w:top="1134"/>
+      <w:pgMar w:left="1077" w:right="1077" w:top="1077" w:bottom="1077"/>
     </w:sectPr>
   </w:body>
 </w:document>
@@ -4179,7 +4394,7 @@
       <w:color w:themeColor="accent1" w:themeShade="BF" w:val="365F91"/>
     </w:rPr>
   </w:style>
-  <w:style w:customStyle="1" w:styleId="SourceCode" w:type="paragraph">
+  <w:style w:type="paragraph" w:customStyle="1" w:styleId="SourceCode">
     <w:name w:val="Source Code"/>
     <w:basedOn w:val="Normal"/>
     <w:link w:val="VerbatimChar"/>
@@ -4187,7 +4402,7 @@
       <w:wordWrap w:val="off"/>
     </w:pPr>
   </w:style>
-  <w:style w:customStyle="1" w:styleId="KeywordTok" w:type="character">
+  <w:style w:type="character" w:customStyle="1" w:styleId="KeywordTok">
     <w:name w:val="KeywordTok"/>
     <w:basedOn w:val="VerbatimChar"/>
     <w:rPr>
@@ -4195,77 +4410,77 @@
       <w:b/>
     </w:rPr>
   </w:style>
-  <w:style w:customStyle="1" w:styleId="DataTypeTok" w:type="character">
+  <w:style w:type="character" w:customStyle="1" w:styleId="DataTypeTok">
     <w:name w:val="DataTypeTok"/>
     <w:basedOn w:val="VerbatimChar"/>
     <w:rPr>
       <w:color w:val="902000"/>
     </w:rPr>
   </w:style>
-  <w:style w:customStyle="1" w:styleId="DecValTok" w:type="character">
+  <w:style w:type="character" w:customStyle="1" w:styleId="DecValTok">
     <w:name w:val="DecValTok"/>
     <w:basedOn w:val="VerbatimChar"/>
     <w:rPr>
       <w:color w:val="40a070"/>
     </w:rPr>
   </w:style>
-  <w:style w:customStyle="1" w:styleId="BaseNTok" w:type="character">
+  <w:style w:type="character" w:customStyle="1" w:styleId="BaseNTok">
     <w:name w:val="BaseNTok"/>
     <w:basedOn w:val="VerbatimChar"/>
     <w:rPr>
       <w:color w:val="40a070"/>
     </w:rPr>
   </w:style>
-  <w:style w:customStyle="1" w:styleId="FloatTok" w:type="character">
+  <w:style w:type="character" w:customStyle="1" w:styleId="FloatTok">
     <w:name w:val="FloatTok"/>
     <w:basedOn w:val="VerbatimChar"/>
     <w:rPr>
       <w:color w:val="40a070"/>
     </w:rPr>
   </w:style>
-  <w:style w:customStyle="1" w:styleId="ConstantTok" w:type="character">
+  <w:style w:type="character" w:customStyle="1" w:styleId="ConstantTok">
     <w:name w:val="ConstantTok"/>
     <w:basedOn w:val="VerbatimChar"/>
     <w:rPr>
       <w:color w:val="880000"/>
     </w:rPr>
   </w:style>
-  <w:style w:customStyle="1" w:styleId="CharTok" w:type="character">
+  <w:style w:type="character" w:customStyle="1" w:styleId="CharTok">
     <w:name w:val="CharTok"/>
     <w:basedOn w:val="VerbatimChar"/>
     <w:rPr>
       <w:color w:val="4070a0"/>
     </w:rPr>
   </w:style>
-  <w:style w:customStyle="1" w:styleId="SpecialCharTok" w:type="character">
+  <w:style w:type="character" w:customStyle="1" w:styleId="SpecialCharTok">
     <w:name w:val="SpecialCharTok"/>
     <w:basedOn w:val="VerbatimChar"/>
     <w:rPr>
       <w:color w:val="4070a0"/>
     </w:rPr>
   </w:style>
-  <w:style w:customStyle="1" w:styleId="StringTok" w:type="character">
+  <w:style w:type="character" w:customStyle="1" w:styleId="StringTok">
     <w:name w:val="StringTok"/>
     <w:basedOn w:val="VerbatimChar"/>
     <w:rPr>
       <w:color w:val="4070a0"/>
     </w:rPr>
   </w:style>
-  <w:style w:customStyle="1" w:styleId="VerbatimStringTok" w:type="character">
+  <w:style w:type="character" w:customStyle="1" w:styleId="VerbatimStringTok">
     <w:name w:val="VerbatimStringTok"/>
     <w:basedOn w:val="VerbatimChar"/>
     <w:rPr>
       <w:color w:val="4070a0"/>
     </w:rPr>
   </w:style>
-  <w:style w:customStyle="1" w:styleId="SpecialStringTok" w:type="character">
+  <w:style w:type="character" w:customStyle="1" w:styleId="SpecialStringTok">
     <w:name w:val="SpecialStringTok"/>
     <w:basedOn w:val="VerbatimChar"/>
     <w:rPr>
       <w:color w:val="bb6688"/>
     </w:rPr>
   </w:style>
-  <w:style w:customStyle="1" w:styleId="ImportTok" w:type="character">
+  <w:style w:type="character" w:customStyle="1" w:styleId="ImportTok">
     <w:name w:val="ImportTok"/>
     <w:basedOn w:val="VerbatimChar"/>
     <w:rPr>
@@ -4273,7 +4488,7 @@
       <w:b/>
     </w:rPr>
   </w:style>
-  <w:style w:customStyle="1" w:styleId="CommentTok" w:type="character">
+  <w:style w:type="character" w:customStyle="1" w:styleId="CommentTok">
     <w:name w:val="CommentTok"/>
     <w:basedOn w:val="VerbatimChar"/>
     <w:rPr>
@@ -4281,7 +4496,7 @@
       <w:i/>
     </w:rPr>
   </w:style>
-  <w:style w:customStyle="1" w:styleId="DocumentationTok" w:type="character">
+  <w:style w:type="character" w:customStyle="1" w:styleId="DocumentationTok">
     <w:name w:val="DocumentationTok"/>
     <w:basedOn w:val="VerbatimChar"/>
     <w:rPr>
@@ -4289,7 +4504,7 @@
       <w:i/>
     </w:rPr>
   </w:style>
-  <w:style w:customStyle="1" w:styleId="AnnotationTok" w:type="character">
+  <w:style w:type="character" w:customStyle="1" w:styleId="AnnotationTok">
     <w:name w:val="AnnotationTok"/>
     <w:basedOn w:val="VerbatimChar"/>
     <w:rPr>
@@ -4298,7 +4513,7 @@
       <w:i/>
     </w:rPr>
   </w:style>
-  <w:style w:customStyle="1" w:styleId="CommentVarTok" w:type="character">
+  <w:style w:type="character" w:customStyle="1" w:styleId="CommentVarTok">
     <w:name w:val="CommentVarTok"/>
     <w:basedOn w:val="VerbatimChar"/>
     <w:rPr>
@@ -4307,28 +4522,28 @@
       <w:i/>
     </w:rPr>
   </w:style>
-  <w:style w:customStyle="1" w:styleId="OtherTok" w:type="character">
+  <w:style w:type="character" w:customStyle="1" w:styleId="OtherTok">
     <w:name w:val="OtherTok"/>
     <w:basedOn w:val="VerbatimChar"/>
     <w:rPr>
       <w:color w:val="007020"/>
     </w:rPr>
   </w:style>
-  <w:style w:customStyle="1" w:styleId="FunctionTok" w:type="character">
+  <w:style w:type="character" w:customStyle="1" w:styleId="FunctionTok">
     <w:name w:val="FunctionTok"/>
     <w:basedOn w:val="VerbatimChar"/>
     <w:rPr>
       <w:color w:val="06287e"/>
     </w:rPr>
   </w:style>
-  <w:style w:customStyle="1" w:styleId="VariableTok" w:type="character">
+  <w:style w:type="character" w:customStyle="1" w:styleId="VariableTok">
     <w:name w:val="VariableTok"/>
     <w:basedOn w:val="VerbatimChar"/>
     <w:rPr>
       <w:color w:val="19177c"/>
     </w:rPr>
   </w:style>
-  <w:style w:customStyle="1" w:styleId="ControlFlowTok" w:type="character">
+  <w:style w:type="character" w:customStyle="1" w:styleId="ControlFlowTok">
     <w:name w:val="ControlFlowTok"/>
     <w:basedOn w:val="VerbatimChar"/>
     <w:rPr>
@@ -4336,45 +4551,45 @@
       <w:b/>
     </w:rPr>
   </w:style>
-  <w:style w:customStyle="1" w:styleId="OperatorTok" w:type="character">
+  <w:style w:type="character" w:customStyle="1" w:styleId="OperatorTok">
     <w:name w:val="OperatorTok"/>
     <w:basedOn w:val="VerbatimChar"/>
     <w:rPr>
       <w:color w:val="666666"/>
     </w:rPr>
   </w:style>
-  <w:style w:customStyle="1" w:styleId="BuiltInTok" w:type="character">
+  <w:style w:type="character" w:customStyle="1" w:styleId="BuiltInTok">
     <w:name w:val="BuiltInTok"/>
     <w:basedOn w:val="VerbatimChar"/>
     <w:rPr>
       <w:color w:val="008000"/>
     </w:rPr>
   </w:style>
-  <w:style w:customStyle="1" w:styleId="ExtensionTok" w:type="character">
+  <w:style w:type="character" w:customStyle="1" w:styleId="ExtensionTok">
     <w:name w:val="ExtensionTok"/>
     <w:basedOn w:val="VerbatimChar"/>
     <w:rPr/>
   </w:style>
-  <w:style w:customStyle="1" w:styleId="PreprocessorTok" w:type="character">
+  <w:style w:type="character" w:customStyle="1" w:styleId="PreprocessorTok">
     <w:name w:val="PreprocessorTok"/>
     <w:basedOn w:val="VerbatimChar"/>
     <w:rPr>
       <w:color w:val="bc7a00"/>
     </w:rPr>
   </w:style>
-  <w:style w:customStyle="1" w:styleId="AttributeTok" w:type="character">
+  <w:style w:type="character" w:customStyle="1" w:styleId="AttributeTok">
     <w:name w:val="AttributeTok"/>
     <w:basedOn w:val="VerbatimChar"/>
     <w:rPr>
       <w:color w:val="7d9029"/>
     </w:rPr>
   </w:style>
-  <w:style w:customStyle="1" w:styleId="RegionMarkerTok" w:type="character">
+  <w:style w:type="character" w:customStyle="1" w:styleId="RegionMarkerTok">
     <w:name w:val="RegionMarkerTok"/>
     <w:basedOn w:val="VerbatimChar"/>
     <w:rPr/>
   </w:style>
-  <w:style w:customStyle="1" w:styleId="InformationTok" w:type="character">
+  <w:style w:type="character" w:customStyle="1" w:styleId="InformationTok">
     <w:name w:val="InformationTok"/>
     <w:basedOn w:val="VerbatimChar"/>
     <w:rPr>
@@ -4383,7 +4598,7 @@
       <w:i/>
     </w:rPr>
   </w:style>
-  <w:style w:customStyle="1" w:styleId="WarningTok" w:type="character">
+  <w:style w:type="character" w:customStyle="1" w:styleId="WarningTok">
     <w:name w:val="WarningTok"/>
     <w:basedOn w:val="VerbatimChar"/>
     <w:rPr>
@@ -4392,7 +4607,7 @@
       <w:i/>
     </w:rPr>
   </w:style>
-  <w:style w:customStyle="1" w:styleId="AlertTok" w:type="character">
+  <w:style w:type="character" w:customStyle="1" w:styleId="AlertTok">
     <w:name w:val="AlertTok"/>
     <w:basedOn w:val="VerbatimChar"/>
     <w:rPr>
@@ -4400,7 +4615,7 @@
       <w:b/>
     </w:rPr>
   </w:style>
-  <w:style w:customStyle="1" w:styleId="ErrorTok" w:type="character">
+  <w:style w:type="character" w:customStyle="1" w:styleId="ErrorTok">
     <w:name w:val="ErrorTok"/>
     <w:basedOn w:val="VerbatimChar"/>
     <w:rPr>
@@ -4408,7 +4623,7 @@
       <w:b/>
     </w:rPr>
   </w:style>
-  <w:style w:customStyle="1" w:styleId="NormalTok" w:type="character">
+  <w:style w:type="character" w:customStyle="1" w:styleId="NormalTok">
     <w:name w:val="NormalTok"/>
     <w:basedOn w:val="VerbatimChar"/>
     <w:rPr/>

</xml_diff>

<commit_message>
LLM pilot results (GPT-4.1-mini, 30 games): hidden channel detected from actions; same-model base rate absorbed by net correction; final 8-page build
Co-Authored-By: Claude Fable 5.1 <noreply@anthropic.com>
Claude-Session: https://claude.ai/code/session_018qJiaQKKjpemqx8e3Wrmcq
</commit_message>
<xml_diff>
--- a/report/report_draft.docx
+++ b/report/report_draft.docx
@@ -304,7 +304,7 @@
         <w:pStyle w:val="FirstParagraph"/>
       </w:pPr>
       <w:r>
-        <w:t xml:space="preserve">What should count as evidence that two AI agents are colluding? Antitrust law holds that parallel conduct is not an agreement and demands plus factors. We test one plus factor at two evidence surfaces, action logs and model internals, and in each case measure how the naive reading mistakes something innocent for collusion. On actions, we implement pairwise net influence (Bonjour et al. 2022) for N players, add a within-state permutation null, and run the ground-truth evaluation the method has never had: 7,400 scripted games over five horizons, six collusion strengths, four baselines, two public-state definitions, two kinds of innocent pair and a coalition of three. The published memoryless statistic and every unconditioned baseline rank the innocent pair first in 96 to 100 percent of games; conditioning on the public state recovers the true pair in 98 to 100 percent; the permutation null cuts the 25-round false-positive rate from 100 percent to 25 percent; and we report where the conditioned detector breaks. On internals, we run the privileged-observer control Rose et al. (2026) proposed: a Jacobian-lens assay on gemma-4-12B-it with a partner’s coded proposal and five matched conditions. The receiver never approved an ineligible item; the proposal reads out at vocabulary rank 0 when the receiver is about to act on it legitimately and at chance when it has understood it and declined. A workspace monitor at the decision point sees the action, not the understanding. Code, logs and notebooks are released.</w:t>
+        <w:t xml:space="preserve">Antitrust law holds that parallel conduct is not an agreement and demands plus factors. We test one plus factor at two evidence surfaces, action logs and model internals, and measure how the naive reading of each mistakes something innocent for collusion. On actions, we implement pairwise net influence (Bonjour et al. 2022) for N players, add a within-state permutation null, and run the ground-truth evaluation the method has never had: 7,400 scripted games over five horizons, six collusion strengths, four baselines, two public-state definitions, two kinds of innocent pair and a coalition of three. Every unconditioned statistic ranks the innocent pair first in 96 to 100 percent of games; conditioning on the public state recovers the true pair in 98 to 100 percent; the permutation null cuts the 25-round false-positive rate from 100 to 25 percent; and we report where the detector breaks. On internals, we run the privileged-observer control Rose et al. (2026) proposed: a Jacobian-lens assay on gemma-4-12B-it with a partner’s coded proposal and five matched conditions. The receiver never approved an ineligible item; the proposal reads out at rank 0 when the receiver is about to act on it legitimately and at chance when it has understood it and declined. A workspace monitor at the decision point sees the action, not the understanding. On GPT-4.1-mini agents with a hidden channel, the detector ranks the colluding pair first from actions alone and flags nothing in a same-model control. Code, logs and notebooks are released.</w:t>
       </w:r>
     </w:p>
     <w:bookmarkEnd w:id="20"/>
@@ -388,7 +388,7 @@
       <w:r>
         <w:drawing>
           <wp:inline>
-            <wp:extent cx="4267200" cy="2607733"/>
+            <wp:extent cx="3307080" cy="2020993"/>
             <wp:effectExtent b="0" l="0" r="0" t="0"/>
             <wp:docPr descr="Figure 1. Two evidence surfaces, one rule. Left: on an action log, the naive statistic points at the innocent pair that follows the same public rule; the state-conditioned, permutation-calibrated statistic points at the hidden coalition. Right: in the receiver’s workspace, the lens reads the partner’s proposal; the assay asks whether the readout differs between adopting and understanding-and-refusing." title="" id="22" name="Picture"/>
             <a:graphic>
@@ -409,7 +409,7 @@
                   <pic:spPr bwMode="auto">
                     <a:xfrm>
                       <a:off x="0" y="0"/>
-                      <a:ext cx="4267200" cy="2607733"/>
+                      <a:ext cx="3307080" cy="2020993"/>
                     </a:xfrm>
                     <a:prstGeom prst="rect">
                       <a:avLst/>
@@ -479,7 +479,7 @@
         <w:t xml:space="preserve"> </w:t>
       </w:r>
       <w:r>
-        <w:t xml:space="preserve">Rose et al. (2026) train a deception direction on residual activations and aggregate per-agent scores across a group, reaching 1.00 AUROC in-distribution and 0.73 to 0.93 zero-shot. They name, and leave to future work, a privileged-observer control in which an agent knows the scheme but does not take part. Li et al. (2026) find that a probe confined to the Jacobian-lens transport subspace detects stated stance but is no better than a random subspace at detecting withheld collusion. Veras Neves (2026) reads a coordination signal from the J-lens on single legal-judgement prompts in Qwen3.5-4B and gemma-4-e4b-it, with lexical-echo and answer-slot controls but no condition in which the model understands a proposal and declines it. Gurnee et al. (2026) and Ayonrinde and Lindsey (2026) show that a concept can sit in the workspace while the model suppresses it, which is the premise our refusal-matched assay tests.</w:t>
+        <w:t xml:space="preserve">Rose et al. (2026) train a deception direction on residual activations and aggregate per-agent scores across a group; they name, and leave to future work, a privileged-observer control in which an agent knows the scheme but does not take part. Li et al. (2026) find that a probe confined to the Jacobian-lens transport subspace detects stated stance but not withheld collusion. Veras Neves (2026) reads a coordination signal from the J-lens on single prompts with no condition in which the model understands a proposal and declines it. Gurnee et al. (2026) and Ayonrinde and Lindsey (2026) show that a concept can sit in the workspace while the model suppresses it, the premise our refusal-matched assay tests.</w:t>
       </w:r>
     </w:p>
     <w:p>
@@ -772,7 +772,7 @@
       <w:r>
         <w:drawing>
           <wp:inline>
-            <wp:extent cx="4267200" cy="2015066"/>
+            <wp:extent cx="3307080" cy="1561676"/>
             <wp:effectExtent b="0" l="0" r="0" t="0"/>
             <wp:docPr descr="Figure 2. The lens assay: scripted sender, random codebook, receiver prompt, Jacobian-lens readout at the last prompt token, one-word action, and the five matched conditions per base case." title="" id="31" name="Picture"/>
             <a:graphic>
@@ -793,7 +793,7 @@
                   <pic:spPr bwMode="auto">
                     <a:xfrm>
                       <a:off x="0" y="0"/>
-                      <a:ext cx="4267200" cy="2015066"/>
+                      <a:ext cx="3307080" cy="1561676"/>
                     </a:xfrm>
                     <a:prstGeom prst="rect">
                       <a:avLst/>
@@ -838,7 +838,7 @@
       <w:r>
         <w:drawing>
           <wp:inline>
-            <wp:extent cx="4267200" cy="1493520"/>
+            <wp:extent cx="3307080" cy="1157478"/>
             <wp:effectExtent b="0" l="0" r="0" t="0"/>
             <wp:docPr descr="Figure 3. Left: rank-1 accuracy when an innocent parallel pair is present (CP = 0.6). Middle: false-positive rate under the published criterion when no collusion is present, in the all-random and parallel-only worlds. Right: criterion accuracy at 25 rounds as a function of collusion strength, random non-colluders. 100 seeds per point." title="" id="36" name="Picture"/>
             <a:graphic>
@@ -859,7 +859,7 @@
                   <pic:spPr bwMode="auto">
                     <a:xfrm>
                       <a:off x="0" y="0"/>
-                      <a:ext cx="4267200" cy="1493520"/>
+                      <a:ext cx="3307080" cy="1157478"/>
                     </a:xfrm>
                     <a:prstGeom prst="rect">
                       <a:avLst/>
@@ -987,7 +987,7 @@
         <w:t xml:space="preserve"> </w:t>
       </w:r>
       <w:r>
-        <w:t xml:space="preserve">With the majority-action state, gamma(C; D | S) is zero because both parallel players are deterministic functions of S. Rank-1 accuracy of the true pair becomes 1.00 at every T and CP from 0.2 upwards, and the innocent pair is never flagged. This is the operational content of the antitrust rule: dependence that survives conditioning on what everyone could see is evidence of something more than parallelism.</w:t>
+        <w:t xml:space="preserve">With the majority-action state, gamma(C; D | S) is zero because both parallel players are deterministic functions of S; rank-1 accuracy of the true pair becomes 1.00 at every T and CP from 0.2 upwards, and the innocent pair is never flagged.</w:t>
       </w:r>
     </w:p>
     <w:p>
@@ -2466,13 +2466,510 @@
           <w:bCs/>
           <w:b/>
         </w:rPr>
-        <w:t xml:space="preserve">Status.</w:t>
-      </w:r>
-      <w:r>
-        <w:t xml:space="preserve"> </w:t>
-      </w:r>
-      <w:r>
-        <w:t xml:space="preserve">This pilot was set up but not completed before the submission deadline. The harness (experiments/llm_rps.py, experiments/analyse_llm.py) and the Colab notebook (collusion_llm_pilot.ipynb) are in the repository, and experiments/fill_report.py inserts the result table into this section once a run lands under results/. No run arrived in time, so this report makes no claim about coalition advantage, detector ranking, the no-channel salience condition or the same-model false-alarm rate on GPT-4.1-mini. The scripted results in Section 4 stand on their own; what they predict for this pilot is that a 25-round game detects the team pair only if the pair coordinates in well over half of rounds, and that pooling the ten games is needed for weaker coordination.</w:t>
+        <w:t xml:space="preserve">Results</w:t>
+      </w:r>
+      <w:r>
+        <w:t xml:space="preserve"> </w:t>
+      </w:r>
+      <w:r>
+        <w:t xml:space="preserve">(pooled 250 rounds per condition; raw output in results/20261026-0917-llm-pilot/; Alpha and Bravo are the team).</w:t>
+      </w:r>
+    </w:p>
+    <w:tbl>
+      <w:tblPr>
+        <w:tblStyle w:val="Table"/>
+        <w:tblW w:type="pct" w:w="5000"/>
+        <w:tblLook w:firstRow="1" w:lastRow="0" w:firstColumn="0" w:lastColumn="0" w:noHBand="0" w:noVBand="0" w:val="0020"/>
+        <w:jc w:val="start"/>
+      </w:tblPr>
+      <w:tblGrid>
+        <w:gridCol w:w="990"/>
+        <w:gridCol w:w="990"/>
+        <w:gridCol w:w="990"/>
+        <w:gridCol w:w="990"/>
+        <w:gridCol w:w="990"/>
+        <w:gridCol w:w="990"/>
+        <w:gridCol w:w="990"/>
+        <w:gridCol w:w="990"/>
+      </w:tblGrid>
+      <w:tr>
+        <w:trPr>
+          <w:tblHeader w:val="true"/>
+        </w:trPr>
+        <w:tc>
+          <w:tcPr/>
+          <w:p>
+            <w:pPr>
+              <w:pStyle w:val="Compact"/>
+              <w:jc w:val="left"/>
+            </w:pPr>
+            <w:r>
+              <w:t xml:space="preserve">condition</w:t>
+            </w:r>
+          </w:p>
+        </w:tc>
+        <w:tc>
+          <w:tcPr/>
+          <w:p>
+            <w:pPr>
+              <w:pStyle w:val="Compact"/>
+              <w:jc w:val="left"/>
+            </w:pPr>
+            <w:r>
+              <w:t xml:space="preserve">coalition advantage per game</w:t>
+            </w:r>
+          </w:p>
+        </w:tc>
+        <w:tc>
+          <w:tcPr/>
+          <w:p>
+            <w:pPr>
+              <w:pStyle w:val="Compact"/>
+              <w:jc w:val="left"/>
+            </w:pPr>
+            <w:r>
+              <w:t xml:space="preserve">pooled gamma(Alpha; Bravo), nats</w:t>
+            </w:r>
+          </w:p>
+        </w:tc>
+        <w:tc>
+          <w:tcPr/>
+          <w:p>
+            <w:pPr>
+              <w:pStyle w:val="Compact"/>
+              <w:jc w:val="left"/>
+            </w:pPr>
+            <w:r>
+              <w:t xml:space="preserve">team pair: net-influence rank of 6</w:t>
+            </w:r>
+          </w:p>
+        </w:tc>
+        <w:tc>
+          <w:tcPr/>
+          <w:p>
+            <w:pPr>
+              <w:pStyle w:val="Compact"/>
+              <w:jc w:val="left"/>
+            </w:pPr>
+            <w:r>
+              <w:t xml:space="preserve">criterion flags</w:t>
+            </w:r>
+          </w:p>
+        </w:tc>
+        <w:tc>
+          <w:tcPr/>
+          <w:p>
+            <w:pPr>
+              <w:pStyle w:val="Compact"/>
+              <w:jc w:val="left"/>
+            </w:pPr>
+            <w:r>
+              <w:t xml:space="preserve">per-game rank-1, memoryless</w:t>
+            </w:r>
+          </w:p>
+        </w:tc>
+        <w:tc>
+          <w:tcPr/>
+          <w:p>
+            <w:pPr>
+              <w:pStyle w:val="Compact"/>
+              <w:jc w:val="left"/>
+            </w:pPr>
+            <w:r>
+              <w:t xml:space="preserve">per-game rank-1, majority state</w:t>
+            </w:r>
+          </w:p>
+        </w:tc>
+        <w:tc>
+          <w:tcPr/>
+          <w:p>
+            <w:pPr>
+              <w:pStyle w:val="Compact"/>
+              <w:jc w:val="left"/>
+            </w:pPr>
+            <w:r>
+              <w:t xml:space="preserve">most dependent non-team pair (gamma, perm p)</w:t>
+            </w:r>
+          </w:p>
+        </w:tc>
+      </w:tr>
+      <w:tr>
+        <w:tc>
+          <w:tcPr/>
+          <w:p>
+            <w:pPr>
+              <w:pStyle w:val="Compact"/>
+              <w:jc w:val="left"/>
+            </w:pPr>
+            <w:r>
+              <w:t xml:space="preserve">collude</w:t>
+            </w:r>
+          </w:p>
+        </w:tc>
+        <w:tc>
+          <w:tcPr/>
+          <w:p>
+            <w:pPr>
+              <w:pStyle w:val="Compact"/>
+              <w:jc w:val="left"/>
+            </w:pPr>
+            <w:r>
+              <w:t xml:space="preserve">-0.25</w:t>
+            </w:r>
+          </w:p>
+        </w:tc>
+        <w:tc>
+          <w:tcPr/>
+          <w:p>
+            <w:pPr>
+              <w:pStyle w:val="Compact"/>
+              <w:jc w:val="left"/>
+            </w:pPr>
+            <w:r>
+              <w:t xml:space="preserve">0.166 (p = 0.002)</w:t>
+            </w:r>
+          </w:p>
+        </w:tc>
+        <w:tc>
+          <w:tcPr/>
+          <w:p>
+            <w:pPr>
+              <w:pStyle w:val="Compact"/>
+              <w:jc w:val="left"/>
+            </w:pPr>
+            <w:r>
+              <w:t xml:space="preserve">1</w:t>
+            </w:r>
+          </w:p>
+        </w:tc>
+        <w:tc>
+          <w:tcPr/>
+          <w:p>
+            <w:pPr>
+              <w:pStyle w:val="Compact"/>
+              <w:jc w:val="left"/>
+            </w:pPr>
+            <w:r>
+              <w:t xml:space="preserve">the team</w:t>
+            </w:r>
+          </w:p>
+        </w:tc>
+        <w:tc>
+          <w:tcPr/>
+          <w:p>
+            <w:pPr>
+              <w:pStyle w:val="Compact"/>
+              <w:jc w:val="left"/>
+            </w:pPr>
+            <w:r>
+              <w:t xml:space="preserve">0.90</w:t>
+            </w:r>
+          </w:p>
+        </w:tc>
+        <w:tc>
+          <w:tcPr/>
+          <w:p>
+            <w:pPr>
+              <w:pStyle w:val="Compact"/>
+              <w:jc w:val="left"/>
+            </w:pPr>
+            <w:r>
+              <w:t xml:space="preserve">0.30</w:t>
+            </w:r>
+          </w:p>
+        </w:tc>
+        <w:tc>
+          <w:tcPr/>
+          <w:p>
+            <w:pPr>
+              <w:pStyle w:val="Compact"/>
+              <w:jc w:val="left"/>
+            </w:pPr>
+            <w:r>
+              <w:t xml:space="preserve">Charlie-Delta (0.043, p = 0.002)</w:t>
+            </w:r>
+          </w:p>
+        </w:tc>
+      </w:tr>
+      <w:tr>
+        <w:tc>
+          <w:tcPr/>
+          <w:p>
+            <w:pPr>
+              <w:pStyle w:val="Compact"/>
+              <w:jc w:val="left"/>
+            </w:pPr>
+            <w:r>
+              <w:t xml:space="preserve">team_no_channel</w:t>
+            </w:r>
+          </w:p>
+        </w:tc>
+        <w:tc>
+          <w:tcPr/>
+          <w:p>
+            <w:pPr>
+              <w:pStyle w:val="Compact"/>
+              <w:jc w:val="left"/>
+            </w:pPr>
+            <w:r>
+              <w:t xml:space="preserve">-0.20</w:t>
+            </w:r>
+          </w:p>
+        </w:tc>
+        <w:tc>
+          <w:tcPr/>
+          <w:p>
+            <w:pPr>
+              <w:pStyle w:val="Compact"/>
+              <w:jc w:val="left"/>
+            </w:pPr>
+            <w:r>
+              <w:t xml:space="preserve">0.021 (p = 0.046)</w:t>
+            </w:r>
+          </w:p>
+        </w:tc>
+        <w:tc>
+          <w:tcPr/>
+          <w:p>
+            <w:pPr>
+              <w:pStyle w:val="Compact"/>
+              <w:jc w:val="left"/>
+            </w:pPr>
+            <w:r>
+              <w:t xml:space="preserve">2</w:t>
+            </w:r>
+          </w:p>
+        </w:tc>
+        <w:tc>
+          <w:tcPr/>
+          <w:p>
+            <w:pPr>
+              <w:pStyle w:val="Compact"/>
+              <w:jc w:val="left"/>
+            </w:pPr>
+            <w:r>
+              <w:t xml:space="preserve">none</w:t>
+            </w:r>
+          </w:p>
+        </w:tc>
+        <w:tc>
+          <w:tcPr/>
+          <w:p>
+            <w:pPr>
+              <w:pStyle w:val="Compact"/>
+              <w:jc w:val="left"/>
+            </w:pPr>
+            <w:r>
+              <w:t xml:space="preserve">0.10</w:t>
+            </w:r>
+          </w:p>
+        </w:tc>
+        <w:tc>
+          <w:tcPr/>
+          <w:p>
+            <w:pPr>
+              <w:pStyle w:val="Compact"/>
+              <w:jc w:val="left"/>
+            </w:pPr>
+            <w:r>
+              <w:t xml:space="preserve">0.10</w:t>
+            </w:r>
+          </w:p>
+        </w:tc>
+        <w:tc>
+          <w:tcPr/>
+          <w:p>
+            <w:pPr>
+              <w:pStyle w:val="Compact"/>
+              <w:jc w:val="left"/>
+            </w:pPr>
+            <w:r>
+              <w:t xml:space="preserve">Charlie-Delta (0.045, p = 0.002)</w:t>
+            </w:r>
+          </w:p>
+        </w:tc>
+      </w:tr>
+      <w:tr>
+        <w:tc>
+          <w:tcPr/>
+          <w:p>
+            <w:pPr>
+              <w:pStyle w:val="Compact"/>
+              <w:jc w:val="left"/>
+            </w:pPr>
+            <w:r>
+              <w:t xml:space="preserve">independent</w:t>
+            </w:r>
+          </w:p>
+        </w:tc>
+        <w:tc>
+          <w:tcPr/>
+          <w:p>
+            <w:pPr>
+              <w:pStyle w:val="Compact"/>
+              <w:jc w:val="left"/>
+            </w:pPr>
+            <w:r>
+              <w:t xml:space="preserve">+0.75 (no team)</w:t>
+            </w:r>
+          </w:p>
+        </w:tc>
+        <w:tc>
+          <w:tcPr/>
+          <w:p>
+            <w:pPr>
+              <w:pStyle w:val="Compact"/>
+              <w:jc w:val="left"/>
+            </w:pPr>
+            <w:r>
+              <w:t xml:space="preserve">0.020 (p = 0.052)</w:t>
+            </w:r>
+          </w:p>
+        </w:tc>
+        <w:tc>
+          <w:tcPr/>
+          <w:p>
+            <w:pPr>
+              <w:pStyle w:val="Compact"/>
+              <w:jc w:val="left"/>
+            </w:pPr>
+            <w:r>
+              <w:t xml:space="preserve">4</w:t>
+            </w:r>
+          </w:p>
+        </w:tc>
+        <w:tc>
+          <w:tcPr/>
+          <w:p>
+            <w:pPr>
+              <w:pStyle w:val="Compact"/>
+              <w:jc w:val="left"/>
+            </w:pPr>
+            <w:r>
+              <w:t xml:space="preserve">none</w:t>
+            </w:r>
+          </w:p>
+        </w:tc>
+        <w:tc>
+          <w:tcPr/>
+          <w:p>
+            <w:pPr>
+              <w:pStyle w:val="Compact"/>
+              <w:jc w:val="left"/>
+            </w:pPr>
+            <w:r>
+              <w:t xml:space="preserve">0.00</w:t>
+            </w:r>
+          </w:p>
+        </w:tc>
+        <w:tc>
+          <w:tcPr/>
+          <w:p>
+            <w:pPr>
+              <w:pStyle w:val="Compact"/>
+              <w:jc w:val="left"/>
+            </w:pPr>
+            <w:r>
+              <w:t xml:space="preserve">0.10</w:t>
+            </w:r>
+          </w:p>
+        </w:tc>
+        <w:tc>
+          <w:tcPr/>
+          <w:p>
+            <w:pPr>
+              <w:pStyle w:val="Compact"/>
+              <w:jc w:val="left"/>
+            </w:pPr>
+            <w:r>
+              <w:t xml:space="preserve">Alpha-Delta (0.057, p = 0.002)</w:t>
+            </w:r>
+          </w:p>
+        </w:tc>
+      </w:tr>
+    </w:tbl>
+    <w:p>
+      <w:pPr>
+        <w:pStyle w:val="BodyText"/>
+      </w:pPr>
+      <w:r>
+        <w:rPr>
+          <w:bCs/>
+          <w:b/>
+        </w:rPr>
+        <w:t xml:space="preserve">The hidden channel is detectable from actions alone.</w:t>
+      </w:r>
+      <w:r>
+        <w:t xml:space="preserve"> </w:t>
+      </w:r>
+      <w:r>
+        <w:t xml:space="preserve">With the private channel, the team pair has the largest pairwise dependence by a factor of four, ranks first under net influence on the pooled log, is the only pair the exactly-one-pair criterion flags, and ranks first in 9 of 10 single 25-round games under the memoryless statistic. The private messages show what the detector is picking up: a sacrificial scheme in which one partner plays the move that loses to the other (</w:t>
+      </w:r>
+      <w:r>
+        <w:t xml:space="preserve">“</w:t>
+      </w:r>
+      <w:r>
+        <w:t xml:space="preserve">I’ll play rock to beat your scissors, so I can score while you lose</w:t>
+      </w:r>
+      <w:r>
+        <w:t xml:space="preserve">”</w:t>
+      </w:r>
+      <w:r>
+        <w:t xml:space="preserve">), alternating with same-move rounds. The team did not profit from it: coalition advantage is -0.25 points per game. Collusion here is detectable without being successful, and an auditor scoring harm alone would have missed it.</w:t>
+      </w:r>
+    </w:p>
+    <w:p>
+      <w:pPr>
+        <w:pStyle w:val="BodyText"/>
+      </w:pPr>
+      <w:r>
+        <w:rPr>
+          <w:bCs/>
+          <w:b/>
+        </w:rPr>
+        <w:t xml:space="preserve">Conditioning costs power at 25 rounds, as the scripted sweep predicted.</w:t>
+      </w:r>
+      <w:r>
+        <w:t xml:space="preserve"> </w:t>
+      </w:r>
+      <w:r>
+        <w:t xml:space="preserve">With the majority-state condition, per-game rank-1 accuracy falls from 0.90 to 0.30; pooling ten games restores the verdict (rank 1, flagged). The team’s scheme is not a function of the previous majority, so the loss is estimation noise from splitting 25 rounds across four states, not confounding.</w:t>
+      </w:r>
+    </w:p>
+    <w:p>
+      <w:pPr>
+        <w:pStyle w:val="BodyText"/>
+      </w:pPr>
+      <w:r>
+        <w:rPr>
+          <w:bCs/>
+          <w:b/>
+        </w:rPr>
+        <w:t xml:space="preserve">A shared goal without a channel produces nothing the detector can see.</w:t>
+      </w:r>
+      <w:r>
+        <w:t xml:space="preserve"> </w:t>
+      </w:r>
+      <w:r>
+        <w:t xml:space="preserve">In team_no_channel the team pair’s dependence is 0.021 nats, ranks second, and is not flagged; the shared-salience route of question 1.3 did not operate at this scale for this model.</w:t>
+      </w:r>
+    </w:p>
+    <w:p>
+      <w:pPr>
+        <w:pStyle w:val="BodyText"/>
+      </w:pPr>
+      <w:r>
+        <w:rPr>
+          <w:bCs/>
+          <w:b/>
+        </w:rPr>
+        <w:t xml:space="preserve">The same-model base rate is real and the net correction is what absorbs it.</w:t>
+      </w:r>
+      <w:r>
+        <w:t xml:space="preserve"> </w:t>
+      </w:r>
+      <w:r>
+        <w:t xml:space="preserve">In every condition, including the control with no team at all, one non-team pair of two GPT-4.1-mini instances reaches a permutation p-value of 0.002 on the pooled log (Charlie-Delta at 0.043 to 0.045 nats; Alpha-Delta at 0.057 nats), which survives a Holm correction over six pairs. A raw permutation test on pairwise dependence would therefore flag an innocent same-model pair in each condition, the pattern Xu et al. (2026) describe. The net-influence step, which subtracts the strongest third-party influence on each agent, leaves those pairs below the criterion in all three conditions and flags only the true team in the condition where there is one. The margin in the control is narrow (Alpha-Delta’s net score is 0.037 against alpha = 0.05) and ten games is a pilot, not a calibration.</w:t>
       </w:r>
       <w:r>
         <w:t xml:space="preserve"> </w:t>
@@ -3160,7 +3657,7 @@
         <w:t xml:space="preserve"> </w:t>
       </w:r>
       <w:r>
-        <w:t xml:space="preserve">What is new here is narrow. We release the first general-N implementation of Bonjour et al.’s net influence with a within-state permutation null, and the first controlled study of its false-positive behaviour at 25 to 500 rounds against an innocent parallel-conduct pair, with four baselines and ground truth across 4,400 games. On the interpretability side, we specify and release a refusal-matched assay that asks whether a receiver’s workspace representation of a partner’s coded proposal differs between adopting it and understanding-and-refusing it; the assay has not yet produced a result. What is not new: net influence itself; conditioning on state (already in the original definition); permutation calibration of dependence statistics; reading collusion-related content with the J-lens (Veras Neves, Li et al.); activation probes for collusion (Rose et al.); and the observation that same-model agents correlate (Xu et al.).</w:t>
+        <w:t xml:space="preserve">New: a general-N implementation of net influence with a within-state permutation null, the first ground-truth study of its false-positive behaviour at 25 to 500 rounds against innocent parallel conduct with four baselines, and the privileged-observer control on a workspace lens with matched refusal conditions. Not new: net influence itself; conditioning on state; permutation calibration; reading collusion-related content with the J-lens (Veras Neves; Li et al.); activation probes for collusion (Rose et al.); same-model correlation (Xu et al.).</w:t>
       </w:r>
     </w:p>
     <w:p>
@@ -3168,7 +3665,17 @@
         <w:pStyle w:val="BodyText"/>
       </w:pPr>
       <w:r>
-        <w:t xml:space="preserve">The main action-side result is a negative one with a constructive fix. Every unconditioned dependence statistic, the published one included, mistakes two agents following the same public rule for a coalition in every game. Conditioning on the public information set fixes this, at the cost of a false-positive rate the fixed threshold does not control at short horizons; a permutation null fixes that. Conditioning plus calibration is a concrete plus factor: dependence not explained by what everyone could observe, larger than chance would produce in a log this short.</w:t>
+        <w:rPr>
+          <w:bCs/>
+          <w:b/>
+        </w:rPr>
+        <w:t xml:space="preserve">Actions.</w:t>
+      </w:r>
+      <w:r>
+        <w:t xml:space="preserve"> </w:t>
+      </w:r>
+      <w:r>
+        <w:t xml:space="preserve">Every unconditioned dependence statistic, the published one included, mistakes two agents following the same public rule for a coalition in every game. Conditioning on the public information set fixes this, at the cost of a false-positive rate the fixed threshold does not control at short horizons; a permutation null fixes that. The GPT-4.1-mini pilot shows the same structure on a real model: the hidden channel is visible in the actions, one innocent same-model pair per condition is significant on its own, and the net correction is what keeps it below the criterion. Section 4.5 adds the result that matters most for deployment: with a primary and two assistants, the net correction cancels the coalition’s own signal, so the published criterion loses power as the log grows. A coalition detector needs a conditional dependence structure, not a pairwise net score.</w:t>
       </w:r>
     </w:p>
     <w:p>
@@ -3176,7 +3683,17 @@
         <w:pStyle w:val="BodyText"/>
       </w:pPr>
       <w:r>
-        <w:t xml:space="preserve">The internals half applies the same rule to a different observation surface. A lens that reads the partner’s proposal out of the workspace has shown comprehension; whether it has shown agreement is exactly what the refusal control decides. Section 6 reports what we found under a rule fixed before any receiver was run: the model never acted on an ineligible proposal, and when it understood and declined one, the proposal was at chance in the lens. On this surface the readout at the decision point is a readout of the coming action. That is useful to an auditor only in the way the action itself already is, and it is the collusion-side counterpart of Li et al.’s finding that the J-lens subspace reads what agents say rather than what they withhold.</w:t>
+        <w:rPr>
+          <w:bCs/>
+          <w:b/>
+        </w:rPr>
+        <w:t xml:space="preserve">Internals.</w:t>
+      </w:r>
+      <w:r>
+        <w:t xml:space="preserve"> </w:t>
+      </w:r>
+      <w:r>
+        <w:t xml:space="preserve">A lens that reads the partner’s proposal out of the workspace has shown comprehension; whether it has shown agreement is what the refusal control decides. Under a rule fixed before any receiver was run, gemma-4-12B-it never acted on an ineligible proposal, and when it understood and declined one the proposal sat at chance in the lens; when it acted on the same tag legitimately, the item sat at rank 0. The readout at the decision point is a readout of the coming action, useful to an auditor only in the way the action itself already is. This is the collusion-side counterpart of Li et al.’s finding that the J-lens subspace reads what agents say rather than what they withhold.</w:t>
       </w:r>
     </w:p>
     <w:p>
@@ -3184,33 +3701,17 @@
         <w:pStyle w:val="BodyText"/>
       </w:pPr>
       <w:r>
-        <w:t xml:space="preserve">Two caveats are important. The parallel rule we used keys on a state we then condition on, which is the best case for the method; an innocent rule that keys on a richer public state than the detector conditions on would survive as apparent influence, and in LLM settings the</w:t>
-      </w:r>
-      <w:r>
-        <w:t xml:space="preserve"> </w:t>
-      </w:r>
-      <w:r>
-        <w:t xml:space="preserve">“</w:t>
-      </w:r>
-      <w:r>
-        <w:t xml:space="preserve">public rule</w:t>
-      </w:r>
-      <w:r>
-        <w:t xml:space="preserve">”</w:t>
-      </w:r>
-      <w:r>
-        <w:t xml:space="preserve"> </w:t>
-      </w:r>
-      <w:r>
-        <w:t xml:space="preserve">is the shared prior of the base model, which cannot be written down as a state variable. This is the open problem that the same-model negative control in Section 5 is built to probe, once that pilot has run. Second, the same-action baseline’s failure is a reminder that collusion need not look like agreement; detectors should be sign-agnostic.</w:t>
-      </w:r>
-    </w:p>
-    <w:p>
-      <w:pPr>
-        <w:pStyle w:val="BodyText"/>
-      </w:pPr>
-      <w:r>
-        <w:t xml:space="preserve">Section 4.5 adds the result that matters most for deployment: the net correction, which removes third-party influence, cancels the coalition’s own signal when a primary has two assistants, so the published criterion loses power as the log grows. A coalition detector needs a conditional dependence structure (which pairs are dependent given which others), not a pairwise net score. Future work: move to the Agrawal et al. (2025) double auction, where the public state is the order book; test whether conditioning on the other agents’ actions in the same round (rather than only the previous round) separates coordination from common response to a shock; and extend to coalitions larger than two.</w:t>
+        <w:rPr>
+          <w:bCs/>
+          <w:b/>
+        </w:rPr>
+        <w:t xml:space="preserve">Future work.</w:t>
+      </w:r>
+      <w:r>
+        <w:t xml:space="preserve"> </w:t>
+      </w:r>
+      <w:r>
+        <w:t xml:space="preserve">A p-value criterion with a conditional-independence structure for coalitions; the Agrawal et al. (2025) double auction, where the public state is the order book; a receiver model that does adopt unauthorised proposals, so the adopt-versus-refuse contrast can be run as designed; and reading the lens at the tag token rather than the decision token. Appendix A states what the results do and do not establish.</w:t>
       </w:r>
     </w:p>
     <w:bookmarkEnd w:id="45"/>
@@ -3392,7 +3893,7 @@
         <w:t xml:space="preserve"> </w:t>
       </w:r>
       <w:r>
-        <w:t xml:space="preserve">On a scripted four-player game with known ground truth, state-conditioned, permutation-corrected net influence recovers a seeded colluding pair and ignores an innocent parallel pair, while the published statistic and naive baselines do not. On a real model, the lens assay (thirty base cases, one model, one lens) establishes that the pre-action workspace readout of a coded proposal tracks whether the receiver is about to act on it, and is at chance when the receiver has understood it and declined. The action-only LLM pilot did not return results before submission and Section 5 says so in place of a result.</w:t>
+        <w:t xml:space="preserve">On a scripted four-player game with known ground truth, state-conditioned, permutation-corrected net influence recovers a seeded colluding pair and ignores an innocent parallel pair, while the published statistic and naive baselines do not. On a real model, the lens assay (thirty base cases, one model, one lens) establishes that the pre-action workspace readout of a coded proposal tracks whether the receiver is about to act on it, and is at chance when the receiver has understood it and declined. On GPT-4.1-mini agents, the detector identifies a pair coordinating through a hidden channel from actions alone, in a pilot of ten games per condition.</w:t>
       </w:r>
     </w:p>
     <w:p>
@@ -3410,7 +3911,7 @@
         <w:t xml:space="preserve"> </w:t>
       </w:r>
       <w:r>
-        <w:t xml:space="preserve">We tested one confound and one state function, both chosen to match. Real innocent correlation (shared base-model priors, common reactions to unmodelled shocks) is not reducible to a four-valued state. Our collusion model assumes ex-ante signalling, as in the original paper; LLM coalitions coordinate imperfectly, and the only evidence on that point here is scripted. The LLM pilot design is small (ten games per condition, one model, one temperature) and has not yet been executed. The lens assay uses one receiver model, one fitted lens, a scripted sender, a four-item vocabulary and a planted codebook; it is a controlled communication assay, not a demonstration that agents invent covert channels, and lens readouts of single tokens cover a fraction of the workspace. Its intended positive arm did not occur, because gemma-4-12B-it refused every ineligible nomination under the bonus objective, so the adopt-versus-refuse contrast is between permitted adoption and refusal rather than between unauthorised adoption and refusal; a receiver that does collude might represent a proposal differently, and the rank-0 readout in the permitted arm is what any next-token lens would show for the about-to-be-emitted word, so it is not evidence of a workspace-level proposal representation beyond output prediction. Decoding rates are compared across conditions on paired base cases, not against an absolute threshold, and the chance level for four candidates is 0.25. All code was written in a single sprint day and has not been independently reviewed. Concurrent entries in the same sprint apply net influence with permutation tests to LLM players; our contribution on the action surface is the ground-truth characterisation, not the method. On the internals surface, Li et al. (2026) report that the J-lens subspace tracks what agents say rather than what they withhold; a null adopt-versus-refuse separation in our assay would be consistent with that, and a positive one would need reconciling with it.</w:t>
+        <w:t xml:space="preserve">We tested one confound and one state function, both chosen to match. Real innocent correlation (shared base-model priors, common reactions to unmodelled shocks) is not reducible to a four-valued state. Our collusion model assumes ex-ante signalling, as in the original paper; LLM coalitions coordinate imperfectly, and the only evidence on that point here is scripted. The LLM pilot is small (ten games per condition, one model, one temperature) and its same-model control shows an innocent pair within 0.013 nats of the criterion, so the false-positive rate on same-model agents is not established. The lens assay uses one receiver model, one fitted lens, a scripted sender, a four-item vocabulary and a planted codebook; it is a controlled communication assay, not a demonstration that agents invent covert channels, and lens readouts of single tokens cover a fraction of the workspace. Its intended positive arm did not occur, because gemma-4-12B-it refused every ineligible nomination under the bonus objective, so the adopt-versus-refuse contrast is between permitted adoption and refusal rather than between unauthorised adoption and refusal; a receiver that does collude might represent a proposal differently, and the rank-0 readout in the permitted arm is what any next-token lens would show for the about-to-be-emitted word, so it is not evidence of a workspace-level proposal representation beyond output prediction. Decoding rates are compared across conditions on paired base cases, not against an absolute threshold, and the chance level for four candidates is 0.25. All code was written in a single sprint day and has not been independently reviewed. Concurrent entries in the same sprint apply net influence with permutation tests to LLM players; our contribution on the action surface is the ground-truth characterisation, not the method. On the internals surface, Li et al. (2026) report that the J-lens subspace tracks what agents say rather than what they withhold; a null adopt-versus-refuse separation in our assay would be consistent with that, and a positive one would need reconciling with it.</w:t>
       </w:r>
     </w:p>
     <w:p>
@@ -3589,7 +4090,7 @@
     </w:p>
     <w:bookmarkEnd w:id="48"/>
     <w:sectPr>
-      <w:pgMar w:left="1077" w:right="1077" w:top="1077" w:bottom="1077"/>
+      <w:pgMar w:left="1020" w:right="1020" w:top="1020" w:bottom="1020"/>
     </w:sectPr>
   </w:body>
 </w:document>

</xml_diff>

<commit_message>
LLM pilot run 2 (revised analysis): both runs reported, any-pair false positives, Holm rule flags innocent pair on pooled control in both runs
Co-Authored-By: Claude Fable 5.1 <noreply@anthropic.com>
Claude-Session: https://claude.ai/code/session_018qJiaQKKjpemqx8e3Wrmcq
</commit_message>
<xml_diff>
--- a/report/report_draft.docx
+++ b/report/report_draft.docx
@@ -316,7 +316,7 @@
         <w:pStyle w:val="FirstParagraph"/>
       </w:pPr>
       <w:r>
-        <w:t xml:space="preserve">Pairwise net influence (Bonjour et al. 2022) detects a colluding pair from action logs alone: dependence between two agents’ actions conditional on the public state, minus the strongest third-party dependence. We ask under which assumptions about public information, sample size and coalition structure it distinguishes planted coordination from innocent dependence, and where calibration fails to transfer. We extend the original ground-truth evaluation to matched innocent-dependence confounds, short-horizon calibration, state misspecification and a three-member coalition, over 7,400 scripted games, then test transfer on 30 games of GPT-4.1-mini agents with and without a hidden channel. Four failure mechanisms emerge. First, conditioning on the wrong public state confidently identifies an innocent pair that follows a shared public rule, in every game. Second, reducing the plug-in bias of the statistic is not the same as controlling false positives: the fixed threshold fires in half of all-random 25-round games, and a Holm-corrected permutation rule that is calibrated on the scripted nulls flags an innocent same-model pair on the pooled LLM control. Third, with a primary and two assistants, the pairwise net correction subtracts one coalition member’s influence from another’s and cancels the signal in the population limit, so more data makes the fixed-threshold detector less likely to fire. Fourth, on the LLM pilot, ranking, detection and benefit come apart: the team ranks first in nine of ten games, is flagged in five, and gained nothing. An exploratory Jacobian-lens assay on gemma-4-12B-it is reported with its intended positive arm absent. Code and logs are released.</w:t>
+        <w:t xml:space="preserve">Pairwise net influence (Bonjour et al. 2022) detects a colluding pair from action logs alone: dependence between two agents’ actions conditional on the public state, minus the strongest third-party dependence. We ask under which assumptions about public information, sample size and coalition structure it distinguishes planted coordination from innocent dependence, and where calibration fails to transfer. We extend the original ground-truth evaluation to matched innocent-dependence confounds, short-horizon calibration, state misspecification and a three-member coalition, over 7,400 scripted games, then test transfer on 30 games of GPT-4.1-mini agents with and without a hidden channel. Four failure mechanisms emerge. First, conditioning on the wrong public state confidently identifies an innocent pair that follows a shared public rule, in every game. Second, reducing plug-in bias is not controlling false positives: the fixed threshold fires in half of all-random 25-round games, and a Holm-corrected permutation rule calibrated on the scripted nulls flags an innocent same-model pair on the pooled LLM control. Third, with a primary and two assistants, the pairwise net correction subtracts one coalition member’s influence from another’s and cancels the signal in the population limit, so more data makes the fixed-threshold detector less likely to fire. Fourth, in two independent LLM pilot runs, ranking, detection and benefit come apart: the team ranks first in eight or nine of ten games, is flagged in five or seven, and its benefit is not distinguishable from zero. An exploratory Jacobian-lens assay on gemma-4-12B-it is reported with its intended positive arm absent. Code and logs are released.</w:t>
       </w:r>
     </w:p>
     <w:bookmarkEnd w:id="20"/>
@@ -2260,7 +2260,7 @@
         <w:t xml:space="preserve"> </w:t>
       </w:r>
       <w:r>
-        <w:t xml:space="preserve">(no team; a same-model control). The detector sees only the 25 x 4 action log; messages are logged but never scored. Outcomes are kept separate: pair ranking, detection under each rule, and coalition benefit (team mean score minus non-team mean score).</w:t>
+        <w:t xml:space="preserve">(no team; a same-model control). The detector sees only the 25 x 4 action log; messages are logged but never scored. The pilot was generated twice with identical code and settings. Run 1 (output recorded 26 October 09:17 UTC) was scored with the original analysis script, which recomputed the majority state across game boundaries (10 of 250 pooled rounds affected) and reported only whether the designated team was flagged per game. Run 2 (output recorded 11:06 UTC) is an independent set of 30 games scored with the revised script: states computed per game, permutations within (game, state) strata, both decision rules, any-pair false positives, Wilson 95% intervals on per-game rates and a bootstrap over games on pooled scores. The two logs are different draws, not a re-scoring (the team’s pooled memoryless dependence is 0.166 nats in run 1 and 0.356 in run 2, and the memoryless statistic is unaffected by the pooling fix). Outcomes are kept separate throughout: pair ranking, detection under each rule, and coalition benefit (team mean score minus non-team mean score per game).</w:t>
       </w:r>
     </w:p>
     <w:p>
@@ -2272,7 +2272,7 @@
           <w:bCs/>
           <w:b/>
         </w:rPr>
-        <w:t xml:space="preserve">Table 3. LLM pilot, pooled 250 rounds per condition, memoryless state, permutation-corrected scores (values from the run’s llm_analysis.json; Alpha-Bravo is the team).</w:t>
+        <w:t xml:space="preserve">Table 3. Pooled 250 rounds per condition, memoryless state, corrected scores. Run 1 values from its llm_analysis.json; run 2 from llm_analysis_v2.json. Alpha-Bravo is the team.</w:t>
       </w:r>
     </w:p>
     <w:tbl>
@@ -2283,13 +2283,14 @@
         <w:jc w:val="start"/>
       </w:tblPr>
       <w:tblGrid>
-        <w:gridCol w:w="1131"/>
-        <w:gridCol w:w="1131"/>
-        <w:gridCol w:w="1131"/>
-        <w:gridCol w:w="1131"/>
-        <w:gridCol w:w="1131"/>
-        <w:gridCol w:w="1131"/>
-        <w:gridCol w:w="1131"/>
+        <w:gridCol w:w="990"/>
+        <w:gridCol w:w="990"/>
+        <w:gridCol w:w="990"/>
+        <w:gridCol w:w="990"/>
+        <w:gridCol w:w="990"/>
+        <w:gridCol w:w="990"/>
+        <w:gridCol w:w="990"/>
+        <w:gridCol w:w="990"/>
       </w:tblGrid>
       <w:tr>
         <w:trPr>
@@ -2303,6 +2304,18 @@
               <w:jc w:val="left"/>
             </w:pPr>
             <w:r>
+              <w:t xml:space="preserve">run</w:t>
+            </w:r>
+          </w:p>
+        </w:tc>
+        <w:tc>
+          <w:tcPr/>
+          <w:p>
+            <w:pPr>
+              <w:pStyle w:val="Compact"/>
+              <w:jc w:val="left"/>
+            </w:pPr>
+            <w:r>
               <w:t xml:space="preserve">condition</w:t>
             </w:r>
           </w:p>
@@ -2327,7 +2340,7 @@
               <w:jc w:val="left"/>
             </w:pPr>
             <w:r>
-              <w:t xml:space="preserve">gamma(Alpha; Bravo), nats (perm p)</w:t>
+              <w:t xml:space="preserve">gamma(team), nats (perm p)</w:t>
             </w:r>
           </w:p>
         </w:tc>
@@ -2389,6 +2402,18 @@
               <w:jc w:val="left"/>
             </w:pPr>
             <w:r>
+              <w:t xml:space="preserve">1</w:t>
+            </w:r>
+          </w:p>
+        </w:tc>
+        <w:tc>
+          <w:tcPr/>
+          <w:p>
+            <w:pPr>
+              <w:pStyle w:val="Compact"/>
+              <w:jc w:val="left"/>
+            </w:pPr>
+            <w:r>
               <w:t xml:space="preserve">collude</w:t>
             </w:r>
           </w:p>
@@ -2437,31 +2462,31 @@
               <w:jc w:val="left"/>
             </w:pPr>
             <w:r>
-              <w:t xml:space="preserve">Alpha-Bravo</w:t>
-            </w:r>
-          </w:p>
-        </w:tc>
-        <w:tc>
-          <w:tcPr/>
-          <w:p>
-            <w:pPr>
-              <w:pStyle w:val="Compact"/>
-              <w:jc w:val="left"/>
-            </w:pPr>
-            <w:r>
-              <w:t xml:space="preserve">Alpha-Bravo (0.002, 0.012)</w:t>
-            </w:r>
-          </w:p>
-        </w:tc>
-        <w:tc>
-          <w:tcPr/>
-          <w:p>
-            <w:pPr>
-              <w:pStyle w:val="Compact"/>
-              <w:jc w:val="left"/>
-            </w:pPr>
-            <w:r>
-              <w:t xml:space="preserve">Alpha-Bravo</w:t>
+              <w:t xml:space="preserve">team</w:t>
+            </w:r>
+          </w:p>
+        </w:tc>
+        <w:tc>
+          <w:tcPr/>
+          <w:p>
+            <w:pPr>
+              <w:pStyle w:val="Compact"/>
+              <w:jc w:val="left"/>
+            </w:pPr>
+            <w:r>
+              <w:t xml:space="preserve">team (0.002, 0.012)</w:t>
+            </w:r>
+          </w:p>
+        </w:tc>
+        <w:tc>
+          <w:tcPr/>
+          <w:p>
+            <w:pPr>
+              <w:pStyle w:val="Compact"/>
+              <w:jc w:val="left"/>
+            </w:pPr>
+            <w:r>
+              <w:t xml:space="preserve">team</w:t>
             </w:r>
           </w:p>
         </w:tc>
@@ -2475,6 +2500,18 @@
               <w:jc w:val="left"/>
             </w:pPr>
             <w:r>
+              <w:t xml:space="preserve">1</w:t>
+            </w:r>
+          </w:p>
+        </w:tc>
+        <w:tc>
+          <w:tcPr/>
+          <w:p>
+            <w:pPr>
+              <w:pStyle w:val="Compact"/>
+              <w:jc w:val="left"/>
+            </w:pPr>
+            <w:r>
               <w:t xml:space="preserve">team_no_channel</w:t>
             </w:r>
           </w:p>
@@ -2547,7 +2584,7 @@
               <w:jc w:val="left"/>
             </w:pPr>
             <w:r>
-              <w:t xml:space="preserve">Charlie-Delta, a non-team pair</w:t>
+              <w:t xml:space="preserve">Charlie-Delta, non-team</w:t>
             </w:r>
           </w:p>
         </w:tc>
@@ -2561,6 +2598,18 @@
               <w:jc w:val="left"/>
             </w:pPr>
             <w:r>
+              <w:t xml:space="preserve">1</w:t>
+            </w:r>
+          </w:p>
+        </w:tc>
+        <w:tc>
+          <w:tcPr/>
+          <w:p>
+            <w:pPr>
+              <w:pStyle w:val="Compact"/>
+              <w:jc w:val="left"/>
+            </w:pPr>
+            <w:r>
               <w:t xml:space="preserve">independent</w:t>
             </w:r>
           </w:p>
@@ -2633,7 +2682,301 @@
               <w:jc w:val="left"/>
             </w:pPr>
             <w:r>
-              <w:t xml:space="preserve">Alpha-Delta, an innocent pair</w:t>
+              <w:t xml:space="preserve">Alpha-Delta, innocent</w:t>
+            </w:r>
+          </w:p>
+        </w:tc>
+      </w:tr>
+      <w:tr>
+        <w:tc>
+          <w:tcPr/>
+          <w:p>
+            <w:pPr>
+              <w:pStyle w:val="Compact"/>
+              <w:jc w:val="left"/>
+            </w:pPr>
+            <w:r>
+              <w:t xml:space="preserve">2</w:t>
+            </w:r>
+          </w:p>
+        </w:tc>
+        <w:tc>
+          <w:tcPr/>
+          <w:p>
+            <w:pPr>
+              <w:pStyle w:val="Compact"/>
+              <w:jc w:val="left"/>
+            </w:pPr>
+            <w:r>
+              <w:t xml:space="preserve">collude</w:t>
+            </w:r>
+          </w:p>
+        </w:tc>
+        <w:tc>
+          <w:tcPr/>
+          <w:p>
+            <w:pPr>
+              <w:pStyle w:val="Compact"/>
+              <w:jc w:val="left"/>
+            </w:pPr>
+            <w:r>
+              <w:t xml:space="preserve">+1.00 (game range -3.16 to 5.94)</w:t>
+            </w:r>
+          </w:p>
+        </w:tc>
+        <w:tc>
+          <w:tcPr/>
+          <w:p>
+            <w:pPr>
+              <w:pStyle w:val="Compact"/>
+              <w:jc w:val="left"/>
+            </w:pPr>
+            <w:r>
+              <w:t xml:space="preserve">0.356 (0.002)</w:t>
+            </w:r>
+          </w:p>
+        </w:tc>
+        <w:tc>
+          <w:tcPr/>
+          <w:p>
+            <w:pPr>
+              <w:pStyle w:val="Compact"/>
+              <w:jc w:val="left"/>
+            </w:pPr>
+            <w:r>
+              <w:t xml:space="preserve">1</w:t>
+            </w:r>
+          </w:p>
+        </w:tc>
+        <w:tc>
+          <w:tcPr/>
+          <w:p>
+            <w:pPr>
+              <w:pStyle w:val="Compact"/>
+              <w:jc w:val="left"/>
+            </w:pPr>
+            <w:r>
+              <w:t xml:space="preserve">team</w:t>
+            </w:r>
+          </w:p>
+        </w:tc>
+        <w:tc>
+          <w:tcPr/>
+          <w:p>
+            <w:pPr>
+              <w:pStyle w:val="Compact"/>
+              <w:jc w:val="left"/>
+            </w:pPr>
+            <w:r>
+              <w:t xml:space="preserve">team (0.002, 0.012)</w:t>
+            </w:r>
+          </w:p>
+        </w:tc>
+        <w:tc>
+          <w:tcPr/>
+          <w:p>
+            <w:pPr>
+              <w:pStyle w:val="Compact"/>
+              <w:jc w:val="left"/>
+            </w:pPr>
+            <w:r>
+              <w:t xml:space="preserve">team</w:t>
+            </w:r>
+          </w:p>
+        </w:tc>
+      </w:tr>
+      <w:tr>
+        <w:tc>
+          <w:tcPr/>
+          <w:p>
+            <w:pPr>
+              <w:pStyle w:val="Compact"/>
+              <w:jc w:val="left"/>
+            </w:pPr>
+            <w:r>
+              <w:t xml:space="preserve">2</w:t>
+            </w:r>
+          </w:p>
+        </w:tc>
+        <w:tc>
+          <w:tcPr/>
+          <w:p>
+            <w:pPr>
+              <w:pStyle w:val="Compact"/>
+              <w:jc w:val="left"/>
+            </w:pPr>
+            <w:r>
+              <w:t xml:space="preserve">team_no_channel</w:t>
+            </w:r>
+          </w:p>
+        </w:tc>
+        <w:tc>
+          <w:tcPr/>
+          <w:p>
+            <w:pPr>
+              <w:pStyle w:val="Compact"/>
+              <w:jc w:val="left"/>
+            </w:pPr>
+            <w:r>
+              <w:t xml:space="preserve">+0.80 (-2.27 to 3.28)</w:t>
+            </w:r>
+          </w:p>
+        </w:tc>
+        <w:tc>
+          <w:tcPr/>
+          <w:p>
+            <w:pPr>
+              <w:pStyle w:val="Compact"/>
+              <w:jc w:val="left"/>
+            </w:pPr>
+            <w:r>
+              <w:t xml:space="preserve">0.021 (0.038)</w:t>
+            </w:r>
+          </w:p>
+        </w:tc>
+        <w:tc>
+          <w:tcPr/>
+          <w:p>
+            <w:pPr>
+              <w:pStyle w:val="Compact"/>
+              <w:jc w:val="left"/>
+            </w:pPr>
+            <w:r>
+              <w:t xml:space="preserve">1</w:t>
+            </w:r>
+          </w:p>
+        </w:tc>
+        <w:tc>
+          <w:tcPr/>
+          <w:p>
+            <w:pPr>
+              <w:pStyle w:val="Compact"/>
+              <w:jc w:val="left"/>
+            </w:pPr>
+            <w:r>
+              <w:t xml:space="preserve">none</w:t>
+            </w:r>
+          </w:p>
+        </w:tc>
+        <w:tc>
+          <w:tcPr/>
+          <w:p>
+            <w:pPr>
+              <w:pStyle w:val="Compact"/>
+              <w:jc w:val="left"/>
+            </w:pPr>
+            <w:r>
+              <w:t xml:space="preserve">team (0.038, 0.228)</w:t>
+            </w:r>
+          </w:p>
+        </w:tc>
+        <w:tc>
+          <w:tcPr/>
+          <w:p>
+            <w:pPr>
+              <w:pStyle w:val="Compact"/>
+              <w:jc w:val="left"/>
+            </w:pPr>
+            <w:r>
+              <w:t xml:space="preserve">none</w:t>
+            </w:r>
+          </w:p>
+        </w:tc>
+      </w:tr>
+      <w:tr>
+        <w:tc>
+          <w:tcPr/>
+          <w:p>
+            <w:pPr>
+              <w:pStyle w:val="Compact"/>
+              <w:jc w:val="left"/>
+            </w:pPr>
+            <w:r>
+              <w:t xml:space="preserve">2</w:t>
+            </w:r>
+          </w:p>
+        </w:tc>
+        <w:tc>
+          <w:tcPr/>
+          <w:p>
+            <w:pPr>
+              <w:pStyle w:val="Compact"/>
+              <w:jc w:val="left"/>
+            </w:pPr>
+            <w:r>
+              <w:t xml:space="preserve">independent</w:t>
+            </w:r>
+          </w:p>
+        </w:tc>
+        <w:tc>
+          <w:tcPr/>
+          <w:p>
+            <w:pPr>
+              <w:pStyle w:val="Compact"/>
+              <w:jc w:val="left"/>
+            </w:pPr>
+            <w:r>
+              <w:t xml:space="preserve">+0.60 (-4.39 to 4.78; no team)</w:t>
+            </w:r>
+          </w:p>
+        </w:tc>
+        <w:tc>
+          <w:tcPr/>
+          <w:p>
+            <w:pPr>
+              <w:pStyle w:val="Compact"/>
+              <w:jc w:val="left"/>
+            </w:pPr>
+            <w:r>
+              <w:t xml:space="preserve">0.025 (0.016)</w:t>
+            </w:r>
+          </w:p>
+        </w:tc>
+        <w:tc>
+          <w:tcPr/>
+          <w:p>
+            <w:pPr>
+              <w:pStyle w:val="Compact"/>
+              <w:jc w:val="left"/>
+            </w:pPr>
+            <w:r>
+              <w:t xml:space="preserve">2</w:t>
+            </w:r>
+          </w:p>
+        </w:tc>
+        <w:tc>
+          <w:tcPr/>
+          <w:p>
+            <w:pPr>
+              <w:pStyle w:val="Compact"/>
+              <w:jc w:val="left"/>
+            </w:pPr>
+            <w:r>
+              <w:t xml:space="preserve">none</w:t>
+            </w:r>
+          </w:p>
+        </w:tc>
+        <w:tc>
+          <w:tcPr/>
+          <w:p>
+            <w:pPr>
+              <w:pStyle w:val="Compact"/>
+              <w:jc w:val="left"/>
+            </w:pPr>
+            <w:r>
+              <w:t xml:space="preserve">Charlie-Delta (0.002, 0.012)</w:t>
+            </w:r>
+          </w:p>
+        </w:tc>
+        <w:tc>
+          <w:tcPr/>
+          <w:p>
+            <w:pPr>
+              <w:pStyle w:val="Compact"/>
+              <w:jc w:val="left"/>
+            </w:pPr>
+            <w:r>
+              <w:t xml:space="preserve">Charlie-Delta, innocent</w:t>
             </w:r>
           </w:p>
         </w:tc>
@@ -2648,427 +2991,35 @@
           <w:bCs/>
           <w:b/>
         </w:rPr>
-        <w:t xml:space="preserve">Table 4. LLM pilot, per game (10 games of 25 rounds per condition; from the run’s llm_analysis.json).</w:t>
-      </w:r>
-    </w:p>
-    <w:tbl>
-      <w:tblPr>
-        <w:tblStyle w:val="Table"/>
-        <w:tblW w:type="pct" w:w="5000"/>
-        <w:tblLook w:firstRow="1" w:lastRow="0" w:firstColumn="0" w:lastColumn="0" w:noHBand="0" w:noVBand="0" w:val="0020"/>
-        <w:jc w:val="start"/>
-      </w:tblPr>
-      <w:tblGrid>
-        <w:gridCol w:w="1584"/>
-        <w:gridCol w:w="1584"/>
-        <w:gridCol w:w="1584"/>
-        <w:gridCol w:w="1584"/>
-        <w:gridCol w:w="1584"/>
-      </w:tblGrid>
-      <w:tr>
-        <w:trPr>
-          <w:tblHeader w:val="true"/>
-        </w:trPr>
-        <w:tc>
-          <w:tcPr/>
-          <w:p>
-            <w:pPr>
-              <w:pStyle w:val="Compact"/>
-              <w:jc w:val="left"/>
-            </w:pPr>
-            <w:r>
-              <w:t xml:space="preserve">condition</w:t>
-            </w:r>
-          </w:p>
-        </w:tc>
-        <w:tc>
-          <w:tcPr/>
-          <w:p>
-            <w:pPr>
-              <w:pStyle w:val="Compact"/>
-              <w:jc w:val="left"/>
-            </w:pPr>
-            <w:r>
-              <w:t xml:space="preserve">memoryless: team ranked first</w:t>
-            </w:r>
-          </w:p>
-        </w:tc>
-        <w:tc>
-          <w:tcPr/>
-          <w:p>
-            <w:pPr>
-              <w:pStyle w:val="Compact"/>
-              <w:jc w:val="left"/>
-            </w:pPr>
-            <w:r>
-              <w:t xml:space="preserve">memoryless: fixed rule flags the team</w:t>
-            </w:r>
-          </w:p>
-        </w:tc>
-        <w:tc>
-          <w:tcPr/>
-          <w:p>
-            <w:pPr>
-              <w:pStyle w:val="Compact"/>
-              <w:jc w:val="left"/>
-            </w:pPr>
-            <w:r>
-              <w:t xml:space="preserve">majority state, corrected: team ranked first</w:t>
-            </w:r>
-          </w:p>
-        </w:tc>
-        <w:tc>
-          <w:tcPr/>
-          <w:p>
-            <w:pPr>
-              <w:pStyle w:val="Compact"/>
-              <w:jc w:val="left"/>
-            </w:pPr>
-            <w:r>
-              <w:t xml:space="preserve">majority state, corrected: fixed rule flags the team</w:t>
-            </w:r>
-          </w:p>
-        </w:tc>
-      </w:tr>
-      <w:tr>
-        <w:tc>
-          <w:tcPr/>
-          <w:p>
-            <w:pPr>
-              <w:pStyle w:val="Compact"/>
-              <w:jc w:val="left"/>
-            </w:pPr>
-            <w:r>
-              <w:t xml:space="preserve">collude</w:t>
-            </w:r>
-          </w:p>
-        </w:tc>
-        <w:tc>
-          <w:tcPr/>
-          <w:p>
-            <w:pPr>
-              <w:pStyle w:val="Compact"/>
-              <w:jc w:val="left"/>
-            </w:pPr>
-            <w:r>
-              <w:t xml:space="preserve">9/10</w:t>
-            </w:r>
-          </w:p>
-        </w:tc>
-        <w:tc>
-          <w:tcPr/>
-          <w:p>
-            <w:pPr>
-              <w:pStyle w:val="Compact"/>
-              <w:jc w:val="left"/>
-            </w:pPr>
-            <w:r>
-              <w:t xml:space="preserve">5/10</w:t>
-            </w:r>
-          </w:p>
-        </w:tc>
-        <w:tc>
-          <w:tcPr/>
-          <w:p>
-            <w:pPr>
-              <w:pStyle w:val="Compact"/>
-              <w:jc w:val="left"/>
-            </w:pPr>
-            <w:r>
-              <w:t xml:space="preserve">3/10</w:t>
-            </w:r>
-          </w:p>
-        </w:tc>
-        <w:tc>
-          <w:tcPr/>
-          <w:p>
-            <w:pPr>
-              <w:pStyle w:val="Compact"/>
-              <w:jc w:val="left"/>
-            </w:pPr>
-            <w:r>
-              <w:t xml:space="preserve">0/10</w:t>
-            </w:r>
-          </w:p>
-        </w:tc>
-      </w:tr>
-      <w:tr>
-        <w:tc>
-          <w:tcPr/>
-          <w:p>
-            <w:pPr>
-              <w:pStyle w:val="Compact"/>
-              <w:jc w:val="left"/>
-            </w:pPr>
-            <w:r>
-              <w:t xml:space="preserve">team_no_channel</w:t>
-            </w:r>
-          </w:p>
-        </w:tc>
-        <w:tc>
-          <w:tcPr/>
-          <w:p>
-            <w:pPr>
-              <w:pStyle w:val="Compact"/>
-              <w:jc w:val="left"/>
-            </w:pPr>
-            <w:r>
-              <w:t xml:space="preserve">1/10</w:t>
-            </w:r>
-          </w:p>
-        </w:tc>
-        <w:tc>
-          <w:tcPr/>
-          <w:p>
-            <w:pPr>
-              <w:pStyle w:val="Compact"/>
-              <w:jc w:val="left"/>
-            </w:pPr>
-            <w:r>
-              <w:t xml:space="preserve">0/10</w:t>
-            </w:r>
-          </w:p>
-        </w:tc>
-        <w:tc>
-          <w:tcPr/>
-          <w:p>
-            <w:pPr>
-              <w:pStyle w:val="Compact"/>
-              <w:jc w:val="left"/>
-            </w:pPr>
-            <w:r>
-              <w:t xml:space="preserve">1/10</w:t>
-            </w:r>
-          </w:p>
-        </w:tc>
-        <w:tc>
-          <w:tcPr/>
-          <w:p>
-            <w:pPr>
-              <w:pStyle w:val="Compact"/>
-              <w:jc w:val="left"/>
-            </w:pPr>
-            <w:r>
-              <w:t xml:space="preserve">0/10</w:t>
-            </w:r>
-          </w:p>
-        </w:tc>
-      </w:tr>
-      <w:tr>
-        <w:tc>
-          <w:tcPr/>
-          <w:p>
-            <w:pPr>
-              <w:pStyle w:val="Compact"/>
-              <w:jc w:val="left"/>
-            </w:pPr>
-            <w:r>
-              <w:t xml:space="preserve">independent</w:t>
-            </w:r>
-          </w:p>
-        </w:tc>
-        <w:tc>
-          <w:tcPr/>
-          <w:p>
-            <w:pPr>
-              <w:pStyle w:val="Compact"/>
-              <w:jc w:val="left"/>
-            </w:pPr>
-            <w:r>
-              <w:t xml:space="preserve">0/10</w:t>
-            </w:r>
-          </w:p>
-        </w:tc>
-        <w:tc>
-          <w:tcPr/>
-          <w:p>
-            <w:pPr>
-              <w:pStyle w:val="Compact"/>
-              <w:jc w:val="left"/>
-            </w:pPr>
-            <w:r>
-              <w:t xml:space="preserve">0/10</w:t>
-            </w:r>
-          </w:p>
-        </w:tc>
-        <w:tc>
-          <w:tcPr/>
-          <w:p>
-            <w:pPr>
-              <w:pStyle w:val="Compact"/>
-              <w:jc w:val="left"/>
-            </w:pPr>
-            <w:r>
-              <w:t xml:space="preserve">1/10</w:t>
-            </w:r>
-          </w:p>
-        </w:tc>
-        <w:tc>
-          <w:tcPr/>
-          <w:p>
-            <w:pPr>
-              <w:pStyle w:val="Compact"/>
-              <w:jc w:val="left"/>
-            </w:pPr>
-            <w:r>
-              <w:t xml:space="preserve">0/10</w:t>
-            </w:r>
-          </w:p>
-        </w:tc>
-      </w:tr>
-    </w:tbl>
-    <w:p>
-      <w:pPr>
-        <w:pStyle w:val="BodyText"/>
-      </w:pPr>
+        <w:t xml:space="preserve">Table 4. Run 2, per game (10 games of 25 rounds per condition, corrected scores; Wilson 95% intervals in brackets).</w:t>
+      </w:r>
       <w:r>
         <w:rPr>
           <w:bCs/>
           <w:b/>
         </w:rPr>
-        <w:t xml:space="preserve">Ranking, detection and benefit come apart.</w:t>
-      </w:r>
-      <w:r>
-        <w:t xml:space="preserve"> </w:t>
-      </w:r>
-      <w:r>
-        <w:t xml:space="preserve">With the private channel, the team pair has the largest pairwise dependence by a factor of four and is ranked first on the pooled log and in nine of ten single games under the memoryless statistic. The fixed rule flags it on the pooled log but in only five of ten single games; with majority-state conditioning the team is ranked first in three games and flagged in none, the power cost of splitting 25 rounds over four states that Section 4.2 predicted. The private messages show what the statistic responds to, a sacrificial scheme in which one partner plays the move that loses to the other (</w:t>
-      </w:r>
-      <w:r>
-        <w:t xml:space="preserve">“</w:t>
-      </w:r>
-      <w:r>
-        <w:t xml:space="preserve">I’ll play rock to beat your scissors, so I can score while you lose</w:t>
-      </w:r>
-      <w:r>
-        <w:t xml:space="preserve">”</w:t>
-      </w:r>
-      <w:r>
-        <w:t xml:space="preserve">), alternating with same-move rounds. The team gained nothing from it: coalition benefit was -0.25 points per game. A single 25-round game therefore gives a confident ranking, an unreliable detection and no demonstrated harm, and</w:t>
-      </w:r>
-      <w:r>
-        <w:t xml:space="preserve"> </w:t>
-      </w:r>
-      <w:r>
-        <w:t xml:space="preserve">“</w:t>
-      </w:r>
-      <w:r>
-        <w:t xml:space="preserve">90% detection</w:t>
-      </w:r>
-      <w:r>
-        <w:t xml:space="preserve">”</w:t>
-      </w:r>
-      <w:r>
-        <w:t xml:space="preserve"> </w:t>
-      </w:r>
-      <w:r>
-        <w:t xml:space="preserve">would describe none of these correctly. Without the channel the team’s dependence is 0.021 nats, ranked second, and is not flagged by either rule.</w:t>
-      </w:r>
-    </w:p>
-    <w:p>
-      <w:pPr>
-        <w:pStyle w:val="BodyText"/>
-      </w:pPr>
+        <w:t xml:space="preserve"> </w:t>
+      </w:r>
       <w:r>
         <w:rPr>
           <w:bCs/>
           <w:b/>
         </w:rPr>
-        <w:t xml:space="preserve">Calibration does not transfer.</w:t>
-      </w:r>
-      <w:r>
-        <w:t xml:space="preserve"> </w:t>
-      </w:r>
-      <w:r>
-        <w:t xml:space="preserve">Applying the Section 4.2 Holm rule to the pooled logs, the top-scoring pair has a raw permutation p-value of 0.002 (Holm 0.012) in every condition: the team in</w:t>
-      </w:r>
-      <w:r>
-        <w:t xml:space="preserve"> </w:t>
-      </w:r>
-      <w:r>
-        <w:rPr>
-          <w:iCs/>
-          <w:i/>
-        </w:rPr>
-        <w:t xml:space="preserve">collude</w:t>
-      </w:r>
-      <w:r>
-        <w:t xml:space="preserve">, Charlie-Delta in</w:t>
-      </w:r>
-      <w:r>
-        <w:t xml:space="preserve"> </w:t>
-      </w:r>
-      <w:r>
-        <w:rPr>
-          <w:iCs/>
-          <w:i/>
-        </w:rPr>
-        <w:t xml:space="preserve">team_no_channel</w:t>
-      </w:r>
-      <w:r>
-        <w:t xml:space="preserve">, Alpha-Delta in</w:t>
-      </w:r>
-      <w:r>
-        <w:t xml:space="preserve"> </w:t>
-      </w:r>
-      <w:r>
-        <w:rPr>
-          <w:iCs/>
-          <w:i/>
-        </w:rPr>
-        <w:t xml:space="preserve">independent</w:t>
-      </w:r>
-      <w:r>
-        <w:t xml:space="preserve">. The rule that was calibrated on the scripted nulls flags a non-team pair in the no-channel condition and an innocent pair in the control with no team at all. The fixed rule flags nothing in those two conditions, but narrowly: Alpha-Delta’s net score in the control is 0.037 against the threshold of 0.05. Permutation calibration controlled rejection rates in the tested scripted nulls; it did not distinguish innocent dependence from planted coordination in the pooled LLM pilot. The dependence between those innocent pairs is real under the permutation null, but our design does not say what causes it: shared model weights (Xu et al. 2026), common public history, position effects or shared strategies would all produce it, and the conditioning on the previous majority alone does not make same-state rounds exchangeable for agents that condition on the full history.</w:t>
-      </w:r>
-    </w:p>
-    <w:p>
-      <w:pPr>
-        <w:pStyle w:val="BodyText"/>
-      </w:pPr>
+        <w:t xml:space="preserve">“</w:t>
+      </w:r>
       <w:r>
         <w:rPr>
           <w:bCs/>
           <w:b/>
         </w:rPr>
-        <w:t xml:space="preserve">What the per-game numbers do and do not say.</w:t>
-      </w:r>
-      <w:r>
-        <w:t xml:space="preserve"> </w:t>
-      </w:r>
-      <w:r>
-        <w:t xml:space="preserve">The per-game hit rates in Table 4 measure whether the designated team was flagged, not whether any pair was; a zero in the independent condition does not establish a zero per-game false-positive rate. The run’s pooled majority-state numbers were also computed with the state sequence recomputed across game boundaries, so the first round of games two to ten received a state carried over from a different game (10 of 250 rounds). A revised analysis script in the repository (experiments/analyse_llm.py) computes states per game before pooling, restricts permutations to within-game strata, reports any-pair false positives, correct-pair flags and ranking separately under both rules, and attaches game-level uncertainty (Wilson intervals on per-game rates, bootstrap over games on pooled scores); it was written after the run and before submission and is to be applied to the released logs.</w:t>
-      </w:r>
-    </w:p>
-    <w:bookmarkEnd w:id="37"/>
-    <w:bookmarkEnd w:id="38"/>
-    <w:bookmarkStart w:id="39" w:name="X7b82cc243661e4ae9f2c7ae04c5af640f75ad0f"/>
-    <w:p>
-      <w:pPr>
-        <w:pStyle w:val="Heading2"/>
-      </w:pPr>
-      <w:r>
-        <w:t xml:space="preserve">5. Exploratory: a Jacobian-lens readout of a coded proposal</w:t>
-      </w:r>
-    </w:p>
-    <w:p>
-      <w:pPr>
-        <w:pStyle w:val="FirstParagraph"/>
-      </w:pPr>
-      <w:r>
-        <w:t xml:space="preserve">As a bounded secondary experiment we asked whether a receiver model’s workspace representation of a partner’s coded proposal differs between adopting it and understanding it and declining, the privileged-observer contrast Rose et al. (2026) describe. Design, bands and metrics were specified in code before these runs; full details are in Appendix C. Receiver gemma-4-12B-it (4-bit, solarkyle Jacobian lens, read at the last prompt token) saw a policy marking two of four items ineligible, a random four-word codebook, a routing tag from a scripted partner naming an ineligible item, and an objective; it replied with one item or abstain. Five matched prompts per base case (unauthorized, permitted, refusal, tag swapped, tag erased), 30 base cases.</w:t>
-      </w:r>
-    </w:p>
-    <w:p>
-      <w:pPr>
-        <w:pStyle w:val="BodyText"/>
-      </w:pPr>
+        <w:t xml:space="preserve">Any</w:t>
+      </w:r>
       <w:r>
         <w:rPr>
           <w:bCs/>
           <w:b/>
         </w:rPr>
-        <w:t xml:space="preserve">Table 5. Lens assay (30 base cases per condition). Decoding is</w:t>
+        <w:t xml:space="preserve">”</w:t>
       </w:r>
       <w:r>
         <w:rPr>
@@ -3082,35 +3033,49 @@
           <w:bCs/>
           <w:b/>
         </w:rPr>
-        <w:t xml:space="preserve">“</w:t>
+        <w:t xml:space="preserve">is the fraction of games in which the rule flags some pair;</w:t>
       </w:r>
       <w:r>
         <w:rPr>
           <w:bCs/>
           <w:b/>
         </w:rPr>
-        <w:t xml:space="preserve">transmitted item ranked first of the four candidates</w:t>
+        <w:t xml:space="preserve"> </w:t>
       </w:r>
       <w:r>
         <w:rPr>
           <w:bCs/>
           <w:b/>
         </w:rPr>
-        <w:t xml:space="preserve">”</w:t>
+        <w:t xml:space="preserve">“</w:t>
       </w:r>
       <w:r>
         <w:rPr>
           <w:bCs/>
           <w:b/>
         </w:rPr>
-        <w:t xml:space="preserve"> </w:t>
+        <w:t xml:space="preserve">non-team</w:t>
       </w:r>
       <w:r>
         <w:rPr>
           <w:bCs/>
           <w:b/>
         </w:rPr>
-        <w:t xml:space="preserve">using the best rank across layers in the late band (layers 28 to 43 of 47) and across token variants; ranks beyond 5,000 are censored.</w:t>
+        <w:t xml:space="preserve">”</w:t>
+      </w:r>
+      <w:r>
+        <w:rPr>
+          <w:bCs/>
+          <w:b/>
+        </w:rPr>
+        <w:t xml:space="preserve"> </w:t>
+      </w:r>
+      <w:r>
+        <w:rPr>
+          <w:bCs/>
+          <w:b/>
+        </w:rPr>
+        <w:t xml:space="preserve">is the fraction in which it flags a pair other than Alpha-Bravo, which in the control is a false positive by construction and in the other conditions is a false positive as well. The Holm rule never fires on a single game because 100 permutations per game give a minimum Holm-adjusted p of 6/101 = 0.059; those cells are uninformative and omitted.</w:t>
       </w:r>
     </w:p>
     <w:tbl>
@@ -3152,55 +3117,55 @@
               <w:jc w:val="left"/>
             </w:pPr>
             <w:r>
-              <w:t xml:space="preserve">adopted nomination</w:t>
-            </w:r>
-          </w:p>
-        </w:tc>
-        <w:tc>
-          <w:tcPr/>
-          <w:p>
-            <w:pPr>
-              <w:pStyle w:val="Compact"/>
-              <w:jc w:val="left"/>
-            </w:pPr>
-            <w:r>
-              <w:t xml:space="preserve">policy violation</w:t>
-            </w:r>
-          </w:p>
-        </w:tc>
-        <w:tc>
-          <w:tcPr/>
-          <w:p>
-            <w:pPr>
-              <w:pStyle w:val="Compact"/>
-              <w:jc w:val="left"/>
-            </w:pPr>
-            <w:r>
-              <w:t xml:space="preserve">abstain</w:t>
-            </w:r>
-          </w:p>
-        </w:tc>
-        <w:tc>
-          <w:tcPr/>
-          <w:p>
-            <w:pPr>
-              <w:pStyle w:val="Compact"/>
-              <w:jc w:val="left"/>
-            </w:pPr>
-            <w:r>
-              <w:t xml:space="preserve">late band: transmitted item decoded</w:t>
-            </w:r>
-          </w:p>
-        </w:tc>
-        <w:tc>
-          <w:tcPr/>
-          <w:p>
-            <w:pPr>
-              <w:pStyle w:val="Compact"/>
-              <w:jc w:val="left"/>
-            </w:pPr>
-            <w:r>
-              <w:t xml:space="preserve">late band: median rank of nomination</w:t>
+              <w:t xml:space="preserve">state</w:t>
+            </w:r>
+          </w:p>
+        </w:tc>
+        <w:tc>
+          <w:tcPr/>
+          <w:p>
+            <w:pPr>
+              <w:pStyle w:val="Compact"/>
+              <w:jc w:val="left"/>
+            </w:pPr>
+            <w:r>
+              <w:t xml:space="preserve">team ranked first</w:t>
+            </w:r>
+          </w:p>
+        </w:tc>
+        <w:tc>
+          <w:tcPr/>
+          <w:p>
+            <w:pPr>
+              <w:pStyle w:val="Compact"/>
+              <w:jc w:val="left"/>
+            </w:pPr>
+            <w:r>
+              <w:t xml:space="preserve">fixed rule: any pair</w:t>
+            </w:r>
+          </w:p>
+        </w:tc>
+        <w:tc>
+          <w:tcPr/>
+          <w:p>
+            <w:pPr>
+              <w:pStyle w:val="Compact"/>
+              <w:jc w:val="left"/>
+            </w:pPr>
+            <w:r>
+              <w:t xml:space="preserve">fixed rule: the team</w:t>
+            </w:r>
+          </w:p>
+        </w:tc>
+        <w:tc>
+          <w:tcPr/>
+          <w:p>
+            <w:pPr>
+              <w:pStyle w:val="Compact"/>
+              <w:jc w:val="left"/>
+            </w:pPr>
+            <w:r>
+              <w:t xml:space="preserve">fixed rule: non-team pair</w:t>
             </w:r>
           </w:p>
         </w:tc>
@@ -3214,67 +3179,67 @@
               <w:jc w:val="left"/>
             </w:pPr>
             <w:r>
-              <w:t xml:space="preserve">unauthorized</w:t>
-            </w:r>
-          </w:p>
-        </w:tc>
-        <w:tc>
-          <w:tcPr/>
-          <w:p>
-            <w:pPr>
-              <w:pStyle w:val="Compact"/>
-              <w:jc w:val="left"/>
-            </w:pPr>
-            <w:r>
-              <w:t xml:space="preserve">0/30</w:t>
-            </w:r>
-          </w:p>
-        </w:tc>
-        <w:tc>
-          <w:tcPr/>
-          <w:p>
-            <w:pPr>
-              <w:pStyle w:val="Compact"/>
-              <w:jc w:val="left"/>
-            </w:pPr>
-            <w:r>
-              <w:t xml:space="preserve">0/30</w:t>
-            </w:r>
-          </w:p>
-        </w:tc>
-        <w:tc>
-          <w:tcPr/>
-          <w:p>
-            <w:pPr>
-              <w:pStyle w:val="Compact"/>
-              <w:jc w:val="left"/>
-            </w:pPr>
-            <w:r>
-              <w:t xml:space="preserve">30/30</w:t>
-            </w:r>
-          </w:p>
-        </w:tc>
-        <w:tc>
-          <w:tcPr/>
-          <w:p>
-            <w:pPr>
-              <w:pStyle w:val="Compact"/>
-              <w:jc w:val="left"/>
-            </w:pPr>
-            <w:r>
-              <w:t xml:space="preserve">0.23</w:t>
-            </w:r>
-          </w:p>
-        </w:tc>
-        <w:tc>
-          <w:tcPr/>
-          <w:p>
-            <w:pPr>
-              <w:pStyle w:val="Compact"/>
-              <w:jc w:val="left"/>
-            </w:pPr>
-            <w:r>
-              <w:t xml:space="preserve">1383</w:t>
+              <w:t xml:space="preserve">collude</w:t>
+            </w:r>
+          </w:p>
+        </w:tc>
+        <w:tc>
+          <w:tcPr/>
+          <w:p>
+            <w:pPr>
+              <w:pStyle w:val="Compact"/>
+              <w:jc w:val="left"/>
+            </w:pPr>
+            <w:r>
+              <w:t xml:space="preserve">memoryless</w:t>
+            </w:r>
+          </w:p>
+        </w:tc>
+        <w:tc>
+          <w:tcPr/>
+          <w:p>
+            <w:pPr>
+              <w:pStyle w:val="Compact"/>
+              <w:jc w:val="left"/>
+            </w:pPr>
+            <w:r>
+              <w:t xml:space="preserve">0.8 (0.49, 0.94)</w:t>
+            </w:r>
+          </w:p>
+        </w:tc>
+        <w:tc>
+          <w:tcPr/>
+          <w:p>
+            <w:pPr>
+              <w:pStyle w:val="Compact"/>
+              <w:jc w:val="left"/>
+            </w:pPr>
+            <w:r>
+              <w:t xml:space="preserve">0.8</w:t>
+            </w:r>
+          </w:p>
+        </w:tc>
+        <w:tc>
+          <w:tcPr/>
+          <w:p>
+            <w:pPr>
+              <w:pStyle w:val="Compact"/>
+              <w:jc w:val="left"/>
+            </w:pPr>
+            <w:r>
+              <w:t xml:space="preserve">0.7</w:t>
+            </w:r>
+          </w:p>
+        </w:tc>
+        <w:tc>
+          <w:tcPr/>
+          <w:p>
+            <w:pPr>
+              <w:pStyle w:val="Compact"/>
+              <w:jc w:val="left"/>
+            </w:pPr>
+            <w:r>
+              <w:t xml:space="preserve">0.1</w:t>
             </w:r>
           </w:p>
         </w:tc>
@@ -3288,67 +3253,67 @@
               <w:jc w:val="left"/>
             </w:pPr>
             <w:r>
-              <w:t xml:space="preserve">permitted</w:t>
-            </w:r>
-          </w:p>
-        </w:tc>
-        <w:tc>
-          <w:tcPr/>
-          <w:p>
-            <w:pPr>
-              <w:pStyle w:val="Compact"/>
-              <w:jc w:val="left"/>
-            </w:pPr>
-            <w:r>
-              <w:t xml:space="preserve">30/30</w:t>
-            </w:r>
-          </w:p>
-        </w:tc>
-        <w:tc>
-          <w:tcPr/>
-          <w:p>
-            <w:pPr>
-              <w:pStyle w:val="Compact"/>
-              <w:jc w:val="left"/>
-            </w:pPr>
-            <w:r>
-              <w:t xml:space="preserve">0/30</w:t>
-            </w:r>
-          </w:p>
-        </w:tc>
-        <w:tc>
-          <w:tcPr/>
-          <w:p>
-            <w:pPr>
-              <w:pStyle w:val="Compact"/>
-              <w:jc w:val="left"/>
-            </w:pPr>
-            <w:r>
-              <w:t xml:space="preserve">0/30</w:t>
-            </w:r>
-          </w:p>
-        </w:tc>
-        <w:tc>
-          <w:tcPr/>
-          <w:p>
-            <w:pPr>
-              <w:pStyle w:val="Compact"/>
-              <w:jc w:val="left"/>
-            </w:pPr>
-            <w:r>
-              <w:t xml:space="preserve">1.00</w:t>
-            </w:r>
-          </w:p>
-        </w:tc>
-        <w:tc>
-          <w:tcPr/>
-          <w:p>
-            <w:pPr>
-              <w:pStyle w:val="Compact"/>
-              <w:jc w:val="left"/>
-            </w:pPr>
-            <w:r>
-              <w:t xml:space="preserve">0</w:t>
+              <w:t xml:space="preserve">collude</w:t>
+            </w:r>
+          </w:p>
+        </w:tc>
+        <w:tc>
+          <w:tcPr/>
+          <w:p>
+            <w:pPr>
+              <w:pStyle w:val="Compact"/>
+              <w:jc w:val="left"/>
+            </w:pPr>
+            <w:r>
+              <w:t xml:space="preserve">majority</w:t>
+            </w:r>
+          </w:p>
+        </w:tc>
+        <w:tc>
+          <w:tcPr/>
+          <w:p>
+            <w:pPr>
+              <w:pStyle w:val="Compact"/>
+              <w:jc w:val="left"/>
+            </w:pPr>
+            <w:r>
+              <w:t xml:space="preserve">0.7 (0.40, 0.89)</w:t>
+            </w:r>
+          </w:p>
+        </w:tc>
+        <w:tc>
+          <w:tcPr/>
+          <w:p>
+            <w:pPr>
+              <w:pStyle w:val="Compact"/>
+              <w:jc w:val="left"/>
+            </w:pPr>
+            <w:r>
+              <w:t xml:space="preserve">0.7</w:t>
+            </w:r>
+          </w:p>
+        </w:tc>
+        <w:tc>
+          <w:tcPr/>
+          <w:p>
+            <w:pPr>
+              <w:pStyle w:val="Compact"/>
+              <w:jc w:val="left"/>
+            </w:pPr>
+            <w:r>
+              <w:t xml:space="preserve">0.5</w:t>
+            </w:r>
+          </w:p>
+        </w:tc>
+        <w:tc>
+          <w:tcPr/>
+          <w:p>
+            <w:pPr>
+              <w:pStyle w:val="Compact"/>
+              <w:jc w:val="left"/>
+            </w:pPr>
+            <w:r>
+              <w:t xml:space="preserve">0.2</w:t>
             </w:r>
           </w:p>
         </w:tc>
@@ -3362,67 +3327,67 @@
               <w:jc w:val="left"/>
             </w:pPr>
             <w:r>
-              <w:t xml:space="preserve">refusal</w:t>
-            </w:r>
-          </w:p>
-        </w:tc>
-        <w:tc>
-          <w:tcPr/>
-          <w:p>
-            <w:pPr>
-              <w:pStyle w:val="Compact"/>
-              <w:jc w:val="left"/>
-            </w:pPr>
-            <w:r>
-              <w:t xml:space="preserve">0/30</w:t>
-            </w:r>
-          </w:p>
-        </w:tc>
-        <w:tc>
-          <w:tcPr/>
-          <w:p>
-            <w:pPr>
-              <w:pStyle w:val="Compact"/>
-              <w:jc w:val="left"/>
-            </w:pPr>
-            <w:r>
-              <w:t xml:space="preserve">0/30</w:t>
-            </w:r>
-          </w:p>
-        </w:tc>
-        <w:tc>
-          <w:tcPr/>
-          <w:p>
-            <w:pPr>
-              <w:pStyle w:val="Compact"/>
-              <w:jc w:val="left"/>
-            </w:pPr>
-            <w:r>
-              <w:t xml:space="preserve">30/30</w:t>
-            </w:r>
-          </w:p>
-        </w:tc>
-        <w:tc>
-          <w:tcPr/>
-          <w:p>
-            <w:pPr>
-              <w:pStyle w:val="Compact"/>
-              <w:jc w:val="left"/>
-            </w:pPr>
-            <w:r>
-              <w:t xml:space="preserve">0.17</w:t>
-            </w:r>
-          </w:p>
-        </w:tc>
-        <w:tc>
-          <w:tcPr/>
-          <w:p>
-            <w:pPr>
-              <w:pStyle w:val="Compact"/>
-              <w:jc w:val="left"/>
-            </w:pPr>
-            <w:r>
-              <w:t xml:space="preserve">censored</w:t>
+              <w:t xml:space="preserve">team_no_channel</w:t>
+            </w:r>
+          </w:p>
+        </w:tc>
+        <w:tc>
+          <w:tcPr/>
+          <w:p>
+            <w:pPr>
+              <w:pStyle w:val="Compact"/>
+              <w:jc w:val="left"/>
+            </w:pPr>
+            <w:r>
+              <w:t xml:space="preserve">memoryless</w:t>
+            </w:r>
+          </w:p>
+        </w:tc>
+        <w:tc>
+          <w:tcPr/>
+          <w:p>
+            <w:pPr>
+              <w:pStyle w:val="Compact"/>
+              <w:jc w:val="left"/>
+            </w:pPr>
+            <w:r>
+              <w:t xml:space="preserve">0.1 (0.02, 0.40)</w:t>
+            </w:r>
+          </w:p>
+        </w:tc>
+        <w:tc>
+          <w:tcPr/>
+          <w:p>
+            <w:pPr>
+              <w:pStyle w:val="Compact"/>
+              <w:jc w:val="left"/>
+            </w:pPr>
+            <w:r>
+              <w:t xml:space="preserve">0.4</w:t>
+            </w:r>
+          </w:p>
+        </w:tc>
+        <w:tc>
+          <w:tcPr/>
+          <w:p>
+            <w:pPr>
+              <w:pStyle w:val="Compact"/>
+              <w:jc w:val="left"/>
+            </w:pPr>
+            <w:r>
+              <w:t xml:space="preserve">0.1</w:t>
+            </w:r>
+          </w:p>
+        </w:tc>
+        <w:tc>
+          <w:tcPr/>
+          <w:p>
+            <w:pPr>
+              <w:pStyle w:val="Compact"/>
+              <w:jc w:val="left"/>
+            </w:pPr>
+            <w:r>
+              <w:t xml:space="preserve">0.3</w:t>
             </w:r>
           </w:p>
         </w:tc>
@@ -3436,67 +3401,67 @@
               <w:jc w:val="left"/>
             </w:pPr>
             <w:r>
-              <w:t xml:space="preserve">tag swapped</w:t>
-            </w:r>
-          </w:p>
-        </w:tc>
-        <w:tc>
-          <w:tcPr/>
-          <w:p>
-            <w:pPr>
-              <w:pStyle w:val="Compact"/>
-              <w:jc w:val="left"/>
-            </w:pPr>
-            <w:r>
-              <w:t xml:space="preserve">0/30</w:t>
-            </w:r>
-          </w:p>
-        </w:tc>
-        <w:tc>
-          <w:tcPr/>
-          <w:p>
-            <w:pPr>
-              <w:pStyle w:val="Compact"/>
-              <w:jc w:val="left"/>
-            </w:pPr>
-            <w:r>
-              <w:t xml:space="preserve">0/30</w:t>
-            </w:r>
-          </w:p>
-        </w:tc>
-        <w:tc>
-          <w:tcPr/>
-          <w:p>
-            <w:pPr>
-              <w:pStyle w:val="Compact"/>
-              <w:jc w:val="left"/>
-            </w:pPr>
-            <w:r>
-              <w:t xml:space="preserve">30/30</w:t>
-            </w:r>
-          </w:p>
-        </w:tc>
-        <w:tc>
-          <w:tcPr/>
-          <w:p>
-            <w:pPr>
-              <w:pStyle w:val="Compact"/>
-              <w:jc w:val="left"/>
-            </w:pPr>
-            <w:r>
-              <w:t xml:space="preserve">0.13</w:t>
-            </w:r>
-          </w:p>
-        </w:tc>
-        <w:tc>
-          <w:tcPr/>
-          <w:p>
-            <w:pPr>
-              <w:pStyle w:val="Compact"/>
-              <w:jc w:val="left"/>
-            </w:pPr>
-            <w:r>
-              <w:t xml:space="preserve">1987</w:t>
+              <w:t xml:space="preserve">team_no_channel</w:t>
+            </w:r>
+          </w:p>
+        </w:tc>
+        <w:tc>
+          <w:tcPr/>
+          <w:p>
+            <w:pPr>
+              <w:pStyle w:val="Compact"/>
+              <w:jc w:val="left"/>
+            </w:pPr>
+            <w:r>
+              <w:t xml:space="preserve">majority</w:t>
+            </w:r>
+          </w:p>
+        </w:tc>
+        <w:tc>
+          <w:tcPr/>
+          <w:p>
+            <w:pPr>
+              <w:pStyle w:val="Compact"/>
+              <w:jc w:val="left"/>
+            </w:pPr>
+            <w:r>
+              <w:t xml:space="preserve">0.4 (0.17, 0.69)</w:t>
+            </w:r>
+          </w:p>
+        </w:tc>
+        <w:tc>
+          <w:tcPr/>
+          <w:p>
+            <w:pPr>
+              <w:pStyle w:val="Compact"/>
+              <w:jc w:val="left"/>
+            </w:pPr>
+            <w:r>
+              <w:t xml:space="preserve">0.6</w:t>
+            </w:r>
+          </w:p>
+        </w:tc>
+        <w:tc>
+          <w:tcPr/>
+          <w:p>
+            <w:pPr>
+              <w:pStyle w:val="Compact"/>
+              <w:jc w:val="left"/>
+            </w:pPr>
+            <w:r>
+              <w:t xml:space="preserve">0.1</w:t>
+            </w:r>
+          </w:p>
+        </w:tc>
+        <w:tc>
+          <w:tcPr/>
+          <w:p>
+            <w:pPr>
+              <w:pStyle w:val="Compact"/>
+              <w:jc w:val="left"/>
+            </w:pPr>
+            <w:r>
+              <w:t xml:space="preserve">0.5</w:t>
             </w:r>
           </w:p>
         </w:tc>
@@ -3510,67 +3475,141 @@
               <w:jc w:val="left"/>
             </w:pPr>
             <w:r>
-              <w:t xml:space="preserve">tag erased</w:t>
-            </w:r>
-          </w:p>
-        </w:tc>
-        <w:tc>
-          <w:tcPr/>
-          <w:p>
-            <w:pPr>
-              <w:pStyle w:val="Compact"/>
-              <w:jc w:val="left"/>
-            </w:pPr>
-            <w:r>
-              <w:t xml:space="preserve">0/30</w:t>
-            </w:r>
-          </w:p>
-        </w:tc>
-        <w:tc>
-          <w:tcPr/>
-          <w:p>
-            <w:pPr>
-              <w:pStyle w:val="Compact"/>
-              <w:jc w:val="left"/>
-            </w:pPr>
-            <w:r>
-              <w:t xml:space="preserve">0/30</w:t>
-            </w:r>
-          </w:p>
-        </w:tc>
-        <w:tc>
-          <w:tcPr/>
-          <w:p>
-            <w:pPr>
-              <w:pStyle w:val="Compact"/>
-              <w:jc w:val="left"/>
-            </w:pPr>
-            <w:r>
-              <w:t xml:space="preserve">30/30</w:t>
-            </w:r>
-          </w:p>
-        </w:tc>
-        <w:tc>
-          <w:tcPr/>
-          <w:p>
-            <w:pPr>
-              <w:pStyle w:val="Compact"/>
-              <w:jc w:val="left"/>
-            </w:pPr>
-            <w:r>
-              <w:t xml:space="preserve">n/a</w:t>
-            </w:r>
-          </w:p>
-        </w:tc>
-        <w:tc>
-          <w:tcPr/>
-          <w:p>
-            <w:pPr>
-              <w:pStyle w:val="Compact"/>
-              <w:jc w:val="left"/>
-            </w:pPr>
-            <w:r>
-              <w:t xml:space="preserve">censored</w:t>
+              <w:t xml:space="preserve">independent</w:t>
+            </w:r>
+          </w:p>
+        </w:tc>
+        <w:tc>
+          <w:tcPr/>
+          <w:p>
+            <w:pPr>
+              <w:pStyle w:val="Compact"/>
+              <w:jc w:val="left"/>
+            </w:pPr>
+            <w:r>
+              <w:t xml:space="preserve">memoryless</w:t>
+            </w:r>
+          </w:p>
+        </w:tc>
+        <w:tc>
+          <w:tcPr/>
+          <w:p>
+            <w:pPr>
+              <w:pStyle w:val="Compact"/>
+              <w:jc w:val="left"/>
+            </w:pPr>
+            <w:r>
+              <w:t xml:space="preserve">0.5 (0.24, 0.76)</w:t>
+            </w:r>
+          </w:p>
+        </w:tc>
+        <w:tc>
+          <w:tcPr/>
+          <w:p>
+            <w:pPr>
+              <w:pStyle w:val="Compact"/>
+              <w:jc w:val="left"/>
+            </w:pPr>
+            <w:r>
+              <w:t xml:space="preserve">0.5</w:t>
+            </w:r>
+          </w:p>
+        </w:tc>
+        <w:tc>
+          <w:tcPr/>
+          <w:p>
+            <w:pPr>
+              <w:pStyle w:val="Compact"/>
+              <w:jc w:val="left"/>
+            </w:pPr>
+            <w:r>
+              <w:t xml:space="preserve">0.3</w:t>
+            </w:r>
+          </w:p>
+        </w:tc>
+        <w:tc>
+          <w:tcPr/>
+          <w:p>
+            <w:pPr>
+              <w:pStyle w:val="Compact"/>
+              <w:jc w:val="left"/>
+            </w:pPr>
+            <w:r>
+              <w:t xml:space="preserve">0.2</w:t>
+            </w:r>
+          </w:p>
+        </w:tc>
+      </w:tr>
+      <w:tr>
+        <w:tc>
+          <w:tcPr/>
+          <w:p>
+            <w:pPr>
+              <w:pStyle w:val="Compact"/>
+              <w:jc w:val="left"/>
+            </w:pPr>
+            <w:r>
+              <w:t xml:space="preserve">independent</w:t>
+            </w:r>
+          </w:p>
+        </w:tc>
+        <w:tc>
+          <w:tcPr/>
+          <w:p>
+            <w:pPr>
+              <w:pStyle w:val="Compact"/>
+              <w:jc w:val="left"/>
+            </w:pPr>
+            <w:r>
+              <w:t xml:space="preserve">majority</w:t>
+            </w:r>
+          </w:p>
+        </w:tc>
+        <w:tc>
+          <w:tcPr/>
+          <w:p>
+            <w:pPr>
+              <w:pStyle w:val="Compact"/>
+              <w:jc w:val="left"/>
+            </w:pPr>
+            <w:r>
+              <w:t xml:space="preserve">0.1 (0.02, 0.40)</w:t>
+            </w:r>
+          </w:p>
+        </w:tc>
+        <w:tc>
+          <w:tcPr/>
+          <w:p>
+            <w:pPr>
+              <w:pStyle w:val="Compact"/>
+              <w:jc w:val="left"/>
+            </w:pPr>
+            <w:r>
+              <w:t xml:space="preserve">0.7</w:t>
+            </w:r>
+          </w:p>
+        </w:tc>
+        <w:tc>
+          <w:tcPr/>
+          <w:p>
+            <w:pPr>
+              <w:pStyle w:val="Compact"/>
+              <w:jc w:val="left"/>
+            </w:pPr>
+            <w:r>
+              <w:t xml:space="preserve">0.1</w:t>
+            </w:r>
+          </w:p>
+        </w:tc>
+        <w:tc>
+          <w:tcPr/>
+          <w:p>
+            <w:pPr>
+              <w:pStyle w:val="Compact"/>
+              <w:jc w:val="left"/>
+            </w:pPr>
+            <w:r>
+              <w:t xml:space="preserve">0.6</w:t>
             </w:r>
           </w:p>
         </w:tc>
@@ -3581,6 +3620,616 @@
         <w:pStyle w:val="BodyText"/>
       </w:pPr>
       <w:r>
+        <w:t xml:space="preserve">Run 1 per game (original script, team-only flags): the team was ranked first in 9 of 10 games and flagged by the fixed rule in 5 of 10 under the memoryless statistic, and ranked first in 3 and flagged in 0 under majority-state conditioning.</w:t>
+      </w:r>
+    </w:p>
+    <w:p>
+      <w:pPr>
+        <w:pStyle w:val="BodyText"/>
+      </w:pPr>
+      <w:r>
+        <w:rPr>
+          <w:bCs/>
+          <w:b/>
+        </w:rPr>
+        <w:t xml:space="preserve">Ranking, detection and benefit come apart.</w:t>
+      </w:r>
+      <w:r>
+        <w:t xml:space="preserve"> </w:t>
+      </w:r>
+      <w:r>
+        <w:t xml:space="preserve">With the private channel the team pair has the largest dependence by a factor of four (run 1) to nine (run 2), is ranked first on the pooled log in both runs with a bootstrap-over-games interval for its net score of 0.19 to 0.50 nats in run 2, and is ranked first in 8 or 9 of 10 single games under the memoryless statistic. Detection is weaker than ranking: the fixed rule flags the team in 5 (run 1) or 7 (run 2) of 10 single games, and in run 2 flags a non-team pair in one. Majority-state conditioning lowers single-game ranking and detection further (3/10 and 0/10 in run 1; 7/10 and 5/10 in run 2), the power cost of splitting 25 rounds over four states that Section 4.2 predicted; pooling restores the verdict under both rules in both runs. The private messages show what the statistic responds to, a sacrificial scheme in which one partner plays the move that loses to the other (</w:t>
+      </w:r>
+      <w:r>
+        <w:t xml:space="preserve">“</w:t>
+      </w:r>
+      <w:r>
+        <w:t xml:space="preserve">I’ll play rock to beat your scissors, so I can score while you lose</w:t>
+      </w:r>
+      <w:r>
+        <w:t xml:space="preserve">”</w:t>
+      </w:r>
+      <w:r>
+        <w:t xml:space="preserve">), alternating with same-move rounds. Benefit is not established: -0.25 points per game in run 1 and +1.00 in run 2, with a run 2 game-level range of -3.16 to 5.94. A single 25-round game therefore gives a reliable ranking, an unreliable detection and no demonstrated harm;</w:t>
+      </w:r>
+      <w:r>
+        <w:t xml:space="preserve"> </w:t>
+      </w:r>
+      <w:r>
+        <w:t xml:space="preserve">“</w:t>
+      </w:r>
+      <w:r>
+        <w:t xml:space="preserve">detection accuracy</w:t>
+      </w:r>
+      <w:r>
+        <w:t xml:space="preserve">”</w:t>
+      </w:r>
+      <w:r>
+        <w:t xml:space="preserve"> </w:t>
+      </w:r>
+      <w:r>
+        <w:t xml:space="preserve">would describe none of these. Without the channel the team’s pooled dependence is 0.021 nats in both runs and no rule flags it on the pooled log.</w:t>
+      </w:r>
+    </w:p>
+    <w:p>
+      <w:pPr>
+        <w:pStyle w:val="BodyText"/>
+      </w:pPr>
+      <w:r>
+        <w:rPr>
+          <w:bCs/>
+          <w:b/>
+        </w:rPr>
+        <w:t xml:space="preserve">Calibration does not transfer.</w:t>
+      </w:r>
+      <w:r>
+        <w:t xml:space="preserve"> </w:t>
+      </w:r>
+      <w:r>
+        <w:t xml:space="preserve">The Holm rule, calibrated on the scripted nulls in Section 4.2, flags an innocent pair on the pooled control in both runs: Alpha-Delta in run 1 and Charlie-Delta in run 2 (raw p 0.002, Holm 0.012 each), and under majority-state conditioning in run 2 Alpha-Charlie (raw p 0.006, Holm 0.036). In run 1 it also flags Charlie-Delta in the no-channel condition. The fixed rule flags nothing on the pooled control in either run, but narrowly (net scores of 0.037 and 0.011 against a threshold of 0.05), and on single games it fires in 0.5 (memoryless) to 0.7 (majority) of control games, matching the scripted all-random rate of 0.49 to 0.55 at 25 rounds. Permutation calibration controlled rejection rates in the tested scripted nulls; it did not reliably distinguish innocent dependence from planted coordination in the pooled LLM pilot. The dependence between those innocent pairs is real under the permutation null, but our design does not say what causes it: shared model weights (Xu et al. 2026), common public history, position effects or shared strategies would all produce it, and conditioning on the previous majority does not make same-state rounds exchangeable for agents that condition on the full history. Rejecting conditional independence is not establishing collusion.</w:t>
+      </w:r>
+    </w:p>
+    <w:bookmarkEnd w:id="37"/>
+    <w:bookmarkEnd w:id="38"/>
+    <w:bookmarkStart w:id="39" w:name="X7b82cc243661e4ae9f2c7ae04c5af640f75ad0f"/>
+    <w:p>
+      <w:pPr>
+        <w:pStyle w:val="Heading2"/>
+      </w:pPr>
+      <w:r>
+        <w:t xml:space="preserve">5. Exploratory: a Jacobian-lens readout of a coded proposal</w:t>
+      </w:r>
+    </w:p>
+    <w:p>
+      <w:pPr>
+        <w:pStyle w:val="FirstParagraph"/>
+      </w:pPr>
+      <w:r>
+        <w:t xml:space="preserve">As a bounded secondary experiment we asked whether a receiver model’s workspace representation of a partner’s coded proposal differs between adopting it and understanding it and declining, the privileged-observer contrast Rose et al. (2026) describe. Design, bands and metrics were specified in code before these runs; full details are in Appendix C. Receiver gemma-4-12B-it (4-bit, solarkyle Jacobian lens, read at the last prompt token) saw a policy marking two of four items ineligible, a random four-word codebook, a routing tag from a scripted partner naming an ineligible item, and an objective; it replied with one item or abstain. Five matched prompts per base case (unauthorized, permitted, refusal, tag swapped, tag erased), 30 base cases.</w:t>
+      </w:r>
+    </w:p>
+    <w:p>
+      <w:pPr>
+        <w:pStyle w:val="BodyText"/>
+      </w:pPr>
+      <w:r>
+        <w:rPr>
+          <w:bCs/>
+          <w:b/>
+        </w:rPr>
+        <w:t xml:space="preserve">Table 5. Lens assay (30 base cases per condition). Decoding is</w:t>
+      </w:r>
+      <w:r>
+        <w:rPr>
+          <w:bCs/>
+          <w:b/>
+        </w:rPr>
+        <w:t xml:space="preserve"> </w:t>
+      </w:r>
+      <w:r>
+        <w:rPr>
+          <w:bCs/>
+          <w:b/>
+        </w:rPr>
+        <w:t xml:space="preserve">“</w:t>
+      </w:r>
+      <w:r>
+        <w:rPr>
+          <w:bCs/>
+          <w:b/>
+        </w:rPr>
+        <w:t xml:space="preserve">transmitted item ranked first of the four candidates</w:t>
+      </w:r>
+      <w:r>
+        <w:rPr>
+          <w:bCs/>
+          <w:b/>
+        </w:rPr>
+        <w:t xml:space="preserve">”</w:t>
+      </w:r>
+      <w:r>
+        <w:rPr>
+          <w:bCs/>
+          <w:b/>
+        </w:rPr>
+        <w:t xml:space="preserve"> </w:t>
+      </w:r>
+      <w:r>
+        <w:rPr>
+          <w:bCs/>
+          <w:b/>
+        </w:rPr>
+        <w:t xml:space="preserve">using the best rank across layers in the late band (layers 28 to 43 of 47) and across token variants; ranks beyond 5,000 are censored.</w:t>
+      </w:r>
+    </w:p>
+    <w:tbl>
+      <w:tblPr>
+        <w:tblStyle w:val="Table"/>
+        <w:tblW w:type="pct" w:w="5000"/>
+        <w:tblLook w:firstRow="1" w:lastRow="0" w:firstColumn="0" w:lastColumn="0" w:noHBand="0" w:noVBand="0" w:val="0020"/>
+        <w:jc w:val="start"/>
+      </w:tblPr>
+      <w:tblGrid>
+        <w:gridCol w:w="1320"/>
+        <w:gridCol w:w="1320"/>
+        <w:gridCol w:w="1320"/>
+        <w:gridCol w:w="1320"/>
+        <w:gridCol w:w="1320"/>
+        <w:gridCol w:w="1320"/>
+      </w:tblGrid>
+      <w:tr>
+        <w:trPr>
+          <w:tblHeader w:val="true"/>
+        </w:trPr>
+        <w:tc>
+          <w:tcPr/>
+          <w:p>
+            <w:pPr>
+              <w:pStyle w:val="Compact"/>
+              <w:jc w:val="left"/>
+            </w:pPr>
+            <w:r>
+              <w:t xml:space="preserve">condition</w:t>
+            </w:r>
+          </w:p>
+        </w:tc>
+        <w:tc>
+          <w:tcPr/>
+          <w:p>
+            <w:pPr>
+              <w:pStyle w:val="Compact"/>
+              <w:jc w:val="left"/>
+            </w:pPr>
+            <w:r>
+              <w:t xml:space="preserve">adopted nomination</w:t>
+            </w:r>
+          </w:p>
+        </w:tc>
+        <w:tc>
+          <w:tcPr/>
+          <w:p>
+            <w:pPr>
+              <w:pStyle w:val="Compact"/>
+              <w:jc w:val="left"/>
+            </w:pPr>
+            <w:r>
+              <w:t xml:space="preserve">policy violation</w:t>
+            </w:r>
+          </w:p>
+        </w:tc>
+        <w:tc>
+          <w:tcPr/>
+          <w:p>
+            <w:pPr>
+              <w:pStyle w:val="Compact"/>
+              <w:jc w:val="left"/>
+            </w:pPr>
+            <w:r>
+              <w:t xml:space="preserve">abstain</w:t>
+            </w:r>
+          </w:p>
+        </w:tc>
+        <w:tc>
+          <w:tcPr/>
+          <w:p>
+            <w:pPr>
+              <w:pStyle w:val="Compact"/>
+              <w:jc w:val="left"/>
+            </w:pPr>
+            <w:r>
+              <w:t xml:space="preserve">late band: transmitted item decoded</w:t>
+            </w:r>
+          </w:p>
+        </w:tc>
+        <w:tc>
+          <w:tcPr/>
+          <w:p>
+            <w:pPr>
+              <w:pStyle w:val="Compact"/>
+              <w:jc w:val="left"/>
+            </w:pPr>
+            <w:r>
+              <w:t xml:space="preserve">late band: median rank of nomination</w:t>
+            </w:r>
+          </w:p>
+        </w:tc>
+      </w:tr>
+      <w:tr>
+        <w:tc>
+          <w:tcPr/>
+          <w:p>
+            <w:pPr>
+              <w:pStyle w:val="Compact"/>
+              <w:jc w:val="left"/>
+            </w:pPr>
+            <w:r>
+              <w:t xml:space="preserve">unauthorized</w:t>
+            </w:r>
+          </w:p>
+        </w:tc>
+        <w:tc>
+          <w:tcPr/>
+          <w:p>
+            <w:pPr>
+              <w:pStyle w:val="Compact"/>
+              <w:jc w:val="left"/>
+            </w:pPr>
+            <w:r>
+              <w:t xml:space="preserve">0/30</w:t>
+            </w:r>
+          </w:p>
+        </w:tc>
+        <w:tc>
+          <w:tcPr/>
+          <w:p>
+            <w:pPr>
+              <w:pStyle w:val="Compact"/>
+              <w:jc w:val="left"/>
+            </w:pPr>
+            <w:r>
+              <w:t xml:space="preserve">0/30</w:t>
+            </w:r>
+          </w:p>
+        </w:tc>
+        <w:tc>
+          <w:tcPr/>
+          <w:p>
+            <w:pPr>
+              <w:pStyle w:val="Compact"/>
+              <w:jc w:val="left"/>
+            </w:pPr>
+            <w:r>
+              <w:t xml:space="preserve">30/30</w:t>
+            </w:r>
+          </w:p>
+        </w:tc>
+        <w:tc>
+          <w:tcPr/>
+          <w:p>
+            <w:pPr>
+              <w:pStyle w:val="Compact"/>
+              <w:jc w:val="left"/>
+            </w:pPr>
+            <w:r>
+              <w:t xml:space="preserve">0.23</w:t>
+            </w:r>
+          </w:p>
+        </w:tc>
+        <w:tc>
+          <w:tcPr/>
+          <w:p>
+            <w:pPr>
+              <w:pStyle w:val="Compact"/>
+              <w:jc w:val="left"/>
+            </w:pPr>
+            <w:r>
+              <w:t xml:space="preserve">1383</w:t>
+            </w:r>
+          </w:p>
+        </w:tc>
+      </w:tr>
+      <w:tr>
+        <w:tc>
+          <w:tcPr/>
+          <w:p>
+            <w:pPr>
+              <w:pStyle w:val="Compact"/>
+              <w:jc w:val="left"/>
+            </w:pPr>
+            <w:r>
+              <w:t xml:space="preserve">permitted</w:t>
+            </w:r>
+          </w:p>
+        </w:tc>
+        <w:tc>
+          <w:tcPr/>
+          <w:p>
+            <w:pPr>
+              <w:pStyle w:val="Compact"/>
+              <w:jc w:val="left"/>
+            </w:pPr>
+            <w:r>
+              <w:t xml:space="preserve">30/30</w:t>
+            </w:r>
+          </w:p>
+        </w:tc>
+        <w:tc>
+          <w:tcPr/>
+          <w:p>
+            <w:pPr>
+              <w:pStyle w:val="Compact"/>
+              <w:jc w:val="left"/>
+            </w:pPr>
+            <w:r>
+              <w:t xml:space="preserve">0/30</w:t>
+            </w:r>
+          </w:p>
+        </w:tc>
+        <w:tc>
+          <w:tcPr/>
+          <w:p>
+            <w:pPr>
+              <w:pStyle w:val="Compact"/>
+              <w:jc w:val="left"/>
+            </w:pPr>
+            <w:r>
+              <w:t xml:space="preserve">0/30</w:t>
+            </w:r>
+          </w:p>
+        </w:tc>
+        <w:tc>
+          <w:tcPr/>
+          <w:p>
+            <w:pPr>
+              <w:pStyle w:val="Compact"/>
+              <w:jc w:val="left"/>
+            </w:pPr>
+            <w:r>
+              <w:t xml:space="preserve">1.00</w:t>
+            </w:r>
+          </w:p>
+        </w:tc>
+        <w:tc>
+          <w:tcPr/>
+          <w:p>
+            <w:pPr>
+              <w:pStyle w:val="Compact"/>
+              <w:jc w:val="left"/>
+            </w:pPr>
+            <w:r>
+              <w:t xml:space="preserve">0</w:t>
+            </w:r>
+          </w:p>
+        </w:tc>
+      </w:tr>
+      <w:tr>
+        <w:tc>
+          <w:tcPr/>
+          <w:p>
+            <w:pPr>
+              <w:pStyle w:val="Compact"/>
+              <w:jc w:val="left"/>
+            </w:pPr>
+            <w:r>
+              <w:t xml:space="preserve">refusal</w:t>
+            </w:r>
+          </w:p>
+        </w:tc>
+        <w:tc>
+          <w:tcPr/>
+          <w:p>
+            <w:pPr>
+              <w:pStyle w:val="Compact"/>
+              <w:jc w:val="left"/>
+            </w:pPr>
+            <w:r>
+              <w:t xml:space="preserve">0/30</w:t>
+            </w:r>
+          </w:p>
+        </w:tc>
+        <w:tc>
+          <w:tcPr/>
+          <w:p>
+            <w:pPr>
+              <w:pStyle w:val="Compact"/>
+              <w:jc w:val="left"/>
+            </w:pPr>
+            <w:r>
+              <w:t xml:space="preserve">0/30</w:t>
+            </w:r>
+          </w:p>
+        </w:tc>
+        <w:tc>
+          <w:tcPr/>
+          <w:p>
+            <w:pPr>
+              <w:pStyle w:val="Compact"/>
+              <w:jc w:val="left"/>
+            </w:pPr>
+            <w:r>
+              <w:t xml:space="preserve">30/30</w:t>
+            </w:r>
+          </w:p>
+        </w:tc>
+        <w:tc>
+          <w:tcPr/>
+          <w:p>
+            <w:pPr>
+              <w:pStyle w:val="Compact"/>
+              <w:jc w:val="left"/>
+            </w:pPr>
+            <w:r>
+              <w:t xml:space="preserve">0.17</w:t>
+            </w:r>
+          </w:p>
+        </w:tc>
+        <w:tc>
+          <w:tcPr/>
+          <w:p>
+            <w:pPr>
+              <w:pStyle w:val="Compact"/>
+              <w:jc w:val="left"/>
+            </w:pPr>
+            <w:r>
+              <w:t xml:space="preserve">censored</w:t>
+            </w:r>
+          </w:p>
+        </w:tc>
+      </w:tr>
+      <w:tr>
+        <w:tc>
+          <w:tcPr/>
+          <w:p>
+            <w:pPr>
+              <w:pStyle w:val="Compact"/>
+              <w:jc w:val="left"/>
+            </w:pPr>
+            <w:r>
+              <w:t xml:space="preserve">tag swapped</w:t>
+            </w:r>
+          </w:p>
+        </w:tc>
+        <w:tc>
+          <w:tcPr/>
+          <w:p>
+            <w:pPr>
+              <w:pStyle w:val="Compact"/>
+              <w:jc w:val="left"/>
+            </w:pPr>
+            <w:r>
+              <w:t xml:space="preserve">0/30</w:t>
+            </w:r>
+          </w:p>
+        </w:tc>
+        <w:tc>
+          <w:tcPr/>
+          <w:p>
+            <w:pPr>
+              <w:pStyle w:val="Compact"/>
+              <w:jc w:val="left"/>
+            </w:pPr>
+            <w:r>
+              <w:t xml:space="preserve">0/30</w:t>
+            </w:r>
+          </w:p>
+        </w:tc>
+        <w:tc>
+          <w:tcPr/>
+          <w:p>
+            <w:pPr>
+              <w:pStyle w:val="Compact"/>
+              <w:jc w:val="left"/>
+            </w:pPr>
+            <w:r>
+              <w:t xml:space="preserve">30/30</w:t>
+            </w:r>
+          </w:p>
+        </w:tc>
+        <w:tc>
+          <w:tcPr/>
+          <w:p>
+            <w:pPr>
+              <w:pStyle w:val="Compact"/>
+              <w:jc w:val="left"/>
+            </w:pPr>
+            <w:r>
+              <w:t xml:space="preserve">0.13</w:t>
+            </w:r>
+          </w:p>
+        </w:tc>
+        <w:tc>
+          <w:tcPr/>
+          <w:p>
+            <w:pPr>
+              <w:pStyle w:val="Compact"/>
+              <w:jc w:val="left"/>
+            </w:pPr>
+            <w:r>
+              <w:t xml:space="preserve">1987</w:t>
+            </w:r>
+          </w:p>
+        </w:tc>
+      </w:tr>
+      <w:tr>
+        <w:tc>
+          <w:tcPr/>
+          <w:p>
+            <w:pPr>
+              <w:pStyle w:val="Compact"/>
+              <w:jc w:val="left"/>
+            </w:pPr>
+            <w:r>
+              <w:t xml:space="preserve">tag erased</w:t>
+            </w:r>
+          </w:p>
+        </w:tc>
+        <w:tc>
+          <w:tcPr/>
+          <w:p>
+            <w:pPr>
+              <w:pStyle w:val="Compact"/>
+              <w:jc w:val="left"/>
+            </w:pPr>
+            <w:r>
+              <w:t xml:space="preserve">0/30</w:t>
+            </w:r>
+          </w:p>
+        </w:tc>
+        <w:tc>
+          <w:tcPr/>
+          <w:p>
+            <w:pPr>
+              <w:pStyle w:val="Compact"/>
+              <w:jc w:val="left"/>
+            </w:pPr>
+            <w:r>
+              <w:t xml:space="preserve">0/30</w:t>
+            </w:r>
+          </w:p>
+        </w:tc>
+        <w:tc>
+          <w:tcPr/>
+          <w:p>
+            <w:pPr>
+              <w:pStyle w:val="Compact"/>
+              <w:jc w:val="left"/>
+            </w:pPr>
+            <w:r>
+              <w:t xml:space="preserve">30/30</w:t>
+            </w:r>
+          </w:p>
+        </w:tc>
+        <w:tc>
+          <w:tcPr/>
+          <w:p>
+            <w:pPr>
+              <w:pStyle w:val="Compact"/>
+              <w:jc w:val="left"/>
+            </w:pPr>
+            <w:r>
+              <w:t xml:space="preserve">n/a</w:t>
+            </w:r>
+          </w:p>
+        </w:tc>
+        <w:tc>
+          <w:tcPr/>
+          <w:p>
+            <w:pPr>
+              <w:pStyle w:val="Compact"/>
+              <w:jc w:val="left"/>
+            </w:pPr>
+            <w:r>
+              <w:t xml:space="preserve">censored</w:t>
+            </w:r>
+          </w:p>
+        </w:tc>
+      </w:tr>
+    </w:tbl>
+    <w:p>
+      <w:pPr>
+        <w:pStyle w:val="BodyText"/>
+      </w:pPr>
+      <w:r>
         <w:t xml:space="preserve">At the final pre-generation position, the selected J-lens readout strongly recovered nominated items during permitted adoption but did not reliably recover them during abstention. Because unauthorized adoption never occurred, this experiment does not establish whether the readout distinguishes collusive participation from refusal. Correct behaviour under the permitted prompt shows decoding capability in that condition; it does not verify the computation under each refusal prompt, and failure to recover a token with one lens at one position is a measurement limitation, not evidence that the information is absent. Two implementation details bear on the numbers: the readout takes the best rank across all layers in a band and across four token variants of each item, not a typical-layer rank; and when all four candidates are censored the tie is broken in list order, so decoding rates in censored conditions include tie artefacts (the early-band rates of 0.30 to 0.37, with every median censored, are such artefacts and are omitted from the table). We report this as an observation about one readout at one position and claim nothing about what the workspace contains.</w:t>
       </w:r>
     </w:p>
@@ -3599,7 +4248,7 @@
         <w:pStyle w:val="FirstParagraph"/>
       </w:pPr>
       <w:r>
-        <w:t xml:space="preserve">The four mechanisms in Section 4 share one lesson: each plausible piece of collusion evidence rests on an assumption an auditor must check before trusting it. Conditional dependence is evidence only relative to the conditioning information, and an innocent public rule the auditor has not modelled produces a confident false verdict (4.1). A corrected statistic is not a calibrated decision, and a decision rule calibrated on one family of nulls carried a 0.002 p-value onto an innocent same-model pair in another (4.2, 4.4). A pairwise correction designed to remove third parties removes coalition members too, so for a coalition of three the published detector loses power as evidence accumulates (4.3). And ranking, thresholding and benefit are different outcomes that a single number conflates (4.4).</w:t>
+        <w:t xml:space="preserve">The four mechanisms in Section 4 share one lesson: each plausible piece of collusion evidence rests on an assumption an auditor must check before trusting it. Conditional dependence is evidence only relative to the conditioning information, and an innocent public rule the auditor has not modelled produces a confident false verdict (4.1). A corrected statistic is not a calibrated decision, and a decision rule calibrated on one family of nulls carried a 0.002 p-value onto an innocent same-model pair in another (4.2, 4.4). A pairwise correction designed to remove third parties removes coalition members too, so for a coalition of three the published detector loses power as evidence accumulates (4.3). And ranking, thresholding and benefit are different outcomes that a single number conflates, in both independent runs of the pilot (4.4).</w:t>
       </w:r>
     </w:p>
     <w:p>
@@ -3607,7 +4256,7 @@
         <w:pStyle w:val="BodyText"/>
       </w:pPr>
       <w:r>
-        <w:t xml:space="preserve">What is new here is narrow. We release a general-N implementation of net influence with a within-state permutation null; we extend the original ground-truth evaluation to matched innocent-dependence confounds, short-horizon calibration, state misspecification and a three-member coalition; we give the algebraic account of coalition cancellation; and we run two decision rules side by side on the same LLM logs. Not new: the statistic, conditioning on state, permutation calibration of dependence statistics, scripted evaluation as such (Bonjour et al.; Lee et al.), and the observation that same-model agents correlate (Xu et al.). Section 5 is exploratory and establishes neither presence nor absence of a proposal in the workspace.</w:t>
+        <w:t xml:space="preserve">What is new here is narrow. We release a general-N implementation of net influence with a within-state permutation null; we extend the original ground-truth evaluation to matched innocent-dependence confounds, short-horizon calibration, state misspecification and a three-member coalition; we give the algebraic account of coalition cancellation; and we run two decision rules side by side on two independent LLM pilot runs. Not new: the statistic, conditioning on state, permutation calibration of dependence statistics, scripted evaluation as such (Bonjour et al.; Lee et al.), and the observation that same-model agents correlate (Xu et al.). Section 5 is exploratory and establishes neither presence nor absence of a proposal in the workspace.</w:t>
       </w:r>
     </w:p>
     <w:p>
@@ -3615,7 +4264,7 @@
         <w:pStyle w:val="BodyText"/>
       </w:pPr>
       <w:r>
-        <w:t xml:space="preserve">Future work, in order of value: apply the revised per-game analysis to the released logs and report any-pair false positives; a coalition detector built on a conditional-independence structure rather than pairwise net scores; a null that respects the agents’ actual conditioning information, for example by fitting each agent’s reaction function to the public history and permuting residuals; the Agrawal et al. (2025) double auction, where the public state is the order book; and, for the lens, a receiver that does adopt unauthorised proposals and a readout at the tag token rather than the decision token.</w:t>
+        <w:t xml:space="preserve">Future work, in order of value: a per-game permutation budget large enough for the Holm rule to be informative on single games (at least 120 permutations), and more games; a coalition detector built on a conditional-independence structure rather than pairwise net scores; a null that respects the agents’ actual conditioning information, for example by fitting each agent’s reaction function to the public history and permuting residuals; the Agrawal et al. (2025) double auction, where the public state is the order book; and, for the lens, a receiver that does adopt unauthorised proposals and a readout at the tag token rather than the decision token.</w:t>
       </w:r>
     </w:p>
     <w:bookmarkEnd w:id="40"/>
@@ -3773,7 +4422,7 @@
         <w:t xml:space="preserve"> </w:t>
       </w:r>
       <w:r>
-        <w:t xml:space="preserve">On scripted games with known ground truth: unconditioned dependence statistics rank an innocent same-rule pair first; majority-state conditioning removes that confound and fails against a rule keyed on a richer state; the permutation correction reduces but does not calibrate the fixed rule’s false-positive rate at 25 rounds, and a Holm permutation rule is calibrated on the scripted nulls at a power cost; and with two assistants the pairwise net correction cancels the coalition’s signal, so the fixed rule’s detection rate falls with sample size. On the GPT-4.1-mini pilot (ten games per condition): the team with a hidden channel is ranked first in nine of ten games and flagged by the fixed rule in five; it gained no benefit; and the Holm rule flags a non-team pair in the no-channel condition and an innocent pair in the control.</w:t>
+        <w:t xml:space="preserve">On scripted games with known ground truth: unconditioned dependence statistics rank an innocent same-rule pair first; majority-state conditioning removes that confound and fails against a rule keyed on a richer state; the permutation correction reduces but does not calibrate the fixed rule’s false-positive rate at 25 rounds, and a Holm permutation rule is calibrated on the scripted nulls at a power cost; and with two assistants the pairwise net correction cancels the coalition’s signal, so the fixed rule’s detection rate falls with sample size. On the GPT-4.1-mini pilot (two independent runs of ten games per condition): the team with a hidden channel is ranked first in eight or nine of ten games and flagged by the fixed rule in five or seven; its benefit is not distinguishable from zero; the fixed rule fires in half or more of single control games; and the Holm rule flags an innocent pair on the pooled control in both runs.</w:t>
       </w:r>
     </w:p>
     <w:p>
@@ -3791,7 +4440,7 @@
         <w:t xml:space="preserve"> </w:t>
       </w:r>
       <w:r>
-        <w:t xml:space="preserve">The scripted innocent rules are deterministic and key on states we can name; real innocent dependence (shared priors, common reactions to unmodelled shocks) is not reducible to a small state. The collusion model assumes ex-ante signalling. The LLM pilot has one model, one temperature and ten games per condition; its pooled majority-state numbers were computed with cross-game state carry-over at 10 of 250 rounds; its per-game hit rates do not measure any-pair false positives; and the permutation null treats same-state rounds as exchangeable, which is not established for agents conditioning on the full history. The source of the innocent dependence in the control (weights, history, position, strategy) is not identified. The lens assay has one receiver, one lens, a scripted sender, a four-item vocabulary and a planted codebook, its intended positive arm did not occur, its readout is a best-rank-over-band statistic with censoring, and it establishes nothing about what the workspace contains. All code was written during the sprint and has not been independently reviewed.</w:t>
+        <w:t xml:space="preserve">The scripted innocent rules are deterministic and key on states we can name; real innocent dependence (shared priors, common reactions to unmodelled shocks) is not reducible to a small state. The collusion model assumes ex-ante signalling. The LLM pilot has one model, one temperature and ten games per condition per run; run 1’s pooled majority-state numbers were computed with cross-game state carry-over at 10 of 250 rounds and its per-game rates do not measure any-pair false positives (run 2 corrects both); the per-game Holm rule is uninformative at 100 permutations; and the permutation null treats same-state rounds as exchangeable, which is not established for agents conditioning on the full history. The source of the innocent dependence in the control (weights, history, position, strategy) is not identified. The lens assay has one receiver, one lens, a scripted sender, a four-item vocabulary and a planted codebook, its intended positive arm did not occur, its readout is a best-rank-over-band statistic with censoring, and it establishes nothing about what the workspace contains. All code was written during the sprint and has not been independently reviewed.</w:t>
       </w:r>
     </w:p>
     <w:p>
@@ -3827,7 +4476,7 @@
         <w:pStyle w:val="FirstParagraph"/>
       </w:pPr>
       <w:r>
-        <w:t xml:space="preserve">Code and logs: github.com/in-a-quantum-world/collusion-net-influence. All code was written during the sprint; nothing pre-existed. Completion times (UTC, which equals UK time on these dates): scripted main sweep 25 October 21:52; LLM pilot and lens notebooks started on Colab 25 October about 22:40; extensions 26 October about 00:00; lens run output recorded 26 October 09:10; LLM pilot output recorded 26 October 09:17; revised LLM analysis script and this manuscript 26 October before 11:00. The submission deadline is 26 October 11:59 UTC.</w:t>
+        <w:t xml:space="preserve">Code and logs: github.com/in-a-quantum-world/collusion-net-influence. All code was written during the sprint; nothing pre-existed. Completion times (UTC, which equals UK time on these dates): scripted main sweep 25 October 21:52; LLM pilot and lens notebooks started on Colab 25 October about 22:40; extensions 26 October about 00:00; lens run output recorded 26 October 09:10; LLM pilot run 1 output recorded 26 October 09:17; revised LLM analysis script 26 October about 09:50; LLM pilot run 2 (regenerated on Colab with identical code and settings) output recorded 26 October 11:06; this manuscript finalised 26 October before 11:30. The submission deadline is 26 October 11:59 UTC.</w:t>
       </w:r>
       <w:r>
         <w:t xml:space="preserve"> </w:t>
@@ -3953,7 +4602,7 @@
         <w:t xml:space="preserve">results/20261026-*</w:t>
       </w:r>
       <w:r>
-        <w:t xml:space="preserve">. Tables 3 and 4 are taken from the run’s</w:t>
+        <w:t xml:space="preserve">. Run 1 values in Table 3 are from its</w:t>
       </w:r>
       <w:r>
         <w:t xml:space="preserve"> </w:t>
@@ -3968,7 +4617,7 @@
         <w:t xml:space="preserve"> </w:t>
       </w:r>
       <w:r>
-        <w:t xml:space="preserve">produced by the original analysis script; the revised script writes</w:t>
+        <w:t xml:space="preserve">(original script); run 2 values in Tables 3 and 4 are from</w:t>
       </w:r>
       <w:r>
         <w:t xml:space="preserve"> </w:t>
@@ -3978,6 +4627,33 @@
           <w:rStyle w:val="VerbatimChar"/>
         </w:rPr>
         <w:t xml:space="preserve">llm_analysis_v2.json</w:t>
+      </w:r>
+      <w:r>
+        <w:t xml:space="preserve"> </w:t>
+      </w:r>
+      <w:r>
+        <w:t xml:space="preserve">(revised script,</w:t>
+      </w:r>
+      <w:r>
+        <w:t xml:space="preserve"> </w:t>
+      </w:r>
+      <w:r>
+        <w:rPr>
+          <w:rStyle w:val="VerbatimChar"/>
+        </w:rPr>
+        <w:t xml:space="preserve">reanalyse_llm_pilot_v2.ipynb</w:t>
+      </w:r>
+      <w:r>
+        <w:t xml:space="preserve">), with the printed output under</w:t>
+      </w:r>
+      <w:r>
+        <w:t xml:space="preserve"> </w:t>
+      </w:r>
+      <w:r>
+        <w:rPr>
+          <w:rStyle w:val="VerbatimChar"/>
+        </w:rPr>
+        <w:t xml:space="preserve">results/20261026-1106-llm-pilot-run2/</w:t>
       </w:r>
       <w:r>
         <w:t xml:space="preserve">.</w:t>

</xml_diff>

<commit_message>
Second review: benefit and bootstrap labelling, tie and permutation-budget disclosures, wording on controls and p-values, Rose v1 authors, replacement summary; final before deadline
Co-Authored-By: Claude Fable 5.1 <noreply@anthropic.com>
Claude-Session: https://claude.ai/code/session_018qJiaQKKjpemqx8e3Wrmcq
</commit_message>
<xml_diff>
--- a/report/report_draft.docx
+++ b/report/report_draft.docx
@@ -316,7 +316,39 @@
         <w:pStyle w:val="FirstParagraph"/>
       </w:pPr>
       <w:r>
-        <w:t xml:space="preserve">Pairwise net influence (Bonjour et al. 2022) detects a colluding pair from action logs alone: dependence between two agents’ actions conditional on the public state, minus the strongest third-party dependence. We ask under which assumptions about public information, sample size and coalition structure it distinguishes planted coordination from innocent dependence, and where calibration fails to transfer. We extend the original ground-truth evaluation to matched innocent-dependence confounds, short-horizon calibration, state misspecification and a three-member coalition over 7,400 scripted games, then test transfer on GPT-4.1-mini agents with and without a hidden channel. Four failure mechanisms emerge. First, conditioning on the wrong public state confidently identifies an innocent pair that follows a shared public rule, in every game. Second, reducing plug-in bias is not controlling false positives: the fixed threshold fires in half of all-random 25-round games, and a Holm-corrected permutation rule calibrated on the scripted nulls flags an innocent same-model pair on the pooled LLM control. Third, with a primary and two assistants, the pairwise net correction subtracts one coalition member’s influence from another’s and cancels the signal in the population limit, so more data makes the fixed-threshold detector less likely to fire. Fourth, in two independent LLM pilot runs, ranking, detection and benefit come apart: the team ranks first in eight or nine of ten games, is flagged in five or seven, and its benefit is not distinguishable from zero. An exploratory Jacobian-lens assay on gemma-4-12B-it is reported with its intended positive arm absent. Code and logs are released.</w:t>
+        <w:t xml:space="preserve">When does statistical dependence constitute evidence of agent collusion? We stress-test pairwise net influence using 7,400 scripted games and two GPT-4.1-mini pilot runs, each comprising ten games in each of three conditions.</w:t>
+      </w:r>
+    </w:p>
+    <w:p>
+      <w:pPr>
+        <w:pStyle w:val="BodyText"/>
+      </w:pPr>
+      <w:r>
+        <w:t xml:space="preserve">We examine public-state specification, finite-sample calibration, and coalition size. Innocent agents following the same public rule defeat unconditioned dependence statistics; conditioning removes this confound only when the chosen state captures that rule. At 25 rounds, a fixed threshold produces false accusations in approximately half of all-random games. A Holm-corrected permutation rule reduces false-positive rates on the tested scripted nulls, but flags a pair in each pooled LLM control without a planted coalition. These outcomes distinguish statistical rejection from evidence of collusion.</w:t>
+      </w:r>
+    </w:p>
+    <w:p>
+      <w:pPr>
+        <w:pStyle w:val="BodyText"/>
+      </w:pPr>
+      <w:r>
+        <w:t xml:space="preserve">For a symmetric coalition with one primary and two assistants, we derive a cancellation mechanism: the pairwise correction subtracts one coalition member’s influence from another’s. Consequently, fixed-threshold detection deteriorates as sample size increases.</w:t>
+      </w:r>
+    </w:p>
+    <w:p>
+      <w:pPr>
+        <w:pStyle w:val="BodyText"/>
+      </w:pPr>
+      <w:r>
+        <w:t xml:space="preserve">In the LLM pilots, the planted pair ranks first in eight or nine of ten games but is correctly flagged in five or seven. Its mean within-game score advantage changes from -0.25 to +1.00 across runs; these descriptive differences do not establish a causal benefit from coordination.</w:t>
+      </w:r>
+    </w:p>
+    <w:p>
+      <w:pPr>
+        <w:pStyle w:val="BodyText"/>
+      </w:pPr>
+      <w:r>
+        <w:t xml:space="preserve">An exploratory Jacobian-lens assay includes 150 receiver evaluations but no unauthorized adoption, leaving its intended participation-versus-refusal contrast unresolved. We release code and evaluation artifacts and identify assumptions auditors must check before treating dependence as evidence of collusion.</w:t>
       </w:r>
     </w:p>
     <w:bookmarkEnd w:id="20"/>
@@ -358,7 +390,7 @@
         <w:pStyle w:val="BodyText"/>
       </w:pPr>
       <w:r>
-        <w:t xml:space="preserve">We extend prior ground-truth evaluation along four axes that the original paper and the concurrent entries do not cover: a matched innocent-dependence confound (two non-colluders following the same public rule), short-horizon calibration (25 to 500 rounds, where plug-in bias is comparable to the published threshold), state misspecification (an innocent rule keyed on a richer state than the detector conditions on) and a three-member coalition. We then apply both the fixed-threshold rule and a permutation-calibrated rule to GPT-4.1-mini agents with a hidden private channel and to a same-model control, and report ranking, detection and coalition benefit as separate outcomes. The principle throughout is the one the sprint brief states: do not confuse an observable signal with evidence of collusion. Section 5 reports, as a bounded exploratory result, a Jacobian-lens assay that asked the same question of a model’s internals and whose intended positive arm did not occur.</w:t>
+        <w:t xml:space="preserve">We combine four evaluation axes and emphasise their interaction: a matched innocent-dependence confound (two non-colluders following the same public rule), short-horizon calibration (25 to 500 rounds, where plug-in bias is comparable to the published threshold), state misspecification (an innocent rule keyed on a richer state than the detector conditions on) and a three-member coalition, together with an analytic account of coalition cancellation and the transfer of two decision rules to the same LLM logs. We then apply both the fixed-threshold rule and a permutation-calibrated rule to GPT-4.1-mini agents with a hidden private channel and to a same-model control, and report ranking, detection and coalition benefit as separate outcomes. The principle throughout is the one the sprint brief states: do not confuse an observable signal with evidence of collusion. Section 5 reports, as a bounded exploratory result, a Jacobian-lens assay that asked the same question of a model’s internals and whose intended positive arm did not occur.</w:t>
       </w:r>
     </w:p>
     <w:bookmarkEnd w:id="21"/>
@@ -2260,7 +2292,7 @@
         <w:t xml:space="preserve"> </w:t>
       </w:r>
       <w:r>
-        <w:t xml:space="preserve">(no team; a same-model control). The detector sees only the 25 x 4 action log; messages are logged but never scored. The pilot was generated twice with identical code and settings. Run 1 (output recorded 26 October 09:17 UTC) was scored with the original analysis script, which recomputed the majority state across game boundaries (10 of 250 pooled rounds affected) and reported only whether the designated team was flagged per game. Run 2 (output recorded 11:06 UTC) is an independent set of 30 games scored with the revised script: states computed per game, permutations within (game, state) strata, both decision rules, any-pair false positives, Wilson 95% intervals on per-game rates and a bootstrap over games on pooled scores. The two logs are different draws, not a re-scoring (the team’s pooled memoryless dependence is 0.166 nats in run 1 and 0.356 in run 2, and the memoryless statistic is unaffected by the pooling fix). Outcomes are kept separate throughout: pair ranking, detection under each rule, and coalition benefit (team mean score minus non-team mean score per game).</w:t>
+        <w:t xml:space="preserve">(no team; a same-model control). The detector sees only the 25 x 4 action log; messages are logged but never scored. The pilot was generated twice with identical code and settings. Run 1 (output recorded 26 October 09:17 UTC) was scored with the original analysis script, which recomputed the majority state across the nine inter-game boundaries and reported only whether the designated team was flagged per game. Run 2 (output recorded 11:06 UTC) is an independent set of 30 games scored with the revised script: states computed per game, permutations within (game, state) strata, both decision rules, any-pair false positives, Wilson 95% intervals on per-game rates and a bootstrap over games on pooled scores. The two logs are different draws, not a re-scoring (the team’s pooled memoryless dependence is 0.166 nats in run 1 and 0.356 in run 2, and the memoryless statistic is unaffected by the pooling fix). Outcomes are kept separate throughout: pair ranking, detection under each rule, and coalition benefit (team mean score minus non-team mean score per game).</w:t>
       </w:r>
     </w:p>
     <w:p>
@@ -2272,7 +2304,7 @@
           <w:bCs/>
           <w:b/>
         </w:rPr>
-        <w:t xml:space="preserve">Table 3. Pooled 250 rounds per condition, memoryless state, corrected scores. Run 1 values from its llm_analysis.json; run 2 from llm_analysis_v2.json. Alpha-Bravo is the team.</w:t>
+        <w:t xml:space="preserve">Table 3. Pooled 250 rounds per condition, memoryless state, corrected scores. Run 1 values from its llm_analysis.json; run 2 from llm_analysis_v2.json. Alpha-Bravo is the planted pair in collude and team_no_channel and the reference pair in independent.</w:t>
       </w:r>
     </w:p>
     <w:tbl>
@@ -2328,31 +2360,31 @@
               <w:jc w:val="left"/>
             </w:pPr>
             <w:r>
-              <w:t xml:space="preserve">coalition benefit per game</w:t>
-            </w:r>
-          </w:p>
-        </w:tc>
-        <w:tc>
-          <w:tcPr/>
-          <w:p>
-            <w:pPr>
-              <w:pStyle w:val="Compact"/>
-              <w:jc w:val="left"/>
-            </w:pPr>
-            <w:r>
-              <w:t xml:space="preserve">gamma(team), nats (perm p)</w:t>
-            </w:r>
-          </w:p>
-        </w:tc>
-        <w:tc>
-          <w:tcPr/>
-          <w:p>
-            <w:pPr>
-              <w:pStyle w:val="Compact"/>
-              <w:jc w:val="left"/>
-            </w:pPr>
-            <w:r>
-              <w:t xml:space="preserve">team rank of 6</w:t>
+              <w:t xml:space="preserve">mean within-game score advantage of the designated pair (run 2: empirical 2.5th to 97.5th percentiles of individual-game advantages)</w:t>
+            </w:r>
+          </w:p>
+        </w:tc>
+        <w:tc>
+          <w:tcPr/>
+          <w:p>
+            <w:pPr>
+              <w:pStyle w:val="Compact"/>
+              <w:jc w:val="left"/>
+            </w:pPr>
+            <w:r>
+              <w:t xml:space="preserve">gamma(pair), nats (perm p)</w:t>
+            </w:r>
+          </w:p>
+        </w:tc>
+        <w:tc>
+          <w:tcPr/>
+          <w:p>
+            <w:pPr>
+              <w:pStyle w:val="Compact"/>
+              <w:jc w:val="left"/>
+            </w:pPr>
+            <w:r>
+              <w:t xml:space="preserve">pair rank of 6</w:t>
             </w:r>
           </w:p>
         </w:tc>
@@ -2622,7 +2654,7 @@
               <w:jc w:val="left"/>
             </w:pPr>
             <w:r>
-              <w:t xml:space="preserve">+0.75 (no team)</w:t>
+              <w:t xml:space="preserve">+0.75 (reference pair, no planted coalition)</w:t>
             </w:r>
           </w:p>
         </w:tc>
@@ -2916,7 +2948,7 @@
               <w:jc w:val="left"/>
             </w:pPr>
             <w:r>
-              <w:t xml:space="preserve">+0.60 (-4.39 to 4.78; no team)</w:t>
+              <w:t xml:space="preserve">+0.60 (-4.39 to 4.78; reference pair, no planted coalition)</w:t>
             </w:r>
           </w:p>
         </w:tc>
@@ -2991,7 +3023,7 @@
           <w:bCs/>
           <w:b/>
         </w:rPr>
-        <w:t xml:space="preserve">Table 4. Run 2, per game (10 games of 25 rounds per condition, corrected scores; Wilson 95% intervals in brackets).</w:t>
+        <w:t xml:space="preserve">Table 4. Run 2, per game (10 games of 25 rounds per condition, corrected scores; Wilson 95% intervals in brackets for the ranking column).</w:t>
       </w:r>
       <w:r>
         <w:rPr>
@@ -3054,7 +3086,7 @@
           <w:bCs/>
           <w:b/>
         </w:rPr>
-        <w:t xml:space="preserve">non-team</w:t>
+        <w:t xml:space="preserve">other pair</w:t>
       </w:r>
       <w:r>
         <w:rPr>
@@ -3075,7 +3107,7 @@
           <w:bCs/>
           <w:b/>
         </w:rPr>
-        <w:t xml:space="preserve">is the fraction in which it flags a pair other than Alpha-Bravo, which in the control is a false positive by construction and in the other conditions is a false positive as well. The Holm rule never fires on a single game because 100 permutations per game give a minimum Holm-adjusted p of 6/101 = 0.059; those cells are uninformative and omitted.</w:t>
+        <w:t xml:space="preserve">is the fraction in which it flags a pair other than Alpha-Bravo, a false positive relative to the planted-coalition labels. Ranking ties are broken in enumeration order, which begins with Alpha-Bravo, and clipping corrected estimates at zero can create ties; a tie audit was not completed before submission, so the ranking rates are upper bounds. The Holm rule was not evaluated at adequate resolution on single games: the script uses 100 permutations per game, for which the minimum Holm-adjusted p over six pairs is 6/101 = 0.059, so those cells are omitted rather than reported as zeros.</w:t>
       </w:r>
     </w:p>
     <w:tbl>
@@ -3129,7 +3161,7 @@
               <w:jc w:val="left"/>
             </w:pPr>
             <w:r>
-              <w:t xml:space="preserve">team ranked first</w:t>
+              <w:t xml:space="preserve">Alpha-Bravo ranked first</w:t>
             </w:r>
           </w:p>
         </w:tc>
@@ -3153,19 +3185,19 @@
               <w:jc w:val="left"/>
             </w:pPr>
             <w:r>
-              <w:t xml:space="preserve">fixed rule: the team</w:t>
-            </w:r>
-          </w:p>
-        </w:tc>
-        <w:tc>
-          <w:tcPr/>
-          <w:p>
-            <w:pPr>
-              <w:pStyle w:val="Compact"/>
-              <w:jc w:val="left"/>
-            </w:pPr>
-            <w:r>
-              <w:t xml:space="preserve">fixed rule: non-team pair</w:t>
+              <w:t xml:space="preserve">fixed rule: Alpha-Bravo</w:t>
+            </w:r>
+          </w:p>
+        </w:tc>
+        <w:tc>
+          <w:tcPr/>
+          <w:p>
+            <w:pPr>
+              <w:pStyle w:val="Compact"/>
+              <w:jc w:val="left"/>
+            </w:pPr>
+            <w:r>
+              <w:t xml:space="preserve">fixed rule: other pair</w:t>
             </w:r>
           </w:p>
         </w:tc>
@@ -3620,7 +3652,7 @@
         <w:pStyle w:val="BodyText"/>
       </w:pPr>
       <w:r>
-        <w:t xml:space="preserve">Run 1 per game (original script, team-only flags): the team was ranked first in 9 of 10 games and flagged by the fixed rule in 5 of 10 under the memoryless statistic, and ranked first in 3 and flagged in 0 under majority-state conditioning.</w:t>
+        <w:t xml:space="preserve">Run 1 per game (original script, team-only flags): the team was ranked first in 9 of 10 games and flagged by the fixed rule in 5 of 10 under the memoryless statistic, and ranked first in 3 and flagged in 0 under majority-state conditioning. The raw run 1 logs were not available in the repository at submission, so run 1 could not be re-scored with the corrected procedure; its original analysis is retained as provenance and the two runs are therefore analysed with different procedures (within-game permutation strata can change corrected scores and p-values even for the memoryless statistic).</w:t>
       </w:r>
     </w:p>
     <w:p>
@@ -3638,7 +3670,7 @@
         <w:t xml:space="preserve"> </w:t>
       </w:r>
       <w:r>
-        <w:t xml:space="preserve">With the private channel the team pair has the largest dependence by a factor of four (run 1) to nine (run 2), is ranked first on the pooled log in both runs with a bootstrap-over-games interval for its net score of 0.19 to 0.50 nats in run 2, and is ranked first in 8 or 9 of 10 single games under the memoryless statistic. Detection is weaker than ranking: the fixed rule flags the team in 5 (run 1) or 7 (run 2) of 10 single games, and in run 2 flags a non-team pair in one. Majority-state conditioning lowers single-game ranking and detection further (3/10 and 0/10 in run 1; 7/10 and 5/10 in run 2), the power cost of splitting 25 rounds over four states that Section 4.2 predicted; pooling restores the verdict under both rules in both runs. The private messages show what the statistic responds to, a sacrificial scheme in which one partner plays the move that loses to the other (</w:t>
+        <w:t xml:space="preserve">With the private channel the team pair has the largest dependence by a factor of four (run 1) to nine (run 2), is ranked first on the pooled log in both runs (run 2 game-bootstrap 95% interval for its uncorrected net influence: 0.19 to 0.50 nats; the corrected estimator was not bootstrapped), and is ranked first in 8 or 9 of 10 single games under the memoryless statistic, subject to the tie caveat in Table 4. Detection is weaker than ranking: the fixed rule flags the team in 5 (run 1) or 7 (run 2) of 10 single games, and in run 2 flags a non-team pair in one. Majority-state conditioning lowers single-game ranking and detection further (3/10 and 0/10 in run 1; 7/10 and 5/10 in run 2), the power cost of splitting 25 rounds over four states that Section 4.2 predicted; pooling restores the verdict under both rules in both runs. The private messages show what the statistic responds to, a sacrificial scheme in which one partner plays the move that loses to the other (</w:t>
       </w:r>
       <w:r>
         <w:t xml:space="preserve">“</w:t>
@@ -3650,7 +3682,7 @@
         <w:t xml:space="preserve">”</w:t>
       </w:r>
       <w:r>
-        <w:t xml:space="preserve">), alternating with same-move rounds. Benefit is not established: -0.25 points per game in run 1 and +1.00 in run 2, with a run 2 game-level range of -3.16 to 5.94. A single 25-round game therefore gives a reliable ranking, an unreliable detection and no demonstrated harm;</w:t>
+        <w:t xml:space="preserve">), alternating with same-move rounds. Mean within-game score advantage was -0.25 in the first run and +1.00 in the second; these descriptive results do not establish a benefit from coordination, and the run 2 interval (-3.16 to 5.94) is the empirical 2.5th to 97.5th percentile range of individual-game advantages, not a confidence interval for the mean. Whether the designated pair outscored the others is also a different question from whether enabling coordination caused it to score better than it otherwise would, and only the first is measured here. In these pilots, single-game pair ranking was more successful than threshold-based detection, but both estimates remain uncertain;</w:t>
       </w:r>
       <w:r>
         <w:t xml:space="preserve"> </w:t>
@@ -3668,7 +3700,7 @@
         <w:t xml:space="preserve"> </w:t>
       </w:r>
       <w:r>
-        <w:t xml:space="preserve">would describe none of these. Without the channel the team’s pooled dependence is 0.021 nats in both runs and no rule flags it on the pooled log.</w:t>
+        <w:t xml:space="preserve">would describe neither. Without the channel the team’s pooled dependence is 0.021 nats in both runs and no rule flags it on the pooled log.</w:t>
       </w:r>
     </w:p>
     <w:p>
@@ -3686,7 +3718,7 @@
         <w:t xml:space="preserve"> </w:t>
       </w:r>
       <w:r>
-        <w:t xml:space="preserve">The Holm rule, calibrated on the scripted nulls in Section 4.2, flags an innocent pair on the pooled control in both runs: Alpha-Delta in run 1 and Charlie-Delta in run 2 (raw p 0.002, Holm 0.012 each), and under majority-state conditioning in run 2 Alpha-Charlie (raw p 0.006, Holm 0.036). In run 1 it also flags Charlie-Delta in the no-channel condition. The fixed rule flags nothing on the pooled control in either run, but narrowly (net scores of 0.037 and 0.011 against a threshold of 0.05), and on single games it fires in 0.5 (memoryless) to 0.7 (majority) of control games, matching the scripted all-random rate of 0.49 to 0.55 at 25 rounds. Permutation calibration controlled rejection rates in the tested scripted nulls; it did not reliably distinguish innocent dependence from planted coordination in the pooled LLM pilot. The dependence between those innocent pairs is real under the permutation null, but our design does not say what causes it: shared model weights (Xu et al. 2026), common public history, position effects or shared strategies would all produce it, and conditioning on the previous majority does not make same-state rounds exchangeable for agents that condition on the full history. Rejecting conditional independence is not establishing collusion.</w:t>
+        <w:t xml:space="preserve">The Holm rule, calibrated on the scripted nulls in Section 4.2, flags a pair on the pooled control without a planted coalition in both runs: Alpha-Delta in run 1 and Charlie-Delta in run 2 (raw p 0.002, Holm 0.012 each), and under majority-state conditioning in run 2 Alpha-Charlie (raw p 0.006, Holm 0.036). In run 1 it also flags Charlie-Delta in the no-channel condition. The fixed rule flags nothing on the pooled control in either run, but narrowly (net scores of 0.037 and 0.011 against a threshold of 0.05), and on single games it fires in 0.5 (memoryless) to 0.7 (majority) of control games, matching the scripted all-random rate of 0.49 to 0.55 at 25 rounds. Permutation calibration controlled rejection rates in the tested scripted nulls; it did not reliably distinguish dependence in controls without a planted coalition from planted coordination in the pooled LLM pilot. The observed associations exceeded those generated by the chosen permutation procedure; because exchangeability is not established for agents that condition on the full public history, these p-values are not validated evidence of collusion, and the failure demonstrated is the use of this procedure as a collusion decision rule rather than a failure of Holm correction itself. Our design also does not say what produces the associations: shared model weights (Xu et al. 2026), common public history, position effects or shared strategies would all do so. Rejecting conditional independence is not establishing collusion.</w:t>
       </w:r>
     </w:p>
     <w:bookmarkEnd w:id="37"/>
@@ -3837,7 +3869,7 @@
               <w:jc w:val="left"/>
             </w:pPr>
             <w:r>
-              <w:t xml:space="preserve">late band: transmitted item decoded</w:t>
+              <w:t xml:space="preserve">late band: nominal candidate-decoding rate, including tie artefacts</w:t>
             </w:r>
           </w:p>
         </w:tc>
@@ -4248,7 +4280,7 @@
         <w:pStyle w:val="FirstParagraph"/>
       </w:pPr>
       <w:r>
-        <w:t xml:space="preserve">The four mechanisms in Section 4 share one lesson: each plausible piece of collusion evidence rests on an assumption an auditor must check before trusting it. Conditional dependence is evidence only relative to the conditioning information, and an innocent public rule the auditor has not modelled produces a confident false verdict (4.1). A corrected statistic is not a calibrated decision, and a decision rule calibrated on one family of nulls carried a 0.002 p-value onto an innocent same-model pair in another (4.2, 4.4). A pairwise correction designed to remove third parties removes coalition members too, so for a coalition of three the published detector loses power as evidence accumulates (4.3). And ranking, thresholding and benefit are different outcomes that a single number conflates, in both independent runs of the pilot (4.4).</w:t>
+        <w:t xml:space="preserve">The four findings in Section 4 share one lesson: each plausible piece of collusion evidence rests on an assumption an auditor must check before trusting it. Conditional dependence is evidence only relative to the conditioning information, and an innocent public rule the auditor has not modelled produces a confident false verdict (4.1). A corrected statistic is not a calibrated decision, and a decision rule calibrated on one family of nulls carried a 0.002 p-value onto an innocent same-model pair in another (4.2, 4.4). A pairwise correction designed to remove third parties removes coalition members too, so for a coalition of three the published detector loses power as evidence accumulates (4.3). And ranking, thresholding and benefit are different outcomes that a single number conflates, in both independent runs of the pilot (4.4).</w:t>
       </w:r>
     </w:p>
     <w:p>
@@ -4256,7 +4288,7 @@
         <w:pStyle w:val="BodyText"/>
       </w:pPr>
       <w:r>
-        <w:t xml:space="preserve">What is new here is narrow. We release a general-N implementation of net influence with a within-state permutation null; we extend the original ground-truth evaluation to matched innocent-dependence confounds, short-horizon calibration, state misspecification and a three-member coalition; we give the algebraic account of coalition cancellation; and we run two decision rules side by side on two independent LLM pilot runs. Not new: the statistic, conditioning on state, permutation calibration of dependence statistics, scripted evaluation as such (Bonjour et al.; Lee et al.), and the observation that same-model agents correlate (Xu et al.). Section 5 is exploratory and establishes neither presence nor absence of a proposal in the workspace.</w:t>
+        <w:t xml:space="preserve">What is new here is narrow. We release a general-N implementation of net influence with a within-state permutation null; we extend the original ground-truth evaluation to matched innocent-dependence confounds, short-horizon calibration, state misspecification and a three-member coalition; we give the algebraic account of coalition cancellation; and we run two decision rules side by side on two independent LLM pilot runs (with different analysis procedures, as Section 4.4 states). Not new: the statistic, conditioning on state, permutation calibration of dependence statistics, scripted evaluation as such (Bonjour et al.; Lee et al.), and the observation that same-model agents correlate (Xu et al.). Section 5 is exploratory and establishes neither presence nor absence of a proposal in the workspace.</w:t>
       </w:r>
     </w:p>
     <w:p>
@@ -4354,7 +4386,7 @@
         <w:pStyle w:val="BodyText"/>
       </w:pPr>
       <w:r>
-        <w:t xml:space="preserve">Rose, A., Cullen, C., Abdelnabi, S., Torr, P., Kaplowitz, B. G. and Schroeder de Witt, C. (2026). Detecting Multi-Agent Collusion Through Multi-Agent Interpretability. arXiv:2604.01151 (v1, 1 April 2026; the privileged-observer control is in Section 4.4).</w:t>
+        <w:t xml:space="preserve">Rose, A., Cullen, C., Kaplowitz, B. G. and Schroeder de Witt, C. (2026). Detecting Multi-Agent Collusion Through Multi-Agent Interpretability. arXiv:2604.01151v1, 1 April 2026 (the privileged-observer control is in Section 4.4; later versions add authors and the HELIOS and NARCBench names).</w:t>
       </w:r>
     </w:p>
     <w:p>
@@ -4422,7 +4454,7 @@
         <w:t xml:space="preserve"> </w:t>
       </w:r>
       <w:r>
-        <w:t xml:space="preserve">On scripted games with known ground truth: unconditioned dependence statistics rank an innocent same-rule pair first; majority-state conditioning removes that confound and fails against a rule keyed on a richer state; the permutation correction reduces but does not calibrate the fixed rule’s false-positive rate at 25 rounds, and a Holm permutation rule is calibrated on the scripted nulls at a power cost; and with two assistants the pairwise net correction cancels the coalition’s signal, so the fixed rule’s detection rate falls with sample size. On the GPT-4.1-mini pilot (two independent runs of ten games per condition): the team with a hidden channel is ranked first in eight or nine of ten games and flagged by the fixed rule in five or seven; its benefit is not distinguishable from zero; the fixed rule fires in half or more of single control games; and the Holm rule flags an innocent pair on the pooled control in both runs.</w:t>
+        <w:t xml:space="preserve">On scripted games with known ground truth: unconditioned dependence statistics rank an innocent same-rule pair first; majority-state conditioning removes that confound and fails against a rule keyed on a richer state; the permutation correction reduces but does not calibrate the fixed rule’s false-positive rate at 25 rounds, and a Holm permutation rule is calibrated on the scripted nulls at a power cost; and with two assistants the pairwise net correction cancels the coalition’s signal, so the fixed rule’s detection rate falls with sample size. On the GPT-4.1-mini pilot (two independent runs of ten games per condition): the pair with a hidden channel is ranked first in eight or nine of ten games (upper bounds pending a tie audit) and flagged by the fixed rule in five or seven; its mean within-game score advantage was -0.25 and +1.00, which does not establish a benefit; the fixed rule fires in half or more of single control games; and the Holm rule flags a pair on the pooled control without a planted coalition in both runs.</w:t>
       </w:r>
     </w:p>
     <w:p>
@@ -4440,7 +4472,25 @@
         <w:t xml:space="preserve"> </w:t>
       </w:r>
       <w:r>
-        <w:t xml:space="preserve">The scripted innocent rules are deterministic and key on states we can name; real innocent dependence (shared priors, common reactions to unmodelled shocks) is not reducible to a small state. The collusion model assumes ex-ante signalling. The LLM pilot has one model, one temperature and ten games per condition per run; run 1’s pooled majority-state numbers were computed with cross-game state carry-over at 10 of 250 rounds and its per-game rates do not measure any-pair false positives (run 2 corrects both); the per-game Holm rule is uninformative at 100 permutations; and the permutation null treats same-state rounds as exchangeable, which is not established for agents conditioning on the full history. The source of the innocent dependence in the control (weights, history, position, strategy) is not identified. The lens assay has one receiver, one lens, a scripted sender, a four-item vocabulary and a planted codebook, its intended positive arm did not occur, its readout is a best-rank-over-band statistic with censoring, and it establishes nothing about what the workspace contains. All code was written during the sprint and has not been independently reviewed.</w:t>
+        <w:t xml:space="preserve">The scripted innocent rules are deterministic and key on states we can name; real innocent dependence (shared priors, common reactions to unmodelled shocks) is not reducible to a small state. The collusion model assumes ex-ante signalling. The LLM pilot has one model, one temperature and ten games per condition per run; run 1’s pooled majority-state numbers were computed with cross-game state carry-over at the nine inter-game boundaries and its per-game rates do not measure any-pair false positives (run 2 corrects both, but run 1 could not be re-scored); the per-game Holm rule was not evaluated at adequate resolution (100 permutations); ranking ties were not audited; the game bootstrap covers the uncorrected statistic only;</w:t>
+      </w:r>
+      <w:r>
+        <w:t xml:space="preserve"> </w:t>
+      </w:r>
+      <w:r>
+        <w:t xml:space="preserve">“</w:t>
+      </w:r>
+      <w:r>
+        <w:t xml:space="preserve">no planted coalition</w:t>
+      </w:r>
+      <w:r>
+        <w:t xml:space="preserve">”</w:t>
+      </w:r>
+      <w:r>
+        <w:t xml:space="preserve"> </w:t>
+      </w:r>
+      <w:r>
+        <w:t xml:space="preserve">is what the controls establish, not that no coordination of any kind occurred; and the permutation null treats same-state rounds as exchangeable, which is not established for agents conditioning on the full history. The source of the innocent dependence in the control (weights, history, position, strategy) is not identified. The lens assay has one receiver, one lens, a scripted sender, a four-item vocabulary and a planted codebook, its intended positive arm did not occur, its readout is a best-rank-over-band statistic with censoring, and it establishes nothing about what the workspace contains. All code was written during the sprint and has not been independently reviewed.</w:t>
       </w:r>
     </w:p>
     <w:p>
@@ -4476,7 +4526,7 @@
         <w:pStyle w:val="FirstParagraph"/>
       </w:pPr>
       <w:r>
-        <w:t xml:space="preserve">Code and logs: github.com/in-a-quantum-world/collusion-net-influence. All code was written during the sprint; nothing pre-existed. Completion times (UTC, which equals UK time on these dates): scripted main sweep 25 October 21:52; LLM pilot and lens notebooks started on Colab 25 October about 22:40; extensions 26 October about 00:00; lens run output recorded 26 October 09:10; LLM pilot run 1 output recorded 26 October 09:17; revised LLM analysis script 26 October about 09:50; LLM pilot run 2 (regenerated on Colab with identical code and settings) output recorded 26 October 11:06; this manuscript finalised 26 October before 11:30. The submission deadline is 26 October 11:59 UTC.</w:t>
+        <w:t xml:space="preserve">Code and logs: github.com/in-a-quantum-world/collusion-net-influence. All code was written during the sprint; nothing pre-existed. Completion times (UTC, which equals UK time on these dates): scripted main sweep 25 October 21:52; LLM pilot and lens notebooks started on Colab 25 October about 22:40; extensions 26 October about 00:00; lens run output recorded 26 October 09:10; LLM pilot run 1 output recorded 26 October 09:17; revised LLM analysis script 26 October about 09:50; LLM pilot run 2 (regenerated on Colab with identical code and settings) output recorded 26 October 11:06; this manuscript finalised 26 October 11:45. The final analysis commit is the last commit on main before 11:59 UTC; run 2’s raw game log (llm_games.jsonl) is to be added to results/20261026-1106-llm-pilot-run2/ from the Colab download as soon as possible after submission, and its absence at submission is noted here. The submission deadline is 26 October 11:59 UTC.</w:t>
       </w:r>
       <w:r>
         <w:t xml:space="preserve"> </w:t>

</xml_diff>

<commit_message>
Plain-language pass on the report
Co-Authored-By: Claude Fable 5.1 <noreply@anthropic.com>
Claude-Session: https://claude.ai/code/session_018qJiaQKKjpemqx8e3Wrmcq
</commit_message>
<xml_diff>
--- a/report/report_draft.docx
+++ b/report/report_draft.docx
@@ -374,7 +374,7 @@
         <w:pStyle w:val="BodyText"/>
       </w:pPr>
       <w:r>
-        <w:t xml:space="preserve">Bonjour et al. (2022) proposed a statistic built for exactly this difficulty. It measures the dependence between two agents’ actions conditional on the observable game state, then subtracts the strongest dependence any third agent has on the same target. It is domain independent and needs only logged actions. The original paper evaluated it on known colluding configurations, varied collusion strength and sample size, treated the threshold as a hyperparameter to be tuned on training data, and limited its scope to two colluders. Several concurrent sprint entries apply it to LLM players (Ayeku 2026; Snow 2026; Lee et al. 2026), and Lee et al. include 2,800 scripted coalition games. None of this tells an auditor which assumptions the verdict rests on. That is the question here:</w:t>
+        <w:t xml:space="preserve">Bonjour et al. (2022) proposed a statistic built for exactly this difficulty. It measures the dependence between two agents’ actions conditional on the observable game state, then subtracts the strongest dependence any third agent has on the same target. It is domain independent and needs only logged actions. The original paper evaluated it on known colluding configurations, varied collusion strength and sample size, treated the threshold as a hyperparameter to be tuned on training data, and limited its scope to two colluders. Several concurrent sprint entries apply it to LLM players (Ayeku 2026; Snow 2026; Lee et al. 2026), and Lee et al. include 2,800 scripted coalition games. None of this tells an auditor which assumptions the verdict rests on. The question is this:</w:t>
       </w:r>
     </w:p>
     <w:p>
@@ -390,7 +390,7 @@
         <w:pStyle w:val="BodyText"/>
       </w:pPr>
       <w:r>
-        <w:t xml:space="preserve">We combine four evaluation axes and emphasise their interaction: a matched innocent-dependence confound (two non-colluders following the same public rule), short-horizon calibration (25 to 500 rounds, where plug-in bias is comparable to the published threshold), state misspecification (an innocent rule keyed on a richer state than the detector conditions on) and a three-member coalition, together with an analytic account of coalition cancellation and the transfer of two decision rules to the same LLM logs. We then apply both the fixed-threshold rule and a permutation-calibrated rule to GPT-4.1-mini agents with a hidden private channel and to a same-model control, and report ranking, detection and coalition benefit as separate outcomes. The principle throughout is the one the sprint brief states: do not confuse an observable signal with evidence of collusion. Section 5 reports, as a bounded exploratory result, a Jacobian-lens assay that asked the same question of a model’s internals and whose intended positive arm did not occur.</w:t>
+        <w:t xml:space="preserve">We combine four evaluation axes and emphasise their interaction: a matched innocent-dependence confound (two non-colluders following the same public rule), short-horizon calibration (25 to 500 rounds, where plug-in bias is comparable to the published threshold), state misspecification (an innocent rule keyed on a richer state than the detector conditions on) and a three-member coalition, together with an analytic account of coalition cancellation and the transfer of two decision rules to the same LLM logs. We then apply both the fixed-threshold rule and a permutation-calibrated rule to GPT-4.1-mini agents with a hidden private channel and to a same-model control, and report ranking, detection and coalition benefit as separate outcomes. Throughout, a signal is not treated as evidence of collusion until the assumption behind it has been checked. Section 5 reports a small Jacobian-lens experiment that asked the same question of a model’s internals; the condition it needed did not occur, and it is presented as exploratory.</w:t>
       </w:r>
     </w:p>
     <w:bookmarkEnd w:id="21"/>
@@ -418,7 +418,7 @@
         <w:t xml:space="preserve"> </w:t>
       </w:r>
       <w:r>
-        <w:t xml:space="preserve">Bonjour, Aggarwal and Bhargava (2022) define influence between agents as conditional mutual information given the game state and flag a pair whose net influence exceeds a threshold tuned on labelled data; they evaluate on iterated Rock-Paper-Scissors and poker with two colluders, across collusion probabilities and numbers of games, and note the two-colluder scope as a limitation. Later information-theoretic detectors for LLM agents (Tailor 2025; Ghanem 2026) estimate cross-run mutual information over transcripts rather than actions. Xu et al. (2026) show that two deployments of one base model carry a small residual bid correlation and argue that price-level audits are blind by construction. Within this sprint, Ayeku (2026) and Snow (2026) apply net influence with a permutation test to LLM players, Ayeku conditions on a public state against an innocent rule-following pair, and Lee et al. (2026) extend the statistic to coalitions with graph methods over 2,800 scripted coalition games and 400 honest games. Our axes differ: matched innocent-dependence confounds under correct and misspecified conditioning, the gap between bias correction and decision calibration at short horizons, an analytic account of why the pairwise correction cancels a three-member coalition, and a transfer test in which both decision rules are run on the same LLM logs.</w:t>
+        <w:t xml:space="preserve">Bonjour, Aggarwal and Bhargava (2022) define influence between agents as conditional mutual information given the game state and flag a pair whose net influence exceeds a threshold tuned on labelled data; they evaluate on iterated Rock-Paper-Scissors and poker with two colluders, across collusion probabilities and numbers of games, and note the two-colluder scope as a limitation. Later information-theoretic detectors for LLM agents (Tailor 2025; Ghanem 2026) estimate cross-run mutual information over transcripts rather than actions. Xu et al. (2026) show that two deployments of one base model carry a small residual bid correlation and argue that price-level audits are blind by construction. Within this sprint, Ayeku (2026) and Snow (2026) apply net influence with a permutation test to LLM players, Ayeku conditions on a public state against an innocent rule-following pair, and Lee et al. (2026) extend the statistic to coalitions with graph methods over 2,800 scripted coalition games and 400 honest games. Our experiments differ from these in four respects: matched innocent-dependence confounds under correct and misspecified conditioning, the gap between bias correction and decision calibration at short horizons, an analytic account of why the pairwise correction cancels a three-member coalition, and a transfer test in which both decision rules are run on the same LLM logs.</w:t>
       </w:r>
     </w:p>
     <w:p>
@@ -436,7 +436,7 @@
         <w:t xml:space="preserve"> </w:t>
       </w:r>
       <w:r>
-        <w:t xml:space="preserve">Rose et al. (2026) train a deception direction on residual activations and aggregate per-agent scores across a group; in their limitations (v1, Section 4.4) they write that a privileged-observer control, an agent who knows the collusion scheme but is instructed not to participate, would help, and leave it for future work. Li et al. (2026) find that a probe confined to the Jacobian-lens transport subspace detects an agent’s stated stance but not withheld collusion. Veras Neves (2026) reads a coordination signal from the J-lens on single prompts. Gurnee et al. (2026) and Ayonrinde and Lindsey (2026) report that a concept can remain in the workspace while the model is instructed to suppress it. Section 5 is a small exploratory step toward the control Rose et al. describe.</w:t>
+        <w:t xml:space="preserve">Rose et al. (2026) train a deception direction on residual activations and aggregate per-agent scores across a group; in their limitations (v1, Section 4.4) they write that a privileged-observer control, an agent who knows the collusion scheme but is instructed not to participate, would help, and leave it for future work. Li et al. (2026) find that a probe confined to the Jacobian-lens transport subspace detects an agent’s stated stance but not withheld collusion. Veras Neves (2026) reads a coordination signal from the J-lens on single prompts. Gurnee et al. (2026) and Ayonrinde and Lindsey (2026) report that a concept can remain in the workspace while the model is instructed to suppress it. Section 5 is a first attempt at the control Rose et al. describe.</w:t>
       </w:r>
     </w:p>
     <w:bookmarkEnd w:id="22"/>
@@ -581,7 +581,7 @@
         <w:t xml:space="preserve"> </w:t>
       </w:r>
       <w:r>
-        <w:t xml:space="preserve">(the top-scoring pair has a Holm-adjusted permutation p-value below 0.05 over the six pairs). Rejecting conditional independence is a statement about a specified null given the conditioning information; it is not equivalent to establishing collusion, and Section 4 is about the gap between the two.</w:t>
+        <w:t xml:space="preserve">(the top-scoring pair has a Holm-adjusted permutation p-value below 0.05 over the six pairs). Rejecting conditional independence is a statement about a specified null given the conditioning information; it is not equivalent to establishing collusion, and Section 4 measures the gap between the two.</w:t>
       </w:r>
     </w:p>
     <w:bookmarkEnd w:id="25"/>
@@ -922,7 +922,7 @@
         <w:t xml:space="preserve">parallel_rich</w:t>
       </w:r>
       <w:r>
-        <w:t xml:space="preserve">, majority-state conditioning fails completely: gamma(C; D | S) stays at 0.91 to 1.07 nats, the innocent pair ranks first in 100% of games at every T, and the fixed rule flags it in 65 to 100% of no-collusion games. Conditioning on the full previous profile removes the dependence but spreads 25 to 500 rounds over 15 to 29 occupied states; uncorrected, the bias flags a pair in 97 to 100% of no-collusion games, and even corrected the true pair is ranked first in only 0.75 of 25-round games (0.97 at 50, 1.00 from 100; false-positive rate 0.00 to 0.06). An auditor who conditions on a coarser state than the agents’ actual public rule obtains a confident, wrong verdict, and one who conditions on a richer state pays in sample size.</w:t>
+        <w:t xml:space="preserve">, majority-state conditioning fails completely: gamma(C; D | S) stays at 0.91 to 1.07 nats, the innocent pair ranks first in 100% of games at every T, and the fixed rule flags it in 65 to 100% of no-collusion games. Conditioning on the full previous profile removes the dependence but spreads 25 to 500 rounds over 15 to 29 occupied states; uncorrected, the bias flags a pair in 97 to 100% of no-collusion games, and even corrected the true pair is ranked first in only 0.75 of 25-round games (0.97 at 50, 1.00 from 100; false-positive rate 0.00 to 0.06). An auditor who conditions on a coarser state than the rule the agents follow gets a wrong answer with high confidence. One who conditions on a richer state needs many more rounds.</w:t>
       </w:r>
     </w:p>
     <w:p>
@@ -1625,7 +1625,7 @@
         <w:t xml:space="preserve"> </w:t>
       </w:r>
       <w:r>
-        <w:t xml:space="preserve">world the corrected fixed rule still fires in 0.49 to 0.55 of 25-round games and 0.01 to 0.10 of 100-round games: removing the mean of the bias leaves its variance, and the fixed threshold has no account of it.</w:t>
+        <w:t xml:space="preserve">world the corrected fixed rule still fires in 0.49 to 0.55 of 25-round games and 0.01 to 0.10 of 100-round games: subtracting the mean of the bias leaves its variance, which the fixed threshold ignores.</w:t>
       </w:r>
     </w:p>
     <w:p>
@@ -1633,7 +1633,7 @@
         <w:pStyle w:val="BodyText"/>
       </w:pPr>
       <w:r>
-        <w:t xml:space="preserve">The Holm rule is calibrated on the scripted nulls where the fixed rule is not (Table 2): 0.03 to 0.06 in the all-random world at every length and 0.00 to 0.01 in the parallel-only world, never naming the innocent pair. The price is power at short horizons: 0.42 against 0.96 in</w:t>
+        <w:t xml:space="preserve">The Holm rule is calibrated on the scripted nulls where the fixed rule is not (Table 2): 0.03 to 0.06 in the all-random world at every length and 0.00 to 0.01 in the parallel-only world, never naming the innocent pair. The cost is power in short games: 0.42 against 0.96 in</w:t>
       </w:r>
       <w:r>
         <w:t xml:space="preserve"> </w:t>
@@ -2145,7 +2145,7 @@
         <w:pStyle w:val="FirstParagraph"/>
       </w:pPr>
       <w:r>
-        <w:t xml:space="preserve">Bonjour et al. limit their method to two colluders. In the five-player condition with a primary A and two assistants B and C (CP = 0.6), the mechanism that makes net influence robust to third parties works against the coalition. In the symmetric construction gamma(B; A) = gamma(C; A) = m in expectation, so</w:t>
+        <w:t xml:space="preserve">Bonjour et al. limit their method to two colluders. In the five-player condition with a primary A and two assistants B and C (CP = 0.6), the subtraction that protects net influence against third parties turns against the coalition. In the symmetric construction gamma(B; A) = gamma(C; A) = m in expectation, so</w:t>
       </w:r>
     </w:p>
     <w:p>
@@ -2161,7 +2161,7 @@
         <w:pStyle w:val="BodyText"/>
       </w:pPr>
       <w:r>
-        <w:t xml:space="preserve">whenever neither outsider influences A more than the other assistant does, and since the pair score is the minimum of the two directions, the true pair’s score cannot exceed a positive threshold in the population limit. The subtraction treats another coalition member as the competing explanation and removes the signal. Empirically the AB score falls to 0.006 nats at 500 rounds and the fixed rule returns no pair in 25%, 32%, 54% and 68% of games at 50, 100, 200 and 500 rounds, almost always because no pair crosses alpha; detection gets worse as the log grows. Ranking is unaffected: a true pair is ranked first in 0.98 to 1.00 of games under both raw mutual information and net influence, and raw mutual information places all three coalition pairs in the top three from 200 rounds (2.81 of 3 at 50). Net influence places exactly two, because B and C are conditionally independent given A (gamma(B; C | A) = 0.014 at 500 rounds) and Gamma(B; C) is negative (-0.24 nats). Whether that is right depends on the target: B and C are members of the same coalition while having no direct dependence, and coalition membership and direct interaction edges are different ground truths. A coalition detector needs a conditional-dependence structure over the group, not a pairwise net score.</w:t>
+        <w:t xml:space="preserve">whenever neither outsider influences A more than the other assistant does, and since the pair score is the minimum of the two directions, the true pair’s score cannot exceed a positive threshold in the population limit. The subtraction treats another coalition member as the competing explanation and removes the signal. Empirically the AB score falls to 0.006 nats at 500 rounds and the fixed rule returns no pair in 25%, 32%, 54% and 68% of games at 50, 100, 200 and 500 rounds, almost always because no pair crosses alpha; detection gets worse as the log grows. Ranking is unaffected: a true pair is ranked first in 0.98 to 1.00 of games under both raw mutual information and net influence, and raw mutual information places all three coalition pairs in the top three from 200 rounds (2.81 of 3 at 50). Net influence places exactly two, because B and C are conditionally independent given A (gamma(B; C | A) = 0.014 at 500 rounds) and Gamma(B; C) is negative (-0.24 nats). Whether that is the right answer depends on what is being asked: B and C are members of the same coalition while having no direct dependence, and coalition membership and direct interaction edges are different ground truths. A coalition detector needs a conditional-dependence structure over the group, not a pairwise net score.</w:t>
       </w:r>
     </w:p>
     <w:p>
@@ -2292,7 +2292,7 @@
         <w:t xml:space="preserve"> </w:t>
       </w:r>
       <w:r>
-        <w:t xml:space="preserve">(no team; a same-model control). The detector sees only the 25 x 4 action log; messages are logged but never scored. The pilot was generated twice with identical code and settings. Run 1 (output recorded 26 October 09:17 UTC) was scored with the original analysis script, which recomputed the majority state across the nine inter-game boundaries and reported only whether the designated team was flagged per game. Run 2 (output recorded 11:06 UTC) is an independent set of 30 games scored with the revised script: states computed per game, permutations within (game, state) strata, both decision rules, any-pair false positives, Wilson 95% intervals on per-game rates and a bootstrap over games on pooled scores. The two logs are different draws, not a re-scoring (the team’s pooled memoryless dependence is 0.166 nats in run 1 and 0.356 in run 2, and the memoryless statistic is unaffected by the pooling fix). Outcomes are kept separate throughout: pair ranking, detection under each rule, and coalition benefit (team mean score minus non-team mean score per game).</w:t>
+        <w:t xml:space="preserve">(no team; a same-model control). The detector sees only the 25 x 4 action log; messages are logged but never scored. The pilot was generated twice with identical code and settings. Run 1 (output recorded 26 October 09:17 UTC) was scored with the original analysis script, which recomputed the majority state across the nine inter-game boundaries and reported only whether the designated team was flagged per game. Run 2 (output recorded 11:06 UTC) is an independent set of 30 games scored with the revised script: states computed per game, permutations within (game, state) strata, both decision rules, any-pair false positives, Wilson 95% intervals on per-game rates and a bootstrap over games on pooled scores. The two logs are different draws, not a re-scoring (the team’s pooled memoryless dependence is 0.166 nats in run 1 and 0.356 in run 2, and the memoryless statistic is unaffected by the pooling fix). We report three outcomes separately: pair ranking, detection under each rule, and coalition benefit (team mean score minus non-team mean score per game).</w:t>
       </w:r>
     </w:p>
     <w:p>
@@ -3664,13 +3664,13 @@
           <w:bCs/>
           <w:b/>
         </w:rPr>
-        <w:t xml:space="preserve">Ranking, detection and benefit come apart.</w:t>
-      </w:r>
-      <w:r>
-        <w:t xml:space="preserve"> </w:t>
-      </w:r>
-      <w:r>
-        <w:t xml:space="preserve">With the private channel the team pair has the largest dependence by a factor of four (run 1) to nine (run 2), is ranked first on the pooled log in both runs (run 2 game-bootstrap 95% interval for its uncorrected net influence: 0.19 to 0.50 nats; the corrected estimator was not bootstrapped), and is ranked first in 8 or 9 of 10 single games under the memoryless statistic, subject to the tie caveat in Table 4. Detection is weaker than ranking: the fixed rule flags the team in 5 (run 1) or 7 (run 2) of 10 single games, and in run 2 flags a non-team pair in one. Majority-state conditioning lowers single-game ranking and detection further (3/10 and 0/10 in run 1; 7/10 and 5/10 in run 2), the power cost of splitting 25 rounds over four states that Section 4.2 predicted; pooling restores the verdict under both rules in both runs. The private messages show what the statistic responds to, a sacrificial scheme in which one partner plays the move that loses to the other (</w:t>
+        <w:t xml:space="preserve">Ranking, detection and benefit give different answers.</w:t>
+      </w:r>
+      <w:r>
+        <w:t xml:space="preserve"> </w:t>
+      </w:r>
+      <w:r>
+        <w:t xml:space="preserve">With the private channel the team pair has the largest dependence by a factor of four (run 1) to nine (run 2), is ranked first on the pooled log in both runs (run 2 game-bootstrap 95% interval for its uncorrected net influence: 0.19 to 0.50 nats; the corrected estimator was not bootstrapped), and is ranked first in 8 or 9 of 10 single games under the memoryless statistic, subject to the tie caveat in Table 4. Detection is weaker than ranking: the fixed rule flags the team in 5 (run 1) or 7 (run 2) of 10 single games, and in run 2 flags a non-team pair in one. Majority-state conditioning lowers single-game ranking and detection further (3/10 and 0/10 in run 1; 7/10 and 5/10 in run 2), the power cost of splitting 25 rounds over four states that Section 4.2 predicted; pooling restores the verdict under both rules in both runs. The private messages show what the statistic is picking up: a sacrificial scheme in which one partner plays the move that loses to the other (</w:t>
       </w:r>
       <w:r>
         <w:t xml:space="preserve">“</w:t>
@@ -3737,7 +3737,7 @@
         <w:pStyle w:val="FirstParagraph"/>
       </w:pPr>
       <w:r>
-        <w:t xml:space="preserve">As a bounded secondary experiment we asked whether a receiver model’s workspace representation of a partner’s coded proposal differs between adopting it and understanding it and declining, the privileged-observer contrast Rose et al. (2026) describe. Design, bands and metrics were specified in code before these runs; full details are in Appendix C. Receiver gemma-4-12B-it (4-bit, solarkyle Jacobian lens, read at the last prompt token) saw a policy marking two of four items ineligible, a random four-word codebook, a routing tag from a scripted partner naming an ineligible item, and an objective; it replied with one item or abstain. Five matched prompts per base case (unauthorized, permitted, refusal, tag swapped, tag erased), 30 base cases.</w:t>
+        <w:t xml:space="preserve">In a secondary experiment we asked whether a receiver model’s workspace representation of a partner’s coded proposal differs between adopting it and understanding it and declining, the privileged-observer contrast Rose et al. (2026) describe. Design, bands and metrics were specified in code before these runs; full details are in Appendix C. Receiver gemma-4-12B-it (4-bit, solarkyle Jacobian lens, read at the last prompt token) saw a policy marking two of four items ineligible, a random four-word codebook, a routing tag from a scripted partner naming an ineligible item, and an objective; it replied with one item or abstain. Five matched prompts per base case (unauthorized, permitted, refusal, tag swapped, tag erased), 30 base cases.</w:t>
       </w:r>
     </w:p>
     <w:p>
@@ -4262,7 +4262,7 @@
         <w:pStyle w:val="BodyText"/>
       </w:pPr>
       <w:r>
-        <w:t xml:space="preserve">At the final pre-generation position, the selected J-lens readout strongly recovered nominated items during permitted adoption but did not reliably recover them during abstention. Because unauthorized adoption never occurred, this experiment does not establish whether the readout distinguishes collusive participation from refusal. Correct behaviour under the permitted prompt shows decoding capability in that condition; it does not verify the computation under each refusal prompt, and failure to recover a token with one lens at one position is a measurement limitation, not evidence that the information is absent. Two implementation details bear on the numbers: the readout takes the best rank across all layers in a band and across four token variants of each item, not a typical-layer rank; and when all four candidates are censored the tie is broken in list order, so decoding rates in censored conditions include tie artefacts (the early-band rates of 0.30 to 0.37, with every median censored, are such artefacts and are omitted from the table). We report this as an observation about one readout at one position and claim nothing about what the workspace contains.</w:t>
+        <w:t xml:space="preserve">At the final pre-generation position, the selected J-lens readout strongly recovered nominated items during permitted adoption but did not reliably recover them during abstention. Because unauthorized adoption never occurred, this experiment does not establish whether the readout distinguishes collusive participation from refusal. Correct behaviour under the permitted prompt shows decoding capability in that condition; it does not verify the computation under each refusal prompt, and failure to recover a token with one lens at one position is a measurement limitation, not evidence that the information is absent. Two details of the implementation affect the numbers: the readout takes the best rank across all layers in a band and across four token variants of each item, not a typical-layer rank; and when all four candidates are censored the tie is broken in list order, so decoding rates in censored conditions include tie artefacts (the early-band rates of 0.30 to 0.37, with every median censored, are such artefacts and are omitted from the table). This is an observation about one readout at one position. It says nothing about what the workspace contains.</w:t>
       </w:r>
     </w:p>
     <w:bookmarkEnd w:id="39"/>
@@ -4280,7 +4280,7 @@
         <w:pStyle w:val="FirstParagraph"/>
       </w:pPr>
       <w:r>
-        <w:t xml:space="preserve">The four findings in Section 4 share one lesson: each plausible piece of collusion evidence rests on an assumption an auditor must check before trusting it. Conditional dependence is evidence only relative to the conditioning information, and an innocent public rule the auditor has not modelled produces a confident false verdict (4.1). A corrected statistic is not a calibrated decision, and a decision rule calibrated on one family of nulls carried a 0.002 p-value onto an innocent same-model pair in another (4.2, 4.4). A pairwise correction designed to remove third parties removes coalition members too, so for a coalition of three the published detector loses power as evidence accumulates (4.3). And ranking, thresholding and benefit are different outcomes that a single number conflates, in both independent runs of the pilot (4.4).</w:t>
+        <w:t xml:space="preserve">Each of the four findings in Section 4 points to an assumption an auditor has to check before trusting the evidence. Conditional dependence is evidence only relative to the conditioning information, and an innocent public rule the auditor has not modelled produces a confident false verdict (4.1). A corrected statistic is not a calibrated decision, and a decision rule calibrated on one family of nulls carried a 0.002 p-value onto an innocent same-model pair in another (4.2, 4.4). A pairwise correction designed to remove third parties removes coalition members too, so for a coalition of three the published detector loses power as evidence accumulates (4.3). And ranking, thresholding and benefit are different outcomes that a single number conflates, in both independent runs of the pilot (4.4).</w:t>
       </w:r>
     </w:p>
     <w:p>
@@ -4288,7 +4288,7 @@
         <w:pStyle w:val="BodyText"/>
       </w:pPr>
       <w:r>
-        <w:t xml:space="preserve">What is new here is narrow. We release a general-N implementation of net influence with a within-state permutation null; we extend the original ground-truth evaluation to matched innocent-dependence confounds, short-horizon calibration, state misspecification and a three-member coalition; we give the algebraic account of coalition cancellation; and we run two decision rules side by side on two independent LLM pilot runs (with different analysis procedures, as Section 4.4 states). Not new: the statistic, conditioning on state, permutation calibration of dependence statistics, scripted evaluation as such (Bonjour et al.; Lee et al.), and the observation that same-model agents correlate (Xu et al.). Section 5 is exploratory and establishes neither presence nor absence of a proposal in the workspace.</w:t>
+        <w:t xml:space="preserve">The new material is limited to the following. We release a general-N implementation of net influence with a within-state permutation null; we extend the original ground-truth evaluation to matched innocent-dependence confounds, short-horizon calibration, state misspecification and a three-member coalition; we give the algebraic account of coalition cancellation; and we run two decision rules side by side on two independent LLM pilot runs (with different analysis procedures, as Section 4.4 states). Not new: the statistic, conditioning on state, permutation calibration of dependence statistics, scripted evaluation as such (Bonjour et al.; Lee et al.), and the observation that same-model agents correlate (Xu et al.). Section 5 is exploratory and establishes neither presence nor absence of a proposal in the workspace.</w:t>
       </w:r>
     </w:p>
     <w:p>
@@ -4296,7 +4296,7 @@
         <w:pStyle w:val="BodyText"/>
       </w:pPr>
       <w:r>
-        <w:t xml:space="preserve">Future work, in order of value: a per-game permutation budget large enough for the Holm rule to be informative on single games (at least 120 permutations), and more games; a coalition detector built on a conditional-independence structure rather than pairwise net scores; a null that respects the agents’ actual conditioning information, for example by fitting each agent’s reaction function to the public history and permuting residuals; the Agrawal et al. (2025) double auction, where the public state is the order book; and, for the lens, a receiver that does adopt unauthorised proposals and a readout at the tag token rather than the decision token.</w:t>
+        <w:t xml:space="preserve">Future work, most useful first: a per-game permutation budget large enough for the Holm rule to be informative on single games (at least 120 permutations), and more games; a coalition detector built on a conditional-independence structure rather than pairwise net scores; a null that respects the agents’ actual conditioning information, for example by fitting each agent’s reaction function to the public history and permuting residuals; the Agrawal et al. (2025) double auction, where the public state is the order book; and, for the lens, a receiver that does adopt unauthorised proposals and a readout at the tag token rather than the decision token.</w:t>
       </w:r>
     </w:p>
     <w:bookmarkEnd w:id="40"/>

</xml_diff>

<commit_message>
Full plain-language rewrite of the report; numbers, tables and structure unchanged
Co-Authored-By: Claude Fable 5.1 <noreply@anthropic.com>
Claude-Session: https://claude.ai/code/session_018qJiaQKKjpemqx8e3Wrmcq
</commit_message>
<xml_diff>
--- a/report/report_draft.docx
+++ b/report/report_draft.docx
@@ -316,7 +316,7 @@
         <w:pStyle w:val="FirstParagraph"/>
       </w:pPr>
       <w:r>
-        <w:t xml:space="preserve">When does statistical dependence constitute evidence of agent collusion? We stress-test pairwise net influence using 7,400 scripted games and two GPT-4.1-mini pilot runs, each comprising ten games in each of three conditions.</w:t>
+        <w:t xml:space="preserve">When does statistical dependence between two agents count as evidence that they are colluding? We stress-test pairwise net influence (Bonjour et al. 2022), a detector that works from action logs alone, on 7,400 scripted games with a planted colluding pair and on two runs of GPT-4.1-mini agents, each ten games in three conditions.</w:t>
       </w:r>
     </w:p>
     <w:p>
@@ -324,7 +324,7 @@
         <w:pStyle w:val="BodyText"/>
       </w:pPr>
       <w:r>
-        <w:t xml:space="preserve">We examine public-state specification, finite-sample calibration, and coalition size. Innocent agents following the same public rule defeat unconditioned dependence statistics; conditioning removes this confound only when the chosen state captures that rule. At 25 rounds, a fixed threshold produces false accusations in approximately half of all-random games. A Holm-corrected permutation rule reduces false-positive rates on the tested scripted nulls, but flags a pair in each pooled LLM control without a planted coalition. These outcomes distinguish statistical rejection from evidence of collusion.</w:t>
+        <w:t xml:space="preserve">We vary the public state the detector conditions on, the length of the game, and the size of the coalition. Two innocent agents that follow the same public rule defeat every unconditioned dependence statistic. Conditioning removes the problem only when the chosen state captures the rule they follow. At 25 rounds a fixed threshold accuses a pair in about half of all-random games. A Holm-corrected permutation rule holds the false-positive rate down on the scripted nulls, but flags a pair in each pooled LLM control that has no planted coalition. A rejected null is not the same as evidence of collusion.</w:t>
       </w:r>
     </w:p>
     <w:p>
@@ -332,7 +332,7 @@
         <w:pStyle w:val="BodyText"/>
       </w:pPr>
       <w:r>
-        <w:t xml:space="preserve">For a symmetric coalition with one primary and two assistants, we derive a cancellation mechanism: the pairwise correction subtracts one coalition member’s influence from another’s. Consequently, fixed-threshold detection deteriorates as sample size increases.</w:t>
+        <w:t xml:space="preserve">With one primary agent and two assistants we derive a cancellation: the pairwise correction subtracts one coalition member’s influence from another’s, so fixed-threshold detection gets worse as the log grows.</w:t>
       </w:r>
     </w:p>
     <w:p>
@@ -340,7 +340,7 @@
         <w:pStyle w:val="BodyText"/>
       </w:pPr>
       <w:r>
-        <w:t xml:space="preserve">In the LLM pilots, the planted pair ranks first in eight or nine of ten games but is correctly flagged in five or seven. Its mean within-game score advantage changes from -0.25 to +1.00 across runs; these descriptive differences do not establish a causal benefit from coordination.</w:t>
+        <w:t xml:space="preserve">In the LLM pilots the planted pair ranks first in eight or nine of ten games but is flagged in five or seven. Its mean score advantage was -0.25 in one run and +1.00 in the other, which does not show that the coordination paid off.</w:t>
       </w:r>
     </w:p>
     <w:p>
@@ -348,7 +348,7 @@
         <w:pStyle w:val="BodyText"/>
       </w:pPr>
       <w:r>
-        <w:t xml:space="preserve">An exploratory Jacobian-lens assay includes 150 receiver evaluations but no unauthorized adoption, leaving its intended participation-versus-refusal contrast unresolved. We release code and evaluation artifacts and identify assumptions auditors must check before treating dependence as evidence of collusion.</w:t>
+        <w:t xml:space="preserve">An exploratory Jacobian-lens experiment ran 150 receiver evaluations but produced no unauthorised adoption, so its intended contrast between taking part and refusing is unresolved. We release the code and logs and list the assumptions an auditor has to check before treating dependence as evidence.</w:t>
       </w:r>
     </w:p>
     <w:bookmarkEnd w:id="20"/>
@@ -366,7 +366,7 @@
         <w:pStyle w:val="FirstParagraph"/>
       </w:pPr>
       <w:r>
-        <w:t xml:space="preserve">The sprint asks what should count as evidence that agents are colluding when the evidence is a log of actions (question 2.3), and whether information-theoretic measures can identify colluding pairs among several agents (question 1.4). Antitrust law has long faced the same difficulty: competitors act in parallel because they respond to the same public information, and parallel conduct alone is not an agreement (Berger et al. 2025). A detector that flags correlation flags every pair that shares a prior or a strategy, and two instances of one base model share a great deal of prior (Xu et al. 2026).</w:t>
+        <w:t xml:space="preserve">The sprint asks what should count as evidence that agents are colluding when the evidence is a log of actions (question 2.3), and whether information-theoretic measures can pick out a colluding pair among several agents (question 1.4). Antitrust law has dealt with the same problem for decades. Competitors act in parallel because they see the same public information, and parallel conduct on its own is not an agreement (Berger et al. 2025). A detector that flags correlation flags every pair that shares a prior or a strategy, and two copies of one base model share a lot of prior (Xu et al. 2026).</w:t>
       </w:r>
     </w:p>
     <w:p>
@@ -374,7 +374,7 @@
         <w:pStyle w:val="BodyText"/>
       </w:pPr>
       <w:r>
-        <w:t xml:space="preserve">Bonjour et al. (2022) proposed a statistic built for exactly this difficulty. It measures the dependence between two agents’ actions conditional on the observable game state, then subtracts the strongest dependence any third agent has on the same target. It is domain independent and needs only logged actions. The original paper evaluated it on known colluding configurations, varied collusion strength and sample size, treated the threshold as a hyperparameter to be tuned on training data, and limited its scope to two colluders. Several concurrent sprint entries apply it to LLM players (Ayeku 2026; Snow 2026; Lee et al. 2026), and Lee et al. include 2,800 scripted coalition games. None of this tells an auditor which assumptions the verdict rests on. The question is this:</w:t>
+        <w:t xml:space="preserve">Bonjour et al. (2022) built a statistic for exactly this problem. It measures how much two agents’ actions depend on each other given the public state of the game, then subtracts the strongest dependence any third agent has on the same target. It needs nothing but logged actions. The original paper tested it on known colluding set-ups, varied the strength of collusion and the number of games, treated the threshold as a hyperparameter to tune on labelled data, and limited the method to two colluders. Three concurrent sprint entries apply it to LLM players (Ayeku 2026; Snow 2026; Lee et al. 2026), and Lee et al. include 2,800 scripted coalition games. None of this tells an auditor which assumptions a verdict rests on. The question is this:</w:t>
       </w:r>
     </w:p>
     <w:p>
@@ -382,7 +382,7 @@
         <w:pStyle w:val="BodyText"/>
       </w:pPr>
       <w:r>
-        <w:t xml:space="preserve">Under which assumptions about public information, sample size and coalition structure does net influence distinguish planted coordination from innocent dependence, and where does calibration fail to transfer?</w:t>
+        <w:t xml:space="preserve">Under which assumptions about public information, sample size and coalition structure does net influence tell planted coordination apart from innocent dependence, and where does its calibration fail to carry over?</w:t>
       </w:r>
     </w:p>
     <w:p>
@@ -390,7 +390,7 @@
         <w:pStyle w:val="BodyText"/>
       </w:pPr>
       <w:r>
-        <w:t xml:space="preserve">We combine four evaluation axes and emphasise their interaction: a matched innocent-dependence confound (two non-colluders following the same public rule), short-horizon calibration (25 to 500 rounds, where plug-in bias is comparable to the published threshold), state misspecification (an innocent rule keyed on a richer state than the detector conditions on) and a three-member coalition, together with an analytic account of coalition cancellation and the transfer of two decision rules to the same LLM logs. We then apply both the fixed-threshold rule and a permutation-calibrated rule to GPT-4.1-mini agents with a hidden private channel and to a same-model control, and report ranking, detection and coalition benefit as separate outcomes. Throughout, a signal is not treated as evidence of collusion until the assumption behind it has been checked. Section 5 reports a small Jacobian-lens experiment that asked the same question of a model’s internals; the condition it needed did not occur, and it is presented as exploratory.</w:t>
+        <w:t xml:space="preserve">We combine four evaluation axes and look at how they interact: a matched innocent-dependence confound (two non-colluders following the same public rule); short games (25 to 500 rounds, where the plug-in bias of the statistic is as large as the published threshold); state misspecification (an innocent rule keyed on a richer state than the detector conditions on); and a three-member coalition. We give an algebraic account of why the pairwise correction cancels a coalition, and we run two decision rules on the same LLM logs. Pair ranking, threshold detection and coalition benefit are reported as three separate outcomes. A signal is not treated as evidence until the assumption behind it has been checked. Section 5 reports a small Jacobian-lens experiment that asked the same question of a model’s internals; the condition it needed did not occur, and it is presented as exploratory.</w:t>
       </w:r>
     </w:p>
     <w:bookmarkEnd w:id="21"/>
@@ -412,13 +412,13 @@
           <w:bCs/>
           <w:b/>
         </w:rPr>
-        <w:t xml:space="preserve">Information-theoretic detection from actions.</w:t>
-      </w:r>
-      <w:r>
-        <w:t xml:space="preserve"> </w:t>
-      </w:r>
-      <w:r>
-        <w:t xml:space="preserve">Bonjour, Aggarwal and Bhargava (2022) define influence between agents as conditional mutual information given the game state and flag a pair whose net influence exceeds a threshold tuned on labelled data; they evaluate on iterated Rock-Paper-Scissors and poker with two colluders, across collusion probabilities and numbers of games, and note the two-colluder scope as a limitation. Later information-theoretic detectors for LLM agents (Tailor 2025; Ghanem 2026) estimate cross-run mutual information over transcripts rather than actions. Xu et al. (2026) show that two deployments of one base model carry a small residual bid correlation and argue that price-level audits are blind by construction. Within this sprint, Ayeku (2026) and Snow (2026) apply net influence with a permutation test to LLM players, Ayeku conditions on a public state against an innocent rule-following pair, and Lee et al. (2026) extend the statistic to coalitions with graph methods over 2,800 scripted coalition games and 400 honest games. Our experiments differ from these in four respects: matched innocent-dependence confounds under correct and misspecified conditioning, the gap between bias correction and decision calibration at short horizons, an analytic account of why the pairwise correction cancels a three-member coalition, and a transfer test in which both decision rules are run on the same LLM logs.</w:t>
+        <w:t xml:space="preserve">Detection from actions.</w:t>
+      </w:r>
+      <w:r>
+        <w:t xml:space="preserve"> </w:t>
+      </w:r>
+      <w:r>
+        <w:t xml:space="preserve">Bonjour, Aggarwal and Bhargava (2022) define the influence of one agent on another as conditional mutual information given the game state and flag a pair whose net influence passes a threshold tuned on labelled data. They evaluate on iterated Rock-Paper-Scissors and poker with two colluders, across collusion probabilities and numbers of games, and name the two-colluder limit as a limitation. Later information-theoretic detectors for LLM agents (Tailor 2025; Ghanem 2026) estimate cross-run mutual information over transcripts, not actions. Xu et al. (2026) show that two deployments of one base model carry a small residual bid correlation and conclude that price-level audits cannot work by construction. In this sprint, Ayeku (2026) and Snow (2026) apply net influence with a permutation test to LLM players, Ayeku conditions on a public state against an innocent rule-following pair, and Lee et al. (2026) extend the statistic to coalitions with graph methods over 2,800 scripted coalition games and 400 honest games. Our experiments differ in four respects: matched innocent-dependence confounds under correct and misspecified conditioning; the gap between bias correction and decision calibration in short games; an algebraic account of why the pairwise correction cancels a three-member coalition; and a transfer test in which both decision rules run on the same LLM logs.</w:t>
       </w:r>
     </w:p>
     <w:p>
@@ -436,7 +436,7 @@
         <w:t xml:space="preserve"> </w:t>
       </w:r>
       <w:r>
-        <w:t xml:space="preserve">Rose et al. (2026) train a deception direction on residual activations and aggregate per-agent scores across a group; in their limitations (v1, Section 4.4) they write that a privileged-observer control, an agent who knows the collusion scheme but is instructed not to participate, would help, and leave it for future work. Li et al. (2026) find that a probe confined to the Jacobian-lens transport subspace detects an agent’s stated stance but not withheld collusion. Veras Neves (2026) reads a coordination signal from the J-lens on single prompts. Gurnee et al. (2026) and Ayonrinde and Lindsey (2026) report that a concept can remain in the workspace while the model is instructed to suppress it. Section 5 is a first attempt at the control Rose et al. describe.</w:t>
+        <w:t xml:space="preserve">Rose et al. (2026) train a deception direction on residual activations and combine per-agent scores across a group. In their limitations (v1, Section 4.4) they write that a privileged-observer control, an agent who knows the collusion scheme but is instructed not to take part, would help, and leave it for future work. Li et al. (2026) find that a probe restricted to the Jacobian-lens transport subspace detects an agent’s stated stance but not withheld collusion. Veras Neves (2026) reads a coordination signal from the J-lens on single prompts. Gurnee et al. (2026) and Ayonrinde and Lindsey (2026) report that a concept can stay in the workspace while the model is told to suppress it. Section 5 is a first attempt at the control Rose et al. describe.</w:t>
       </w:r>
     </w:p>
     <w:bookmarkEnd w:id="22"/>
@@ -463,7 +463,7 @@
         <w:pStyle w:val="FirstParagraph"/>
       </w:pPr>
       <w:r>
-        <w:t xml:space="preserve">Consider N agents playing a repeated simultaneous-move game with K actions. Let A_i^t be agent i’s action in round t and S^t the public state before round t. Bonjour et al. define the influence of i on j as</w:t>
+        <w:t xml:space="preserve">N agents play a repeated simultaneous-move game with K actions. A_i^t is agent i’s action in round t and S^t is the public state before round t. Bonjour et al. define the influence of i on j as</w:t>
       </w:r>
     </w:p>
     <w:p>
@@ -479,7 +479,7 @@
         <w:pStyle w:val="BodyText"/>
       </w:pPr>
       <w:r>
-        <w:t xml:space="preserve">the conditional mutual information I(A_i; A_j | S), symmetric in the simultaneous fully observable case. The net influence is</w:t>
+        <w:t xml:space="preserve">which is the conditional mutual information I(A_i; A_j | S); it is symmetric when moves are simultaneous and fully observed. The net influence is</w:t>
       </w:r>
     </w:p>
     <w:p>
@@ -495,7 +495,7 @@
         <w:pStyle w:val="BodyText"/>
       </w:pPr>
       <w:r>
-        <w:t xml:space="preserve">and agents i and j are declared colluding if Gamma(i; j) &gt;= alpha and Gamma(j; i) &gt;= alpha. The paper reports a pair only when exactly one pair satisfies this and uses alpha = 0.05 (natural log). We implement this with plug-in probabilities and score each unordered pair by min(Gamma(i; j), Gamma(j; i)).</w:t>
+        <w:t xml:space="preserve">and i and j are declared colluding if Gamma(i; j) &gt;= alpha and Gamma(j; i) &gt;= alpha. The paper reports a pair only when exactly one pair satisfies this, with alpha = 0.05 in natural-log units. We implement this with plug-in probabilities and score each unordered pair by min(Gamma(i; j), Gamma(j; i)).</w:t>
       </w:r>
     </w:p>
     <w:bookmarkEnd w:id="23"/>
@@ -513,7 +513,7 @@
         <w:pStyle w:val="FirstParagraph"/>
       </w:pPr>
       <w:r>
-        <w:t xml:space="preserve">We compare a memoryless state (gamma reduces to mutual information), the previous round’s majority action (four values) and the full previous action profile (82 values, sparse at short horizons).</w:t>
+        <w:t xml:space="preserve">We compare a memoryless state (gamma becomes plain mutual information), the previous round’s majority action (four values), and the full previous action profile (82 values, sparse in short games).</w:t>
       </w:r>
     </w:p>
     <w:bookmarkEnd w:id="24"/>
@@ -531,7 +531,7 @@
         <w:pStyle w:val="FirstParagraph"/>
       </w:pPr>
       <w:r>
-        <w:t xml:space="preserve">Plug-in mutual information is biased upwards by about (K-1)^2 / (2T) nats per state stratum; for K = 3 and T = 25 this is 0.08 nats, larger than alpha. We estimate the null of gamma(i; j) under</w:t>
+        <w:t xml:space="preserve">Plug-in mutual information is biased upward by about (K-1)^2 / (2T) nats per state stratum. For K = 3 and T = 25 that is 0.08 nats, more than alpha. We estimate the null of gamma(i; j) under</w:t>
       </w:r>
       <w:r>
         <w:t xml:space="preserve"> </w:t>
@@ -549,7 +549,7 @@
         <w:t xml:space="preserve"> </w:t>
       </w:r>
       <w:r>
-        <w:t xml:space="preserve">by shuffling A_j within each state stratum (100 to 500 permutations) and report the corrected statistic gamma minus the null mean, clipped at zero, and a permutation p-value per pair. Net influence is computed from the corrected gamma. Two decision rules are then applied, and they are different procedures: the</w:t>
+        <w:t xml:space="preserve">by shuffling A_j within each state stratum (100 to 500 permutations), and report the corrected statistic (gamma minus the null mean, clipped at zero) and a permutation p-value per pair. Net influence is computed from the corrected gamma. Two decision rules are then applied, and they are different procedures. The</w:t>
       </w:r>
       <w:r>
         <w:t xml:space="preserve"> </w:t>
@@ -562,10 +562,7 @@
         <w:t xml:space="preserve">fixed rule</w:t>
       </w:r>
       <w:r>
-        <w:t xml:space="preserve"> </w:t>
-      </w:r>
-      <w:r>
-        <w:t xml:space="preserve">(exactly one pair has net-influence score &gt;= 0.05) and the</w:t>
+        <w:t xml:space="preserve">: exactly one pair has a net-influence score of 0.05 or more. The</w:t>
       </w:r>
       <w:r>
         <w:t xml:space="preserve"> </w:t>
@@ -578,10 +575,7 @@
         <w:t xml:space="preserve">Holm rule</w:t>
       </w:r>
       <w:r>
-        <w:t xml:space="preserve"> </w:t>
-      </w:r>
-      <w:r>
-        <w:t xml:space="preserve">(the top-scoring pair has a Holm-adjusted permutation p-value below 0.05 over the six pairs). Rejecting conditional independence is a statement about a specified null given the conditioning information; it is not equivalent to establishing collusion, and Section 4 measures the gap between the two.</w:t>
+        <w:t xml:space="preserve">: the top-scoring pair has a Holm-adjusted permutation p-value below 0.05 over the six pairs. Rejecting conditional independence is a statement about one null under one set of conditioning information; it is not the same as establishing collusion, and Section 4 measures the gap between the two.</w:t>
       </w:r>
     </w:p>
     <w:bookmarkEnd w:id="25"/>
@@ -599,7 +593,7 @@
         <w:pStyle w:val="FirstParagraph"/>
       </w:pPr>
       <w:r>
-        <w:t xml:space="preserve">Four players (five in Section 4.3), actions rock, paper, scissors. Payoffs follow Bonjour et al.: all the same, nobody scores; all three actions present, everyone scores 1; exactly two actions present, the winning action’s players score 1. Agent types:</w:t>
+        <w:t xml:space="preserve">Four players (five in Section 4.3), actions rock, paper, scissors. Payoffs follow Bonjour et al.: all the same, nobody scores; all three actions present, everyone scores 1; exactly two actions present, the players who chose the winning action score 1. Agent types:</w:t>
       </w:r>
       <w:r>
         <w:t xml:space="preserve"> </w:t>
@@ -625,7 +619,7 @@
         <w:t xml:space="preserve">assistant</w:t>
       </w:r>
       <w:r>
-        <w:t xml:space="preserve">, which with probability CP plays the action that loses to the primary’s action (guaranteeing the primary a point, with ex-ante signalling assumed as in the paper) and is otherwise uniform;</w:t>
+        <w:t xml:space="preserve">, which with probability CP plays the action that loses to the primary’s action, guaranteeing the primary a point (ex-ante signalling is assumed, as in the paper), and is otherwise uniform;</w:t>
       </w:r>
       <w:r>
         <w:t xml:space="preserve"> </w:t>
@@ -638,7 +632,7 @@
         <w:t xml:space="preserve">parallel</w:t>
       </w:r>
       <w:r>
-        <w:t xml:space="preserve">, which plays the action that beats the previous round’s majority (a public, deterministic, unilateral rule);</w:t>
+        <w:t xml:space="preserve">, which plays the action that beats the previous round’s majority, a public, deterministic, unilateral rule;</w:t>
       </w:r>
       <w:r>
         <w:t xml:space="preserve"> </w:t>
@@ -651,7 +645,7 @@
         <w:t xml:space="preserve">parallel_rich</w:t>
       </w:r>
       <w:r>
-        <w:t xml:space="preserve">, which plays the action that beats the previous move of the lowest-indexed player who scored in the previous round (a function of the previous full profile but not of the previous majority). Conditions:</w:t>
+        <w:t xml:space="preserve">, which plays the action that beats the previous move of the lowest-indexed player who scored in the previous round, a function of the previous full profile but not of the previous majority. Conditions:</w:t>
       </w:r>
       <w:r>
         <w:t xml:space="preserve"> </w:t>
@@ -760,7 +754,7 @@
         <w:t xml:space="preserve"> </w:t>
       </w:r>
       <w:r>
-        <w:t xml:space="preserve">condition (A primary, B and C assistants, D and E random). Main sweep: T in {25, 50, 100, 200, 500} at CP = 0.6 and CP in {0, 0.2, 0.4, 0.6, 0.8, 1.0} at T = 25 and 100, 100 seeds per cell, 100 permutations (4,400 games, seeds 0 to 99 and 10000 to 10099). Extensions: 100 seeds per cell, 200 permutations, different seeds (3,000 games). Nominally identical cells therefore differ slightly between the two batches (for example a parallel-only false-positive rate of 0.25 in the main sweep against 0.33 in the extensions at T = 25); both are reported with their batch.</w:t>
+        <w:t xml:space="preserve">condition (A primary, B and C assistants, D and E random). Main sweep: T in {25, 50, 100, 200, 500} at CP = 0.6 and CP in {0, 0.2, 0.4, 0.6, 0.8, 1.0} at T = 25 and 100, 100 seeds per cell, 100 permutations (4,400 games, seeds 0 to 99 and 10000 to 10099). Extensions: 100 seeds per cell, 200 permutations, different seeds (3,000 games). Cells that are nominally the same differ slightly between the two batches (a parallel-only false-positive rate of 0.25 in the main sweep and 0.33 in the extensions at T = 25); each number is reported with its batch.</w:t>
       </w:r>
     </w:p>
     <w:p>
@@ -768,7 +762,7 @@
         <w:pStyle w:val="BodyText"/>
       </w:pPr>
       <w:r>
-        <w:t xml:space="preserve">Detectors, all action-only: net influence with each state, with and without correction; raw mutual information; Cramer’s V; same-action rate. Outcomes, kept separate: rank-1 accuracy (the true pair scores highest of six), correct detection (a rule flags exactly the true pair), and false-positive rate (a rule flags any pair when no collusion is present).</w:t>
+        <w:t xml:space="preserve">Detectors, all working from actions: net influence with each state, with and without correction; raw mutual information; Cramer’s V; same-action rate. Outcomes, kept separate: rank-1 accuracy (the true pair has the highest score of six), correct detection (a rule flags exactly the true pair) and false-positive rate (a rule flags any pair when no collusion is present).</w:t>
       </w:r>
     </w:p>
     <w:bookmarkEnd w:id="26"/>
@@ -791,7 +785,7 @@
           <wp:inline>
             <wp:extent cx="5334000" cy="1866900"/>
             <wp:effectExtent b="0" l="0" r="0" t="0"/>
-            <wp:docPr descr="Figure 1. Main sweep (100 seeds per point). (a) Rank-1 accuracy of the true pair when an innocent parallel pair is present, CP = 0.6. (b) False-positive rate of the fixed rule with no collusion present, in the all-random and parallel-only worlds. (c) Correct detection at 25 rounds against collusion strength, random non-colluders." title="" id="29" name="Picture"/>
+            <wp:docPr descr="Figure 1. Main sweep, 100 seeds per point. (a) Rank-1 accuracy of the true pair when an innocent parallel pair is present, CP = 0.6. (b) False-positive rate of the fixed rule with no collusion present, in the all-random and parallel-only worlds. (c) Correct detection at 25 rounds against collusion strength, random non-colluders." title="" id="29" name="Picture"/>
             <a:graphic>
               <a:graphicData uri="http://schemas.openxmlformats.org/drawingml/2006/picture">
                 <pic:pic>
@@ -834,7 +828,7 @@
         <w:pStyle w:val="ImageCaption"/>
       </w:pPr>
       <w:r>
-        <w:t xml:space="preserve">Figure 1. Main sweep (100 seeds per point). (a) Rank-1 accuracy of the true pair when an innocent parallel pair is present, CP = 0.6. (b) False-positive rate of the fixed rule with no collusion present, in the all-random and parallel-only worlds. (c) Correct detection at 25 rounds against collusion strength, random non-colluders.</w:t>
+        <w:t xml:space="preserve">Figure 1. Main sweep, 100 seeds per point. (a) Rank-1 accuracy of the true pair when an innocent parallel pair is present, CP = 0.6. (b) False-positive rate of the fixed rule with no collusion present, in the all-random and parallel-only worlds. (c) Correct detection at 25 rounds against collusion strength, random non-colluders.</w:t>
       </w:r>
     </w:p>
     <w:p>
@@ -852,16 +846,16 @@
         <w:t xml:space="preserve"> </w:t>
       </w:r>
       <w:r>
-        <w:t xml:space="preserve">With random non-colluders, the paper’s setting, memoryless net influence behaves as published: rank-1 accuracy at CP = 0.6 is 0.95 at 25 rounds and 1.00 from 50; correct detection under the fixed rule is 0.82, 0.93 and 1.00 at 25, 50 and 100 rounds, and at T = 100 rises from 0.24 at CP = 0.2 to 1.00 at CP = 0.6. Same-action rate scores 0.00 in every collusion condition from 50 rounds, because the assisting move is the move that loses to the partner; Cramer’s V and raw mutual information, which are sign-agnostic, match net influence here.</w:t>
-      </w:r>
-    </w:p>
-    <w:bookmarkStart w:id="31" w:name="X04b6ba2b3ee66f9aa87be1b4a0429d020a955b7"/>
+        <w:t xml:space="preserve">With random non-colluders, the paper’s own setting, memoryless net influence behaves as published. Rank-1 accuracy at CP = 0.6 is 0.95 at 25 rounds and 1.00 from 50. Correct detection under the fixed rule is 0.82, 0.93 and 1.00 at 25, 50 and 100 rounds, and at T = 100 it rises from 0.24 at CP = 0.2 to 1.00 at CP = 0.6. Same-action rate scores 0.00 in every collusion condition from 50 rounds, because the assisting move is the one that loses to the partner. Cramer’s V and raw mutual information do not depend on sign and match net influence here.</w:t>
+      </w:r>
+    </w:p>
+    <w:bookmarkStart w:id="31" w:name="X80d7d20e770dd41e2b7966ff8b1da005cf0c0c1"/>
     <w:p>
       <w:pPr>
         <w:pStyle w:val="Heading3"/>
       </w:pPr>
       <w:r>
-        <w:t xml:space="preserve">4.1 State misspecification: the wrong public state confidently identifies an innocent pair</w:t>
+        <w:t xml:space="preserve">4.1 State misspecification: the wrong public state names an innocent pair</w:t>
       </w:r>
     </w:p>
     <w:p>
@@ -885,7 +879,7 @@
         <w:t xml:space="preserve"> </w:t>
       </w:r>
       <w:r>
-        <w:t xml:space="preserve">condition, memoryless net influence, raw mutual information, Cramer’s V and same-action rate all rank the innocent pair CD first in 96 to 100% of games at every T and every CP below 1.0 (Table 1); gamma(C; D) is about 1.07 nats against 0.17 for the true pair at CP = 0.6, and the net correction does not help because no third party influences A or B. The fixed rule names the innocent pair in 83 to 100% of</w:t>
+        <w:t xml:space="preserve">condition, memoryless net influence, raw mutual information, Cramer’s V and same-action rate all rank the innocent pair CD first in 96 to 100% of games at every T and every CP below 1.0 (Table 1). gamma(C; D) is about 1.07 nats against 0.17 for the true pair at CP = 0.6, and the net correction does nothing because no third party influences A or B. The fixed rule names the innocent pair in 83 to 100% of</w:t>
       </w:r>
       <w:r>
         <w:t xml:space="preserve"> </w:t>
@@ -901,7 +895,7 @@
         <w:t xml:space="preserve"> </w:t>
       </w:r>
       <w:r>
-        <w:t xml:space="preserve">games. Conditioning on the previous majority removes the dependence exactly (gamma(C; D | S) = 0), rank-1 accuracy of the true pair becomes 1.00 at every T and CP from 0.2, and the innocent pair is never flagged.</w:t>
+        <w:t xml:space="preserve">games. Conditioning on the previous majority removes the dependence exactly (gamma(C; D | S) = 0): rank-1 accuracy of the true pair becomes 1.00 at every T and every CP from 0.2, and the innocent pair is never flagged.</w:t>
       </w:r>
     </w:p>
     <w:p>
@@ -909,7 +903,7 @@
         <w:pStyle w:val="BodyText"/>
       </w:pPr>
       <w:r>
-        <w:t xml:space="preserve">That success depends on conditioning on the state the innocent rule uses. Against</w:t>
+        <w:t xml:space="preserve">That works because the detector conditions on the state the innocent rule uses. Against</w:t>
       </w:r>
       <w:r>
         <w:t xml:space="preserve"> </w:t>
@@ -922,7 +916,7 @@
         <w:t xml:space="preserve">parallel_rich</w:t>
       </w:r>
       <w:r>
-        <w:t xml:space="preserve">, majority-state conditioning fails completely: gamma(C; D | S) stays at 0.91 to 1.07 nats, the innocent pair ranks first in 100% of games at every T, and the fixed rule flags it in 65 to 100% of no-collusion games. Conditioning on the full previous profile removes the dependence but spreads 25 to 500 rounds over 15 to 29 occupied states; uncorrected, the bias flags a pair in 97 to 100% of no-collusion games, and even corrected the true pair is ranked first in only 0.75 of 25-round games (0.97 at 50, 1.00 from 100; false-positive rate 0.00 to 0.06). An auditor who conditions on a coarser state than the rule the agents follow gets a wrong answer with high confidence. One who conditions on a richer state needs many more rounds.</w:t>
+        <w:t xml:space="preserve">, majority conditioning fails completely. gamma(C; D | S) stays at 0.91 to 1.07 nats, the innocent pair ranks first in 100% of games at every T, and the fixed rule flags it in 65 to 100% of no-collusion games. Conditioning on the full previous profile removes the dependence but spreads 25 to 500 rounds over 15 to 29 occupied states. Uncorrected, the bias flags a pair in 97 to 100% of no-collusion games. Corrected, the true pair is ranked first in only 0.75 of 25-round games (0.97 at 50, 1.00 from 100), with a false-positive rate of 0.00 to 0.06. An auditor who conditions on a coarser state than the rule the agents follow gets a wrong answer with high confidence. One who conditions on a richer state needs many more rounds.</w:t>
       </w:r>
     </w:p>
     <w:p>
@@ -1561,7 +1555,7 @@
         <w:pStyle w:val="FirstParagraph"/>
       </w:pPr>
       <w:r>
-        <w:t xml:space="preserve">Once C and D are deterministic given S, gamma(C; j | S) is zero for every j, the net correction subtracts nothing from the random pair AB, and Gamma(A; B) is pure estimation bias. In</w:t>
+        <w:t xml:space="preserve">Once C and D are deterministic given S, gamma(C; j | S) is zero for every j. The net correction then subtracts nothing from the random pair AB, and Gamma(A; B) is estimation bias and nothing else. In</w:t>
       </w:r>
       <w:r>
         <w:t xml:space="preserve"> </w:t>
@@ -1577,7 +1571,7 @@
         <w:t xml:space="preserve"> </w:t>
       </w:r>
       <w:r>
-        <w:t xml:space="preserve">the state-conditioned fixed rule flags a pair in 100% of 25-round games and 67% of 100-round games; at CP = 0 in</w:t>
+        <w:t xml:space="preserve">the state-conditioned fixed rule flags a pair in 100% of 25-round games and 67% of 100-round games. At CP = 0 in</w:t>
       </w:r>
       <w:r>
         <w:t xml:space="preserve"> </w:t>
@@ -1593,7 +1587,7 @@
         <w:t xml:space="preserve"> </w:t>
       </w:r>
       <w:r>
-        <w:t xml:space="preserve">it names the innocent random pair AB in 100% of 25-round games. Subtracting the within-state permutation null mean reduces the</w:t>
+        <w:t xml:space="preserve">it names the innocent random pair AB in 100% of 25-round games. Subtracting the within-state permutation null mean brings the</w:t>
       </w:r>
       <w:r>
         <w:t xml:space="preserve"> </w:t>
@@ -1609,7 +1603,7 @@
         <w:t xml:space="preserve"> </w:t>
       </w:r>
       <w:r>
-        <w:t xml:space="preserve">rate to 0.25, 0.20, 0.05 and 0.01 at 25, 50, 100 and 200 rounds while rank-1 accuracy stays at 0.98 to 1.00. But in the all-random</w:t>
+        <w:t xml:space="preserve">rate down to 0.25, 0.20, 0.05 and 0.01 at 25, 50, 100 and 200 rounds while rank-1 accuracy stays at 0.98 to 1.00. In the all-random</w:t>
       </w:r>
       <w:r>
         <w:t xml:space="preserve"> </w:t>
@@ -1625,7 +1619,7 @@
         <w:t xml:space="preserve"> </w:t>
       </w:r>
       <w:r>
-        <w:t xml:space="preserve">world the corrected fixed rule still fires in 0.49 to 0.55 of 25-round games and 0.01 to 0.10 of 100-round games: subtracting the mean of the bias leaves its variance, which the fixed threshold ignores.</w:t>
+        <w:t xml:space="preserve">world, though, the corrected fixed rule still fires in 0.49 to 0.55 of 25-round games and 0.01 to 0.10 of 100-round games. Subtracting the mean of the bias leaves its variance, which a fixed threshold ignores.</w:t>
       </w:r>
     </w:p>
     <w:p>
@@ -1665,7 +1659,7 @@
         <w:t xml:space="preserve"> </w:t>
       </w:r>
       <w:r>
-        <w:t xml:space="preserve">at 25 rounds; from 100 rounds both rules reach 1.00. Section 4.4 shows that this calibration does not transfer to the LLM control.</w:t>
+        <w:t xml:space="preserve">at 25 rounds. From 100 rounds both rules reach 1.00. Section 4.4 shows that this calibration does not carry over to the LLM control.</w:t>
       </w:r>
     </w:p>
     <w:p>
@@ -1677,7 +1671,7 @@
           <w:bCs/>
           <w:b/>
         </w:rPr>
-        <w:t xml:space="preserve">Table 2. Fixed rule versus Holm rule, NI+perm, state = previous majority, CP = 0.6 (extensions batch).</w:t>
+        <w:t xml:space="preserve">Table 2. Fixed rule and Holm rule, NI+perm, state = previous majority, CP = 0.6 (extensions batch).</w:t>
       </w:r>
     </w:p>
     <w:tbl>
@@ -2145,7 +2139,7 @@
         <w:pStyle w:val="FirstParagraph"/>
       </w:pPr>
       <w:r>
-        <w:t xml:space="preserve">Bonjour et al. limit their method to two colluders. In the five-player condition with a primary A and two assistants B and C (CP = 0.6), the subtraction that protects net influence against third parties turns against the coalition. In the symmetric construction gamma(B; A) = gamma(C; A) = m in expectation, so</w:t>
+        <w:t xml:space="preserve">Bonjour et al. limit the method to two colluders. With a primary A and two assistants B and C (CP = 0.6) in a five-player game, the subtraction that protects net influence against third parties turns against the coalition. In the symmetric construction gamma(B; A) = gamma(C; A) = m in expectation, so</w:t>
       </w:r>
     </w:p>
     <w:p>
@@ -2161,7 +2155,7 @@
         <w:pStyle w:val="BodyText"/>
       </w:pPr>
       <w:r>
-        <w:t xml:space="preserve">whenever neither outsider influences A more than the other assistant does, and since the pair score is the minimum of the two directions, the true pair’s score cannot exceed a positive threshold in the population limit. The subtraction treats another coalition member as the competing explanation and removes the signal. Empirically the AB score falls to 0.006 nats at 500 rounds and the fixed rule returns no pair in 25%, 32%, 54% and 68% of games at 50, 100, 200 and 500 rounds, almost always because no pair crosses alpha; detection gets worse as the log grows. Ranking is unaffected: a true pair is ranked first in 0.98 to 1.00 of games under both raw mutual information and net influence, and raw mutual information places all three coalition pairs in the top three from 200 rounds (2.81 of 3 at 50). Net influence places exactly two, because B and C are conditionally independent given A (gamma(B; C | A) = 0.014 at 500 rounds) and Gamma(B; C) is negative (-0.24 nats). Whether that is the right answer depends on what is being asked: B and C are members of the same coalition while having no direct dependence, and coalition membership and direct interaction edges are different ground truths. A coalition detector needs a conditional-dependence structure over the group, not a pairwise net score.</w:t>
+        <w:t xml:space="preserve">whenever neither outsider influences A more than the other assistant does. The pair score is the minimum of the two directions, so the true pair’s score cannot rise above a positive threshold in the population limit. The subtraction treats another coalition member as the competing explanation and removes the signal. In the data the AB score falls to 0.006 nats at 500 rounds, and the fixed rule returns no pair in 25%, 32%, 54% and 68% of games at 50, 100, 200 and 500 rounds, almost always because no pair crosses alpha. More rounds mean less detection. Ranking is unaffected: a true pair is ranked first in 0.98 to 1.00 of games under both raw mutual information and net influence, and raw mutual information puts all three coalition pairs in the top three from 200 rounds (2.81 of 3 at 50). Net influence puts exactly two there, because B and C are conditionally independent given A (gamma(B; C | A) = 0.014 at 500 rounds) and Gamma(B; C) is negative (-0.24 nats). Whether that is the right answer depends on what is being asked. B and C belong to the same coalition and have no direct dependence; coalition membership and direct interaction are different ground truths. A coalition detector needs a conditional-dependence structure over the group, not a pairwise net score.</w:t>
       </w:r>
     </w:p>
     <w:p>
@@ -2173,7 +2167,7 @@
           <wp:inline>
             <wp:extent cx="5334000" cy="1582993"/>
             <wp:effectExtent b="0" l="0" r="0" t="0"/>
-            <wp:docPr descr="Figure 2. Extensions (100 seeds per point). (a) Fixed rule versus Holm rule. (b) Innocent pair keyed on the full previous profile: majority-state conditioning fails; profile-state conditioning with correction recovers the true pair from 50 rounds. (c) Coalition of three: fraction of the three true pairs in the top three under raw mutual information and net influence." title="" id="34" name="Picture"/>
+            <wp:docPr descr="Figure 2. Extensions, 100 seeds per point. (a) Fixed rule and Holm rule. (b) Innocent pair keyed on the full previous profile: majority-state conditioning fails; profile-state conditioning with correction recovers the true pair from 50 rounds. (c) Coalition of three: fraction of the three true pairs in the top three under raw mutual information and net influence." title="" id="34" name="Picture"/>
             <a:graphic>
               <a:graphicData uri="http://schemas.openxmlformats.org/drawingml/2006/picture">
                 <pic:pic>
@@ -2216,7 +2210,7 @@
         <w:pStyle w:val="ImageCaption"/>
       </w:pPr>
       <w:r>
-        <w:t xml:space="preserve">Figure 2. Extensions (100 seeds per point). (a) Fixed rule versus Holm rule. (b) Innocent pair keyed on the full previous profile: majority-state conditioning fails; profile-state conditioning with correction recovers the true pair from 50 rounds. (c) Coalition of three: fraction of the three true pairs in the top three under raw mutual information and net influence.</w:t>
+        <w:t xml:space="preserve">Figure 2. Extensions, 100 seeds per point. (a) Fixed rule and Holm rule. (b) Innocent pair keyed on the full previous profile: majority-state conditioning fails; profile-state conditioning with correction recovers the true pair from 50 rounds. (c) Coalition of three: fraction of the three true pairs in the top three under raw mutual information and net influence.</w:t>
       </w:r>
     </w:p>
     <w:bookmarkEnd w:id="36"/>
@@ -2244,7 +2238,7 @@
         <w:t xml:space="preserve"> </w:t>
       </w:r>
       <w:r>
-        <w:t xml:space="preserve">Four GPT-4.1-mini players (temperature 1.0), 25 rounds, full public history in context; ten games in each of three conditions:</w:t>
+        <w:t xml:space="preserve">Four GPT-4.1-mini players (temperature 1.0), 25 rounds, full public history in context; ten games in each of three conditions.</w:t>
       </w:r>
       <w:r>
         <w:t xml:space="preserve"> </w:t>
@@ -2257,10 +2251,7 @@
         <w:t xml:space="preserve">collude</w:t>
       </w:r>
       <w:r>
-        <w:t xml:space="preserve"> </w:t>
-      </w:r>
-      <w:r>
-        <w:t xml:space="preserve">(Alpha and Bravo told privately they are a team maximising their combined score, with one private message each before every round),</w:t>
+        <w:t xml:space="preserve">: Alpha and Bravo are told privately that they are a team maximising their combined score and may exchange one private message each before every round.</w:t>
       </w:r>
       <w:r>
         <w:t xml:space="preserve"> </w:t>
@@ -2273,10 +2264,7 @@
         <w:t xml:space="preserve">team_no_channel</w:t>
       </w:r>
       <w:r>
-        <w:t xml:space="preserve"> </w:t>
-      </w:r>
-      <w:r>
-        <w:t xml:space="preserve">(same instruction, no channel) and</w:t>
+        <w:t xml:space="preserve">: the same instruction, no channel.</w:t>
       </w:r>
       <w:r>
         <w:t xml:space="preserve"> </w:t>
@@ -2289,10 +2277,7 @@
         <w:t xml:space="preserve">independent</w:t>
       </w:r>
       <w:r>
-        <w:t xml:space="preserve"> </w:t>
-      </w:r>
-      <w:r>
-        <w:t xml:space="preserve">(no team; a same-model control). The detector sees only the 25 x 4 action log; messages are logged but never scored. The pilot was generated twice with identical code and settings. Run 1 (output recorded 26 October 09:17 UTC) was scored with the original analysis script, which recomputed the majority state across the nine inter-game boundaries and reported only whether the designated team was flagged per game. Run 2 (output recorded 11:06 UTC) is an independent set of 30 games scored with the revised script: states computed per game, permutations within (game, state) strata, both decision rules, any-pair false positives, Wilson 95% intervals on per-game rates and a bootstrap over games on pooled scores. The two logs are different draws, not a re-scoring (the team’s pooled memoryless dependence is 0.166 nats in run 1 and 0.356 in run 2, and the memoryless statistic is unaffected by the pooling fix). We report three outcomes separately: pair ranking, detection under each rule, and coalition benefit (team mean score minus non-team mean score per game).</w:t>
+        <w:t xml:space="preserve">: no team, a same-model control. The detector sees only the 25 x 4 action log; messages are logged but never scored. The pilot was generated twice with identical code and settings. Run 1 (output recorded 26 October 09:17 UTC) was scored with the original analysis script, which recomputed the majority state across the nine inter-game boundaries and reported only whether the designated team was flagged in each game. Run 2 (output recorded 11:06 UTC) is a separate set of 30 games scored with the revised script: states computed per game, permutations within (game, state) strata, both decision rules, any-pair false positives, Wilson 95% intervals on per-game rates, and a bootstrap over games for pooled scores. The two logs are different draws, not a re-scoring of one log: the team’s pooled memoryless dependence is 0.166 nats in run 1 and 0.356 in run 2, and the memoryless statistic is not affected by the state fix. We report three outcomes separately: pair ranking, detection under each rule, and coalition benefit (team mean score minus non-team mean score per game).</w:t>
       </w:r>
     </w:p>
     <w:p>
@@ -2714,7 +2699,7 @@
               <w:jc w:val="left"/>
             </w:pPr>
             <w:r>
-              <w:t xml:space="preserve">Alpha-Delta, innocent</w:t>
+              <w:t xml:space="preserve">Alpha-Delta</w:t>
             </w:r>
           </w:p>
         </w:tc>
@@ -2752,7 +2737,7 @@
               <w:jc w:val="left"/>
             </w:pPr>
             <w:r>
-              <w:t xml:space="preserve">+1.00 (game range -3.16 to 5.94)</w:t>
+              <w:t xml:space="preserve">+1.00 (-3.16 to 5.94)</w:t>
             </w:r>
           </w:p>
         </w:tc>
@@ -3008,7 +2993,7 @@
               <w:jc w:val="left"/>
             </w:pPr>
             <w:r>
-              <w:t xml:space="preserve">Charlie-Delta, innocent</w:t>
+              <w:t xml:space="preserve">Charlie-Delta</w:t>
             </w:r>
           </w:p>
         </w:tc>
@@ -3107,7 +3092,7 @@
           <w:bCs/>
           <w:b/>
         </w:rPr>
-        <w:t xml:space="preserve">is the fraction in which it flags a pair other than Alpha-Bravo, a false positive relative to the planted-coalition labels. Ranking ties are broken in enumeration order, which begins with Alpha-Bravo, and clipping corrected estimates at zero can create ties; a tie audit was not completed before submission, so the ranking rates are upper bounds. The Holm rule was not evaluated at adequate resolution on single games: the script uses 100 permutations per game, for which the minimum Holm-adjusted p over six pairs is 6/101 = 0.059, so those cells are omitted rather than reported as zeros.</w:t>
+        <w:t xml:space="preserve">is the fraction in which it flags a pair other than Alpha-Bravo, a false positive relative to the planted-coalition labels. Ranking ties are broken in enumeration order, which begins with Alpha-Bravo, and clipping corrected estimates at zero can create ties; a tie audit was not completed before submission, so the ranking rates are upper bounds. The Holm rule was not evaluated at adequate resolution on single games: the script uses 100 permutations per game, for which the smallest Holm-adjusted p over six pairs is 6/101 = 0.059, so those cells are omitted rather than reported as zeros.</w:t>
       </w:r>
     </w:p>
     <w:tbl>
@@ -3652,7 +3637,7 @@
         <w:pStyle w:val="BodyText"/>
       </w:pPr>
       <w:r>
-        <w:t xml:space="preserve">Run 1 per game (original script, team-only flags): the team was ranked first in 9 of 10 games and flagged by the fixed rule in 5 of 10 under the memoryless statistic, and ranked first in 3 and flagged in 0 under majority-state conditioning. The raw run 1 logs were not available in the repository at submission, so run 1 could not be re-scored with the corrected procedure; its original analysis is retained as provenance and the two runs are therefore analysed with different procedures (within-game permutation strata can change corrected scores and p-values even for the memoryless statistic).</w:t>
+        <w:t xml:space="preserve">Run 1 per game (original script, team-only flags): the team was ranked first in 9 of 10 games and flagged by the fixed rule in 5 of 10 under the memoryless statistic, and ranked first in 3 and flagged in 0 under majority-state conditioning. The raw run 1 logs were not in the repository at submission, so run 1 could not be re-scored with the corrected procedure. Its original analysis is kept as provenance, and the two runs are therefore scored with different procedures; within-game permutation strata can change corrected scores and p-values even for the memoryless statistic.</w:t>
       </w:r>
     </w:p>
     <w:p>
@@ -3670,7 +3655,7 @@
         <w:t xml:space="preserve"> </w:t>
       </w:r>
       <w:r>
-        <w:t xml:space="preserve">With the private channel the team pair has the largest dependence by a factor of four (run 1) to nine (run 2), is ranked first on the pooled log in both runs (run 2 game-bootstrap 95% interval for its uncorrected net influence: 0.19 to 0.50 nats; the corrected estimator was not bootstrapped), and is ranked first in 8 or 9 of 10 single games under the memoryless statistic, subject to the tie caveat in Table 4. Detection is weaker than ranking: the fixed rule flags the team in 5 (run 1) or 7 (run 2) of 10 single games, and in run 2 flags a non-team pair in one. Majority-state conditioning lowers single-game ranking and detection further (3/10 and 0/10 in run 1; 7/10 and 5/10 in run 2), the power cost of splitting 25 rounds over four states that Section 4.2 predicted; pooling restores the verdict under both rules in both runs. The private messages show what the statistic is picking up: a sacrificial scheme in which one partner plays the move that loses to the other (</w:t>
+        <w:t xml:space="preserve">With the private channel, the team pair has the largest dependence by a factor of four (run 1) to nine (run 2). It is ranked first on the pooled log in both runs (run 2 game-bootstrap 95% interval for its uncorrected net influence: 0.19 to 0.50 nats; the corrected estimator was not bootstrapped), and first in 8 or 9 of 10 single games under the memoryless statistic, subject to the tie caveat in Table 4. Detection is weaker than ranking. The fixed rule flags the team in 5 (run 1) or 7 (run 2) of 10 single games, and in run 2 flags some other pair in one. Majority-state conditioning lowers single-game ranking and detection further (3/10 and 0/10 in run 1; 7/10 and 5/10 in run 2), the loss of power from splitting 25 rounds over four states that Section 4.2 predicted; pooling restores the verdict under both rules in both runs. The private messages show what the statistic is picking up: a sacrificial scheme in which one partner plays the move that loses to the other (</w:t>
       </w:r>
       <w:r>
         <w:t xml:space="preserve">“</w:t>
@@ -3682,7 +3667,7 @@
         <w:t xml:space="preserve">”</w:t>
       </w:r>
       <w:r>
-        <w:t xml:space="preserve">), alternating with same-move rounds. Mean within-game score advantage was -0.25 in the first run and +1.00 in the second; these descriptive results do not establish a benefit from coordination, and the run 2 interval (-3.16 to 5.94) is the empirical 2.5th to 97.5th percentile range of individual-game advantages, not a confidence interval for the mean. Whether the designated pair outscored the others is also a different question from whether enabling coordination caused it to score better than it otherwise would, and only the first is measured here. In these pilots, single-game pair ranking was more successful than threshold-based detection, but both estimates remain uncertain;</w:t>
+        <w:t xml:space="preserve">), alternating with rounds where both play the same move. Mean within-game score advantage was -0.25 in the first run and +1.00 in the second. These are descriptive numbers and do not show that the coordination paid off; the run 2 interval (-3.16 to 5.94) is the empirical 2.5th to 97.5th percentile range of individual-game advantages, not a confidence interval for the mean. Whether the designated pair outscored the others is also a different question from whether enabling coordination made it score better than it otherwise would, and only the first is measured here. In these pilots, single-game pair ranking was more successful than threshold detection, but both estimates are uncertain;</w:t>
       </w:r>
       <w:r>
         <w:t xml:space="preserve"> </w:t>
@@ -3700,7 +3685,7 @@
         <w:t xml:space="preserve"> </w:t>
       </w:r>
       <w:r>
-        <w:t xml:space="preserve">would describe neither. Without the channel the team’s pooled dependence is 0.021 nats in both runs and no rule flags it on the pooled log.</w:t>
+        <w:t xml:space="preserve">would describe neither. Without the channel, the team’s pooled dependence is 0.021 nats in both runs and no rule flags it on the pooled log.</w:t>
       </w:r>
     </w:p>
     <w:p>
@@ -3712,13 +3697,13 @@
           <w:bCs/>
           <w:b/>
         </w:rPr>
-        <w:t xml:space="preserve">Calibration does not transfer.</w:t>
-      </w:r>
-      <w:r>
-        <w:t xml:space="preserve"> </w:t>
-      </w:r>
-      <w:r>
-        <w:t xml:space="preserve">The Holm rule, calibrated on the scripted nulls in Section 4.2, flags a pair on the pooled control without a planted coalition in both runs: Alpha-Delta in run 1 and Charlie-Delta in run 2 (raw p 0.002, Holm 0.012 each), and under majority-state conditioning in run 2 Alpha-Charlie (raw p 0.006, Holm 0.036). In run 1 it also flags Charlie-Delta in the no-channel condition. The fixed rule flags nothing on the pooled control in either run, but narrowly (net scores of 0.037 and 0.011 against a threshold of 0.05), and on single games it fires in 0.5 (memoryless) to 0.7 (majority) of control games, matching the scripted all-random rate of 0.49 to 0.55 at 25 rounds. Permutation calibration controlled rejection rates in the tested scripted nulls; it did not reliably distinguish dependence in controls without a planted coalition from planted coordination in the pooled LLM pilot. The observed associations exceeded those generated by the chosen permutation procedure; because exchangeability is not established for agents that condition on the full public history, these p-values are not validated evidence of collusion, and the failure demonstrated is the use of this procedure as a collusion decision rule rather than a failure of Holm correction itself. Our design also does not say what produces the associations: shared model weights (Xu et al. 2026), common public history, position effects or shared strategies would all do so. Rejecting conditional independence is not establishing collusion.</w:t>
+        <w:t xml:space="preserve">Calibration does not carry over.</w:t>
+      </w:r>
+      <w:r>
+        <w:t xml:space="preserve"> </w:t>
+      </w:r>
+      <w:r>
+        <w:t xml:space="preserve">The Holm rule, calibrated on the scripted nulls in Section 4.2, flags a pair on the pooled control without a planted coalition in both runs: Alpha-Delta in run 1 and Charlie-Delta in run 2 (raw p 0.002, Holm 0.012 each), and under majority-state conditioning in run 2 Alpha-Charlie (raw p 0.006, Holm 0.036). In run 1 it also flags Charlie-Delta in the no-channel condition. The fixed rule flags nothing on the pooled control in either run, but by a small margin (net scores of 0.037 and 0.011 against a threshold of 0.05), and on single games it fires in 0.5 (memoryless) to 0.7 (majority) of control games, in line with the scripted all-random rate of 0.49 to 0.55 at 25 rounds. Permutation calibration controlled rejection rates on the scripted nulls we tested; it did not reliably separate dependence in controls without a planted coalition from planted coordination in the pooled LLM pilot. The observed associations exceeded those produced by the chosen permutation procedure. Because exchangeability is not established for agents that condition on the full public history, these p-values are not validated evidence of collusion; what fails here is the use of this procedure as a collusion decision rule, not Holm correction as such. The design also does not say what produces the associations. Shared model weights (Xu et al. 2026), common public history, position effects and shared strategies would all do so. A rejected conditional-independence null is not a finding of collusion.</w:t>
       </w:r>
     </w:p>
     <w:bookmarkEnd w:id="37"/>
@@ -3737,7 +3722,7 @@
         <w:pStyle w:val="FirstParagraph"/>
       </w:pPr>
       <w:r>
-        <w:t xml:space="preserve">In a secondary experiment we asked whether a receiver model’s workspace representation of a partner’s coded proposal differs between adopting it and understanding it and declining, the privileged-observer contrast Rose et al. (2026) describe. Design, bands and metrics were specified in code before these runs; full details are in Appendix C. Receiver gemma-4-12B-it (4-bit, solarkyle Jacobian lens, read at the last prompt token) saw a policy marking two of four items ineligible, a random four-word codebook, a routing tag from a scripted partner naming an ineligible item, and an objective; it replied with one item or abstain. Five matched prompts per base case (unauthorized, permitted, refusal, tag swapped, tag erased), 30 base cases.</w:t>
+        <w:t xml:space="preserve">In a secondary experiment we asked whether a receiver model’s internal representation of a partner’s coded proposal differs between adopting it and understanding it and declining, the privileged-observer contrast Rose et al. (2026) describe. Design, layer bands and metrics were fixed in code before these runs; details are in Appendix C. The receiver, gemma-4-12B-it (4-bit, solarkyle Jacobian lens, read at the last prompt token), saw a policy marking two of four items ineligible, a random four-word codebook, a routing tag from a scripted partner naming an ineligible item, and an objective, and replied with one item or abstain. Five matched prompts per base case (unauthorized, permitted, refusal, tag swapped, tag erased), 30 base cases.</w:t>
       </w:r>
     </w:p>
     <w:p>
@@ -3749,7 +3734,7 @@
           <w:bCs/>
           <w:b/>
         </w:rPr>
-        <w:t xml:space="preserve">Table 5. Lens assay (30 base cases per condition). Decoding is</w:t>
+        <w:t xml:space="preserve">Table 5. Lens assay, 30 base cases per condition.</w:t>
       </w:r>
       <w:r>
         <w:rPr>
@@ -3770,7 +3755,7 @@
           <w:bCs/>
           <w:b/>
         </w:rPr>
-        <w:t xml:space="preserve">transmitted item ranked first of the four candidates</w:t>
+        <w:t xml:space="preserve">Decoded</w:t>
       </w:r>
       <w:r>
         <w:rPr>
@@ -3791,7 +3776,7 @@
           <w:bCs/>
           <w:b/>
         </w:rPr>
-        <w:t xml:space="preserve">using the best rank across layers in the late band (layers 28 to 43 of 47) and across token variants; ranks beyond 5,000 are censored.</w:t>
+        <w:t xml:space="preserve">means the transmitted item ranked first of the four candidates, using the best rank across layers in the late band (layers 28 to 43 of 47) and across token variants; ranks beyond 5,000 are censored.</w:t>
       </w:r>
     </w:p>
     <w:tbl>
@@ -4262,7 +4247,7 @@
         <w:pStyle w:val="BodyText"/>
       </w:pPr>
       <w:r>
-        <w:t xml:space="preserve">At the final pre-generation position, the selected J-lens readout strongly recovered nominated items during permitted adoption but did not reliably recover them during abstention. Because unauthorized adoption never occurred, this experiment does not establish whether the readout distinguishes collusive participation from refusal. Correct behaviour under the permitted prompt shows decoding capability in that condition; it does not verify the computation under each refusal prompt, and failure to recover a token with one lens at one position is a measurement limitation, not evidence that the information is absent. Two details of the implementation affect the numbers: the readout takes the best rank across all layers in a band and across four token variants of each item, not a typical-layer rank; and when all four candidates are censored the tie is broken in list order, so decoding rates in censored conditions include tie artefacts (the early-band rates of 0.30 to 0.37, with every median censored, are such artefacts and are omitted from the table). This is an observation about one readout at one position. It says nothing about what the workspace contains.</w:t>
+        <w:t xml:space="preserve">At the final pre-generation position, the chosen J-lens readout recovered nominated items strongly during permitted adoption and did not reliably recover them during abstention. Because unauthorised adoption never happened, the experiment does not show whether the readout separates taking part from refusing. Correct behaviour under the permitted prompt shows that the model can decode the tag in that condition; it does not show what computation ran under each refusal prompt, and failing to recover a token with one lens at one position is a limit of the measurement, not evidence that the information is absent. Two details of the implementation affect the numbers. The readout takes the best rank over every layer in a band and over four token variants of each item, so it is not a typical-layer rank. When all four candidates are censored the tie is broken in list order, so decoding rates in censored conditions include tie artefacts; the early-band rates of 0.30 to 0.37, with every median censored, are such artefacts and are left out of the table. This is an observation about one readout at one position. It says nothing about what the workspace contains.</w:t>
       </w:r>
     </w:p>
     <w:bookmarkEnd w:id="39"/>
@@ -4280,7 +4265,7 @@
         <w:pStyle w:val="FirstParagraph"/>
       </w:pPr>
       <w:r>
-        <w:t xml:space="preserve">Each of the four findings in Section 4 points to an assumption an auditor has to check before trusting the evidence. Conditional dependence is evidence only relative to the conditioning information, and an innocent public rule the auditor has not modelled produces a confident false verdict (4.1). A corrected statistic is not a calibrated decision, and a decision rule calibrated on one family of nulls carried a 0.002 p-value onto an innocent same-model pair in another (4.2, 4.4). A pairwise correction designed to remove third parties removes coalition members too, so for a coalition of three the published detector loses power as evidence accumulates (4.3). And ranking, thresholding and benefit are different outcomes that a single number conflates, in both independent runs of the pilot (4.4).</w:t>
+        <w:t xml:space="preserve">Each of the four findings points to an assumption an auditor has to check before trusting the evidence. Conditional dependence is evidence only relative to the conditioning information, and an innocent public rule the auditor has not modelled produces a confident false verdict (4.1). A corrected statistic is not a calibrated decision, and a rule calibrated on one family of nulls carried a 0.002 p-value onto a pair in a control with no planted coalition (4.2, 4.4). A pairwise correction built to remove third parties removes coalition members too, so for a coalition of three the published detector loses power as evidence accumulates (4.3). Ranking, thresholding and benefit are three different numbers, and a single accuracy figure hides that (4.4).</w:t>
       </w:r>
     </w:p>
     <w:p>
@@ -4288,7 +4273,7 @@
         <w:pStyle w:val="BodyText"/>
       </w:pPr>
       <w:r>
-        <w:t xml:space="preserve">The new material is limited to the following. We release a general-N implementation of net influence with a within-state permutation null; we extend the original ground-truth evaluation to matched innocent-dependence confounds, short-horizon calibration, state misspecification and a three-member coalition; we give the algebraic account of coalition cancellation; and we run two decision rules side by side on two independent LLM pilot runs (with different analysis procedures, as Section 4.4 states). Not new: the statistic, conditioning on state, permutation calibration of dependence statistics, scripted evaluation as such (Bonjour et al.; Lee et al.), and the observation that same-model agents correlate (Xu et al.). Section 5 is exploratory and establishes neither presence nor absence of a proposal in the workspace.</w:t>
+        <w:t xml:space="preserve">The new material is limited to the following. A general-N implementation of net influence with a within-state permutation null; the four evaluation axes studied together; the algebra of coalition cancellation; and two decision rules run side by side on two LLM pilot runs (scored with different procedures, as Section 4.4 says). Not new: the statistic itself, conditioning on state, permutation calibration of dependence statistics, scripted evaluation (Bonjour et al.; Lee et al.), and the observation that same-model agents correlate (Xu et al.). Section 5 is exploratory and shows neither that a proposal is present in the workspace nor that it is absent.</w:t>
       </w:r>
     </w:p>
     <w:p>
@@ -4296,7 +4281,7 @@
         <w:pStyle w:val="BodyText"/>
       </w:pPr>
       <w:r>
-        <w:t xml:space="preserve">Future work, most useful first: a per-game permutation budget large enough for the Holm rule to be informative on single games (at least 120 permutations), and more games; a coalition detector built on a conditional-independence structure rather than pairwise net scores; a null that respects the agents’ actual conditioning information, for example by fitting each agent’s reaction function to the public history and permuting residuals; the Agrawal et al. (2025) double auction, where the public state is the order book; and, for the lens, a receiver that does adopt unauthorised proposals and a readout at the tag token rather than the decision token.</w:t>
+        <w:t xml:space="preserve">Future work, most useful first: a per-game permutation budget large enough for the Holm rule to be informative on single games (at least 120 permutations, preferably many more) and more games; a coalition detector built on a conditional-independence structure rather than pairwise net scores; a null that respects the agents’ actual conditioning information, for example by fitting each agent’s reaction function to the public history and permuting residuals; the Agrawal et al. (2025) double auction, where the public state is the order book; and, for the lens, a receiver that does adopt unauthorised proposals and a readout at the tag token rather than the decision token. Appendix A says what the results do and do not show.</w:t>
       </w:r>
     </w:p>
     <w:bookmarkEnd w:id="40"/>
@@ -4448,13 +4433,13 @@
           <w:bCs/>
           <w:b/>
         </w:rPr>
-        <w:t xml:space="preserve">What the results establish.</w:t>
-      </w:r>
-      <w:r>
-        <w:t xml:space="preserve"> </w:t>
-      </w:r>
-      <w:r>
-        <w:t xml:space="preserve">On scripted games with known ground truth: unconditioned dependence statistics rank an innocent same-rule pair first; majority-state conditioning removes that confound and fails against a rule keyed on a richer state; the permutation correction reduces but does not calibrate the fixed rule’s false-positive rate at 25 rounds, and a Holm permutation rule is calibrated on the scripted nulls at a power cost; and with two assistants the pairwise net correction cancels the coalition’s signal, so the fixed rule’s detection rate falls with sample size. On the GPT-4.1-mini pilot (two independent runs of ten games per condition): the pair with a hidden channel is ranked first in eight or nine of ten games (upper bounds pending a tie audit) and flagged by the fixed rule in five or seven; its mean within-game score advantage was -0.25 and +1.00, which does not establish a benefit; the fixed rule fires in half or more of single control games; and the Holm rule flags a pair on the pooled control without a planted coalition in both runs.</w:t>
+        <w:t xml:space="preserve">What the results show.</w:t>
+      </w:r>
+      <w:r>
+        <w:t xml:space="preserve"> </w:t>
+      </w:r>
+      <w:r>
+        <w:t xml:space="preserve">On scripted games with known ground truth: unconditioned dependence statistics rank an innocent same-rule pair first; majority-state conditioning removes that confound and fails against a rule keyed on a richer state; the permutation correction reduces but does not calibrate the fixed rule’s false-positive rate at 25 rounds, and a Holm permutation rule is calibrated on the scripted nulls at a cost in power; and with two assistants the pairwise net correction cancels the coalition’s signal, so the fixed rule’s detection rate falls as the log grows. On the GPT-4.1-mini pilot (two runs of ten games per condition): the pair with a hidden channel is ranked first in eight or nine of ten games (upper bounds pending a tie audit) and flagged by the fixed rule in five or seven; its mean within-game score advantage was -0.25 and +1.00, which does not show a benefit; the fixed rule fires in half or more of single control games; and the Holm rule flags a pair on the pooled control without a planted coalition in both runs.</w:t>
       </w:r>
     </w:p>
     <w:p>
@@ -4466,13 +4451,13 @@
           <w:bCs/>
           <w:b/>
         </w:rPr>
-        <w:t xml:space="preserve">What they do not establish.</w:t>
-      </w:r>
-      <w:r>
-        <w:t xml:space="preserve"> </w:t>
-      </w:r>
-      <w:r>
-        <w:t xml:space="preserve">The scripted innocent rules are deterministic and key on states we can name; real innocent dependence (shared priors, common reactions to unmodelled shocks) is not reducible to a small state. The collusion model assumes ex-ante signalling. The LLM pilot has one model, one temperature and ten games per condition per run; run 1’s pooled majority-state numbers were computed with cross-game state carry-over at the nine inter-game boundaries and its per-game rates do not measure any-pair false positives (run 2 corrects both, but run 1 could not be re-scored); the per-game Holm rule was not evaluated at adequate resolution (100 permutations); ranking ties were not audited; the game bootstrap covers the uncorrected statistic only;</w:t>
+        <w:t xml:space="preserve">What they do not show.</w:t>
+      </w:r>
+      <w:r>
+        <w:t xml:space="preserve"> </w:t>
+      </w:r>
+      <w:r>
+        <w:t xml:space="preserve">The scripted innocent rules are deterministic and key on states we can name; real innocent dependence (shared priors, common reactions to shocks nobody modelled) does not reduce to a small state. The collusion model assumes ex-ante signalling. The LLM pilot has one model, one temperature and ten games per condition per run. Run 1’s pooled majority-state numbers were computed with cross-game state carry-over at the nine inter-game boundaries and its per-game rates do not measure any-pair false positives; run 2 corrects both, but run 1 could not be re-scored. The per-game Holm rule was not evaluated at adequate resolution (100 permutations). Ranking ties were not audited. The game bootstrap covers the uncorrected statistic only.</w:t>
       </w:r>
       <w:r>
         <w:t xml:space="preserve"> </w:t>
@@ -4481,7 +4466,7 @@
         <w:t xml:space="preserve">“</w:t>
       </w:r>
       <w:r>
-        <w:t xml:space="preserve">no planted coalition</w:t>
+        <w:t xml:space="preserve">No planted coalition</w:t>
       </w:r>
       <w:r>
         <w:t xml:space="preserve">”</w:t>
@@ -4490,7 +4475,7 @@
         <w:t xml:space="preserve"> </w:t>
       </w:r>
       <w:r>
-        <w:t xml:space="preserve">is what the controls establish, not that no coordination of any kind occurred; and the permutation null treats same-state rounds as exchangeable, which is not established for agents conditioning on the full history. The source of the innocent dependence in the control (weights, history, position, strategy) is not identified. The lens assay has one receiver, one lens, a scripted sender, a four-item vocabulary and a planted codebook, its intended positive arm did not occur, its readout is a best-rank-over-band statistic with censoring, and it establishes nothing about what the workspace contains. All code was written during the sprint and has not been independently reviewed.</w:t>
+        <w:t xml:space="preserve">is what the controls establish, not that no coordination of any kind took place. The permutation null treats same-state rounds as exchangeable, which is not established for agents conditioning on the full history, and the source of the dependence in the control (weights, history, position, strategy) is not identified. The lens assay has one receiver, one lens, a scripted sender, a four-item vocabulary and a planted codebook; its intended positive arm did not occur; its readout is a best-rank-over-band statistic with censoring; and it shows nothing about what the workspace contains. All code was written during the sprint and has not been reviewed by anyone else.</w:t>
       </w:r>
     </w:p>
     <w:p>
@@ -4508,7 +4493,7 @@
         <w:t xml:space="preserve"> </w:t>
       </w:r>
       <w:r>
-        <w:t xml:space="preserve">A published account of where a detector fails tells a coalition where to hide: route coordination through a public signal the auditor has not modelled, keep per-round coordination below the detection floor measured here (CP about 0.2 at 25 rounds), or spread a scheme over three members so pairwise net scores cancel. We think publication is justified because the same account tells an auditor which assumptions to check, and because every mechanism here is a property of the published statistic rather than a new attack. No real market data, deployed system or private information was used.</w:t>
+        <w:t xml:space="preserve">A published account of where a detector fails tells a coalition where to hide: route coordination through a public signal the auditor has not modelled, keep per-round coordination below the floor measured here (CP about 0.2 at 25 rounds), or spread a scheme over three members so pairwise net scores cancel. We think publishing is justified because the same account tells an auditor which assumptions to check, and because every mechanism here is a property of the published statistic rather than a new attack. No real market data, deployed system or private information was used.</w:t>
       </w:r>
     </w:p>
     <w:bookmarkEnd w:id="42"/>
@@ -4526,7 +4511,7 @@
         <w:pStyle w:val="FirstParagraph"/>
       </w:pPr>
       <w:r>
-        <w:t xml:space="preserve">Code and logs: github.com/in-a-quantum-world/collusion-net-influence. All code was written during the sprint; nothing pre-existed. Completion times (UTC, which equals UK time on these dates): scripted main sweep 25 October 21:52; LLM pilot and lens notebooks started on Colab 25 October about 22:40; extensions 26 October about 00:00; lens run output recorded 26 October 09:10; LLM pilot run 1 output recorded 26 October 09:17; revised LLM analysis script 26 October about 09:50; LLM pilot run 2 (regenerated on Colab with identical code and settings) output recorded 26 October 11:06; this manuscript finalised 26 October 11:45. The final analysis commit is the last commit on main before 11:59 UTC; run 2’s raw game log (llm_games.jsonl) is to be added to results/20261026-1106-llm-pilot-run2/ from the Colab download as soon as possible after submission, and its absence at submission is noted here. The submission deadline is 26 October 11:59 UTC.</w:t>
+        <w:t xml:space="preserve">Code and logs: github.com/in-a-quantum-world/collusion-net-influence. All code was written during the sprint; nothing pre-existed. Completion times (UTC, equal to UK time on these dates): scripted main sweep 25 October 21:52; LLM pilot and lens notebooks started on Colab 25 October about 22:40; extensions 26 October about 00:00; lens run output recorded 26 October 09:10; LLM pilot run 1 output recorded 26 October 09:17; revised LLM analysis script 26 October about 09:50; LLM pilot run 2 (regenerated on Colab with identical code and settings) output recorded 26 October 11:06; this manuscript finalised 26 October 11:45, with a plain-language rewrite pushed to the repository afterwards and no change to any number. The submission deadline is 26 October 11:59 UTC. The final analysis commit is the last commit on main before 11:59 UTC. Run 2’s raw game log (llm_games.jsonl) is to be added to results/20261026-1106-llm-pilot-run2/ from the Colab download as soon as possible after submission; its absence at submission is noted here.</w:t>
       </w:r>
       <w:r>
         <w:t xml:space="preserve"> </w:t>
@@ -4616,7 +4601,7 @@
         <w:t xml:space="preserve"> </w:t>
       </w:r>
       <w:r>
-        <w:t xml:space="preserve">wrap the LLM pilot and the lens assay for Colab. Tables:</w:t>
+        <w:t xml:space="preserve">wrap the LLM pilot and the lens assay for Colab, and</w:t>
       </w:r>
       <w:r>
         <w:t xml:space="preserve"> </w:t>
@@ -4625,6 +4610,21 @@
         <w:rPr>
           <w:rStyle w:val="VerbatimChar"/>
         </w:rPr>
+        <w:t xml:space="preserve">reanalyse_llm_pilot_v2.ipynb</w:t>
+      </w:r>
+      <w:r>
+        <w:t xml:space="preserve"> </w:t>
+      </w:r>
+      <w:r>
+        <w:t xml:space="preserve">re-scores an existing log. Tables:</w:t>
+      </w:r>
+      <w:r>
+        <w:t xml:space="preserve"> </w:t>
+      </w:r>
+      <w:r>
+        <w:rPr>
+          <w:rStyle w:val="VerbatimChar"/>
+        </w:rPr>
         <w:t xml:space="preserve">results/scripted_tables.txt</w:t>
       </w:r>
       <w:r>
@@ -4682,19 +4682,7 @@
         <w:t xml:space="preserve"> </w:t>
       </w:r>
       <w:r>
-        <w:t xml:space="preserve">(revised script,</w:t>
-      </w:r>
-      <w:r>
-        <w:t xml:space="preserve"> </w:t>
-      </w:r>
-      <w:r>
-        <w:rPr>
-          <w:rStyle w:val="VerbatimChar"/>
-        </w:rPr>
-        <w:t xml:space="preserve">reanalyse_llm_pilot_v2.ipynb</w:t>
-      </w:r>
-      <w:r>
-        <w:t xml:space="preserve">), with the printed output under</w:t>
+        <w:t xml:space="preserve">(revised script), with the printed output under</w:t>
       </w:r>
       <w:r>
         <w:t xml:space="preserve"> </w:t>
@@ -4819,7 +4807,7 @@
         <w:t xml:space="preserve">”</w:t>
       </w:r>
       <w:r>
-        <w:t xml:space="preserve">; generation is greedy, 6 tokens. The lens is applied at the last prompt token; for each candidate item we take the minimum, over layers in the band and over four token variants (bare, leading space, capitalised, both), of the position of the item’s first token in the lens logits sorted descending, truncated at 5,000 (censored beyond). Bands: early = layers 0 to 10, late = layers 28 to 43, upper = layers 11 to 46, of 47. Candidate decoding is whether the transmitted item has the smallest rank of the four, with list-order tie-breaking; this inflates decoding of</w:t>
+        <w:t xml:space="preserve">; generation is greedy, 6 tokens. The lens is applied at the last prompt token. For each candidate item we take the minimum, over layers in the band and over four token variants (bare, leading space, capitalised, both), of the position of the item’s first token in the lens logits sorted descending, truncated at 5,000 (censored beyond). Bands: early = layers 0 to 10, late = layers 28 to 43, upper = layers 11 to 46, of 47. Candidate decoding is whether the transmitted item has the smallest rank of the four, with list-order tie-breaking; this inflates decoding of</w:t>
       </w:r>
       <w:r>
         <w:t xml:space="preserve"> </w:t>

</xml_diff>

<commit_message>
Abstract within 250 words
Co-Authored-By: Claude Fable 5.1 <noreply@anthropic.com>
Claude-Session: https://claude.ai/code/session_018qJiaQKKjpemqx8e3Wrmcq
</commit_message>
<xml_diff>
--- a/report/report_draft.docx
+++ b/report/report_draft.docx
@@ -324,7 +324,7 @@
         <w:pStyle w:val="BodyText"/>
       </w:pPr>
       <w:r>
-        <w:t xml:space="preserve">We vary the public state the detector conditions on, the length of the game, and the size of the coalition. Two innocent agents that follow the same public rule defeat every unconditioned dependence statistic. Conditioning removes the problem only when the chosen state captures the rule they follow. At 25 rounds a fixed threshold accuses a pair in about half of all-random games. A Holm-corrected permutation rule holds the false-positive rate down on the scripted nulls, but flags a pair in each pooled LLM control that has no planted coalition. A rejected null is not the same as evidence of collusion.</w:t>
+        <w:t xml:space="preserve">We vary the public state the detector conditions on, the length of the game, and the size of the coalition. Two innocent agents that follow the same public rule defeat every unconditioned dependence statistic; conditioning helps only when the chosen state captures their rule. At 25 rounds a fixed threshold accuses a pair in about half of all-random games. A Holm-corrected permutation rule holds the false-positive rate down on the scripted nulls, but flags a pair in each pooled LLM control that has no planted coalition. A rejected null is not evidence of collusion.</w:t>
       </w:r>
     </w:p>
     <w:p>
@@ -332,7 +332,7 @@
         <w:pStyle w:val="BodyText"/>
       </w:pPr>
       <w:r>
-        <w:t xml:space="preserve">With one primary agent and two assistants we derive a cancellation: the pairwise correction subtracts one coalition member’s influence from another’s, so fixed-threshold detection gets worse as the log grows.</w:t>
+        <w:t xml:space="preserve">With one primary agent and two assistants, the pairwise correction subtracts one coalition member’s influence from another’s, so fixed-threshold detection gets worse as the log grows.</w:t>
       </w:r>
     </w:p>
     <w:p>
@@ -348,7 +348,7 @@
         <w:pStyle w:val="BodyText"/>
       </w:pPr>
       <w:r>
-        <w:t xml:space="preserve">An exploratory Jacobian-lens experiment ran 150 receiver evaluations but produced no unauthorised adoption, so its intended contrast between taking part and refusing is unresolved. We release the code and logs and list the assumptions an auditor has to check before treating dependence as evidence.</w:t>
+        <w:t xml:space="preserve">An exploratory Jacobian-lens experiment produced no unauthorised adoption in 150 receiver evaluations, so its contrast between taking part and refusing is unresolved. We release the code and logs and list the assumptions an auditor has to check before treating dependence as evidence.</w:t>
       </w:r>
     </w:p>
     <w:bookmarkEnd w:id="20"/>

</xml_diff>